<commit_message>
Added and tested startup with sessions
</commit_message>
<xml_diff>
--- a/documents/code logic.docx
+++ b/documents/code logic.docx
@@ -3,13 +3,8 @@
 <w:document xmlns:wpc="http://schemas.microsoft.com/office/word/2010/wordprocessingCanvas" xmlns:cx="http://schemas.microsoft.com/office/drawing/2014/chartex" xmlns:cx1="http://schemas.microsoft.com/office/drawing/2015/9/8/chartex" xmlns:cx2="http://schemas.microsoft.com/office/drawing/2015/10/21/chartex" xmlns:cx3="http://schemas.microsoft.com/office/drawing/2016/5/9/chartex" xmlns:cx4="http://schemas.microsoft.com/office/drawing/2016/5/10/chartex" xmlns:cx5="http://schemas.microsoft.com/office/drawing/2016/5/11/chartex" xmlns:cx6="http://schemas.microsoft.com/office/drawing/2016/5/12/chartex" xmlns:cx7="http://schemas.microsoft.com/office/drawing/2016/5/13/chartex" xmlns:cx8="http://schemas.microsoft.com/office/drawing/2016/5/14/chartex" xmlns:mc="http://schemas.openxmlformats.org/markup-compatibility/2006" xmlns:aink="http://schemas.microsoft.com/office/drawing/2016/ink" xmlns:am3d="http://schemas.microsoft.com/office/drawing/2017/model3d" xmlns:o="urn:schemas-microsoft-com:office:office" xmlns:oel="http://schemas.microsoft.com/office/2019/extlst" xmlns:r="http://schemas.openxmlformats.org/officeDocument/2006/relationships" xmlns:m="http://schemas.openxmlformats.org/officeDocument/2006/math" xmlns:v="urn:schemas-microsoft-com:vml" xmlns:wp14="http://schemas.microsoft.com/office/word/2010/wordprocessingDrawing" xmlns:wp="http://schemas.openxmlformats.org/drawingml/2006/wordprocessingDrawing" xmlns:w10="urn:schemas-microsoft-com:office:word" xmlns:w="http://schemas.openxmlformats.org/wordprocessingml/2006/main" xmlns:w14="http://schemas.microsoft.com/office/word/2010/wordml" xmlns:w15="http://schemas.microsoft.com/office/word/2012/wordml" xmlns:w16cex="http://schemas.microsoft.com/office/word/2018/wordml/cex" xmlns:w16cid="http://schemas.microsoft.com/office/word/2016/wordml/cid" xmlns:w16="http://schemas.microsoft.com/office/word/2018/wordml" xmlns:w16du="http://schemas.microsoft.com/office/word/2023/wordml/word16du" xmlns:w16sdtdh="http://schemas.microsoft.com/office/word/2020/wordml/sdtdatahash" xmlns:w16sdtfl="http://schemas.microsoft.com/office/word/2024/wordml/sdtformatlock" xmlns:w16se="http://schemas.microsoft.com/office/word/2015/wordml/symex" xmlns:wpg="http://schemas.microsoft.com/office/word/2010/wordprocessingGroup" xmlns:wpi="http://schemas.microsoft.com/office/word/2010/wordprocessingInk" xmlns:wne="http://schemas.microsoft.com/office/word/2006/wordml" xmlns:wps="http://schemas.microsoft.com/office/word/2010/wordprocessingShape" mc:Ignorable="w14 w15 w16se w16cid w16 w16cex w16sdtdh w16sdtfl w16du wp14">
   <w:body>
     <w:p>
-      <w:proofErr w:type="gramStart"/>
-      <w:r>
-        <w:t>oh</w:t>
-      </w:r>
-      <w:proofErr w:type="gramEnd"/>
-      <w:r>
-        <w:t xml:space="preserve"> so the easy way is to check local token if that exists then redirect to orders page if </w:t>
+      <w:r>
+        <w:t xml:space="preserve">oh so the easy way is to check local token if that exists then redirect to orders page if </w:t>
       </w:r>
       <w:proofErr w:type="spellStart"/>
       <w:r>
@@ -97,27 +92,11 @@
       </w:r>
       <w:proofErr w:type="spellEnd"/>
       <w:r>
-        <w:t xml:space="preserve"> user after </w:t>
-      </w:r>
-      <w:proofErr w:type="gramStart"/>
-      <w:r>
-        <w:t>reinstall) .</w:t>
-      </w:r>
-      <w:proofErr w:type="gramEnd"/>
-      <w:r>
-        <w:t xml:space="preserve"> not exists then firs time user redirect to name entering</w:t>
+        <w:t xml:space="preserve"> user after reinstall) . not exists then firs time user redirect to name entering</w:t>
       </w:r>
       <w:r>
         <w:br/>
-        <w:t xml:space="preserve">but now two things where does local token be </w:t>
-      </w:r>
-      <w:proofErr w:type="gramStart"/>
-      <w:r>
-        <w:t>stored ?</w:t>
-      </w:r>
-      <w:proofErr w:type="gramEnd"/>
-      <w:r>
-        <w:t xml:space="preserve"> in </w:t>
+        <w:t xml:space="preserve">but now two things where does local token be stored ? in </w:t>
       </w:r>
       <w:proofErr w:type="spellStart"/>
       <w:r>
@@ -149,15 +128,7 @@
       </w:r>
       <w:proofErr w:type="spellEnd"/>
       <w:r>
-        <w:t xml:space="preserve"> of user </w:t>
-      </w:r>
-      <w:proofErr w:type="gramStart"/>
-      <w:r>
-        <w:t>id ?</w:t>
-      </w:r>
-      <w:proofErr w:type="gramEnd"/>
-      <w:r>
-        <w:t xml:space="preserve"> because how will </w:t>
+        <w:t xml:space="preserve"> of user id ? because how will </w:t>
       </w:r>
       <w:proofErr w:type="spellStart"/>
       <w:r>
@@ -208,25 +179,12 @@
         <w:t xml:space="preserve">Just check local token existence in the </w:t>
       </w:r>
       <w:proofErr w:type="spellStart"/>
-      <w:proofErr w:type="gramStart"/>
       <w:r>
         <w:t>db</w:t>
       </w:r>
       <w:proofErr w:type="spellEnd"/>
       <w:r>
-        <w:t xml:space="preserve"> .</w:t>
-      </w:r>
-      <w:proofErr w:type="gramEnd"/>
-      <w:r>
-        <w:t xml:space="preserve"> </w:t>
-      </w:r>
-      <w:proofErr w:type="gramStart"/>
-      <w:r>
-        <w:t>if  it</w:t>
-      </w:r>
-      <w:proofErr w:type="gramEnd"/>
-      <w:r>
-        <w:t xml:space="preserve"> exists then redirect to orders</w:t>
+        <w:t xml:space="preserve"> . if  it exists then redirect to orders</w:t>
       </w:r>
     </w:p>
     <w:p>
@@ -323,13 +281,8 @@
       </w:r>
     </w:p>
     <w:p>
-      <w:proofErr w:type="gramStart"/>
-      <w:r>
-        <w:t>Checks  if</w:t>
-      </w:r>
-      <w:proofErr w:type="gramEnd"/>
-      <w:r>
-        <w:t xml:space="preserve"> the entered number already exists in the users table if it does, then set the verified Boolean to false in the </w:t>
+      <w:r>
+        <w:t xml:space="preserve">Checks  if the entered number already exists in the users table if it does, then set the verified Boolean to false in the </w:t>
       </w:r>
       <w:proofErr w:type="spellStart"/>
       <w:r>
@@ -337,147 +290,110 @@
       </w:r>
       <w:proofErr w:type="spellEnd"/>
       <w:r>
+        <w:t xml:space="preserve"> table : the user already exists but has to undergo verification of phone number again</w:t>
+      </w:r>
+    </w:p>
+    <w:p>
+      <w:r>
+        <w:lastRenderedPageBreak/>
+        <w:t>Checks if the entered phone number exists in the pending users table, if it does then do nothing , if it doesn’t then insert the number (This will be done for existing users too that are getting back to the application as they are currently pending (unverified) users too</w:t>
+      </w:r>
+    </w:p>
+    <w:p/>
+    <w:p>
+      <w:r>
+        <w:t xml:space="preserve">Store </w:t>
+      </w:r>
+      <w:proofErr w:type="spellStart"/>
+      <w:r>
+        <w:t>otp</w:t>
+      </w:r>
+      <w:proofErr w:type="spellEnd"/>
+      <w:r>
+        <w:t>:</w:t>
+      </w:r>
+    </w:p>
+    <w:p>
+      <w:r>
+        <w:t xml:space="preserve">Stores </w:t>
+      </w:r>
+      <w:proofErr w:type="spellStart"/>
+      <w:r>
+        <w:t>otp</w:t>
+      </w:r>
+      <w:proofErr w:type="spellEnd"/>
+      <w:r>
+        <w:t xml:space="preserve"> in the pending users table </w:t>
+      </w:r>
+    </w:p>
+    <w:p>
+      <w:r>
+        <w:t xml:space="preserve">If the </w:t>
+      </w:r>
+      <w:proofErr w:type="spellStart"/>
+      <w:r>
+        <w:t>otp</w:t>
+      </w:r>
+      <w:proofErr w:type="spellEnd"/>
+      <w:r>
+        <w:t xml:space="preserve"> already exists then </w:t>
+      </w:r>
+      <w:proofErr w:type="spellStart"/>
+      <w:r>
+        <w:t>upates</w:t>
+      </w:r>
+      <w:proofErr w:type="spellEnd"/>
+      <w:r>
+        <w:t xml:space="preserve"> the </w:t>
+      </w:r>
+      <w:proofErr w:type="spellStart"/>
+      <w:r>
+        <w:t>otp</w:t>
+      </w:r>
+      <w:proofErr w:type="spellEnd"/>
+      <w:r>
+        <w:t xml:space="preserve"> (can be because the user exited during the process came again, or that he requested a new </w:t>
+      </w:r>
+      <w:proofErr w:type="spellStart"/>
+      <w:r>
+        <w:t>otp</w:t>
+      </w:r>
+      <w:proofErr w:type="spellEnd"/>
+      <w:r>
+        <w:t>)</w:t>
+      </w:r>
+    </w:p>
+    <w:p/>
+    <w:p>
+      <w:proofErr w:type="spellStart"/>
+      <w:r>
+        <w:t>Verify_otp_and_activate_users</w:t>
+      </w:r>
+      <w:proofErr w:type="spellEnd"/>
+      <w:r>
+        <w:t xml:space="preserve"> fn:</w:t>
+      </w:r>
+    </w:p>
+    <w:p>
+      <w:r>
+        <w:t xml:space="preserve">Checks the entered  </w:t>
+      </w:r>
+      <w:proofErr w:type="spellStart"/>
+      <w:r>
+        <w:t>otp</w:t>
+      </w:r>
+      <w:proofErr w:type="spellEnd"/>
+      <w:r>
+        <w:t xml:space="preserve"> against the stored </w:t>
+      </w:r>
+      <w:proofErr w:type="spellStart"/>
+      <w:r>
+        <w:t>otp</w:t>
+      </w:r>
+      <w:proofErr w:type="spellEnd"/>
+      <w:r>
         <w:t xml:space="preserve"> </w:t>
       </w:r>
-      <w:proofErr w:type="gramStart"/>
-      <w:r>
-        <w:t>table :</w:t>
-      </w:r>
-      <w:proofErr w:type="gramEnd"/>
-      <w:r>
-        <w:t xml:space="preserve"> the user already exists but </w:t>
-      </w:r>
-      <w:proofErr w:type="gramStart"/>
-      <w:r>
-        <w:t>has to</w:t>
-      </w:r>
-      <w:proofErr w:type="gramEnd"/>
-      <w:r>
-        <w:t xml:space="preserve"> undergo verification of phone number again</w:t>
-      </w:r>
-    </w:p>
-    <w:p>
-      <w:r>
-        <w:lastRenderedPageBreak/>
-        <w:t xml:space="preserve">Checks if the entered phone number exists in the pending users table, if it does then do </w:t>
-      </w:r>
-      <w:proofErr w:type="gramStart"/>
-      <w:r>
-        <w:t>nothing ,</w:t>
-      </w:r>
-      <w:proofErr w:type="gramEnd"/>
-      <w:r>
-        <w:t xml:space="preserve"> if it doesn’t then insert the number (This will be done for existing users too that are getting back to the application as they are currently pending (unverified) users too</w:t>
-      </w:r>
-    </w:p>
-    <w:p/>
-    <w:p>
-      <w:r>
-        <w:t xml:space="preserve">Store </w:t>
-      </w:r>
-      <w:proofErr w:type="spellStart"/>
-      <w:r>
-        <w:t>otp</w:t>
-      </w:r>
-      <w:proofErr w:type="spellEnd"/>
-      <w:r>
-        <w:t>:</w:t>
-      </w:r>
-    </w:p>
-    <w:p>
-      <w:r>
-        <w:t xml:space="preserve">Stores </w:t>
-      </w:r>
-      <w:proofErr w:type="spellStart"/>
-      <w:r>
-        <w:t>otp</w:t>
-      </w:r>
-      <w:proofErr w:type="spellEnd"/>
-      <w:r>
-        <w:t xml:space="preserve"> in the pending </w:t>
-      </w:r>
-      <w:proofErr w:type="gramStart"/>
-      <w:r>
-        <w:t>users</w:t>
-      </w:r>
-      <w:proofErr w:type="gramEnd"/>
-      <w:r>
-        <w:t xml:space="preserve"> table </w:t>
-      </w:r>
-    </w:p>
-    <w:p>
-      <w:r>
-        <w:t xml:space="preserve">If the </w:t>
-      </w:r>
-      <w:proofErr w:type="spellStart"/>
-      <w:r>
-        <w:t>otp</w:t>
-      </w:r>
-      <w:proofErr w:type="spellEnd"/>
-      <w:r>
-        <w:t xml:space="preserve"> already exists then </w:t>
-      </w:r>
-      <w:proofErr w:type="spellStart"/>
-      <w:r>
-        <w:t>upates</w:t>
-      </w:r>
-      <w:proofErr w:type="spellEnd"/>
-      <w:r>
-        <w:t xml:space="preserve"> the </w:t>
-      </w:r>
-      <w:proofErr w:type="spellStart"/>
-      <w:r>
-        <w:t>otp</w:t>
-      </w:r>
-      <w:proofErr w:type="spellEnd"/>
-      <w:r>
-        <w:t xml:space="preserve"> (can be because the user exited during the process came again, or that he requested a new </w:t>
-      </w:r>
-      <w:proofErr w:type="spellStart"/>
-      <w:r>
-        <w:t>otp</w:t>
-      </w:r>
-      <w:proofErr w:type="spellEnd"/>
-      <w:r>
-        <w:t>)</w:t>
-      </w:r>
-    </w:p>
-    <w:p/>
-    <w:p>
-      <w:proofErr w:type="spellStart"/>
-      <w:r>
-        <w:t>Verify_otp_and_activate_users</w:t>
-      </w:r>
-      <w:proofErr w:type="spellEnd"/>
-      <w:r>
-        <w:t xml:space="preserve"> fn:</w:t>
-      </w:r>
-    </w:p>
-    <w:p>
-      <w:r>
-        <w:t xml:space="preserve">Checks the </w:t>
-      </w:r>
-      <w:proofErr w:type="gramStart"/>
-      <w:r>
-        <w:t xml:space="preserve">entered  </w:t>
-      </w:r>
-      <w:proofErr w:type="spellStart"/>
-      <w:r>
-        <w:t>otp</w:t>
-      </w:r>
-      <w:proofErr w:type="spellEnd"/>
-      <w:proofErr w:type="gramEnd"/>
-      <w:r>
-        <w:t xml:space="preserve"> against the stored </w:t>
-      </w:r>
-      <w:proofErr w:type="spellStart"/>
-      <w:r>
-        <w:t>otp</w:t>
-      </w:r>
-      <w:proofErr w:type="spellEnd"/>
-      <w:r>
-        <w:t xml:space="preserve"> </w:t>
-      </w:r>
     </w:p>
     <w:p>
       <w:r>
@@ -486,15 +402,7 @@
     </w:p>
     <w:p>
       <w:r>
-        <w:t xml:space="preserve">If new user, inserts the info from pending users table to new </w:t>
-      </w:r>
-      <w:proofErr w:type="gramStart"/>
-      <w:r>
-        <w:t>users</w:t>
-      </w:r>
-      <w:proofErr w:type="gramEnd"/>
-      <w:r>
-        <w:t xml:space="preserve"> table</w:t>
+        <w:t>If new user, inserts the info from pending users table to new users table</w:t>
       </w:r>
     </w:p>
     <w:p>
@@ -517,15 +425,7 @@
     </w:p>
     <w:p>
       <w:r>
-        <w:t xml:space="preserve">If both session and role </w:t>
-      </w:r>
-      <w:proofErr w:type="gramStart"/>
-      <w:r>
-        <w:t>exists</w:t>
-      </w:r>
-      <w:proofErr w:type="gramEnd"/>
-      <w:r>
-        <w:t>: Go to orders page</w:t>
+        <w:t>If both session and role exists: Go to orders page</w:t>
       </w:r>
     </w:p>
     <w:p>
@@ -597,15 +497,7 @@
       </w:r>
       <w:proofErr w:type="spellEnd"/>
       <w:r>
-        <w:t xml:space="preserve"> table will be checked, if he doesn’t exist there </w:t>
-      </w:r>
-      <w:proofErr w:type="gramStart"/>
-      <w:r>
-        <w:t>therefore</w:t>
-      </w:r>
-      <w:proofErr w:type="gramEnd"/>
-      <w:r>
-        <w:t xml:space="preserve"> he hasn’t defined one single driver, implying he is a new registration.</w:t>
+        <w:t xml:space="preserve"> table will be checked, if he doesn’t exist there therefore he hasn’t defined one single driver, implying he is a new registration.</w:t>
       </w:r>
     </w:p>
     <w:p>
@@ -623,23 +515,7 @@
         <w:t xml:space="preserve">This will be checked by checking the </w:t>
       </w:r>
       <w:r>
-        <w:t xml:space="preserve">supplier drivers table again against the </w:t>
-      </w:r>
-      <w:proofErr w:type="gramStart"/>
-      <w:r>
-        <w:t>suppliers</w:t>
-      </w:r>
-      <w:proofErr w:type="gramEnd"/>
-      <w:r>
-        <w:t xml:space="preserve"> user </w:t>
-      </w:r>
-      <w:proofErr w:type="gramStart"/>
-      <w:r>
-        <w:t>id, and</w:t>
-      </w:r>
-      <w:proofErr w:type="gramEnd"/>
-      <w:r>
-        <w:t xml:space="preserve"> checking the </w:t>
+        <w:t xml:space="preserve">supplier drivers table again against the suppliers user id, and checking the </w:t>
       </w:r>
       <w:proofErr w:type="spellStart"/>
       <w:r>
@@ -671,23 +547,7 @@
     </w:p>
     <w:p>
       <w:r>
-        <w:t xml:space="preserve">When he comes back to the application, after verification, his session will be generated, upon entering his details it will be checked that if his role is already set to driver that </w:t>
-      </w:r>
-      <w:proofErr w:type="gramStart"/>
-      <w:r>
-        <w:t>implies</w:t>
-      </w:r>
-      <w:proofErr w:type="gramEnd"/>
-      <w:r>
-        <w:t xml:space="preserve"> he is an existing user therefore only set his id back into the supplier </w:t>
-      </w:r>
-      <w:proofErr w:type="gramStart"/>
-      <w:r>
-        <w:t>drivers</w:t>
-      </w:r>
-      <w:proofErr w:type="gramEnd"/>
-      <w:r>
-        <w:t xml:space="preserve"> table. </w:t>
+        <w:t xml:space="preserve">When he comes back to the application, after verification, his session will be generated, upon entering his details it will be checked that if his role is already set to driver that implies he is an existing user therefore only set his id back into the supplier drivers table. </w:t>
       </w:r>
     </w:p>
     <w:p/>
@@ -841,15 +701,7 @@
       </w:r>
       <w:proofErr w:type="spellEnd"/>
       <w:r>
-        <w:t xml:space="preserve"> against that supplier in the supplier </w:t>
-      </w:r>
-      <w:proofErr w:type="gramStart"/>
-      <w:r>
-        <w:t>drivers</w:t>
-      </w:r>
-      <w:proofErr w:type="gramEnd"/>
-      <w:r>
-        <w:t xml:space="preserve"> table</w:t>
+        <w:t xml:space="preserve"> against that supplier in the supplier drivers table</w:t>
       </w:r>
     </w:p>
     <w:p>
@@ -865,13 +717,8 @@
         <w:t xml:space="preserve">, even if one of the </w:t>
       </w:r>
       <w:proofErr w:type="spellStart"/>
-      <w:proofErr w:type="gramStart"/>
-      <w:r>
-        <w:t>driver</w:t>
-      </w:r>
-      <w:proofErr w:type="gramEnd"/>
-      <w:r>
-        <w:t>_id</w:t>
+      <w:r>
+        <w:t>driver_id</w:t>
       </w:r>
       <w:proofErr w:type="spellEnd"/>
       <w:r>
@@ -950,13 +797,8 @@
         <w:t>'</w:t>
       </w:r>
       <w:proofErr w:type="spellStart"/>
-      <w:proofErr w:type="gramStart"/>
-      <w:r>
-        <w:t>orders</w:t>
-      </w:r>
-      <w:proofErr w:type="gramEnd"/>
-      <w:r>
-        <w:t>_channel</w:t>
+      <w:r>
+        <w:t>orders_channel</w:t>
       </w:r>
       <w:proofErr w:type="spellEnd"/>
       <w:r>
@@ -1204,31 +1046,15 @@
           <w:b/>
           <w:bCs/>
         </w:rPr>
-        <w:t>view_available_</w:t>
-      </w:r>
-      <w:proofErr w:type="gramStart"/>
-      <w:r>
-        <w:rPr>
-          <w:b/>
-          <w:bCs/>
-        </w:rPr>
-        <w:t>orders</w:t>
-      </w:r>
-      <w:proofErr w:type="spellEnd"/>
-      <w:r>
-        <w:rPr>
-          <w:b/>
-          <w:bCs/>
-        </w:rPr>
-        <w:t>(</w:t>
-      </w:r>
-      <w:proofErr w:type="gramEnd"/>
-      <w:r>
-        <w:rPr>
-          <w:b/>
-          <w:bCs/>
-        </w:rPr>
-        <w:t>)</w:t>
+        <w:t>view_available_orders</w:t>
+      </w:r>
+      <w:proofErr w:type="spellEnd"/>
+      <w:r>
+        <w:rPr>
+          <w:b/>
+          <w:bCs/>
+        </w:rPr>
+        <w:t>()</w:t>
       </w:r>
     </w:p>
     <w:p>
@@ -1346,31 +1172,15 @@
           <w:b/>
           <w:bCs/>
         </w:rPr>
-        <w:t>view_available_</w:t>
-      </w:r>
-      <w:proofErr w:type="gramStart"/>
-      <w:r>
-        <w:rPr>
-          <w:b/>
-          <w:bCs/>
-        </w:rPr>
-        <w:t>orders</w:t>
-      </w:r>
-      <w:proofErr w:type="spellEnd"/>
-      <w:r>
-        <w:rPr>
-          <w:b/>
-          <w:bCs/>
-        </w:rPr>
-        <w:t>(</w:t>
-      </w:r>
-      <w:proofErr w:type="gramEnd"/>
-      <w:r>
-        <w:rPr>
-          <w:b/>
-          <w:bCs/>
-        </w:rPr>
-        <w:t>) is NOT called by the trigger</w:t>
+        <w:t>view_available_orders</w:t>
+      </w:r>
+      <w:proofErr w:type="spellEnd"/>
+      <w:r>
+        <w:rPr>
+          <w:b/>
+          <w:bCs/>
+        </w:rPr>
+        <w:t>() is NOT called by the trigger</w:t>
       </w:r>
     </w:p>
     <w:p>
@@ -1495,12 +1305,10 @@
     </w:p>
     <w:p>
       <w:proofErr w:type="spellStart"/>
-      <w:proofErr w:type="gramStart"/>
       <w:r>
         <w:t>client.on</w:t>
       </w:r>
       <w:proofErr w:type="spellEnd"/>
-      <w:proofErr w:type="gramEnd"/>
       <w:r>
         <w:t>('notification', (msg) =&gt; {</w:t>
       </w:r>
@@ -1510,12 +1318,10 @@
         <w:t>    if (</w:t>
       </w:r>
       <w:proofErr w:type="spellStart"/>
-      <w:proofErr w:type="gramStart"/>
       <w:r>
         <w:t>msg.channel</w:t>
       </w:r>
       <w:proofErr w:type="spellEnd"/>
-      <w:proofErr w:type="gramEnd"/>
       <w:r>
         <w:t xml:space="preserve"> === '</w:t>
       </w:r>
@@ -1538,36 +1344,21 @@
         <w:t xml:space="preserve">        const orders = await </w:t>
       </w:r>
       <w:proofErr w:type="spellStart"/>
-      <w:proofErr w:type="gramStart"/>
       <w:r>
         <w:t>db.query</w:t>
       </w:r>
       <w:proofErr w:type="spellEnd"/>
-      <w:proofErr w:type="gramEnd"/>
       <w:r>
         <w:t xml:space="preserve">('SELECT </w:t>
       </w:r>
       <w:proofErr w:type="spellStart"/>
       <w:r>
-        <w:t>view_available_</w:t>
-      </w:r>
-      <w:proofErr w:type="gramStart"/>
-      <w:r>
-        <w:t>orders</w:t>
-      </w:r>
-      <w:proofErr w:type="spellEnd"/>
-      <w:r>
-        <w:t>(</w:t>
-      </w:r>
-      <w:proofErr w:type="gramEnd"/>
-      <w:r>
-        <w:t>)'</w:t>
-      </w:r>
-      <w:proofErr w:type="gramStart"/>
-      <w:r>
-        <w:t>);</w:t>
-      </w:r>
-      <w:proofErr w:type="gramEnd"/>
+        <w:t>view_available_orders</w:t>
+      </w:r>
+      <w:proofErr w:type="spellEnd"/>
+      <w:r>
+        <w:t>()');</w:t>
+      </w:r>
     </w:p>
     <w:p>
       <w:r>
@@ -1584,12 +1375,10 @@
         <w:t xml:space="preserve">        </w:t>
       </w:r>
       <w:proofErr w:type="spellStart"/>
-      <w:proofErr w:type="gramStart"/>
       <w:r>
         <w:t>io.emit</w:t>
       </w:r>
       <w:proofErr w:type="spellEnd"/>
-      <w:proofErr w:type="gramEnd"/>
       <w:r>
         <w:t>('</w:t>
       </w:r>
@@ -1599,13 +1388,8 @@
       </w:r>
       <w:proofErr w:type="spellEnd"/>
       <w:r>
-        <w:t>', orders</w:t>
-      </w:r>
-      <w:proofErr w:type="gramStart"/>
-      <w:r>
-        <w:t>);</w:t>
-      </w:r>
-      <w:proofErr w:type="gramEnd"/>
+        <w:t>', orders);</w:t>
+      </w:r>
     </w:p>
     <w:p>
       <w:r>
@@ -1614,34 +1398,13 @@
     </w:p>
     <w:p>
       <w:r>
-        <w:t>}</w:t>
-      </w:r>
-      <w:proofErr w:type="gramStart"/>
-      <w:r>
-        <w:t>);</w:t>
-      </w:r>
-      <w:proofErr w:type="gramEnd"/>
+        <w:t>});</w:t>
+      </w:r>
     </w:p>
     <w:p/>
     <w:p>
       <w:r>
-        <w:t xml:space="preserve">Why not call directly the fn in trigger? Because trigger </w:t>
-      </w:r>
-      <w:proofErr w:type="gramStart"/>
-      <w:r>
-        <w:t>cant</w:t>
-      </w:r>
-      <w:proofErr w:type="gramEnd"/>
-      <w:r>
-        <w:t xml:space="preserve"> do anything with the data. It </w:t>
-      </w:r>
-      <w:proofErr w:type="gramStart"/>
-      <w:r>
-        <w:t>cant</w:t>
-      </w:r>
-      <w:proofErr w:type="gramEnd"/>
-      <w:r>
-        <w:t xml:space="preserve"> return the data back to backend</w:t>
+        <w:t>Why not call directly the fn in trigger? Because trigger cant do anything with the data. It cant return the data back to backend</w:t>
       </w:r>
     </w:p>
     <w:p>
@@ -1661,17 +1424,12 @@
         <w:t xml:space="preserve"> cost in my recommended fare calculation. we will only allow 7 </w:t>
       </w:r>
       <w:proofErr w:type="spellStart"/>
-      <w:proofErr w:type="gramStart"/>
       <w:r>
         <w:t>quantites</w:t>
       </w:r>
       <w:proofErr w:type="spellEnd"/>
       <w:r>
-        <w:t xml:space="preserve">  to</w:t>
-      </w:r>
-      <w:proofErr w:type="gramEnd"/>
-      <w:r>
-        <w:t xml:space="preserve"> be </w:t>
+        <w:t xml:space="preserve">  to be </w:t>
       </w:r>
       <w:proofErr w:type="spellStart"/>
       <w:r>
@@ -2893,15 +2651,7 @@
         <w:t>Every 5-10 seconds</w:t>
       </w:r>
       <w:r>
-        <w:t xml:space="preserve"> - </w:t>
-      </w:r>
-      <w:proofErr w:type="gramStart"/>
-      <w:r>
-        <w:t>Good</w:t>
-      </w:r>
-      <w:proofErr w:type="gramEnd"/>
-      <w:r>
-        <w:t xml:space="preserve"> balance (not too much data)</w:t>
+        <w:t> - Good balance (not too much data)</w:t>
       </w:r>
     </w:p>
     <w:p>
@@ -2987,15 +2737,7 @@
     </w:p>
     <w:p>
       <w:r>
-        <w:t xml:space="preserve">If </w:t>
-      </w:r>
-      <w:proofErr w:type="gramStart"/>
-      <w:r>
-        <w:t>yes</w:t>
-      </w:r>
-      <w:proofErr w:type="gramEnd"/>
-      <w:r>
-        <w:t xml:space="preserve"> then submit bid </w:t>
+        <w:t xml:space="preserve">If yes then submit bid </w:t>
       </w:r>
     </w:p>
     <w:p/>
@@ -3011,15 +2753,7 @@
     </w:p>
     <w:p>
       <w:r>
-        <w:t xml:space="preserve">If it is then </w:t>
-      </w:r>
-      <w:proofErr w:type="gramStart"/>
-      <w:r>
-        <w:t>update</w:t>
-      </w:r>
-      <w:proofErr w:type="gramEnd"/>
-      <w:r>
-        <w:t xml:space="preserve"> the supplier id, accepted price, </w:t>
+        <w:t xml:space="preserve">If it is then update the supplier id, accepted price, </w:t>
       </w:r>
       <w:proofErr w:type="spellStart"/>
       <w:r>
@@ -3027,15 +2761,7 @@
       </w:r>
       <w:proofErr w:type="spellEnd"/>
       <w:r>
-        <w:t xml:space="preserve"> </w:t>
-      </w:r>
-      <w:proofErr w:type="gramStart"/>
-      <w:r>
-        <w:t>at  and</w:t>
-      </w:r>
-      <w:proofErr w:type="gramEnd"/>
-      <w:r>
-        <w:t xml:space="preserve"> </w:t>
+        <w:t xml:space="preserve"> at  and </w:t>
       </w:r>
     </w:p>
     <w:p>
@@ -3046,29 +2772,13 @@
     <w:p/>
     <w:p>
       <w:r>
-        <w:t xml:space="preserve">As soon as this status update happens a trigger will be called for this order where all the bids for that </w:t>
-      </w:r>
-      <w:proofErr w:type="gramStart"/>
-      <w:r>
-        <w:t>order  will</w:t>
-      </w:r>
-      <w:proofErr w:type="gramEnd"/>
-      <w:r>
-        <w:t xml:space="preserve"> be deleted instantly</w:t>
+        <w:t>As soon as this status update happens a trigger will be called for this order where all the bids for that order  will be deleted instantly</w:t>
       </w:r>
     </w:p>
     <w:p/>
     <w:p>
       <w:r>
-        <w:t xml:space="preserve">For accepting bid, the customer id will be sent using the session id from backend (this </w:t>
-      </w:r>
-      <w:proofErr w:type="gramStart"/>
-      <w:r>
-        <w:t>has to</w:t>
-      </w:r>
-      <w:proofErr w:type="gramEnd"/>
-      <w:r>
-        <w:t xml:space="preserve"> be done for others too, for other human/computer interactions</w:t>
+        <w:t>For accepting bid, the customer id will be sent using the session id from backend (this has to be done for others too, for other human/computer interactions</w:t>
       </w:r>
     </w:p>
     <w:p/>
@@ -3084,42 +2794,13 @@
       </w:r>
     </w:p>
     <w:p>
-      <w:proofErr w:type="gramStart"/>
-      <w:r>
-        <w:t>Have to</w:t>
-      </w:r>
-      <w:proofErr w:type="gramEnd"/>
-      <w:r>
-        <w:t xml:space="preserve"> </w:t>
-      </w:r>
-      <w:proofErr w:type="gramStart"/>
-      <w:r>
-        <w:t>remove  the</w:t>
-      </w:r>
-      <w:proofErr w:type="gramEnd"/>
-      <w:r>
-        <w:t xml:space="preserve"> order as soon as timer goes up.</w:t>
-      </w:r>
-    </w:p>
-    <w:p>
-      <w:r>
-        <w:t xml:space="preserve">From the </w:t>
-      </w:r>
-      <w:proofErr w:type="gramStart"/>
-      <w:r>
-        <w:t>orders  table</w:t>
-      </w:r>
-      <w:proofErr w:type="gramEnd"/>
-      <w:r>
-        <w:t xml:space="preserve"> and from </w:t>
-      </w:r>
-      <w:proofErr w:type="gramStart"/>
-      <w:r>
-        <w:t>drivers</w:t>
-      </w:r>
-      <w:proofErr w:type="gramEnd"/>
-      <w:r>
-        <w:t xml:space="preserve"> table</w:t>
+      <w:r>
+        <w:t>Have to remove  the order as soon as timer goes up.</w:t>
+      </w:r>
+    </w:p>
+    <w:p>
+      <w:r>
+        <w:t>From the orders  table and from drivers table</w:t>
       </w:r>
     </w:p>
     <w:p/>
@@ -3165,15 +2846,7 @@
     <w:p/>
     <w:p>
       <w:r>
-        <w:t xml:space="preserve">REMINDER: session id </w:t>
-      </w:r>
-      <w:proofErr w:type="gramStart"/>
-      <w:r>
-        <w:t>has to</w:t>
-      </w:r>
-      <w:proofErr w:type="gramEnd"/>
-      <w:r>
-        <w:t xml:space="preserve"> be checked in backend logic as it was not catered here</w:t>
+        <w:t>REMINDER: session id has to be checked in backend logic as it was not catered here</w:t>
       </w:r>
     </w:p>
     <w:p/>
@@ -3208,15 +2881,7 @@
     </w:p>
     <w:p>
       <w:r>
-        <w:t xml:space="preserve">If assignment already existed but rejected field is </w:t>
-      </w:r>
-      <w:proofErr w:type="gramStart"/>
-      <w:r>
-        <w:t>false</w:t>
-      </w:r>
-      <w:proofErr w:type="gramEnd"/>
-      <w:r>
-        <w:t xml:space="preserve"> then delete that row and reassign and vice versa</w:t>
+        <w:t>If assignment already existed but rejected field is false then delete that row and reassign and vice versa</w:t>
       </w:r>
     </w:p>
     <w:p>
@@ -3274,18 +2939,13 @@
       </w:r>
       <w:proofErr w:type="spellStart"/>
       <w:r>
-        <w:t>get_available_drivers_for_</w:t>
-      </w:r>
-      <w:proofErr w:type="gramStart"/>
-      <w:r>
-        <w:t>supplier</w:t>
+        <w:t>get_available_drivers_for_supplier</w:t>
       </w:r>
       <w:proofErr w:type="spellEnd"/>
       <w:r>
         <w:t>(</w:t>
       </w:r>
       <w:proofErr w:type="spellStart"/>
-      <w:proofErr w:type="gramEnd"/>
       <w:r>
         <w:t>supplier_id</w:t>
       </w:r>
@@ -3377,7 +3037,6 @@
         <w:t xml:space="preserve"> (</w:t>
       </w:r>
       <w:proofErr w:type="spellStart"/>
-      <w:proofErr w:type="gramStart"/>
       <w:r>
         <w:rPr>
           <w:rFonts w:ascii="Consolas" w:eastAsia="Times New Roman" w:hAnsi="Consolas" w:cs="Times New Roman"/>
@@ -3415,7 +3074,6 @@
         <w:t>status</w:t>
       </w:r>
       <w:proofErr w:type="spellEnd"/>
-      <w:proofErr w:type="gramEnd"/>
       <w:r>
         <w:rPr>
           <w:rFonts w:ascii="Consolas" w:eastAsia="Times New Roman" w:hAnsi="Consolas" w:cs="Times New Roman"/>
@@ -3524,7 +3182,6 @@
         </w:rPr>
         <w:t xml:space="preserve"> </w:t>
       </w:r>
-      <w:proofErr w:type="gramStart"/>
       <w:r>
         <w:rPr>
           <w:rFonts w:ascii="Consolas" w:eastAsia="Times New Roman" w:hAnsi="Consolas" w:cs="Times New Roman"/>
@@ -3547,9 +3204,20 @@
           <w:lang w:eastAsia="en-PK"/>
           <w14:ligatures w14:val="none"/>
         </w:rPr>
-        <w:t>(</w:t>
-      </w:r>
-      <w:proofErr w:type="gramEnd"/>
+        <w:t xml:space="preserve">() &lt; new </w:t>
+      </w:r>
+      <w:r>
+        <w:rPr>
+          <w:rFonts w:ascii="Consolas" w:eastAsia="Times New Roman" w:hAnsi="Consolas" w:cs="Times New Roman"/>
+          <w:color w:val="4EC9B0"/>
+          <w:kern w:val="0"/>
+          <w:sz w:val="21"/>
+          <w:szCs w:val="21"/>
+          <w:lang w:eastAsia="en-PK"/>
+          <w14:ligatures w14:val="none"/>
+        </w:rPr>
+        <w:t>Date</w:t>
+      </w:r>
       <w:r>
         <w:rPr>
           <w:rFonts w:ascii="Consolas" w:eastAsia="Times New Roman" w:hAnsi="Consolas" w:cs="Times New Roman"/>
@@ -3560,20 +3228,9 @@
           <w:lang w:eastAsia="en-PK"/>
           <w14:ligatures w14:val="none"/>
         </w:rPr>
-        <w:t xml:space="preserve">) &lt; new </w:t>
-      </w:r>
-      <w:r>
-        <w:rPr>
-          <w:rFonts w:ascii="Consolas" w:eastAsia="Times New Roman" w:hAnsi="Consolas" w:cs="Times New Roman"/>
-          <w:color w:val="4EC9B0"/>
-          <w:kern w:val="0"/>
-          <w:sz w:val="21"/>
-          <w:szCs w:val="21"/>
-          <w:lang w:eastAsia="en-PK"/>
-          <w14:ligatures w14:val="none"/>
-        </w:rPr>
-        <w:t>Date</w:t>
-      </w:r>
+        <w:t>(</w:t>
+      </w:r>
+      <w:proofErr w:type="spellStart"/>
       <w:r>
         <w:rPr>
           <w:rFonts w:ascii="Consolas" w:eastAsia="Times New Roman" w:hAnsi="Consolas" w:cs="Times New Roman"/>
@@ -3584,10 +3241,9 @@
           <w:lang w:eastAsia="en-PK"/>
           <w14:ligatures w14:val="none"/>
         </w:rPr>
-        <w:t>(</w:t>
-      </w:r>
-      <w:proofErr w:type="spellStart"/>
-      <w:proofErr w:type="gramStart"/>
+        <w:t>driver.time_limit</w:t>
+      </w:r>
+      <w:proofErr w:type="spellEnd"/>
       <w:r>
         <w:rPr>
           <w:rFonts w:ascii="Consolas" w:eastAsia="Times New Roman" w:hAnsi="Consolas" w:cs="Times New Roman"/>
@@ -3598,10 +3254,18 @@
           <w:lang w:eastAsia="en-PK"/>
           <w14:ligatures w14:val="none"/>
         </w:rPr>
-        <w:t>driver.time</w:t>
-      </w:r>
-      <w:proofErr w:type="gramEnd"/>
-      <w:r>
+        <w:t>)) {</w:t>
+      </w:r>
+    </w:p>
+    <w:p>
+      <w:pPr>
+        <w:pStyle w:val="ListParagraph"/>
+        <w:numPr>
+          <w:ilvl w:val="0"/>
+          <w:numId w:val="18"/>
+        </w:numPr>
+        <w:shd w:val="clear" w:color="auto" w:fill="1F1F1F"/>
+        <w:spacing w:after="0" w:line="300" w:lineRule="atLeast"/>
         <w:rPr>
           <w:rFonts w:ascii="Consolas" w:eastAsia="Times New Roman" w:hAnsi="Consolas" w:cs="Times New Roman"/>
           <w:color w:val="CCCCCC"/>
@@ -3611,9 +3275,7 @@
           <w:lang w:eastAsia="en-PK"/>
           <w14:ligatures w14:val="none"/>
         </w:rPr>
-        <w:t>_limit</w:t>
-      </w:r>
-      <w:proofErr w:type="spellEnd"/>
+      </w:pPr>
       <w:r>
         <w:rPr>
           <w:rFonts w:ascii="Consolas" w:eastAsia="Times New Roman" w:hAnsi="Consolas" w:cs="Times New Roman"/>
@@ -3624,7 +3286,19 @@
           <w:lang w:eastAsia="en-PK"/>
           <w14:ligatures w14:val="none"/>
         </w:rPr>
-        <w:t>)) {</w:t>
+        <w:t xml:space="preserve">  </w:t>
+      </w:r>
+      <w:r>
+        <w:rPr>
+          <w:rFonts w:ascii="Consolas" w:eastAsia="Times New Roman" w:hAnsi="Consolas" w:cs="Times New Roman"/>
+          <w:color w:val="6A9955"/>
+          <w:kern w:val="0"/>
+          <w:sz w:val="21"/>
+          <w:szCs w:val="21"/>
+          <w:lang w:eastAsia="en-PK"/>
+          <w14:ligatures w14:val="none"/>
+        </w:rPr>
+        <w:t>// Disable button, show countdown timer</w:t>
       </w:r>
     </w:p>
     <w:p>
@@ -3656,6 +3330,315 @@
           <w:lang w:eastAsia="en-PK"/>
           <w14:ligatures w14:val="none"/>
         </w:rPr>
+        <w:lastRenderedPageBreak/>
+        <w:t xml:space="preserve">  </w:t>
+      </w:r>
+      <w:proofErr w:type="spellStart"/>
+      <w:r>
+        <w:rPr>
+          <w:rFonts w:ascii="Consolas" w:eastAsia="Times New Roman" w:hAnsi="Consolas" w:cs="Times New Roman"/>
+          <w:color w:val="9CDCFE"/>
+          <w:kern w:val="0"/>
+          <w:sz w:val="21"/>
+          <w:szCs w:val="21"/>
+          <w:lang w:eastAsia="en-PK"/>
+          <w14:ligatures w14:val="none"/>
+        </w:rPr>
+        <w:t>button</w:t>
+      </w:r>
+      <w:r>
+        <w:rPr>
+          <w:rFonts w:ascii="Consolas" w:eastAsia="Times New Roman" w:hAnsi="Consolas" w:cs="Times New Roman"/>
+          <w:color w:val="CCCCCC"/>
+          <w:kern w:val="0"/>
+          <w:sz w:val="21"/>
+          <w:szCs w:val="21"/>
+          <w:lang w:eastAsia="en-PK"/>
+          <w14:ligatures w14:val="none"/>
+        </w:rPr>
+        <w:t>.</w:t>
+      </w:r>
+      <w:r>
+        <w:rPr>
+          <w:rFonts w:ascii="Consolas" w:eastAsia="Times New Roman" w:hAnsi="Consolas" w:cs="Times New Roman"/>
+          <w:color w:val="9CDCFE"/>
+          <w:kern w:val="0"/>
+          <w:sz w:val="21"/>
+          <w:szCs w:val="21"/>
+          <w:lang w:eastAsia="en-PK"/>
+          <w14:ligatures w14:val="none"/>
+        </w:rPr>
+        <w:t>disabled</w:t>
+      </w:r>
+      <w:proofErr w:type="spellEnd"/>
+      <w:r>
+        <w:rPr>
+          <w:rFonts w:ascii="Consolas" w:eastAsia="Times New Roman" w:hAnsi="Consolas" w:cs="Times New Roman"/>
+          <w:color w:val="CCCCCC"/>
+          <w:kern w:val="0"/>
+          <w:sz w:val="21"/>
+          <w:szCs w:val="21"/>
+          <w:lang w:eastAsia="en-PK"/>
+          <w14:ligatures w14:val="none"/>
+        </w:rPr>
+        <w:t xml:space="preserve"> </w:t>
+      </w:r>
+      <w:r>
+        <w:rPr>
+          <w:rFonts w:ascii="Consolas" w:eastAsia="Times New Roman" w:hAnsi="Consolas" w:cs="Times New Roman"/>
+          <w:color w:val="D4D4D4"/>
+          <w:kern w:val="0"/>
+          <w:sz w:val="21"/>
+          <w:szCs w:val="21"/>
+          <w:lang w:eastAsia="en-PK"/>
+          <w14:ligatures w14:val="none"/>
+        </w:rPr>
+        <w:t>=</w:t>
+      </w:r>
+      <w:r>
+        <w:rPr>
+          <w:rFonts w:ascii="Consolas" w:eastAsia="Times New Roman" w:hAnsi="Consolas" w:cs="Times New Roman"/>
+          <w:color w:val="CCCCCC"/>
+          <w:kern w:val="0"/>
+          <w:sz w:val="21"/>
+          <w:szCs w:val="21"/>
+          <w:lang w:eastAsia="en-PK"/>
+          <w14:ligatures w14:val="none"/>
+        </w:rPr>
+        <w:t xml:space="preserve"> </w:t>
+      </w:r>
+      <w:r>
+        <w:rPr>
+          <w:rFonts w:ascii="Consolas" w:eastAsia="Times New Roman" w:hAnsi="Consolas" w:cs="Times New Roman"/>
+          <w:color w:val="569CD6"/>
+          <w:kern w:val="0"/>
+          <w:sz w:val="21"/>
+          <w:szCs w:val="21"/>
+          <w:lang w:eastAsia="en-PK"/>
+          <w14:ligatures w14:val="none"/>
+        </w:rPr>
+        <w:t>true</w:t>
+      </w:r>
+      <w:r>
+        <w:rPr>
+          <w:rFonts w:ascii="Consolas" w:eastAsia="Times New Roman" w:hAnsi="Consolas" w:cs="Times New Roman"/>
+          <w:color w:val="CCCCCC"/>
+          <w:kern w:val="0"/>
+          <w:sz w:val="21"/>
+          <w:szCs w:val="21"/>
+          <w:lang w:eastAsia="en-PK"/>
+          <w14:ligatures w14:val="none"/>
+        </w:rPr>
+        <w:t>;</w:t>
+      </w:r>
+    </w:p>
+    <w:p>
+      <w:pPr>
+        <w:pStyle w:val="ListParagraph"/>
+        <w:numPr>
+          <w:ilvl w:val="0"/>
+          <w:numId w:val="18"/>
+        </w:numPr>
+        <w:shd w:val="clear" w:color="auto" w:fill="1F1F1F"/>
+        <w:spacing w:after="0" w:line="300" w:lineRule="atLeast"/>
+        <w:rPr>
+          <w:rFonts w:ascii="Consolas" w:eastAsia="Times New Roman" w:hAnsi="Consolas" w:cs="Times New Roman"/>
+          <w:color w:val="CCCCCC"/>
+          <w:kern w:val="0"/>
+          <w:sz w:val="21"/>
+          <w:szCs w:val="21"/>
+          <w:lang w:eastAsia="en-PK"/>
+          <w14:ligatures w14:val="none"/>
+        </w:rPr>
+      </w:pPr>
+      <w:r>
+        <w:rPr>
+          <w:rFonts w:ascii="Consolas" w:eastAsia="Times New Roman" w:hAnsi="Consolas" w:cs="Times New Roman"/>
+          <w:color w:val="CCCCCC"/>
+          <w:kern w:val="0"/>
+          <w:sz w:val="21"/>
+          <w:szCs w:val="21"/>
+          <w:lang w:eastAsia="en-PK"/>
+          <w14:ligatures w14:val="none"/>
+        </w:rPr>
+        <w:t xml:space="preserve">} </w:t>
+      </w:r>
+      <w:r>
+        <w:rPr>
+          <w:rFonts w:ascii="Consolas" w:eastAsia="Times New Roman" w:hAnsi="Consolas" w:cs="Times New Roman"/>
+          <w:color w:val="C586C0"/>
+          <w:kern w:val="0"/>
+          <w:sz w:val="21"/>
+          <w:szCs w:val="21"/>
+          <w:lang w:eastAsia="en-PK"/>
+          <w14:ligatures w14:val="none"/>
+        </w:rPr>
+        <w:t>else</w:t>
+      </w:r>
+      <w:r>
+        <w:rPr>
+          <w:rFonts w:ascii="Consolas" w:eastAsia="Times New Roman" w:hAnsi="Consolas" w:cs="Times New Roman"/>
+          <w:color w:val="CCCCCC"/>
+          <w:kern w:val="0"/>
+          <w:sz w:val="21"/>
+          <w:szCs w:val="21"/>
+          <w:lang w:eastAsia="en-PK"/>
+          <w14:ligatures w14:val="none"/>
+        </w:rPr>
+        <w:t xml:space="preserve"> </w:t>
+      </w:r>
+      <w:r>
+        <w:rPr>
+          <w:rFonts w:ascii="Consolas" w:eastAsia="Times New Roman" w:hAnsi="Consolas" w:cs="Times New Roman"/>
+          <w:color w:val="C586C0"/>
+          <w:kern w:val="0"/>
+          <w:sz w:val="21"/>
+          <w:szCs w:val="21"/>
+          <w:lang w:eastAsia="en-PK"/>
+          <w14:ligatures w14:val="none"/>
+        </w:rPr>
+        <w:t>if</w:t>
+      </w:r>
+      <w:r>
+        <w:rPr>
+          <w:rFonts w:ascii="Consolas" w:eastAsia="Times New Roman" w:hAnsi="Consolas" w:cs="Times New Roman"/>
+          <w:color w:val="CCCCCC"/>
+          <w:kern w:val="0"/>
+          <w:sz w:val="21"/>
+          <w:szCs w:val="21"/>
+          <w:lang w:eastAsia="en-PK"/>
+          <w14:ligatures w14:val="none"/>
+        </w:rPr>
+        <w:t xml:space="preserve"> (</w:t>
+      </w:r>
+      <w:proofErr w:type="spellStart"/>
+      <w:r>
+        <w:rPr>
+          <w:rFonts w:ascii="Consolas" w:eastAsia="Times New Roman" w:hAnsi="Consolas" w:cs="Times New Roman"/>
+          <w:color w:val="9CDCFE"/>
+          <w:kern w:val="0"/>
+          <w:sz w:val="21"/>
+          <w:szCs w:val="21"/>
+          <w:lang w:eastAsia="en-PK"/>
+          <w14:ligatures w14:val="none"/>
+        </w:rPr>
+        <w:t>driver</w:t>
+      </w:r>
+      <w:r>
+        <w:rPr>
+          <w:rFonts w:ascii="Consolas" w:eastAsia="Times New Roman" w:hAnsi="Consolas" w:cs="Times New Roman"/>
+          <w:color w:val="CCCCCC"/>
+          <w:kern w:val="0"/>
+          <w:sz w:val="21"/>
+          <w:szCs w:val="21"/>
+          <w:lang w:eastAsia="en-PK"/>
+          <w14:ligatures w14:val="none"/>
+        </w:rPr>
+        <w:t>.</w:t>
+      </w:r>
+      <w:r>
+        <w:rPr>
+          <w:rFonts w:ascii="Consolas" w:eastAsia="Times New Roman" w:hAnsi="Consolas" w:cs="Times New Roman"/>
+          <w:color w:val="9CDCFE"/>
+          <w:kern w:val="0"/>
+          <w:sz w:val="21"/>
+          <w:szCs w:val="21"/>
+          <w:lang w:eastAsia="en-PK"/>
+          <w14:ligatures w14:val="none"/>
+        </w:rPr>
+        <w:t>status</w:t>
+      </w:r>
+      <w:proofErr w:type="spellEnd"/>
+      <w:r>
+        <w:rPr>
+          <w:rFonts w:ascii="Consolas" w:eastAsia="Times New Roman" w:hAnsi="Consolas" w:cs="Times New Roman"/>
+          <w:color w:val="CCCCCC"/>
+          <w:kern w:val="0"/>
+          <w:sz w:val="21"/>
+          <w:szCs w:val="21"/>
+          <w:lang w:eastAsia="en-PK"/>
+          <w14:ligatures w14:val="none"/>
+        </w:rPr>
+        <w:t xml:space="preserve"> </w:t>
+      </w:r>
+      <w:r>
+        <w:rPr>
+          <w:rFonts w:ascii="Consolas" w:eastAsia="Times New Roman" w:hAnsi="Consolas" w:cs="Times New Roman"/>
+          <w:color w:val="D4D4D4"/>
+          <w:kern w:val="0"/>
+          <w:sz w:val="21"/>
+          <w:szCs w:val="21"/>
+          <w:lang w:eastAsia="en-PK"/>
+          <w14:ligatures w14:val="none"/>
+        </w:rPr>
+        <w:t>===</w:t>
+      </w:r>
+      <w:r>
+        <w:rPr>
+          <w:rFonts w:ascii="Consolas" w:eastAsia="Times New Roman" w:hAnsi="Consolas" w:cs="Times New Roman"/>
+          <w:color w:val="CCCCCC"/>
+          <w:kern w:val="0"/>
+          <w:sz w:val="21"/>
+          <w:szCs w:val="21"/>
+          <w:lang w:eastAsia="en-PK"/>
+          <w14:ligatures w14:val="none"/>
+        </w:rPr>
+        <w:t xml:space="preserve"> </w:t>
+      </w:r>
+      <w:r>
+        <w:rPr>
+          <w:rFonts w:ascii="Consolas" w:eastAsia="Times New Roman" w:hAnsi="Consolas" w:cs="Times New Roman"/>
+          <w:color w:val="CE9178"/>
+          <w:kern w:val="0"/>
+          <w:sz w:val="21"/>
+          <w:szCs w:val="21"/>
+          <w:lang w:eastAsia="en-PK"/>
+          <w14:ligatures w14:val="none"/>
+        </w:rPr>
+        <w:t>'rejected'</w:t>
+      </w:r>
+      <w:r>
+        <w:rPr>
+          <w:rFonts w:ascii="Consolas" w:eastAsia="Times New Roman" w:hAnsi="Consolas" w:cs="Times New Roman"/>
+          <w:color w:val="CCCCCC"/>
+          <w:kern w:val="0"/>
+          <w:sz w:val="21"/>
+          <w:szCs w:val="21"/>
+          <w:lang w:eastAsia="en-PK"/>
+          <w14:ligatures w14:val="none"/>
+        </w:rPr>
+        <w:t>) {</w:t>
+      </w:r>
+    </w:p>
+    <w:p>
+      <w:pPr>
+        <w:pStyle w:val="ListParagraph"/>
+        <w:numPr>
+          <w:ilvl w:val="0"/>
+          <w:numId w:val="18"/>
+        </w:numPr>
+        <w:shd w:val="clear" w:color="auto" w:fill="1F1F1F"/>
+        <w:spacing w:after="0" w:line="300" w:lineRule="atLeast"/>
+        <w:rPr>
+          <w:rFonts w:ascii="Consolas" w:eastAsia="Times New Roman" w:hAnsi="Consolas" w:cs="Times New Roman"/>
+          <w:color w:val="CCCCCC"/>
+          <w:kern w:val="0"/>
+          <w:sz w:val="21"/>
+          <w:szCs w:val="21"/>
+          <w:lang w:eastAsia="en-PK"/>
+          <w14:ligatures w14:val="none"/>
+        </w:rPr>
+      </w:pPr>
+      <w:r>
+        <w:rPr>
+          <w:rFonts w:ascii="Consolas" w:eastAsia="Times New Roman" w:hAnsi="Consolas" w:cs="Times New Roman"/>
+          <w:color w:val="CCCCCC"/>
+          <w:kern w:val="0"/>
+          <w:sz w:val="21"/>
+          <w:szCs w:val="21"/>
+          <w:lang w:eastAsia="en-PK"/>
+          <w14:ligatures w14:val="none"/>
+        </w:rPr>
         <w:t xml:space="preserve">  </w:t>
       </w:r>
       <w:r>
@@ -3668,7 +3651,7 @@
           <w:lang w:eastAsia="en-PK"/>
           <w14:ligatures w14:val="none"/>
         </w:rPr>
-        <w:t>// Disable button, show countdown timer</w:t>
+        <w:t>// Grey out, disable button permanently for this order</w:t>
       </w:r>
     </w:p>
     <w:p>
@@ -3700,11 +3683,9 @@
           <w:lang w:eastAsia="en-PK"/>
           <w14:ligatures w14:val="none"/>
         </w:rPr>
-        <w:lastRenderedPageBreak/>
         <w:t xml:space="preserve">  </w:t>
       </w:r>
       <w:proofErr w:type="spellStart"/>
-      <w:proofErr w:type="gramStart"/>
       <w:r>
         <w:rPr>
           <w:rFonts w:ascii="Consolas" w:eastAsia="Times New Roman" w:hAnsi="Consolas" w:cs="Times New Roman"/>
@@ -3742,7 +3723,6 @@
         <w:t>disabled</w:t>
       </w:r>
       <w:proofErr w:type="spellEnd"/>
-      <w:proofErr w:type="gramEnd"/>
       <w:r>
         <w:rPr>
           <w:rFonts w:ascii="Consolas" w:eastAsia="Times New Roman" w:hAnsi="Consolas" w:cs="Times New Roman"/>
@@ -3779,7 +3759,6 @@
         </w:rPr>
         <w:t xml:space="preserve"> </w:t>
       </w:r>
-      <w:proofErr w:type="gramStart"/>
       <w:r>
         <w:rPr>
           <w:rFonts w:ascii="Consolas" w:eastAsia="Times New Roman" w:hAnsi="Consolas" w:cs="Times New Roman"/>
@@ -3804,7 +3783,6 @@
         </w:rPr>
         <w:t>;</w:t>
       </w:r>
-      <w:proofErr w:type="gramEnd"/>
     </w:p>
     <w:p>
       <w:pPr>
@@ -3835,6 +3813,136 @@
           <w:lang w:eastAsia="en-PK"/>
           <w14:ligatures w14:val="none"/>
         </w:rPr>
+        <w:t xml:space="preserve">  </w:t>
+      </w:r>
+      <w:proofErr w:type="spellStart"/>
+      <w:r>
+        <w:rPr>
+          <w:rFonts w:ascii="Consolas" w:eastAsia="Times New Roman" w:hAnsi="Consolas" w:cs="Times New Roman"/>
+          <w:color w:val="9CDCFE"/>
+          <w:kern w:val="0"/>
+          <w:sz w:val="21"/>
+          <w:szCs w:val="21"/>
+          <w:lang w:eastAsia="en-PK"/>
+          <w14:ligatures w14:val="none"/>
+        </w:rPr>
+        <w:t>button</w:t>
+      </w:r>
+      <w:r>
+        <w:rPr>
+          <w:rFonts w:ascii="Consolas" w:eastAsia="Times New Roman" w:hAnsi="Consolas" w:cs="Times New Roman"/>
+          <w:color w:val="CCCCCC"/>
+          <w:kern w:val="0"/>
+          <w:sz w:val="21"/>
+          <w:szCs w:val="21"/>
+          <w:lang w:eastAsia="en-PK"/>
+          <w14:ligatures w14:val="none"/>
+        </w:rPr>
+        <w:t>.</w:t>
+      </w:r>
+      <w:r>
+        <w:rPr>
+          <w:rFonts w:ascii="Consolas" w:eastAsia="Times New Roman" w:hAnsi="Consolas" w:cs="Times New Roman"/>
+          <w:color w:val="9CDCFE"/>
+          <w:kern w:val="0"/>
+          <w:sz w:val="21"/>
+          <w:szCs w:val="21"/>
+          <w:lang w:eastAsia="en-PK"/>
+          <w14:ligatures w14:val="none"/>
+        </w:rPr>
+        <w:t>classList</w:t>
+      </w:r>
+      <w:r>
+        <w:rPr>
+          <w:rFonts w:ascii="Consolas" w:eastAsia="Times New Roman" w:hAnsi="Consolas" w:cs="Times New Roman"/>
+          <w:color w:val="CCCCCC"/>
+          <w:kern w:val="0"/>
+          <w:sz w:val="21"/>
+          <w:szCs w:val="21"/>
+          <w:lang w:eastAsia="en-PK"/>
+          <w14:ligatures w14:val="none"/>
+        </w:rPr>
+        <w:t>.</w:t>
+      </w:r>
+      <w:r>
+        <w:rPr>
+          <w:rFonts w:ascii="Consolas" w:eastAsia="Times New Roman" w:hAnsi="Consolas" w:cs="Times New Roman"/>
+          <w:color w:val="DCDCAA"/>
+          <w:kern w:val="0"/>
+          <w:sz w:val="21"/>
+          <w:szCs w:val="21"/>
+          <w:lang w:eastAsia="en-PK"/>
+          <w14:ligatures w14:val="none"/>
+        </w:rPr>
+        <w:t>add</w:t>
+      </w:r>
+      <w:proofErr w:type="spellEnd"/>
+      <w:r>
+        <w:rPr>
+          <w:rFonts w:ascii="Consolas" w:eastAsia="Times New Roman" w:hAnsi="Consolas" w:cs="Times New Roman"/>
+          <w:color w:val="CCCCCC"/>
+          <w:kern w:val="0"/>
+          <w:sz w:val="21"/>
+          <w:szCs w:val="21"/>
+          <w:lang w:eastAsia="en-PK"/>
+          <w14:ligatures w14:val="none"/>
+        </w:rPr>
+        <w:t>(</w:t>
+      </w:r>
+      <w:r>
+        <w:rPr>
+          <w:rFonts w:ascii="Consolas" w:eastAsia="Times New Roman" w:hAnsi="Consolas" w:cs="Times New Roman"/>
+          <w:color w:val="CE9178"/>
+          <w:kern w:val="0"/>
+          <w:sz w:val="21"/>
+          <w:szCs w:val="21"/>
+          <w:lang w:eastAsia="en-PK"/>
+          <w14:ligatures w14:val="none"/>
+        </w:rPr>
+        <w:t>'rejected'</w:t>
+      </w:r>
+      <w:r>
+        <w:rPr>
+          <w:rFonts w:ascii="Consolas" w:eastAsia="Times New Roman" w:hAnsi="Consolas" w:cs="Times New Roman"/>
+          <w:color w:val="CCCCCC"/>
+          <w:kern w:val="0"/>
+          <w:sz w:val="21"/>
+          <w:szCs w:val="21"/>
+          <w:lang w:eastAsia="en-PK"/>
+          <w14:ligatures w14:val="none"/>
+        </w:rPr>
+        <w:t>);</w:t>
+      </w:r>
+    </w:p>
+    <w:p>
+      <w:pPr>
+        <w:pStyle w:val="ListParagraph"/>
+        <w:numPr>
+          <w:ilvl w:val="0"/>
+          <w:numId w:val="18"/>
+        </w:numPr>
+        <w:shd w:val="clear" w:color="auto" w:fill="1F1F1F"/>
+        <w:spacing w:after="0" w:line="300" w:lineRule="atLeast"/>
+        <w:rPr>
+          <w:rFonts w:ascii="Consolas" w:eastAsia="Times New Roman" w:hAnsi="Consolas" w:cs="Times New Roman"/>
+          <w:color w:val="CCCCCC"/>
+          <w:kern w:val="0"/>
+          <w:sz w:val="21"/>
+          <w:szCs w:val="21"/>
+          <w:lang w:eastAsia="en-PK"/>
+          <w14:ligatures w14:val="none"/>
+        </w:rPr>
+      </w:pPr>
+      <w:r>
+        <w:rPr>
+          <w:rFonts w:ascii="Consolas" w:eastAsia="Times New Roman" w:hAnsi="Consolas" w:cs="Times New Roman"/>
+          <w:color w:val="CCCCCC"/>
+          <w:kern w:val="0"/>
+          <w:sz w:val="21"/>
+          <w:szCs w:val="21"/>
+          <w:lang w:eastAsia="en-PK"/>
+          <w14:ligatures w14:val="none"/>
+        </w:rPr>
         <w:t xml:space="preserve">} </w:t>
       </w:r>
       <w:r>
@@ -3859,21 +3967,18 @@
           <w:lang w:eastAsia="en-PK"/>
           <w14:ligatures w14:val="none"/>
         </w:rPr>
-        <w:t xml:space="preserve"> </w:t>
-      </w:r>
-      <w:r>
-        <w:rPr>
-          <w:rFonts w:ascii="Consolas" w:eastAsia="Times New Roman" w:hAnsi="Consolas" w:cs="Times New Roman"/>
-          <w:color w:val="C586C0"/>
-          <w:kern w:val="0"/>
-          <w:sz w:val="21"/>
-          <w:szCs w:val="21"/>
-          <w:lang w:eastAsia="en-PK"/>
-          <w14:ligatures w14:val="none"/>
-        </w:rPr>
-        <w:t>if</w:t>
-      </w:r>
-      <w:r>
+        <w:t xml:space="preserve"> {</w:t>
+      </w:r>
+    </w:p>
+    <w:p>
+      <w:pPr>
+        <w:pStyle w:val="ListParagraph"/>
+        <w:numPr>
+          <w:ilvl w:val="0"/>
+          <w:numId w:val="18"/>
+        </w:numPr>
+        <w:shd w:val="clear" w:color="auto" w:fill="1F1F1F"/>
+        <w:spacing w:after="0" w:line="300" w:lineRule="atLeast"/>
         <w:rPr>
           <w:rFonts w:ascii="Consolas" w:eastAsia="Times New Roman" w:hAnsi="Consolas" w:cs="Times New Roman"/>
           <w:color w:val="CCCCCC"/>
@@ -3883,10 +3988,64 @@
           <w:lang w:eastAsia="en-PK"/>
           <w14:ligatures w14:val="none"/>
         </w:rPr>
-        <w:t xml:space="preserve"> (</w:t>
-      </w:r>
-      <w:proofErr w:type="spellStart"/>
-      <w:proofErr w:type="gramStart"/>
+      </w:pPr>
+      <w:r>
+        <w:rPr>
+          <w:rFonts w:ascii="Consolas" w:eastAsia="Times New Roman" w:hAnsi="Consolas" w:cs="Times New Roman"/>
+          <w:color w:val="CCCCCC"/>
+          <w:kern w:val="0"/>
+          <w:sz w:val="21"/>
+          <w:szCs w:val="21"/>
+          <w:lang w:eastAsia="en-PK"/>
+          <w14:ligatures w14:val="none"/>
+        </w:rPr>
+        <w:t xml:space="preserve">  </w:t>
+      </w:r>
+      <w:r>
+        <w:rPr>
+          <w:rFonts w:ascii="Consolas" w:eastAsia="Times New Roman" w:hAnsi="Consolas" w:cs="Times New Roman"/>
+          <w:color w:val="6A9955"/>
+          <w:kern w:val="0"/>
+          <w:sz w:val="21"/>
+          <w:szCs w:val="21"/>
+          <w:lang w:eastAsia="en-PK"/>
+          <w14:ligatures w14:val="none"/>
+        </w:rPr>
+        <w:t>// status === 'available' or timer expired</w:t>
+      </w:r>
+    </w:p>
+    <w:p>
+      <w:pPr>
+        <w:pStyle w:val="ListParagraph"/>
+        <w:numPr>
+          <w:ilvl w:val="0"/>
+          <w:numId w:val="18"/>
+        </w:numPr>
+        <w:shd w:val="clear" w:color="auto" w:fill="1F1F1F"/>
+        <w:spacing w:after="0" w:line="300" w:lineRule="atLeast"/>
+        <w:rPr>
+          <w:rFonts w:ascii="Consolas" w:eastAsia="Times New Roman" w:hAnsi="Consolas" w:cs="Times New Roman"/>
+          <w:color w:val="CCCCCC"/>
+          <w:kern w:val="0"/>
+          <w:sz w:val="21"/>
+          <w:szCs w:val="21"/>
+          <w:lang w:eastAsia="en-PK"/>
+          <w14:ligatures w14:val="none"/>
+        </w:rPr>
+      </w:pPr>
+      <w:r>
+        <w:rPr>
+          <w:rFonts w:ascii="Consolas" w:eastAsia="Times New Roman" w:hAnsi="Consolas" w:cs="Times New Roman"/>
+          <w:color w:val="CCCCCC"/>
+          <w:kern w:val="0"/>
+          <w:sz w:val="21"/>
+          <w:szCs w:val="21"/>
+          <w:lang w:eastAsia="en-PK"/>
+          <w14:ligatures w14:val="none"/>
+        </w:rPr>
+        <w:t xml:space="preserve">  </w:t>
+      </w:r>
+      <w:proofErr w:type="spellStart"/>
       <w:r>
         <w:rPr>
           <w:rFonts w:ascii="Consolas" w:eastAsia="Times New Roman" w:hAnsi="Consolas" w:cs="Times New Roman"/>
@@ -3897,7 +4056,7 @@
           <w:lang w:eastAsia="en-PK"/>
           <w14:ligatures w14:val="none"/>
         </w:rPr>
-        <w:t>driver</w:t>
+        <w:t>button</w:t>
       </w:r>
       <w:r>
         <w:rPr>
@@ -3921,10 +4080,9 @@
           <w:lang w:eastAsia="en-PK"/>
           <w14:ligatures w14:val="none"/>
         </w:rPr>
-        <w:t>status</w:t>
-      </w:r>
-      <w:proofErr w:type="spellEnd"/>
-      <w:proofErr w:type="gramEnd"/>
+        <w:t>disabled</w:t>
+      </w:r>
+      <w:proofErr w:type="spellEnd"/>
       <w:r>
         <w:rPr>
           <w:rFonts w:ascii="Consolas" w:eastAsia="Times New Roman" w:hAnsi="Consolas" w:cs="Times New Roman"/>
@@ -3947,7 +4105,7 @@
           <w:lang w:eastAsia="en-PK"/>
           <w14:ligatures w14:val="none"/>
         </w:rPr>
-        <w:t>===</w:t>
+        <w:t>=</w:t>
       </w:r>
       <w:r>
         <w:rPr>
@@ -3964,14 +4122,14 @@
       <w:r>
         <w:rPr>
           <w:rFonts w:ascii="Consolas" w:eastAsia="Times New Roman" w:hAnsi="Consolas" w:cs="Times New Roman"/>
-          <w:color w:val="CE9178"/>
+          <w:color w:val="569CD6"/>
           <w:kern w:val="0"/>
           <w:sz w:val="21"/>
           <w:szCs w:val="21"/>
           <w:lang w:eastAsia="en-PK"/>
           <w14:ligatures w14:val="none"/>
         </w:rPr>
-        <w:t>'rejected'</w:t>
+        <w:t>false</w:t>
       </w:r>
       <w:r>
         <w:rPr>
@@ -3983,7 +4141,7 @@
           <w:lang w:eastAsia="en-PK"/>
           <w14:ligatures w14:val="none"/>
         </w:rPr>
-        <w:t>) {</w:t>
+        <w:t>;</w:t>
       </w:r>
     </w:p>
     <w:p>
@@ -4015,551 +4173,30 @@
           <w:lang w:eastAsia="en-PK"/>
           <w14:ligatures w14:val="none"/>
         </w:rPr>
-        <w:t xml:space="preserve">  </w:t>
-      </w:r>
-      <w:r>
-        <w:rPr>
-          <w:rFonts w:ascii="Consolas" w:eastAsia="Times New Roman" w:hAnsi="Consolas" w:cs="Times New Roman"/>
-          <w:color w:val="6A9955"/>
-          <w:kern w:val="0"/>
-          <w:sz w:val="21"/>
-          <w:szCs w:val="21"/>
-          <w:lang w:eastAsia="en-PK"/>
-          <w14:ligatures w14:val="none"/>
-        </w:rPr>
-        <w:t>// Grey out, disable button permanently for this order</w:t>
-      </w:r>
-    </w:p>
-    <w:p>
-      <w:pPr>
-        <w:pStyle w:val="ListParagraph"/>
+        <w:t>}</w:t>
+      </w:r>
+    </w:p>
+    <w:p>
+      <w:pPr>
+        <w:numPr>
+          <w:ilvl w:val="1"/>
+          <w:numId w:val="18"/>
+        </w:numPr>
+      </w:pPr>
+    </w:p>
+    <w:p>
+      <w:pPr>
         <w:numPr>
           <w:ilvl w:val="0"/>
           <w:numId w:val="18"/>
         </w:numPr>
-        <w:shd w:val="clear" w:color="auto" w:fill="1F1F1F"/>
-        <w:spacing w:after="0" w:line="300" w:lineRule="atLeast"/>
-        <w:rPr>
-          <w:rFonts w:ascii="Consolas" w:eastAsia="Times New Roman" w:hAnsi="Consolas" w:cs="Times New Roman"/>
-          <w:color w:val="CCCCCC"/>
-          <w:kern w:val="0"/>
-          <w:sz w:val="21"/>
-          <w:szCs w:val="21"/>
-          <w:lang w:eastAsia="en-PK"/>
-          <w14:ligatures w14:val="none"/>
-        </w:rPr>
-      </w:pPr>
-      <w:r>
-        <w:rPr>
-          <w:rFonts w:ascii="Consolas" w:eastAsia="Times New Roman" w:hAnsi="Consolas" w:cs="Times New Roman"/>
-          <w:color w:val="CCCCCC"/>
-          <w:kern w:val="0"/>
-          <w:sz w:val="21"/>
-          <w:szCs w:val="21"/>
-          <w:lang w:eastAsia="en-PK"/>
-          <w14:ligatures w14:val="none"/>
-        </w:rPr>
-        <w:t xml:space="preserve">  </w:t>
-      </w:r>
-      <w:proofErr w:type="spellStart"/>
-      <w:proofErr w:type="gramStart"/>
-      <w:r>
-        <w:rPr>
-          <w:rFonts w:ascii="Consolas" w:eastAsia="Times New Roman" w:hAnsi="Consolas" w:cs="Times New Roman"/>
-          <w:color w:val="9CDCFE"/>
-          <w:kern w:val="0"/>
-          <w:sz w:val="21"/>
-          <w:szCs w:val="21"/>
-          <w:lang w:eastAsia="en-PK"/>
-          <w14:ligatures w14:val="none"/>
-        </w:rPr>
-        <w:t>button</w:t>
-      </w:r>
-      <w:r>
-        <w:rPr>
-          <w:rFonts w:ascii="Consolas" w:eastAsia="Times New Roman" w:hAnsi="Consolas" w:cs="Times New Roman"/>
-          <w:color w:val="CCCCCC"/>
-          <w:kern w:val="0"/>
-          <w:sz w:val="21"/>
-          <w:szCs w:val="21"/>
-          <w:lang w:eastAsia="en-PK"/>
-          <w14:ligatures w14:val="none"/>
-        </w:rPr>
-        <w:t>.</w:t>
-      </w:r>
-      <w:r>
-        <w:rPr>
-          <w:rFonts w:ascii="Consolas" w:eastAsia="Times New Roman" w:hAnsi="Consolas" w:cs="Times New Roman"/>
-          <w:color w:val="9CDCFE"/>
-          <w:kern w:val="0"/>
-          <w:sz w:val="21"/>
-          <w:szCs w:val="21"/>
-          <w:lang w:eastAsia="en-PK"/>
-          <w14:ligatures w14:val="none"/>
-        </w:rPr>
-        <w:t>disabled</w:t>
-      </w:r>
-      <w:proofErr w:type="spellEnd"/>
-      <w:proofErr w:type="gramEnd"/>
-      <w:r>
-        <w:rPr>
-          <w:rFonts w:ascii="Consolas" w:eastAsia="Times New Roman" w:hAnsi="Consolas" w:cs="Times New Roman"/>
-          <w:color w:val="CCCCCC"/>
-          <w:kern w:val="0"/>
-          <w:sz w:val="21"/>
-          <w:szCs w:val="21"/>
-          <w:lang w:eastAsia="en-PK"/>
-          <w14:ligatures w14:val="none"/>
-        </w:rPr>
-        <w:t xml:space="preserve"> </w:t>
-      </w:r>
-      <w:r>
-        <w:rPr>
-          <w:rFonts w:ascii="Consolas" w:eastAsia="Times New Roman" w:hAnsi="Consolas" w:cs="Times New Roman"/>
-          <w:color w:val="D4D4D4"/>
-          <w:kern w:val="0"/>
-          <w:sz w:val="21"/>
-          <w:szCs w:val="21"/>
-          <w:lang w:eastAsia="en-PK"/>
-          <w14:ligatures w14:val="none"/>
-        </w:rPr>
-        <w:t>=</w:t>
-      </w:r>
-      <w:r>
-        <w:rPr>
-          <w:rFonts w:ascii="Consolas" w:eastAsia="Times New Roman" w:hAnsi="Consolas" w:cs="Times New Roman"/>
-          <w:color w:val="CCCCCC"/>
-          <w:kern w:val="0"/>
-          <w:sz w:val="21"/>
-          <w:szCs w:val="21"/>
-          <w:lang w:eastAsia="en-PK"/>
-          <w14:ligatures w14:val="none"/>
-        </w:rPr>
-        <w:t xml:space="preserve"> </w:t>
-      </w:r>
-      <w:proofErr w:type="gramStart"/>
-      <w:r>
-        <w:rPr>
-          <w:rFonts w:ascii="Consolas" w:eastAsia="Times New Roman" w:hAnsi="Consolas" w:cs="Times New Roman"/>
-          <w:color w:val="569CD6"/>
-          <w:kern w:val="0"/>
-          <w:sz w:val="21"/>
-          <w:szCs w:val="21"/>
-          <w:lang w:eastAsia="en-PK"/>
-          <w14:ligatures w14:val="none"/>
-        </w:rPr>
-        <w:t>true</w:t>
-      </w:r>
-      <w:r>
-        <w:rPr>
-          <w:rFonts w:ascii="Consolas" w:eastAsia="Times New Roman" w:hAnsi="Consolas" w:cs="Times New Roman"/>
-          <w:color w:val="CCCCCC"/>
-          <w:kern w:val="0"/>
-          <w:sz w:val="21"/>
-          <w:szCs w:val="21"/>
-          <w:lang w:eastAsia="en-PK"/>
-          <w14:ligatures w14:val="none"/>
-        </w:rPr>
-        <w:t>;</w:t>
-      </w:r>
-      <w:proofErr w:type="gramEnd"/>
-    </w:p>
-    <w:p>
-      <w:pPr>
-        <w:pStyle w:val="ListParagraph"/>
-        <w:numPr>
-          <w:ilvl w:val="0"/>
-          <w:numId w:val="18"/>
-        </w:numPr>
-        <w:shd w:val="clear" w:color="auto" w:fill="1F1F1F"/>
-        <w:spacing w:after="0" w:line="300" w:lineRule="atLeast"/>
-        <w:rPr>
-          <w:rFonts w:ascii="Consolas" w:eastAsia="Times New Roman" w:hAnsi="Consolas" w:cs="Times New Roman"/>
-          <w:color w:val="CCCCCC"/>
-          <w:kern w:val="0"/>
-          <w:sz w:val="21"/>
-          <w:szCs w:val="21"/>
-          <w:lang w:eastAsia="en-PK"/>
-          <w14:ligatures w14:val="none"/>
-        </w:rPr>
-      </w:pPr>
-      <w:r>
-        <w:rPr>
-          <w:rFonts w:ascii="Consolas" w:eastAsia="Times New Roman" w:hAnsi="Consolas" w:cs="Times New Roman"/>
-          <w:color w:val="CCCCCC"/>
-          <w:kern w:val="0"/>
-          <w:sz w:val="21"/>
-          <w:szCs w:val="21"/>
-          <w:lang w:eastAsia="en-PK"/>
-          <w14:ligatures w14:val="none"/>
-        </w:rPr>
-        <w:t xml:space="preserve">  </w:t>
-      </w:r>
-      <w:proofErr w:type="spellStart"/>
-      <w:r>
-        <w:rPr>
-          <w:rFonts w:ascii="Consolas" w:eastAsia="Times New Roman" w:hAnsi="Consolas" w:cs="Times New Roman"/>
-          <w:color w:val="9CDCFE"/>
-          <w:kern w:val="0"/>
-          <w:sz w:val="21"/>
-          <w:szCs w:val="21"/>
-          <w:lang w:eastAsia="en-PK"/>
-          <w14:ligatures w14:val="none"/>
-        </w:rPr>
-        <w:t>button</w:t>
-      </w:r>
-      <w:r>
-        <w:rPr>
-          <w:rFonts w:ascii="Consolas" w:eastAsia="Times New Roman" w:hAnsi="Consolas" w:cs="Times New Roman"/>
-          <w:color w:val="CCCCCC"/>
-          <w:kern w:val="0"/>
-          <w:sz w:val="21"/>
-          <w:szCs w:val="21"/>
-          <w:lang w:eastAsia="en-PK"/>
-          <w14:ligatures w14:val="none"/>
-        </w:rPr>
-        <w:t>.</w:t>
-      </w:r>
-      <w:r>
-        <w:rPr>
-          <w:rFonts w:ascii="Consolas" w:eastAsia="Times New Roman" w:hAnsi="Consolas" w:cs="Times New Roman"/>
-          <w:color w:val="9CDCFE"/>
-          <w:kern w:val="0"/>
-          <w:sz w:val="21"/>
-          <w:szCs w:val="21"/>
-          <w:lang w:eastAsia="en-PK"/>
-          <w14:ligatures w14:val="none"/>
-        </w:rPr>
-        <w:t>classList</w:t>
-      </w:r>
-      <w:r>
-        <w:rPr>
-          <w:rFonts w:ascii="Consolas" w:eastAsia="Times New Roman" w:hAnsi="Consolas" w:cs="Times New Roman"/>
-          <w:color w:val="CCCCCC"/>
-          <w:kern w:val="0"/>
-          <w:sz w:val="21"/>
-          <w:szCs w:val="21"/>
-          <w:lang w:eastAsia="en-PK"/>
-          <w14:ligatures w14:val="none"/>
-        </w:rPr>
-        <w:t>.</w:t>
-      </w:r>
-      <w:r>
-        <w:rPr>
-          <w:rFonts w:ascii="Consolas" w:eastAsia="Times New Roman" w:hAnsi="Consolas" w:cs="Times New Roman"/>
-          <w:color w:val="DCDCAA"/>
-          <w:kern w:val="0"/>
-          <w:sz w:val="21"/>
-          <w:szCs w:val="21"/>
-          <w:lang w:eastAsia="en-PK"/>
-          <w14:ligatures w14:val="none"/>
-        </w:rPr>
-        <w:t>add</w:t>
-      </w:r>
-      <w:proofErr w:type="spellEnd"/>
-      <w:r>
-        <w:rPr>
-          <w:rFonts w:ascii="Consolas" w:eastAsia="Times New Roman" w:hAnsi="Consolas" w:cs="Times New Roman"/>
-          <w:color w:val="CCCCCC"/>
-          <w:kern w:val="0"/>
-          <w:sz w:val="21"/>
-          <w:szCs w:val="21"/>
-          <w:lang w:eastAsia="en-PK"/>
-          <w14:ligatures w14:val="none"/>
-        </w:rPr>
-        <w:t>(</w:t>
-      </w:r>
-      <w:r>
-        <w:rPr>
-          <w:rFonts w:ascii="Consolas" w:eastAsia="Times New Roman" w:hAnsi="Consolas" w:cs="Times New Roman"/>
-          <w:color w:val="CE9178"/>
-          <w:kern w:val="0"/>
-          <w:sz w:val="21"/>
-          <w:szCs w:val="21"/>
-          <w:lang w:eastAsia="en-PK"/>
-          <w14:ligatures w14:val="none"/>
-        </w:rPr>
-        <w:t>'rejected'</w:t>
-      </w:r>
-      <w:proofErr w:type="gramStart"/>
-      <w:r>
-        <w:rPr>
-          <w:rFonts w:ascii="Consolas" w:eastAsia="Times New Roman" w:hAnsi="Consolas" w:cs="Times New Roman"/>
-          <w:color w:val="CCCCCC"/>
-          <w:kern w:val="0"/>
-          <w:sz w:val="21"/>
-          <w:szCs w:val="21"/>
-          <w:lang w:eastAsia="en-PK"/>
-          <w14:ligatures w14:val="none"/>
-        </w:rPr>
-        <w:t>);</w:t>
-      </w:r>
-      <w:proofErr w:type="gramEnd"/>
-    </w:p>
-    <w:p>
-      <w:pPr>
-        <w:pStyle w:val="ListParagraph"/>
-        <w:numPr>
-          <w:ilvl w:val="0"/>
-          <w:numId w:val="18"/>
-        </w:numPr>
-        <w:shd w:val="clear" w:color="auto" w:fill="1F1F1F"/>
-        <w:spacing w:after="0" w:line="300" w:lineRule="atLeast"/>
-        <w:rPr>
-          <w:rFonts w:ascii="Consolas" w:eastAsia="Times New Roman" w:hAnsi="Consolas" w:cs="Times New Roman"/>
-          <w:color w:val="CCCCCC"/>
-          <w:kern w:val="0"/>
-          <w:sz w:val="21"/>
-          <w:szCs w:val="21"/>
-          <w:lang w:eastAsia="en-PK"/>
-          <w14:ligatures w14:val="none"/>
-        </w:rPr>
-      </w:pPr>
-      <w:r>
-        <w:rPr>
-          <w:rFonts w:ascii="Consolas" w:eastAsia="Times New Roman" w:hAnsi="Consolas" w:cs="Times New Roman"/>
-          <w:color w:val="CCCCCC"/>
-          <w:kern w:val="0"/>
-          <w:sz w:val="21"/>
-          <w:szCs w:val="21"/>
-          <w:lang w:eastAsia="en-PK"/>
-          <w14:ligatures w14:val="none"/>
-        </w:rPr>
-        <w:t xml:space="preserve">} </w:t>
-      </w:r>
-      <w:r>
-        <w:rPr>
-          <w:rFonts w:ascii="Consolas" w:eastAsia="Times New Roman" w:hAnsi="Consolas" w:cs="Times New Roman"/>
-          <w:color w:val="C586C0"/>
-          <w:kern w:val="0"/>
-          <w:sz w:val="21"/>
-          <w:szCs w:val="21"/>
-          <w:lang w:eastAsia="en-PK"/>
-          <w14:ligatures w14:val="none"/>
-        </w:rPr>
-        <w:t>else</w:t>
-      </w:r>
-      <w:r>
-        <w:rPr>
-          <w:rFonts w:ascii="Consolas" w:eastAsia="Times New Roman" w:hAnsi="Consolas" w:cs="Times New Roman"/>
-          <w:color w:val="CCCCCC"/>
-          <w:kern w:val="0"/>
-          <w:sz w:val="21"/>
-          <w:szCs w:val="21"/>
-          <w:lang w:eastAsia="en-PK"/>
-          <w14:ligatures w14:val="none"/>
-        </w:rPr>
-        <w:t xml:space="preserve"> {</w:t>
-      </w:r>
-    </w:p>
-    <w:p>
-      <w:pPr>
-        <w:pStyle w:val="ListParagraph"/>
-        <w:numPr>
-          <w:ilvl w:val="0"/>
-          <w:numId w:val="18"/>
-        </w:numPr>
-        <w:shd w:val="clear" w:color="auto" w:fill="1F1F1F"/>
-        <w:spacing w:after="0" w:line="300" w:lineRule="atLeast"/>
-        <w:rPr>
-          <w:rFonts w:ascii="Consolas" w:eastAsia="Times New Roman" w:hAnsi="Consolas" w:cs="Times New Roman"/>
-          <w:color w:val="CCCCCC"/>
-          <w:kern w:val="0"/>
-          <w:sz w:val="21"/>
-          <w:szCs w:val="21"/>
-          <w:lang w:eastAsia="en-PK"/>
-          <w14:ligatures w14:val="none"/>
-        </w:rPr>
-      </w:pPr>
-      <w:r>
-        <w:rPr>
-          <w:rFonts w:ascii="Consolas" w:eastAsia="Times New Roman" w:hAnsi="Consolas" w:cs="Times New Roman"/>
-          <w:color w:val="CCCCCC"/>
-          <w:kern w:val="0"/>
-          <w:sz w:val="21"/>
-          <w:szCs w:val="21"/>
-          <w:lang w:eastAsia="en-PK"/>
-          <w14:ligatures w14:val="none"/>
-        </w:rPr>
-        <w:t xml:space="preserve">  </w:t>
-      </w:r>
-      <w:r>
-        <w:rPr>
-          <w:rFonts w:ascii="Consolas" w:eastAsia="Times New Roman" w:hAnsi="Consolas" w:cs="Times New Roman"/>
-          <w:color w:val="6A9955"/>
-          <w:kern w:val="0"/>
-          <w:sz w:val="21"/>
-          <w:szCs w:val="21"/>
-          <w:lang w:eastAsia="en-PK"/>
-          <w14:ligatures w14:val="none"/>
-        </w:rPr>
-        <w:t>// status === 'available' or timer expired</w:t>
-      </w:r>
-    </w:p>
-    <w:p>
-      <w:pPr>
-        <w:pStyle w:val="ListParagraph"/>
-        <w:numPr>
-          <w:ilvl w:val="0"/>
-          <w:numId w:val="18"/>
-        </w:numPr>
-        <w:shd w:val="clear" w:color="auto" w:fill="1F1F1F"/>
-        <w:spacing w:after="0" w:line="300" w:lineRule="atLeast"/>
-        <w:rPr>
-          <w:rFonts w:ascii="Consolas" w:eastAsia="Times New Roman" w:hAnsi="Consolas" w:cs="Times New Roman"/>
-          <w:color w:val="CCCCCC"/>
-          <w:kern w:val="0"/>
-          <w:sz w:val="21"/>
-          <w:szCs w:val="21"/>
-          <w:lang w:eastAsia="en-PK"/>
-          <w14:ligatures w14:val="none"/>
-        </w:rPr>
-      </w:pPr>
-      <w:r>
-        <w:rPr>
-          <w:rFonts w:ascii="Consolas" w:eastAsia="Times New Roman" w:hAnsi="Consolas" w:cs="Times New Roman"/>
-          <w:color w:val="CCCCCC"/>
-          <w:kern w:val="0"/>
-          <w:sz w:val="21"/>
-          <w:szCs w:val="21"/>
-          <w:lang w:eastAsia="en-PK"/>
-          <w14:ligatures w14:val="none"/>
-        </w:rPr>
-        <w:t xml:space="preserve">  </w:t>
-      </w:r>
-      <w:proofErr w:type="spellStart"/>
-      <w:proofErr w:type="gramStart"/>
-      <w:r>
-        <w:rPr>
-          <w:rFonts w:ascii="Consolas" w:eastAsia="Times New Roman" w:hAnsi="Consolas" w:cs="Times New Roman"/>
-          <w:color w:val="9CDCFE"/>
-          <w:kern w:val="0"/>
-          <w:sz w:val="21"/>
-          <w:szCs w:val="21"/>
-          <w:lang w:eastAsia="en-PK"/>
-          <w14:ligatures w14:val="none"/>
-        </w:rPr>
-        <w:t>button</w:t>
-      </w:r>
-      <w:r>
-        <w:rPr>
-          <w:rFonts w:ascii="Consolas" w:eastAsia="Times New Roman" w:hAnsi="Consolas" w:cs="Times New Roman"/>
-          <w:color w:val="CCCCCC"/>
-          <w:kern w:val="0"/>
-          <w:sz w:val="21"/>
-          <w:szCs w:val="21"/>
-          <w:lang w:eastAsia="en-PK"/>
-          <w14:ligatures w14:val="none"/>
-        </w:rPr>
-        <w:t>.</w:t>
-      </w:r>
-      <w:r>
-        <w:rPr>
-          <w:rFonts w:ascii="Consolas" w:eastAsia="Times New Roman" w:hAnsi="Consolas" w:cs="Times New Roman"/>
-          <w:color w:val="9CDCFE"/>
-          <w:kern w:val="0"/>
-          <w:sz w:val="21"/>
-          <w:szCs w:val="21"/>
-          <w:lang w:eastAsia="en-PK"/>
-          <w14:ligatures w14:val="none"/>
-        </w:rPr>
-        <w:t>disabled</w:t>
-      </w:r>
-      <w:proofErr w:type="spellEnd"/>
-      <w:proofErr w:type="gramEnd"/>
-      <w:r>
-        <w:rPr>
-          <w:rFonts w:ascii="Consolas" w:eastAsia="Times New Roman" w:hAnsi="Consolas" w:cs="Times New Roman"/>
-          <w:color w:val="CCCCCC"/>
-          <w:kern w:val="0"/>
-          <w:sz w:val="21"/>
-          <w:szCs w:val="21"/>
-          <w:lang w:eastAsia="en-PK"/>
-          <w14:ligatures w14:val="none"/>
-        </w:rPr>
-        <w:t xml:space="preserve"> </w:t>
-      </w:r>
-      <w:r>
-        <w:rPr>
-          <w:rFonts w:ascii="Consolas" w:eastAsia="Times New Roman" w:hAnsi="Consolas" w:cs="Times New Roman"/>
-          <w:color w:val="D4D4D4"/>
-          <w:kern w:val="0"/>
-          <w:sz w:val="21"/>
-          <w:szCs w:val="21"/>
-          <w:lang w:eastAsia="en-PK"/>
-          <w14:ligatures w14:val="none"/>
-        </w:rPr>
-        <w:t>=</w:t>
-      </w:r>
-      <w:r>
-        <w:rPr>
-          <w:rFonts w:ascii="Consolas" w:eastAsia="Times New Roman" w:hAnsi="Consolas" w:cs="Times New Roman"/>
-          <w:color w:val="CCCCCC"/>
-          <w:kern w:val="0"/>
-          <w:sz w:val="21"/>
-          <w:szCs w:val="21"/>
-          <w:lang w:eastAsia="en-PK"/>
-          <w14:ligatures w14:val="none"/>
-        </w:rPr>
-        <w:t xml:space="preserve"> </w:t>
-      </w:r>
-      <w:proofErr w:type="gramStart"/>
-      <w:r>
-        <w:rPr>
-          <w:rFonts w:ascii="Consolas" w:eastAsia="Times New Roman" w:hAnsi="Consolas" w:cs="Times New Roman"/>
-          <w:color w:val="569CD6"/>
-          <w:kern w:val="0"/>
-          <w:sz w:val="21"/>
-          <w:szCs w:val="21"/>
-          <w:lang w:eastAsia="en-PK"/>
-          <w14:ligatures w14:val="none"/>
-        </w:rPr>
-        <w:t>false</w:t>
-      </w:r>
-      <w:r>
-        <w:rPr>
-          <w:rFonts w:ascii="Consolas" w:eastAsia="Times New Roman" w:hAnsi="Consolas" w:cs="Times New Roman"/>
-          <w:color w:val="CCCCCC"/>
-          <w:kern w:val="0"/>
-          <w:sz w:val="21"/>
-          <w:szCs w:val="21"/>
-          <w:lang w:eastAsia="en-PK"/>
-          <w14:ligatures w14:val="none"/>
-        </w:rPr>
-        <w:t>;</w:t>
-      </w:r>
-      <w:proofErr w:type="gramEnd"/>
-    </w:p>
-    <w:p>
-      <w:pPr>
-        <w:pStyle w:val="ListParagraph"/>
-        <w:numPr>
-          <w:ilvl w:val="0"/>
-          <w:numId w:val="18"/>
-        </w:numPr>
-        <w:shd w:val="clear" w:color="auto" w:fill="1F1F1F"/>
-        <w:spacing w:after="0" w:line="300" w:lineRule="atLeast"/>
-        <w:rPr>
-          <w:rFonts w:ascii="Consolas" w:eastAsia="Times New Roman" w:hAnsi="Consolas" w:cs="Times New Roman"/>
-          <w:color w:val="CCCCCC"/>
-          <w:kern w:val="0"/>
-          <w:sz w:val="21"/>
-          <w:szCs w:val="21"/>
-          <w:lang w:eastAsia="en-PK"/>
-          <w14:ligatures w14:val="none"/>
-        </w:rPr>
-      </w:pPr>
-      <w:r>
-        <w:rPr>
-          <w:rFonts w:ascii="Consolas" w:eastAsia="Times New Roman" w:hAnsi="Consolas" w:cs="Times New Roman"/>
-          <w:color w:val="CCCCCC"/>
-          <w:kern w:val="0"/>
-          <w:sz w:val="21"/>
-          <w:szCs w:val="21"/>
-          <w:lang w:eastAsia="en-PK"/>
-          <w14:ligatures w14:val="none"/>
-        </w:rPr>
-        <w:t>}</w:t>
+      </w:pPr>
+      <w:r>
+        <w:rPr>
+          <w:b/>
+          <w:bCs/>
+        </w:rPr>
+        <w:t>When supplier clicks "Assign":</w:t>
       </w:r>
     </w:p>
     <w:p>
@@ -4569,20 +4206,16 @@
           <w:numId w:val="18"/>
         </w:numPr>
       </w:pPr>
-    </w:p>
-    <w:p>
-      <w:pPr>
-        <w:numPr>
-          <w:ilvl w:val="0"/>
-          <w:numId w:val="18"/>
-        </w:numPr>
-      </w:pPr>
-      <w:r>
-        <w:rPr>
-          <w:b/>
-          <w:bCs/>
-        </w:rPr>
-        <w:t>When supplier clicks "Assign":</w:t>
+      <w:r>
+        <w:t>Frontend just calls </w:t>
+      </w:r>
+      <w:proofErr w:type="spellStart"/>
+      <w:r>
+        <w:t>assign_driver_to_order</w:t>
+      </w:r>
+      <w:proofErr w:type="spellEnd"/>
+      <w:r>
+        <w:t>()</w:t>
       </w:r>
     </w:p>
     <w:p>
@@ -4593,33 +4226,6 @@
         </w:numPr>
       </w:pPr>
       <w:r>
-        <w:t>Frontend just calls </w:t>
-      </w:r>
-      <w:proofErr w:type="spellStart"/>
-      <w:r>
-        <w:t>assign_driver_to_</w:t>
-      </w:r>
-      <w:proofErr w:type="gramStart"/>
-      <w:r>
-        <w:t>order</w:t>
-      </w:r>
-      <w:proofErr w:type="spellEnd"/>
-      <w:r>
-        <w:t>(</w:t>
-      </w:r>
-      <w:proofErr w:type="gramEnd"/>
-      <w:r>
-        <w:t>)</w:t>
-      </w:r>
-    </w:p>
-    <w:p>
-      <w:pPr>
-        <w:numPr>
-          <w:ilvl w:val="1"/>
-          <w:numId w:val="18"/>
-        </w:numPr>
-      </w:pPr>
-      <w:r>
         <w:t>If they somehow bypass frontend checks, backend validates:</w:t>
       </w:r>
     </w:p>
@@ -4650,15 +4256,7 @@
         </w:numPr>
       </w:pPr>
       <w:r>
-        <w:t xml:space="preserve">Deletes </w:t>
-      </w:r>
-      <w:proofErr w:type="gramStart"/>
-      <w:r>
-        <w:t>old expired</w:t>
-      </w:r>
-      <w:proofErr w:type="gramEnd"/>
-      <w:r>
-        <w:t xml:space="preserve"> assignment</w:t>
+        <w:t>Deletes old expired assignment</w:t>
       </w:r>
     </w:p>
     <w:p>
@@ -4699,19 +4297,11 @@
       </w:r>
       <w:proofErr w:type="spellStart"/>
       <w:r>
-        <w:t>confirm_order_</w:t>
-      </w:r>
-      <w:proofErr w:type="gramStart"/>
-      <w:r>
-        <w:t>driver</w:t>
-      </w:r>
-      <w:proofErr w:type="spellEnd"/>
-      <w:r>
-        <w:t>(</w:t>
-      </w:r>
-      <w:proofErr w:type="gramEnd"/>
-      <w:r>
-        <w:t>) - checks driver's timer</w:t>
+        <w:t>confirm_order_driver</w:t>
+      </w:r>
+      <w:proofErr w:type="spellEnd"/>
+      <w:r>
+        <w:t>() - checks driver's timer</w:t>
       </w:r>
     </w:p>
     <w:p>
@@ -4732,19 +4322,11 @@
       </w:r>
       <w:proofErr w:type="spellStart"/>
       <w:r>
-        <w:t>assign_driver_to_</w:t>
-      </w:r>
-      <w:proofErr w:type="gramStart"/>
-      <w:r>
-        <w:t>order</w:t>
-      </w:r>
-      <w:proofErr w:type="spellEnd"/>
-      <w:r>
-        <w:t>(</w:t>
-      </w:r>
-      <w:proofErr w:type="gramEnd"/>
-      <w:r>
-        <w:t>) - checks rejection status</w:t>
+        <w:t>assign_driver_to_order</w:t>
+      </w:r>
+      <w:proofErr w:type="spellEnd"/>
+      <w:r>
+        <w:t>() - checks rejection status</w:t>
       </w:r>
     </w:p>
     <w:p>
@@ -5028,17 +4610,12 @@
       </w:r>
       <w:proofErr w:type="spellStart"/>
       <w:r>
-        <w:t>notify_driver_assignment_</w:t>
-      </w:r>
-      <w:proofErr w:type="gramStart"/>
-      <w:r>
-        <w:t>updated</w:t>
+        <w:t>notify_driver_assignment_updated</w:t>
       </w:r>
       <w:proofErr w:type="spellEnd"/>
       <w:r>
         <w:t>();</w:t>
       </w:r>
-      <w:proofErr w:type="gramEnd"/>
     </w:p>
     <w:p/>
     <w:p>
@@ -5068,12 +4645,10 @@
     </w:p>
     <w:p>
       <w:proofErr w:type="spellStart"/>
-      <w:proofErr w:type="gramStart"/>
       <w:r>
         <w:t>client.on</w:t>
       </w:r>
       <w:proofErr w:type="spellEnd"/>
-      <w:proofErr w:type="gramEnd"/>
       <w:r>
         <w:t>('notification', (msg) =&gt; {</w:t>
       </w:r>
@@ -5083,12 +4658,10 @@
         <w:t>  if (</w:t>
       </w:r>
       <w:proofErr w:type="spellStart"/>
-      <w:proofErr w:type="gramStart"/>
       <w:r>
         <w:t>msg.channel</w:t>
       </w:r>
       <w:proofErr w:type="spellEnd"/>
-      <w:proofErr w:type="gramEnd"/>
       <w:r>
         <w:t xml:space="preserve"> === '</w:t>
       </w:r>
@@ -5106,12 +4679,10 @@
         <w:t xml:space="preserve">    </w:t>
       </w:r>
       <w:proofErr w:type="spellStart"/>
-      <w:proofErr w:type="gramStart"/>
       <w:r>
         <w:t>io.emit</w:t>
       </w:r>
       <w:proofErr w:type="spellEnd"/>
-      <w:proofErr w:type="gramEnd"/>
       <w:r>
         <w:t>('</w:t>
       </w:r>
@@ -5121,29 +4692,16 @@
       </w:r>
       <w:proofErr w:type="spellEnd"/>
       <w:r>
-        <w:t xml:space="preserve">', </w:t>
-      </w:r>
-      <w:proofErr w:type="gramStart"/>
-      <w:r>
-        <w:t xml:space="preserve">{ </w:t>
-      </w:r>
-      <w:proofErr w:type="spellStart"/>
-      <w:r>
-        <w:t>order</w:t>
-      </w:r>
-      <w:proofErr w:type="gramEnd"/>
-      <w:r>
-        <w:t>_id</w:t>
-      </w:r>
-      <w:proofErr w:type="spellEnd"/>
-      <w:r>
-        <w:t xml:space="preserve">: </w:t>
-      </w:r>
-      <w:proofErr w:type="gramStart"/>
-      <w:r>
-        <w:t>... });</w:t>
-      </w:r>
-      <w:proofErr w:type="gramEnd"/>
+        <w:t xml:space="preserve">', { </w:t>
+      </w:r>
+      <w:proofErr w:type="spellStart"/>
+      <w:r>
+        <w:t>order_id</w:t>
+      </w:r>
+      <w:proofErr w:type="spellEnd"/>
+      <w:r>
+        <w:t>: ... });</w:t>
+      </w:r>
     </w:p>
     <w:p>
       <w:r>
@@ -5152,13 +4710,8 @@
     </w:p>
     <w:p>
       <w:r>
-        <w:t>}</w:t>
-      </w:r>
-      <w:proofErr w:type="gramStart"/>
-      <w:r>
-        <w:t>);</w:t>
-      </w:r>
-      <w:proofErr w:type="gramEnd"/>
+        <w:t>});</w:t>
+      </w:r>
     </w:p>
     <w:p>
       <w:pPr>
@@ -5276,15 +4829,7 @@
     </w:p>
     <w:p>
       <w:r>
-        <w:t xml:space="preserve">Now only the delivery process and the ride finish </w:t>
-      </w:r>
-      <w:proofErr w:type="gramStart"/>
-      <w:r>
-        <w:t>has</w:t>
-      </w:r>
-      <w:proofErr w:type="gramEnd"/>
-      <w:r>
-        <w:t xml:space="preserve"> to be taken care of as well as order history</w:t>
+        <w:t>Now only the delivery process and the ride finish has to be taken care of as well as order history</w:t>
       </w:r>
     </w:p>
     <w:p>
@@ -5327,64 +4872,32 @@
     <w:p/>
     <w:p>
       <w:r>
-        <w:t xml:space="preserve">Now rating is added but for cancellation we </w:t>
-      </w:r>
-      <w:proofErr w:type="gramStart"/>
-      <w:r>
-        <w:t>have to</w:t>
-      </w:r>
-      <w:proofErr w:type="gramEnd"/>
-      <w:r>
-        <w:t xml:space="preserve"> take care of rating too if driver or supplier cancels it rating falls by 0</w:t>
+        <w:t>Now rating is added but for cancellation we have to take care of rating too if driver or supplier cancels it rating falls by 0</w:t>
       </w:r>
       <w:r>
         <w:t xml:space="preserve">.2 for supplier side rating drop will happen if the status was accepted or </w:t>
       </w:r>
       <w:proofErr w:type="spellStart"/>
       <w:r>
-        <w:t>ride_</w:t>
-      </w:r>
-      <w:proofErr w:type="gramStart"/>
-      <w:r>
-        <w:t>started</w:t>
-      </w:r>
-      <w:proofErr w:type="spellEnd"/>
-      <w:r>
-        <w:t xml:space="preserve">  same</w:t>
-      </w:r>
-      <w:proofErr w:type="gramEnd"/>
-      <w:r>
-        <w:t xml:space="preserve"> for </w:t>
-      </w:r>
-      <w:proofErr w:type="gramStart"/>
-      <w:r>
-        <w:t>driver .</w:t>
-      </w:r>
-      <w:proofErr w:type="gramEnd"/>
-      <w:r>
-        <w:t xml:space="preserve"> if customer does it at the accepted or </w:t>
-      </w:r>
-      <w:proofErr w:type="spellStart"/>
-      <w:r>
         <w:t>ride_started</w:t>
       </w:r>
       <w:proofErr w:type="spellEnd"/>
       <w:r>
+        <w:t xml:space="preserve">  same for driver . if customer does it at the accepted or </w:t>
+      </w:r>
+      <w:proofErr w:type="spellStart"/>
+      <w:r>
+        <w:t>ride_started</w:t>
+      </w:r>
+      <w:proofErr w:type="spellEnd"/>
+      <w:r>
         <w:t xml:space="preserve"> stage then no rating will be updated but reason will be logged in rating table if customer or supplier does it at any stage before accepted then no problem</w:t>
       </w:r>
     </w:p>
     <w:p/>
     <w:p>
       <w:r>
-        <w:t xml:space="preserve">Ok first, if any party </w:t>
-      </w:r>
-      <w:proofErr w:type="gramStart"/>
-      <w:r>
-        <w:t>cancelled  on</w:t>
-      </w:r>
-      <w:proofErr w:type="gramEnd"/>
-      <w:r>
-        <w:t xml:space="preserve"> status that was not accepted or ride started then </w:t>
+        <w:t xml:space="preserve">Ok first, if any party cancelled  on status that was not accepted or ride started then </w:t>
       </w:r>
       <w:proofErr w:type="spellStart"/>
       <w:r>
@@ -5410,15 +4923,7 @@
     </w:p>
     <w:p>
       <w:r>
-        <w:t xml:space="preserve">If rider or </w:t>
-      </w:r>
-      <w:proofErr w:type="gramStart"/>
-      <w:r>
-        <w:t>supplier</w:t>
-      </w:r>
-      <w:proofErr w:type="gramEnd"/>
-      <w:r>
-        <w:t xml:space="preserve"> does it, log the reason into ratings table, rating of supplier affected</w:t>
+        <w:t>If rider or supplier does it, log the reason into ratings table, rating of supplier affected</w:t>
       </w:r>
     </w:p>
     <w:p/>
@@ -5474,6 +4979,47 @@
         <w:t xml:space="preserve"> set up.</w:t>
       </w:r>
     </w:p>
+    <w:p>
+      <w:r>
+        <w:lastRenderedPageBreak/>
+        <w:t>17/03/2026:</w:t>
+      </w:r>
+    </w:p>
+    <w:p>
+      <w:r>
+        <w:t>Big Break.</w:t>
+      </w:r>
+    </w:p>
+    <w:p>
+      <w:r>
+        <w:t>Hard reset on backend.</w:t>
+      </w:r>
+    </w:p>
+    <w:p>
+      <w:r>
+        <w:t>Now going step by step on feature implementation and code testing</w:t>
+      </w:r>
+    </w:p>
+    <w:p/>
+    <w:p/>
+    <w:p/>
+    <w:p>
+      <w:r>
+        <w:t>18/03/2026:</w:t>
+      </w:r>
+    </w:p>
+    <w:p>
+      <w:r>
+        <w:t>Startup feature implemented and tested on backend</w:t>
+      </w:r>
+    </w:p>
+    <w:p>
+      <w:r>
+        <w:t>Also noted that session pooler works for home networks as it supports ipv4 networks whereas direct connection only supports ipv6 networks.</w:t>
+      </w:r>
+    </w:p>
+    <w:p/>
+    <w:p/>
     <w:sectPr>
       <w:pgSz w:w="11906" w:h="16838"/>
       <w:pgMar w:top="1440" w:right="1440" w:bottom="1440" w:left="1440" w:header="708" w:footer="708" w:gutter="0"/>

</xml_diff>

<commit_message>
Multiple code and schema changes - Login, Registration and Authentication done
</commit_message>
<xml_diff>
--- a/documents/code logic.docx
+++ b/documents/code logic.docx
@@ -3,8 +3,13 @@
 <w:document xmlns:wpc="http://schemas.microsoft.com/office/word/2010/wordprocessingCanvas" xmlns:cx="http://schemas.microsoft.com/office/drawing/2014/chartex" xmlns:cx1="http://schemas.microsoft.com/office/drawing/2015/9/8/chartex" xmlns:cx2="http://schemas.microsoft.com/office/drawing/2015/10/21/chartex" xmlns:cx3="http://schemas.microsoft.com/office/drawing/2016/5/9/chartex" xmlns:cx4="http://schemas.microsoft.com/office/drawing/2016/5/10/chartex" xmlns:cx5="http://schemas.microsoft.com/office/drawing/2016/5/11/chartex" xmlns:cx6="http://schemas.microsoft.com/office/drawing/2016/5/12/chartex" xmlns:cx7="http://schemas.microsoft.com/office/drawing/2016/5/13/chartex" xmlns:cx8="http://schemas.microsoft.com/office/drawing/2016/5/14/chartex" xmlns:mc="http://schemas.openxmlformats.org/markup-compatibility/2006" xmlns:aink="http://schemas.microsoft.com/office/drawing/2016/ink" xmlns:am3d="http://schemas.microsoft.com/office/drawing/2017/model3d" xmlns:o="urn:schemas-microsoft-com:office:office" xmlns:oel="http://schemas.microsoft.com/office/2019/extlst" xmlns:r="http://schemas.openxmlformats.org/officeDocument/2006/relationships" xmlns:m="http://schemas.openxmlformats.org/officeDocument/2006/math" xmlns:v="urn:schemas-microsoft-com:vml" xmlns:wp14="http://schemas.microsoft.com/office/word/2010/wordprocessingDrawing" xmlns:wp="http://schemas.openxmlformats.org/drawingml/2006/wordprocessingDrawing" xmlns:w10="urn:schemas-microsoft-com:office:word" xmlns:w="http://schemas.openxmlformats.org/wordprocessingml/2006/main" xmlns:w14="http://schemas.microsoft.com/office/word/2010/wordml" xmlns:w15="http://schemas.microsoft.com/office/word/2012/wordml" xmlns:w16cex="http://schemas.microsoft.com/office/word/2018/wordml/cex" xmlns:w16cid="http://schemas.microsoft.com/office/word/2016/wordml/cid" xmlns:w16="http://schemas.microsoft.com/office/word/2018/wordml" xmlns:w16du="http://schemas.microsoft.com/office/word/2023/wordml/word16du" xmlns:w16sdtdh="http://schemas.microsoft.com/office/word/2020/wordml/sdtdatahash" xmlns:w16sdtfl="http://schemas.microsoft.com/office/word/2024/wordml/sdtformatlock" xmlns:w16se="http://schemas.microsoft.com/office/word/2015/wordml/symex" xmlns:wpg="http://schemas.microsoft.com/office/word/2010/wordprocessingGroup" xmlns:wpi="http://schemas.microsoft.com/office/word/2010/wordprocessingInk" xmlns:wne="http://schemas.microsoft.com/office/word/2006/wordml" xmlns:wps="http://schemas.microsoft.com/office/word/2010/wordprocessingShape" mc:Ignorable="w14 w15 w16se w16cid w16 w16cex w16sdtdh w16sdtfl w16du wp14">
   <w:body>
     <w:p>
-      <w:r>
-        <w:t xml:space="preserve">oh so the easy way is to check local token if that exists then redirect to orders page if </w:t>
+      <w:proofErr w:type="gramStart"/>
+      <w:r>
+        <w:t>oh</w:t>
+      </w:r>
+      <w:proofErr w:type="gramEnd"/>
+      <w:r>
+        <w:t xml:space="preserve"> so the easy way is to check local token if that exists then redirect to orders page if </w:t>
       </w:r>
       <w:proofErr w:type="spellStart"/>
       <w:r>
@@ -92,11 +97,27 @@
       </w:r>
       <w:proofErr w:type="spellEnd"/>
       <w:r>
-        <w:t xml:space="preserve"> user after reinstall) . not exists then firs time user redirect to name entering</w:t>
+        <w:t xml:space="preserve"> user after </w:t>
+      </w:r>
+      <w:proofErr w:type="gramStart"/>
+      <w:r>
+        <w:t>reinstall) .</w:t>
+      </w:r>
+      <w:proofErr w:type="gramEnd"/>
+      <w:r>
+        <w:t xml:space="preserve"> not exists then firs time user redirect to name entering</w:t>
       </w:r>
       <w:r>
         <w:br/>
-        <w:t xml:space="preserve">but now two things where does local token be stored ? in </w:t>
+        <w:t xml:space="preserve">but now two things where does local token be </w:t>
+      </w:r>
+      <w:proofErr w:type="gramStart"/>
+      <w:r>
+        <w:t>stored ?</w:t>
+      </w:r>
+      <w:proofErr w:type="gramEnd"/>
+      <w:r>
+        <w:t xml:space="preserve"> in </w:t>
       </w:r>
       <w:proofErr w:type="spellStart"/>
       <w:r>
@@ -128,7 +149,15 @@
       </w:r>
       <w:proofErr w:type="spellEnd"/>
       <w:r>
-        <w:t xml:space="preserve"> of user id ? because how will </w:t>
+        <w:t xml:space="preserve"> of user </w:t>
+      </w:r>
+      <w:proofErr w:type="gramStart"/>
+      <w:r>
+        <w:t>id ?</w:t>
+      </w:r>
+      <w:proofErr w:type="gramEnd"/>
+      <w:r>
+        <w:t xml:space="preserve"> because how will </w:t>
       </w:r>
       <w:proofErr w:type="spellStart"/>
       <w:r>
@@ -179,12 +208,25 @@
         <w:t xml:space="preserve">Just check local token existence in the </w:t>
       </w:r>
       <w:proofErr w:type="spellStart"/>
+      <w:proofErr w:type="gramStart"/>
       <w:r>
         <w:t>db</w:t>
       </w:r>
       <w:proofErr w:type="spellEnd"/>
       <w:r>
-        <w:t xml:space="preserve"> . if  it exists then redirect to orders</w:t>
+        <w:t xml:space="preserve"> .</w:t>
+      </w:r>
+      <w:proofErr w:type="gramEnd"/>
+      <w:r>
+        <w:t xml:space="preserve"> </w:t>
+      </w:r>
+      <w:proofErr w:type="gramStart"/>
+      <w:r>
+        <w:t>if  it</w:t>
+      </w:r>
+      <w:proofErr w:type="gramEnd"/>
+      <w:r>
+        <w:t xml:space="preserve"> exists then redirect to orders</w:t>
       </w:r>
     </w:p>
     <w:p>
@@ -281,8 +323,13 @@
       </w:r>
     </w:p>
     <w:p>
-      <w:r>
-        <w:t xml:space="preserve">Checks  if the entered number already exists in the users table if it does, then set the verified Boolean to false in the </w:t>
+      <w:proofErr w:type="gramStart"/>
+      <w:r>
+        <w:t>Checks  if</w:t>
+      </w:r>
+      <w:proofErr w:type="gramEnd"/>
+      <w:r>
+        <w:t xml:space="preserve"> the entered number already exists in the users table if it does, then set the verified Boolean to false in the </w:t>
       </w:r>
       <w:proofErr w:type="spellStart"/>
       <w:r>
@@ -290,13 +337,37 @@
       </w:r>
       <w:proofErr w:type="spellEnd"/>
       <w:r>
-        <w:t xml:space="preserve"> table : the user already exists but has to undergo verification of phone number again</w:t>
+        <w:t xml:space="preserve"> </w:t>
+      </w:r>
+      <w:proofErr w:type="gramStart"/>
+      <w:r>
+        <w:t>table :</w:t>
+      </w:r>
+      <w:proofErr w:type="gramEnd"/>
+      <w:r>
+        <w:t xml:space="preserve"> the user already exists but </w:t>
+      </w:r>
+      <w:proofErr w:type="gramStart"/>
+      <w:r>
+        <w:t>has to</w:t>
+      </w:r>
+      <w:proofErr w:type="gramEnd"/>
+      <w:r>
+        <w:t xml:space="preserve"> undergo verification of phone number again</w:t>
       </w:r>
     </w:p>
     <w:p>
       <w:r>
         <w:lastRenderedPageBreak/>
-        <w:t>Checks if the entered phone number exists in the pending users table, if it does then do nothing , if it doesn’t then insert the number (This will be done for existing users too that are getting back to the application as they are currently pending (unverified) users too</w:t>
+        <w:t xml:space="preserve">Checks if the entered phone number exists in the pending users table, if it does then do </w:t>
+      </w:r>
+      <w:proofErr w:type="gramStart"/>
+      <w:r>
+        <w:t>nothing ,</w:t>
+      </w:r>
+      <w:proofErr w:type="gramEnd"/>
+      <w:r>
+        <w:t xml:space="preserve"> if it doesn’t then insert the number (This will be done for existing users too that are getting back to the application as they are currently pending (unverified) users too</w:t>
       </w:r>
     </w:p>
     <w:p/>
@@ -323,7 +394,15 @@
       </w:r>
       <w:proofErr w:type="spellEnd"/>
       <w:r>
-        <w:t xml:space="preserve"> in the pending users table </w:t>
+        <w:t xml:space="preserve"> in the pending </w:t>
+      </w:r>
+      <w:proofErr w:type="gramStart"/>
+      <w:r>
+        <w:t>users</w:t>
+      </w:r>
+      <w:proofErr w:type="gramEnd"/>
+      <w:r>
+        <w:t xml:space="preserve"> table </w:t>
       </w:r>
     </w:p>
     <w:p>
@@ -376,13 +455,18 @@
     </w:p>
     <w:p>
       <w:r>
-        <w:t xml:space="preserve">Checks the entered  </w:t>
+        <w:t xml:space="preserve">Checks the </w:t>
+      </w:r>
+      <w:proofErr w:type="gramStart"/>
+      <w:r>
+        <w:t xml:space="preserve">entered  </w:t>
       </w:r>
       <w:proofErr w:type="spellStart"/>
       <w:r>
         <w:t>otp</w:t>
       </w:r>
       <w:proofErr w:type="spellEnd"/>
+      <w:proofErr w:type="gramEnd"/>
       <w:r>
         <w:t xml:space="preserve"> against the stored </w:t>
       </w:r>
@@ -402,7 +486,15 @@
     </w:p>
     <w:p>
       <w:r>
-        <w:t>If new user, inserts the info from pending users table to new users table</w:t>
+        <w:t xml:space="preserve">If new user, inserts the info from pending users table to new </w:t>
+      </w:r>
+      <w:proofErr w:type="gramStart"/>
+      <w:r>
+        <w:t>users</w:t>
+      </w:r>
+      <w:proofErr w:type="gramEnd"/>
+      <w:r>
+        <w:t xml:space="preserve"> table</w:t>
       </w:r>
     </w:p>
     <w:p>
@@ -425,7 +517,15 @@
     </w:p>
     <w:p>
       <w:r>
-        <w:t>If both session and role exists: Go to orders page</w:t>
+        <w:t xml:space="preserve">If both session and role </w:t>
+      </w:r>
+      <w:proofErr w:type="gramStart"/>
+      <w:r>
+        <w:t>exists</w:t>
+      </w:r>
+      <w:proofErr w:type="gramEnd"/>
+      <w:r>
+        <w:t>: Go to orders page</w:t>
       </w:r>
     </w:p>
     <w:p>
@@ -497,7 +597,15 @@
       </w:r>
       <w:proofErr w:type="spellEnd"/>
       <w:r>
-        <w:t xml:space="preserve"> table will be checked, if he doesn’t exist there therefore he hasn’t defined one single driver, implying he is a new registration.</w:t>
+        <w:t xml:space="preserve"> table will be checked, if he doesn’t exist there </w:t>
+      </w:r>
+      <w:proofErr w:type="gramStart"/>
+      <w:r>
+        <w:t>therefore</w:t>
+      </w:r>
+      <w:proofErr w:type="gramEnd"/>
+      <w:r>
+        <w:t xml:space="preserve"> he hasn’t defined one single driver, implying he is a new registration.</w:t>
       </w:r>
     </w:p>
     <w:p>
@@ -515,7 +623,23 @@
         <w:t xml:space="preserve">This will be checked by checking the </w:t>
       </w:r>
       <w:r>
-        <w:t xml:space="preserve">supplier drivers table again against the suppliers user id, and checking the </w:t>
+        <w:t xml:space="preserve">supplier drivers table again against the </w:t>
+      </w:r>
+      <w:proofErr w:type="gramStart"/>
+      <w:r>
+        <w:t>suppliers</w:t>
+      </w:r>
+      <w:proofErr w:type="gramEnd"/>
+      <w:r>
+        <w:t xml:space="preserve"> user </w:t>
+      </w:r>
+      <w:proofErr w:type="gramStart"/>
+      <w:r>
+        <w:t>id, and</w:t>
+      </w:r>
+      <w:proofErr w:type="gramEnd"/>
+      <w:r>
+        <w:t xml:space="preserve"> checking the </w:t>
       </w:r>
       <w:proofErr w:type="spellStart"/>
       <w:r>
@@ -547,7 +671,23 @@
     </w:p>
     <w:p>
       <w:r>
-        <w:t xml:space="preserve">When he comes back to the application, after verification, his session will be generated, upon entering his details it will be checked that if his role is already set to driver that implies he is an existing user therefore only set his id back into the supplier drivers table. </w:t>
+        <w:t xml:space="preserve">When he comes back to the application, after verification, his session will be generated, upon entering his details it will be checked that if his role is already set to driver that </w:t>
+      </w:r>
+      <w:proofErr w:type="gramStart"/>
+      <w:r>
+        <w:t>implies</w:t>
+      </w:r>
+      <w:proofErr w:type="gramEnd"/>
+      <w:r>
+        <w:t xml:space="preserve"> he is an existing user therefore only set his id back into the supplier </w:t>
+      </w:r>
+      <w:proofErr w:type="gramStart"/>
+      <w:r>
+        <w:t>drivers</w:t>
+      </w:r>
+      <w:proofErr w:type="gramEnd"/>
+      <w:r>
+        <w:t xml:space="preserve"> table. </w:t>
       </w:r>
     </w:p>
     <w:p/>
@@ -701,7 +841,15 @@
       </w:r>
       <w:proofErr w:type="spellEnd"/>
       <w:r>
-        <w:t xml:space="preserve"> against that supplier in the supplier drivers table</w:t>
+        <w:t xml:space="preserve"> against that supplier in the supplier </w:t>
+      </w:r>
+      <w:proofErr w:type="gramStart"/>
+      <w:r>
+        <w:t>drivers</w:t>
+      </w:r>
+      <w:proofErr w:type="gramEnd"/>
+      <w:r>
+        <w:t xml:space="preserve"> table</w:t>
       </w:r>
     </w:p>
     <w:p>
@@ -717,8 +865,13 @@
         <w:t xml:space="preserve">, even if one of the </w:t>
       </w:r>
       <w:proofErr w:type="spellStart"/>
-      <w:r>
-        <w:t>driver_id</w:t>
+      <w:proofErr w:type="gramStart"/>
+      <w:r>
+        <w:t>driver</w:t>
+      </w:r>
+      <w:proofErr w:type="gramEnd"/>
+      <w:r>
+        <w:t>_id</w:t>
       </w:r>
       <w:proofErr w:type="spellEnd"/>
       <w:r>
@@ -797,8 +950,13 @@
         <w:t>'</w:t>
       </w:r>
       <w:proofErr w:type="spellStart"/>
-      <w:r>
-        <w:t>orders_channel</w:t>
+      <w:proofErr w:type="gramStart"/>
+      <w:r>
+        <w:t>orders</w:t>
+      </w:r>
+      <w:proofErr w:type="gramEnd"/>
+      <w:r>
+        <w:t>_channel</w:t>
       </w:r>
       <w:proofErr w:type="spellEnd"/>
       <w:r>
@@ -1046,15 +1204,31 @@
           <w:b/>
           <w:bCs/>
         </w:rPr>
-        <w:t>view_available_orders</w:t>
-      </w:r>
-      <w:proofErr w:type="spellEnd"/>
-      <w:r>
-        <w:rPr>
-          <w:b/>
-          <w:bCs/>
-        </w:rPr>
-        <w:t>()</w:t>
+        <w:t>view_available_</w:t>
+      </w:r>
+      <w:proofErr w:type="gramStart"/>
+      <w:r>
+        <w:rPr>
+          <w:b/>
+          <w:bCs/>
+        </w:rPr>
+        <w:t>orders</w:t>
+      </w:r>
+      <w:proofErr w:type="spellEnd"/>
+      <w:r>
+        <w:rPr>
+          <w:b/>
+          <w:bCs/>
+        </w:rPr>
+        <w:t>(</w:t>
+      </w:r>
+      <w:proofErr w:type="gramEnd"/>
+      <w:r>
+        <w:rPr>
+          <w:b/>
+          <w:bCs/>
+        </w:rPr>
+        <w:t>)</w:t>
       </w:r>
     </w:p>
     <w:p>
@@ -1172,15 +1346,31 @@
           <w:b/>
           <w:bCs/>
         </w:rPr>
-        <w:t>view_available_orders</w:t>
-      </w:r>
-      <w:proofErr w:type="spellEnd"/>
-      <w:r>
-        <w:rPr>
-          <w:b/>
-          <w:bCs/>
-        </w:rPr>
-        <w:t>() is NOT called by the trigger</w:t>
+        <w:t>view_available_</w:t>
+      </w:r>
+      <w:proofErr w:type="gramStart"/>
+      <w:r>
+        <w:rPr>
+          <w:b/>
+          <w:bCs/>
+        </w:rPr>
+        <w:t>orders</w:t>
+      </w:r>
+      <w:proofErr w:type="spellEnd"/>
+      <w:r>
+        <w:rPr>
+          <w:b/>
+          <w:bCs/>
+        </w:rPr>
+        <w:t>(</w:t>
+      </w:r>
+      <w:proofErr w:type="gramEnd"/>
+      <w:r>
+        <w:rPr>
+          <w:b/>
+          <w:bCs/>
+        </w:rPr>
+        <w:t>) is NOT called by the trigger</w:t>
       </w:r>
     </w:p>
     <w:p>
@@ -1305,10 +1495,12 @@
     </w:p>
     <w:p>
       <w:proofErr w:type="spellStart"/>
+      <w:proofErr w:type="gramStart"/>
       <w:r>
         <w:t>client.on</w:t>
       </w:r>
       <w:proofErr w:type="spellEnd"/>
+      <w:proofErr w:type="gramEnd"/>
       <w:r>
         <w:t>('notification', (msg) =&gt; {</w:t>
       </w:r>
@@ -1318,10 +1510,12 @@
         <w:t>    if (</w:t>
       </w:r>
       <w:proofErr w:type="spellStart"/>
+      <w:proofErr w:type="gramStart"/>
       <w:r>
         <w:t>msg.channel</w:t>
       </w:r>
       <w:proofErr w:type="spellEnd"/>
+      <w:proofErr w:type="gramEnd"/>
       <w:r>
         <w:t xml:space="preserve"> === '</w:t>
       </w:r>
@@ -1344,21 +1538,36 @@
         <w:t xml:space="preserve">        const orders = await </w:t>
       </w:r>
       <w:proofErr w:type="spellStart"/>
+      <w:proofErr w:type="gramStart"/>
       <w:r>
         <w:t>db.query</w:t>
       </w:r>
       <w:proofErr w:type="spellEnd"/>
+      <w:proofErr w:type="gramEnd"/>
       <w:r>
         <w:t xml:space="preserve">('SELECT </w:t>
       </w:r>
       <w:proofErr w:type="spellStart"/>
       <w:r>
-        <w:t>view_available_orders</w:t>
-      </w:r>
-      <w:proofErr w:type="spellEnd"/>
-      <w:r>
-        <w:t>()');</w:t>
-      </w:r>
+        <w:t>view_available_</w:t>
+      </w:r>
+      <w:proofErr w:type="gramStart"/>
+      <w:r>
+        <w:t>orders</w:t>
+      </w:r>
+      <w:proofErr w:type="spellEnd"/>
+      <w:r>
+        <w:t>(</w:t>
+      </w:r>
+      <w:proofErr w:type="gramEnd"/>
+      <w:r>
+        <w:t>)'</w:t>
+      </w:r>
+      <w:proofErr w:type="gramStart"/>
+      <w:r>
+        <w:t>);</w:t>
+      </w:r>
+      <w:proofErr w:type="gramEnd"/>
     </w:p>
     <w:p>
       <w:r>
@@ -1375,10 +1584,12 @@
         <w:t xml:space="preserve">        </w:t>
       </w:r>
       <w:proofErr w:type="spellStart"/>
+      <w:proofErr w:type="gramStart"/>
       <w:r>
         <w:t>io.emit</w:t>
       </w:r>
       <w:proofErr w:type="spellEnd"/>
+      <w:proofErr w:type="gramEnd"/>
       <w:r>
         <w:t>('</w:t>
       </w:r>
@@ -1388,8 +1599,13 @@
       </w:r>
       <w:proofErr w:type="spellEnd"/>
       <w:r>
-        <w:t>', orders);</w:t>
-      </w:r>
+        <w:t>', orders</w:t>
+      </w:r>
+      <w:proofErr w:type="gramStart"/>
+      <w:r>
+        <w:t>);</w:t>
+      </w:r>
+      <w:proofErr w:type="gramEnd"/>
     </w:p>
     <w:p>
       <w:r>
@@ -1398,13 +1614,34 @@
     </w:p>
     <w:p>
       <w:r>
-        <w:t>});</w:t>
-      </w:r>
+        <w:t>}</w:t>
+      </w:r>
+      <w:proofErr w:type="gramStart"/>
+      <w:r>
+        <w:t>);</w:t>
+      </w:r>
+      <w:proofErr w:type="gramEnd"/>
     </w:p>
     <w:p/>
     <w:p>
       <w:r>
-        <w:t>Why not call directly the fn in trigger? Because trigger cant do anything with the data. It cant return the data back to backend</w:t>
+        <w:t xml:space="preserve">Why not call directly the fn in trigger? Because trigger </w:t>
+      </w:r>
+      <w:proofErr w:type="gramStart"/>
+      <w:r>
+        <w:t>cant</w:t>
+      </w:r>
+      <w:proofErr w:type="gramEnd"/>
+      <w:r>
+        <w:t xml:space="preserve"> do anything with the data. It </w:t>
+      </w:r>
+      <w:proofErr w:type="gramStart"/>
+      <w:r>
+        <w:t>cant</w:t>
+      </w:r>
+      <w:proofErr w:type="gramEnd"/>
+      <w:r>
+        <w:t xml:space="preserve"> return the data back to backend</w:t>
       </w:r>
     </w:p>
     <w:p>
@@ -1424,12 +1661,17 @@
         <w:t xml:space="preserve"> cost in my recommended fare calculation. we will only allow 7 </w:t>
       </w:r>
       <w:proofErr w:type="spellStart"/>
+      <w:proofErr w:type="gramStart"/>
       <w:r>
         <w:t>quantites</w:t>
       </w:r>
       <w:proofErr w:type="spellEnd"/>
       <w:r>
-        <w:t xml:space="preserve">  to be </w:t>
+        <w:t xml:space="preserve">  to</w:t>
+      </w:r>
+      <w:proofErr w:type="gramEnd"/>
+      <w:r>
+        <w:t xml:space="preserve"> be </w:t>
       </w:r>
       <w:proofErr w:type="spellStart"/>
       <w:r>
@@ -2651,7 +2893,15 @@
         <w:t>Every 5-10 seconds</w:t>
       </w:r>
       <w:r>
-        <w:t> - Good balance (not too much data)</w:t>
+        <w:t xml:space="preserve"> - </w:t>
+      </w:r>
+      <w:proofErr w:type="gramStart"/>
+      <w:r>
+        <w:t>Good</w:t>
+      </w:r>
+      <w:proofErr w:type="gramEnd"/>
+      <w:r>
+        <w:t xml:space="preserve"> balance (not too much data)</w:t>
       </w:r>
     </w:p>
     <w:p>
@@ -2737,7 +2987,15 @@
     </w:p>
     <w:p>
       <w:r>
-        <w:t xml:space="preserve">If yes then submit bid </w:t>
+        <w:t xml:space="preserve">If </w:t>
+      </w:r>
+      <w:proofErr w:type="gramStart"/>
+      <w:r>
+        <w:t>yes</w:t>
+      </w:r>
+      <w:proofErr w:type="gramEnd"/>
+      <w:r>
+        <w:t xml:space="preserve"> then submit bid </w:t>
       </w:r>
     </w:p>
     <w:p/>
@@ -2753,7 +3011,15 @@
     </w:p>
     <w:p>
       <w:r>
-        <w:t xml:space="preserve">If it is then update the supplier id, accepted price, </w:t>
+        <w:t xml:space="preserve">If it is then </w:t>
+      </w:r>
+      <w:proofErr w:type="gramStart"/>
+      <w:r>
+        <w:t>update</w:t>
+      </w:r>
+      <w:proofErr w:type="gramEnd"/>
+      <w:r>
+        <w:t xml:space="preserve"> the supplier id, accepted price, </w:t>
       </w:r>
       <w:proofErr w:type="spellStart"/>
       <w:r>
@@ -2761,7 +3027,15 @@
       </w:r>
       <w:proofErr w:type="spellEnd"/>
       <w:r>
-        <w:t xml:space="preserve"> at  and </w:t>
+        <w:t xml:space="preserve"> </w:t>
+      </w:r>
+      <w:proofErr w:type="gramStart"/>
+      <w:r>
+        <w:t>at  and</w:t>
+      </w:r>
+      <w:proofErr w:type="gramEnd"/>
+      <w:r>
+        <w:t xml:space="preserve"> </w:t>
       </w:r>
     </w:p>
     <w:p>
@@ -2772,13 +3046,29 @@
     <w:p/>
     <w:p>
       <w:r>
-        <w:t>As soon as this status update happens a trigger will be called for this order where all the bids for that order  will be deleted instantly</w:t>
+        <w:t xml:space="preserve">As soon as this status update happens a trigger will be called for this order where all the bids for that </w:t>
+      </w:r>
+      <w:proofErr w:type="gramStart"/>
+      <w:r>
+        <w:t>order  will</w:t>
+      </w:r>
+      <w:proofErr w:type="gramEnd"/>
+      <w:r>
+        <w:t xml:space="preserve"> be deleted instantly</w:t>
       </w:r>
     </w:p>
     <w:p/>
     <w:p>
       <w:r>
-        <w:t>For accepting bid, the customer id will be sent using the session id from backend (this has to be done for others too, for other human/computer interactions</w:t>
+        <w:t xml:space="preserve">For accepting bid, the customer id will be sent using the session id from backend (this </w:t>
+      </w:r>
+      <w:proofErr w:type="gramStart"/>
+      <w:r>
+        <w:t>has to</w:t>
+      </w:r>
+      <w:proofErr w:type="gramEnd"/>
+      <w:r>
+        <w:t xml:space="preserve"> be done for others too, for other human/computer interactions</w:t>
       </w:r>
     </w:p>
     <w:p/>
@@ -2794,13 +3084,42 @@
       </w:r>
     </w:p>
     <w:p>
-      <w:r>
-        <w:t>Have to remove  the order as soon as timer goes up.</w:t>
-      </w:r>
-    </w:p>
-    <w:p>
-      <w:r>
-        <w:t>From the orders  table and from drivers table</w:t>
+      <w:proofErr w:type="gramStart"/>
+      <w:r>
+        <w:t>Have to</w:t>
+      </w:r>
+      <w:proofErr w:type="gramEnd"/>
+      <w:r>
+        <w:t xml:space="preserve"> </w:t>
+      </w:r>
+      <w:proofErr w:type="gramStart"/>
+      <w:r>
+        <w:t>remove  the</w:t>
+      </w:r>
+      <w:proofErr w:type="gramEnd"/>
+      <w:r>
+        <w:t xml:space="preserve"> order as soon as timer goes up.</w:t>
+      </w:r>
+    </w:p>
+    <w:p>
+      <w:r>
+        <w:t xml:space="preserve">From the </w:t>
+      </w:r>
+      <w:proofErr w:type="gramStart"/>
+      <w:r>
+        <w:t>orders  table</w:t>
+      </w:r>
+      <w:proofErr w:type="gramEnd"/>
+      <w:r>
+        <w:t xml:space="preserve"> and from </w:t>
+      </w:r>
+      <w:proofErr w:type="gramStart"/>
+      <w:r>
+        <w:t>drivers</w:t>
+      </w:r>
+      <w:proofErr w:type="gramEnd"/>
+      <w:r>
+        <w:t xml:space="preserve"> table</w:t>
       </w:r>
     </w:p>
     <w:p/>
@@ -2846,7 +3165,15 @@
     <w:p/>
     <w:p>
       <w:r>
-        <w:t>REMINDER: session id has to be checked in backend logic as it was not catered here</w:t>
+        <w:t xml:space="preserve">REMINDER: session id </w:t>
+      </w:r>
+      <w:proofErr w:type="gramStart"/>
+      <w:r>
+        <w:t>has to</w:t>
+      </w:r>
+      <w:proofErr w:type="gramEnd"/>
+      <w:r>
+        <w:t xml:space="preserve"> be checked in backend logic as it was not catered here</w:t>
       </w:r>
     </w:p>
     <w:p/>
@@ -2881,7 +3208,15 @@
     </w:p>
     <w:p>
       <w:r>
-        <w:t>If assignment already existed but rejected field is false then delete that row and reassign and vice versa</w:t>
+        <w:t xml:space="preserve">If assignment already existed but rejected field is </w:t>
+      </w:r>
+      <w:proofErr w:type="gramStart"/>
+      <w:r>
+        <w:t>false</w:t>
+      </w:r>
+      <w:proofErr w:type="gramEnd"/>
+      <w:r>
+        <w:t xml:space="preserve"> then delete that row and reassign and vice versa</w:t>
       </w:r>
     </w:p>
     <w:p>
@@ -2939,13 +3274,18 @@
       </w:r>
       <w:proofErr w:type="spellStart"/>
       <w:r>
-        <w:t>get_available_drivers_for_supplier</w:t>
+        <w:t>get_available_drivers_for_</w:t>
+      </w:r>
+      <w:proofErr w:type="gramStart"/>
+      <w:r>
+        <w:t>supplier</w:t>
       </w:r>
       <w:proofErr w:type="spellEnd"/>
       <w:r>
         <w:t>(</w:t>
       </w:r>
       <w:proofErr w:type="spellStart"/>
+      <w:proofErr w:type="gramEnd"/>
       <w:r>
         <w:t>supplier_id</w:t>
       </w:r>
@@ -3037,6 +3377,7 @@
         <w:t xml:space="preserve"> (</w:t>
       </w:r>
       <w:proofErr w:type="spellStart"/>
+      <w:proofErr w:type="gramStart"/>
       <w:r>
         <w:rPr>
           <w:rFonts w:ascii="Consolas" w:eastAsia="Times New Roman" w:hAnsi="Consolas" w:cs="Times New Roman"/>
@@ -3074,6 +3415,7 @@
         <w:t>status</w:t>
       </w:r>
       <w:proofErr w:type="spellEnd"/>
+      <w:proofErr w:type="gramEnd"/>
       <w:r>
         <w:rPr>
           <w:rFonts w:ascii="Consolas" w:eastAsia="Times New Roman" w:hAnsi="Consolas" w:cs="Times New Roman"/>
@@ -3182,6 +3524,7 @@
         </w:rPr>
         <w:t xml:space="preserve"> </w:t>
       </w:r>
+      <w:proofErr w:type="gramStart"/>
       <w:r>
         <w:rPr>
           <w:rFonts w:ascii="Consolas" w:eastAsia="Times New Roman" w:hAnsi="Consolas" w:cs="Times New Roman"/>
@@ -3204,7 +3547,20 @@
           <w:lang w:eastAsia="en-PK"/>
           <w14:ligatures w14:val="none"/>
         </w:rPr>
-        <w:t xml:space="preserve">() &lt; new </w:t>
+        <w:t>(</w:t>
+      </w:r>
+      <w:proofErr w:type="gramEnd"/>
+      <w:r>
+        <w:rPr>
+          <w:rFonts w:ascii="Consolas" w:eastAsia="Times New Roman" w:hAnsi="Consolas" w:cs="Times New Roman"/>
+          <w:color w:val="CCCCCC"/>
+          <w:kern w:val="0"/>
+          <w:sz w:val="21"/>
+          <w:szCs w:val="21"/>
+          <w:lang w:eastAsia="en-PK"/>
+          <w14:ligatures w14:val="none"/>
+        </w:rPr>
+        <w:t xml:space="preserve">) &lt; new </w:t>
       </w:r>
       <w:r>
         <w:rPr>
@@ -3231,6 +3587,7 @@
         <w:t>(</w:t>
       </w:r>
       <w:proofErr w:type="spellStart"/>
+      <w:proofErr w:type="gramStart"/>
       <w:r>
         <w:rPr>
           <w:rFonts w:ascii="Consolas" w:eastAsia="Times New Roman" w:hAnsi="Consolas" w:cs="Times New Roman"/>
@@ -3241,9 +3598,9 @@
           <w:lang w:eastAsia="en-PK"/>
           <w14:ligatures w14:val="none"/>
         </w:rPr>
-        <w:t>driver.time_limit</w:t>
-      </w:r>
-      <w:proofErr w:type="spellEnd"/>
+        <w:t>driver.time</w:t>
+      </w:r>
+      <w:proofErr w:type="gramEnd"/>
       <w:r>
         <w:rPr>
           <w:rFonts w:ascii="Consolas" w:eastAsia="Times New Roman" w:hAnsi="Consolas" w:cs="Times New Roman"/>
@@ -3254,18 +3611,10 @@
           <w:lang w:eastAsia="en-PK"/>
           <w14:ligatures w14:val="none"/>
         </w:rPr>
-        <w:t>)) {</w:t>
-      </w:r>
-    </w:p>
-    <w:p>
-      <w:pPr>
-        <w:pStyle w:val="ListParagraph"/>
-        <w:numPr>
-          <w:ilvl w:val="0"/>
-          <w:numId w:val="18"/>
-        </w:numPr>
-        <w:shd w:val="clear" w:color="auto" w:fill="1F1F1F"/>
-        <w:spacing w:after="0" w:line="300" w:lineRule="atLeast"/>
+        <w:t>_limit</w:t>
+      </w:r>
+      <w:proofErr w:type="spellEnd"/>
+      <w:r>
         <w:rPr>
           <w:rFonts w:ascii="Consolas" w:eastAsia="Times New Roman" w:hAnsi="Consolas" w:cs="Times New Roman"/>
           <w:color w:val="CCCCCC"/>
@@ -3275,8 +3624,18 @@
           <w:lang w:eastAsia="en-PK"/>
           <w14:ligatures w14:val="none"/>
         </w:rPr>
-      </w:pPr>
-      <w:r>
+        <w:t>)) {</w:t>
+      </w:r>
+    </w:p>
+    <w:p>
+      <w:pPr>
+        <w:pStyle w:val="ListParagraph"/>
+        <w:numPr>
+          <w:ilvl w:val="0"/>
+          <w:numId w:val="18"/>
+        </w:numPr>
+        <w:shd w:val="clear" w:color="auto" w:fill="1F1F1F"/>
+        <w:spacing w:after="0" w:line="300" w:lineRule="atLeast"/>
         <w:rPr>
           <w:rFonts w:ascii="Consolas" w:eastAsia="Times New Roman" w:hAnsi="Consolas" w:cs="Times New Roman"/>
           <w:color w:val="CCCCCC"/>
@@ -3286,6 +3645,17 @@
           <w:lang w:eastAsia="en-PK"/>
           <w14:ligatures w14:val="none"/>
         </w:rPr>
+      </w:pPr>
+      <w:r>
+        <w:rPr>
+          <w:rFonts w:ascii="Consolas" w:eastAsia="Times New Roman" w:hAnsi="Consolas" w:cs="Times New Roman"/>
+          <w:color w:val="CCCCCC"/>
+          <w:kern w:val="0"/>
+          <w:sz w:val="21"/>
+          <w:szCs w:val="21"/>
+          <w:lang w:eastAsia="en-PK"/>
+          <w14:ligatures w14:val="none"/>
+        </w:rPr>
         <w:t xml:space="preserve">  </w:t>
       </w:r>
       <w:r>
@@ -3334,6 +3704,7 @@
         <w:t xml:space="preserve">  </w:t>
       </w:r>
       <w:proofErr w:type="spellStart"/>
+      <w:proofErr w:type="gramStart"/>
       <w:r>
         <w:rPr>
           <w:rFonts w:ascii="Consolas" w:eastAsia="Times New Roman" w:hAnsi="Consolas" w:cs="Times New Roman"/>
@@ -3371,6 +3742,7 @@
         <w:t>disabled</w:t>
       </w:r>
       <w:proofErr w:type="spellEnd"/>
+      <w:proofErr w:type="gramEnd"/>
       <w:r>
         <w:rPr>
           <w:rFonts w:ascii="Consolas" w:eastAsia="Times New Roman" w:hAnsi="Consolas" w:cs="Times New Roman"/>
@@ -3407,6 +3779,7 @@
         </w:rPr>
         <w:t xml:space="preserve"> </w:t>
       </w:r>
+      <w:proofErr w:type="gramStart"/>
       <w:r>
         <w:rPr>
           <w:rFonts w:ascii="Consolas" w:eastAsia="Times New Roman" w:hAnsi="Consolas" w:cs="Times New Roman"/>
@@ -3431,6 +3804,7 @@
         </w:rPr>
         <w:t>;</w:t>
       </w:r>
+      <w:proofErr w:type="gramEnd"/>
     </w:p>
     <w:p>
       <w:pPr>
@@ -3512,6 +3886,7 @@
         <w:t xml:space="preserve"> (</w:t>
       </w:r>
       <w:proofErr w:type="spellStart"/>
+      <w:proofErr w:type="gramStart"/>
       <w:r>
         <w:rPr>
           <w:rFonts w:ascii="Consolas" w:eastAsia="Times New Roman" w:hAnsi="Consolas" w:cs="Times New Roman"/>
@@ -3549,6 +3924,7 @@
         <w:t>status</w:t>
       </w:r>
       <w:proofErr w:type="spellEnd"/>
+      <w:proofErr w:type="gramEnd"/>
       <w:r>
         <w:rPr>
           <w:rFonts w:ascii="Consolas" w:eastAsia="Times New Roman" w:hAnsi="Consolas" w:cs="Times New Roman"/>
@@ -3686,6 +4062,7 @@
         <w:t xml:space="preserve">  </w:t>
       </w:r>
       <w:proofErr w:type="spellStart"/>
+      <w:proofErr w:type="gramStart"/>
       <w:r>
         <w:rPr>
           <w:rFonts w:ascii="Consolas" w:eastAsia="Times New Roman" w:hAnsi="Consolas" w:cs="Times New Roman"/>
@@ -3723,6 +4100,7 @@
         <w:t>disabled</w:t>
       </w:r>
       <w:proofErr w:type="spellEnd"/>
+      <w:proofErr w:type="gramEnd"/>
       <w:r>
         <w:rPr>
           <w:rFonts w:ascii="Consolas" w:eastAsia="Times New Roman" w:hAnsi="Consolas" w:cs="Times New Roman"/>
@@ -3759,6 +4137,7 @@
         </w:rPr>
         <w:t xml:space="preserve"> </w:t>
       </w:r>
+      <w:proofErr w:type="gramStart"/>
       <w:r>
         <w:rPr>
           <w:rFonts w:ascii="Consolas" w:eastAsia="Times New Roman" w:hAnsi="Consolas" w:cs="Times New Roman"/>
@@ -3783,6 +4162,7 @@
         </w:rPr>
         <w:t>;</w:t>
       </w:r>
+      <w:proofErr w:type="gramEnd"/>
     </w:p>
     <w:p>
       <w:pPr>
@@ -3901,6 +4281,7 @@
         </w:rPr>
         <w:t>'rejected'</w:t>
       </w:r>
+      <w:proofErr w:type="gramStart"/>
       <w:r>
         <w:rPr>
           <w:rFonts w:ascii="Consolas" w:eastAsia="Times New Roman" w:hAnsi="Consolas" w:cs="Times New Roman"/>
@@ -3913,6 +4294,7 @@
         </w:rPr>
         <w:t>);</w:t>
       </w:r>
+      <w:proofErr w:type="gramEnd"/>
     </w:p>
     <w:p>
       <w:pPr>
@@ -4046,6 +4428,7 @@
         <w:t xml:space="preserve">  </w:t>
       </w:r>
       <w:proofErr w:type="spellStart"/>
+      <w:proofErr w:type="gramStart"/>
       <w:r>
         <w:rPr>
           <w:rFonts w:ascii="Consolas" w:eastAsia="Times New Roman" w:hAnsi="Consolas" w:cs="Times New Roman"/>
@@ -4083,6 +4466,7 @@
         <w:t>disabled</w:t>
       </w:r>
       <w:proofErr w:type="spellEnd"/>
+      <w:proofErr w:type="gramEnd"/>
       <w:r>
         <w:rPr>
           <w:rFonts w:ascii="Consolas" w:eastAsia="Times New Roman" w:hAnsi="Consolas" w:cs="Times New Roman"/>
@@ -4119,6 +4503,7 @@
         </w:rPr>
         <w:t xml:space="preserve"> </w:t>
       </w:r>
+      <w:proofErr w:type="gramStart"/>
       <w:r>
         <w:rPr>
           <w:rFonts w:ascii="Consolas" w:eastAsia="Times New Roman" w:hAnsi="Consolas" w:cs="Times New Roman"/>
@@ -4143,6 +4528,7 @@
         </w:rPr>
         <w:t>;</w:t>
       </w:r>
+      <w:proofErr w:type="gramEnd"/>
     </w:p>
     <w:p>
       <w:pPr>
@@ -4211,11 +4597,19 @@
       </w:r>
       <w:proofErr w:type="spellStart"/>
       <w:r>
-        <w:t>assign_driver_to_order</w:t>
-      </w:r>
-      <w:proofErr w:type="spellEnd"/>
-      <w:r>
-        <w:t>()</w:t>
+        <w:t>assign_driver_to_</w:t>
+      </w:r>
+      <w:proofErr w:type="gramStart"/>
+      <w:r>
+        <w:t>order</w:t>
+      </w:r>
+      <w:proofErr w:type="spellEnd"/>
+      <w:r>
+        <w:t>(</w:t>
+      </w:r>
+      <w:proofErr w:type="gramEnd"/>
+      <w:r>
+        <w:t>)</w:t>
       </w:r>
     </w:p>
     <w:p>
@@ -4256,7 +4650,15 @@
         </w:numPr>
       </w:pPr>
       <w:r>
-        <w:t>Deletes old expired assignment</w:t>
+        <w:t xml:space="preserve">Deletes </w:t>
+      </w:r>
+      <w:proofErr w:type="gramStart"/>
+      <w:r>
+        <w:t>old expired</w:t>
+      </w:r>
+      <w:proofErr w:type="gramEnd"/>
+      <w:r>
+        <w:t xml:space="preserve"> assignment</w:t>
       </w:r>
     </w:p>
     <w:p>
@@ -4297,11 +4699,19 @@
       </w:r>
       <w:proofErr w:type="spellStart"/>
       <w:r>
-        <w:t>confirm_order_driver</w:t>
-      </w:r>
-      <w:proofErr w:type="spellEnd"/>
-      <w:r>
-        <w:t>() - checks driver's timer</w:t>
+        <w:t>confirm_order_</w:t>
+      </w:r>
+      <w:proofErr w:type="gramStart"/>
+      <w:r>
+        <w:t>driver</w:t>
+      </w:r>
+      <w:proofErr w:type="spellEnd"/>
+      <w:r>
+        <w:t>(</w:t>
+      </w:r>
+      <w:proofErr w:type="gramEnd"/>
+      <w:r>
+        <w:t>) - checks driver's timer</w:t>
       </w:r>
     </w:p>
     <w:p>
@@ -4322,11 +4732,19 @@
       </w:r>
       <w:proofErr w:type="spellStart"/>
       <w:r>
-        <w:t>assign_driver_to_order</w:t>
-      </w:r>
-      <w:proofErr w:type="spellEnd"/>
-      <w:r>
-        <w:t>() - checks rejection status</w:t>
+        <w:t>assign_driver_to_</w:t>
+      </w:r>
+      <w:proofErr w:type="gramStart"/>
+      <w:r>
+        <w:t>order</w:t>
+      </w:r>
+      <w:proofErr w:type="spellEnd"/>
+      <w:r>
+        <w:t>(</w:t>
+      </w:r>
+      <w:proofErr w:type="gramEnd"/>
+      <w:r>
+        <w:t>) - checks rejection status</w:t>
       </w:r>
     </w:p>
     <w:p>
@@ -4610,12 +5028,17 @@
       </w:r>
       <w:proofErr w:type="spellStart"/>
       <w:r>
-        <w:t>notify_driver_assignment_updated</w:t>
+        <w:t>notify_driver_assignment_</w:t>
+      </w:r>
+      <w:proofErr w:type="gramStart"/>
+      <w:r>
+        <w:t>updated</w:t>
       </w:r>
       <w:proofErr w:type="spellEnd"/>
       <w:r>
         <w:t>();</w:t>
       </w:r>
+      <w:proofErr w:type="gramEnd"/>
     </w:p>
     <w:p/>
     <w:p>
@@ -4645,10 +5068,12 @@
     </w:p>
     <w:p>
       <w:proofErr w:type="spellStart"/>
+      <w:proofErr w:type="gramStart"/>
       <w:r>
         <w:t>client.on</w:t>
       </w:r>
       <w:proofErr w:type="spellEnd"/>
+      <w:proofErr w:type="gramEnd"/>
       <w:r>
         <w:t>('notification', (msg) =&gt; {</w:t>
       </w:r>
@@ -4658,10 +5083,12 @@
         <w:t>  if (</w:t>
       </w:r>
       <w:proofErr w:type="spellStart"/>
+      <w:proofErr w:type="gramStart"/>
       <w:r>
         <w:t>msg.channel</w:t>
       </w:r>
       <w:proofErr w:type="spellEnd"/>
+      <w:proofErr w:type="gramEnd"/>
       <w:r>
         <w:t xml:space="preserve"> === '</w:t>
       </w:r>
@@ -4679,10 +5106,12 @@
         <w:t xml:space="preserve">    </w:t>
       </w:r>
       <w:proofErr w:type="spellStart"/>
+      <w:proofErr w:type="gramStart"/>
       <w:r>
         <w:t>io.emit</w:t>
       </w:r>
       <w:proofErr w:type="spellEnd"/>
+      <w:proofErr w:type="gramEnd"/>
       <w:r>
         <w:t>('</w:t>
       </w:r>
@@ -4692,16 +5121,29 @@
       </w:r>
       <w:proofErr w:type="spellEnd"/>
       <w:r>
-        <w:t xml:space="preserve">', { </w:t>
-      </w:r>
-      <w:proofErr w:type="spellStart"/>
-      <w:r>
-        <w:t>order_id</w:t>
-      </w:r>
-      <w:proofErr w:type="spellEnd"/>
-      <w:r>
-        <w:t>: ... });</w:t>
-      </w:r>
+        <w:t xml:space="preserve">', </w:t>
+      </w:r>
+      <w:proofErr w:type="gramStart"/>
+      <w:r>
+        <w:t xml:space="preserve">{ </w:t>
+      </w:r>
+      <w:proofErr w:type="spellStart"/>
+      <w:r>
+        <w:t>order</w:t>
+      </w:r>
+      <w:proofErr w:type="gramEnd"/>
+      <w:r>
+        <w:t>_id</w:t>
+      </w:r>
+      <w:proofErr w:type="spellEnd"/>
+      <w:r>
+        <w:t xml:space="preserve">: </w:t>
+      </w:r>
+      <w:proofErr w:type="gramStart"/>
+      <w:r>
+        <w:t>... });</w:t>
+      </w:r>
+      <w:proofErr w:type="gramEnd"/>
     </w:p>
     <w:p>
       <w:r>
@@ -4710,8 +5152,13 @@
     </w:p>
     <w:p>
       <w:r>
-        <w:t>});</w:t>
-      </w:r>
+        <w:t>}</w:t>
+      </w:r>
+      <w:proofErr w:type="gramStart"/>
+      <w:r>
+        <w:t>);</w:t>
+      </w:r>
+      <w:proofErr w:type="gramEnd"/>
     </w:p>
     <w:p>
       <w:pPr>
@@ -4829,7 +5276,15 @@
     </w:p>
     <w:p>
       <w:r>
-        <w:t>Now only the delivery process and the ride finish has to be taken care of as well as order history</w:t>
+        <w:t xml:space="preserve">Now only the delivery process and the ride finish </w:t>
+      </w:r>
+      <w:proofErr w:type="gramStart"/>
+      <w:r>
+        <w:t>has</w:t>
+      </w:r>
+      <w:proofErr w:type="gramEnd"/>
+      <w:r>
+        <w:t xml:space="preserve"> to be taken care of as well as order history</w:t>
       </w:r>
     </w:p>
     <w:p>
@@ -4872,32 +5327,64 @@
     <w:p/>
     <w:p>
       <w:r>
-        <w:t>Now rating is added but for cancellation we have to take care of rating too if driver or supplier cancels it rating falls by 0</w:t>
+        <w:t xml:space="preserve">Now rating is added but for cancellation we </w:t>
+      </w:r>
+      <w:proofErr w:type="gramStart"/>
+      <w:r>
+        <w:t>have to</w:t>
+      </w:r>
+      <w:proofErr w:type="gramEnd"/>
+      <w:r>
+        <w:t xml:space="preserve"> take care of rating too if driver or supplier cancels it rating falls by 0</w:t>
       </w:r>
       <w:r>
         <w:t xml:space="preserve">.2 for supplier side rating drop will happen if the status was accepted or </w:t>
       </w:r>
       <w:proofErr w:type="spellStart"/>
       <w:r>
+        <w:t>ride_</w:t>
+      </w:r>
+      <w:proofErr w:type="gramStart"/>
+      <w:r>
+        <w:t>started</w:t>
+      </w:r>
+      <w:proofErr w:type="spellEnd"/>
+      <w:r>
+        <w:t xml:space="preserve">  same</w:t>
+      </w:r>
+      <w:proofErr w:type="gramEnd"/>
+      <w:r>
+        <w:t xml:space="preserve"> for </w:t>
+      </w:r>
+      <w:proofErr w:type="gramStart"/>
+      <w:r>
+        <w:t>driver .</w:t>
+      </w:r>
+      <w:proofErr w:type="gramEnd"/>
+      <w:r>
+        <w:t xml:space="preserve"> if customer does it at the accepted or </w:t>
+      </w:r>
+      <w:proofErr w:type="spellStart"/>
+      <w:r>
         <w:t>ride_started</w:t>
       </w:r>
       <w:proofErr w:type="spellEnd"/>
       <w:r>
-        <w:t xml:space="preserve">  same for driver . if customer does it at the accepted or </w:t>
-      </w:r>
-      <w:proofErr w:type="spellStart"/>
-      <w:r>
-        <w:t>ride_started</w:t>
-      </w:r>
-      <w:proofErr w:type="spellEnd"/>
-      <w:r>
         <w:t xml:space="preserve"> stage then no rating will be updated but reason will be logged in rating table if customer or supplier does it at any stage before accepted then no problem</w:t>
       </w:r>
     </w:p>
     <w:p/>
     <w:p>
       <w:r>
-        <w:t xml:space="preserve">Ok first, if any party cancelled  on status that was not accepted or ride started then </w:t>
+        <w:t xml:space="preserve">Ok first, if any party </w:t>
+      </w:r>
+      <w:proofErr w:type="gramStart"/>
+      <w:r>
+        <w:t>cancelled  on</w:t>
+      </w:r>
+      <w:proofErr w:type="gramEnd"/>
+      <w:r>
+        <w:t xml:space="preserve"> status that was not accepted or ride started then </w:t>
       </w:r>
       <w:proofErr w:type="spellStart"/>
       <w:r>
@@ -4923,7 +5410,15 @@
     </w:p>
     <w:p>
       <w:r>
-        <w:t>If rider or supplier does it, log the reason into ratings table, rating of supplier affected</w:t>
+        <w:t xml:space="preserve">If rider or </w:t>
+      </w:r>
+      <w:proofErr w:type="gramStart"/>
+      <w:r>
+        <w:t>supplier</w:t>
+      </w:r>
+      <w:proofErr w:type="gramEnd"/>
+      <w:r>
+        <w:t xml:space="preserve"> does it, log the reason into ratings table, rating of supplier affected</w:t>
       </w:r>
     </w:p>
     <w:p/>
@@ -5019,7 +5514,192 @@
       </w:r>
     </w:p>
     <w:p/>
+    <w:p>
+      <w:r>
+        <w:t>Backend holds supplier name, but frontend should show company name only</w:t>
+      </w:r>
+    </w:p>
+    <w:p>
+      <w:r>
+        <w:t>That is what is needed</w:t>
+      </w:r>
+    </w:p>
     <w:p/>
+    <w:p>
+      <w:r>
+        <w:t xml:space="preserve">I implemented a strict role-lock in the database profile functions so users can set role details only </w:t>
+      </w:r>
+      <w:proofErr w:type="gramStart"/>
+      <w:r>
+        <w:t>once, and</w:t>
+      </w:r>
+      <w:proofErr w:type="gramEnd"/>
+      <w:r>
+        <w:t xml:space="preserve"> never change or update role details afterward. I updated the role check in `</w:t>
+      </w:r>
+      <w:proofErr w:type="spellStart"/>
+      <w:r>
+        <w:t>enter_details_customer</w:t>
+      </w:r>
+      <w:proofErr w:type="spellEnd"/>
+      <w:r>
+        <w:t>`, `</w:t>
+      </w:r>
+      <w:proofErr w:type="spellStart"/>
+      <w:r>
+        <w:t>enter_details_driver</w:t>
+      </w:r>
+      <w:proofErr w:type="spellEnd"/>
+      <w:r>
+        <w:t>`, and `</w:t>
+      </w:r>
+      <w:proofErr w:type="spellStart"/>
+      <w:r>
+        <w:t>enter_details_supplier</w:t>
+      </w:r>
+      <w:proofErr w:type="spellEnd"/>
+      <w:r>
+        <w:t>` to reject when the current role is not `undefined</w:t>
+      </w:r>
+      <w:proofErr w:type="gramStart"/>
+      <w:r>
+        <w:t>`, and</w:t>
+      </w:r>
+      <w:proofErr w:type="gramEnd"/>
+      <w:r>
+        <w:t xml:space="preserve"> standardized the rejection message to: "Role already assigned. Details update is not allowed." I did this </w:t>
+      </w:r>
+      <w:r>
+        <w:t>to ensure</w:t>
+      </w:r>
+      <w:r>
+        <w:t xml:space="preserve"> that no updates be allowed for role details after initial setup</w:t>
+      </w:r>
+      <w:r>
+        <w:t>.</w:t>
+      </w:r>
+    </w:p>
+    <w:p>
+      <w:r>
+        <w:t xml:space="preserve">Also </w:t>
+      </w:r>
+      <w:r>
+        <w:t>found a real security gap where a valid token from one role could call another role's endpoint. While the frontend usually prevents this, direct API calls can bypass frontend checks, so enforcing this in SQL is safest since SQL is the source of truth and cannot be bypassed.</w:t>
+      </w:r>
+    </w:p>
+    <w:p/>
+    <w:p/>
+    <w:p>
+      <w:pPr>
+        <w:rPr>
+          <w:lang w:val="en-PK"/>
+        </w:rPr>
+      </w:pPr>
+      <w:r>
+        <w:t xml:space="preserve">I </w:t>
+      </w:r>
+      <w:r>
+        <w:rPr>
+          <w:lang w:val="en-PK"/>
+        </w:rPr>
+        <w:t>added two new supplier-side functions.</w:t>
+      </w:r>
+    </w:p>
+    <w:p>
+      <w:pPr>
+        <w:rPr>
+          <w:lang w:val="en-PK"/>
+        </w:rPr>
+      </w:pPr>
+      <w:r>
+        <w:rPr>
+          <w:lang w:val="en-PK"/>
+        </w:rPr>
+        <w:t>The first function lets a supplier add a driver phone number to their roster with validation so only a valid supplier can add, duplicate entries are blocked, and phones already tied to another supplier are rejected.</w:t>
+      </w:r>
+    </w:p>
+    <w:p>
+      <w:pPr>
+        <w:rPr>
+          <w:lang w:val="en-PK"/>
+        </w:rPr>
+      </w:pPr>
+      <w:r>
+        <w:rPr>
+          <w:lang w:val="en-PK"/>
+        </w:rPr>
+        <w:lastRenderedPageBreak/>
+        <w:t>The second function lets a supplier remove a driver. It first verifies the driver belongs to that supplier. If the row is only a phone placeholder, it removes just that row. If the driver is linked, it enforces a safety check that the driver must not appear in orders before allowing deletion. After that, it cleans the linked driver data from relevant live tables, deletes sessions, removes the supplier-driver linkage, and deletes the driver user while preserving history.</w:t>
+      </w:r>
+    </w:p>
+    <w:p>
+      <w:pPr>
+        <w:rPr>
+          <w:lang w:val="en-PK"/>
+        </w:rPr>
+      </w:pPr>
+      <w:r>
+        <w:rPr>
+          <w:lang w:val="en-PK"/>
+        </w:rPr>
+        <w:t>C</w:t>
+      </w:r>
+      <w:r>
+        <w:rPr>
+          <w:lang w:val="en-PK"/>
+        </w:rPr>
+        <w:t>hanged the order history model to store customer, supplier, and driver names and phones directly instead of relying on foreign-key IDs.</w:t>
+      </w:r>
+    </w:p>
+    <w:p>
+      <w:pPr>
+        <w:rPr>
+          <w:lang w:val="en-PK"/>
+        </w:rPr>
+      </w:pPr>
+      <w:r>
+        <w:rPr>
+          <w:lang w:val="en-PK"/>
+        </w:rPr>
+        <w:t>U</w:t>
+      </w:r>
+      <w:r>
+        <w:rPr>
+          <w:lang w:val="en-PK"/>
+        </w:rPr>
+        <w:t>pdated all related history-writing and history-reading SQL logic so completed and cancelled orders now snapshot names and phones at write time, and later history lookups use those stored values rather than depending on current user records.</w:t>
+      </w:r>
+    </w:p>
+    <w:p>
+      <w:pPr>
+        <w:rPr>
+          <w:lang w:val="en-PK"/>
+        </w:rPr>
+      </w:pPr>
+      <w:r>
+        <w:rPr>
+          <w:lang w:val="en-PK"/>
+        </w:rPr>
+        <w:t>I also removed the earlier order history driver-id nulling step in the remove-driver function since history now keeps stable name and phone snapshots.</w:t>
+      </w:r>
+    </w:p>
+    <w:p/>
+    <w:p/>
+    <w:p>
+      <w:proofErr w:type="gramStart"/>
+      <w:r>
+        <w:t>Lastly ,</w:t>
+      </w:r>
+      <w:proofErr w:type="gramEnd"/>
+      <w:r>
+        <w:t xml:space="preserve"> now on driver onboarding, if he exists in the supplier driver table then allow him in.</w:t>
+      </w:r>
+    </w:p>
+    <w:p>
+      <w:r>
+        <w:t>If he doesn’t then remove him from users table and sessions table, force him to re onboard.</w:t>
+      </w:r>
+    </w:p>
     <w:sectPr>
       <w:pgSz w:w="11906" w:h="16838"/>
       <w:pgMar w:top="1440" w:right="1440" w:bottom="1440" w:left="1440" w:header="708" w:footer="708" w:gutter="0"/>
@@ -8666,7 +9346,6 @@
   <w:style w:type="character" w:default="1" w:styleId="DefaultParagraphFont">
     <w:name w:val="Default Paragraph Font"/>
     <w:uiPriority w:val="1"/>
-    <w:semiHidden/>
     <w:unhideWhenUsed/>
   </w:style>
   <w:style w:type="table" w:default="1" w:styleId="TableNormal">

</xml_diff>

<commit_message>
Authenticaiton and Onboarding with rate limits: Done and Tested
</commit_message>
<xml_diff>
--- a/documents/code logic.docx
+++ b/documents/code logic.docx
@@ -3,201 +3,12 @@
 <w:document xmlns:wpc="http://schemas.microsoft.com/office/word/2010/wordprocessingCanvas" xmlns:cx="http://schemas.microsoft.com/office/drawing/2014/chartex" xmlns:cx1="http://schemas.microsoft.com/office/drawing/2015/9/8/chartex" xmlns:cx2="http://schemas.microsoft.com/office/drawing/2015/10/21/chartex" xmlns:cx3="http://schemas.microsoft.com/office/drawing/2016/5/9/chartex" xmlns:cx4="http://schemas.microsoft.com/office/drawing/2016/5/10/chartex" xmlns:cx5="http://schemas.microsoft.com/office/drawing/2016/5/11/chartex" xmlns:cx6="http://schemas.microsoft.com/office/drawing/2016/5/12/chartex" xmlns:cx7="http://schemas.microsoft.com/office/drawing/2016/5/13/chartex" xmlns:cx8="http://schemas.microsoft.com/office/drawing/2016/5/14/chartex" xmlns:mc="http://schemas.openxmlformats.org/markup-compatibility/2006" xmlns:aink="http://schemas.microsoft.com/office/drawing/2016/ink" xmlns:am3d="http://schemas.microsoft.com/office/drawing/2017/model3d" xmlns:o="urn:schemas-microsoft-com:office:office" xmlns:oel="http://schemas.microsoft.com/office/2019/extlst" xmlns:r="http://schemas.openxmlformats.org/officeDocument/2006/relationships" xmlns:m="http://schemas.openxmlformats.org/officeDocument/2006/math" xmlns:v="urn:schemas-microsoft-com:vml" xmlns:wp14="http://schemas.microsoft.com/office/word/2010/wordprocessingDrawing" xmlns:wp="http://schemas.openxmlformats.org/drawingml/2006/wordprocessingDrawing" xmlns:w10="urn:schemas-microsoft-com:office:word" xmlns:w="http://schemas.openxmlformats.org/wordprocessingml/2006/main" xmlns:w14="http://schemas.microsoft.com/office/word/2010/wordml" xmlns:w15="http://schemas.microsoft.com/office/word/2012/wordml" xmlns:w16cex="http://schemas.microsoft.com/office/word/2018/wordml/cex" xmlns:w16cid="http://schemas.microsoft.com/office/word/2016/wordml/cid" xmlns:w16="http://schemas.microsoft.com/office/word/2018/wordml" xmlns:w16du="http://schemas.microsoft.com/office/word/2023/wordml/word16du" xmlns:w16sdtdh="http://schemas.microsoft.com/office/word/2020/wordml/sdtdatahash" xmlns:w16sdtfl="http://schemas.microsoft.com/office/word/2024/wordml/sdtformatlock" xmlns:w16se="http://schemas.microsoft.com/office/word/2015/wordml/symex" xmlns:wpg="http://schemas.microsoft.com/office/word/2010/wordprocessingGroup" xmlns:wpi="http://schemas.microsoft.com/office/word/2010/wordprocessingInk" xmlns:wne="http://schemas.microsoft.com/office/word/2006/wordml" xmlns:wps="http://schemas.microsoft.com/office/word/2010/wordprocessingShape" mc:Ignorable="w14 w15 w16se w16cid w16 w16cex w16sdtdh w16sdtfl w16du wp14">
   <w:body>
     <w:p>
-      <w:proofErr w:type="gramStart"/>
-      <w:r>
-        <w:t>oh</w:t>
-      </w:r>
-      <w:proofErr w:type="gramEnd"/>
-      <w:r>
-        <w:t xml:space="preserve"> so the easy way is to check local token if that exists then redirect to orders page if </w:t>
-      </w:r>
-      <w:proofErr w:type="spellStart"/>
-      <w:r>
-        <w:t>deosnt</w:t>
-      </w:r>
-      <w:proofErr w:type="spellEnd"/>
-      <w:r>
-        <w:t xml:space="preserve"> exist for this app then red </w:t>
-      </w:r>
-      <w:proofErr w:type="spellStart"/>
-      <w:r>
-        <w:t>diecet</w:t>
-      </w:r>
-      <w:proofErr w:type="spellEnd"/>
-      <w:r>
-        <w:t xml:space="preserve"> to phone </w:t>
-      </w:r>
-      <w:proofErr w:type="spellStart"/>
-      <w:r>
-        <w:t>numeb</w:t>
-      </w:r>
-      <w:proofErr w:type="spellEnd"/>
-      <w:r>
-        <w:t xml:space="preserve"> page </w:t>
-      </w:r>
-      <w:proofErr w:type="spellStart"/>
-      <w:r>
-        <w:t>whihc</w:t>
-      </w:r>
-      <w:proofErr w:type="spellEnd"/>
-      <w:r>
-        <w:t xml:space="preserve"> is same for </w:t>
-      </w:r>
-      <w:proofErr w:type="spellStart"/>
-      <w:r>
-        <w:t>reislateld</w:t>
-      </w:r>
-      <w:proofErr w:type="spellEnd"/>
-      <w:r>
-        <w:t xml:space="preserve"> suers and new users same opt </w:t>
-      </w:r>
-      <w:proofErr w:type="spellStart"/>
-      <w:r>
-        <w:t>verifaiton</w:t>
-      </w:r>
-      <w:proofErr w:type="spellEnd"/>
-      <w:r>
-        <w:t xml:space="preserve">. then this </w:t>
-      </w:r>
-      <w:proofErr w:type="spellStart"/>
-      <w:r>
-        <w:t>numebr</w:t>
-      </w:r>
-      <w:proofErr w:type="spellEnd"/>
-      <w:r>
-        <w:t xml:space="preserve"> is </w:t>
-      </w:r>
-      <w:proofErr w:type="spellStart"/>
-      <w:r>
-        <w:t>chekced</w:t>
-      </w:r>
-      <w:proofErr w:type="spellEnd"/>
-      <w:r>
-        <w:t xml:space="preserve"> in database if exists then </w:t>
-      </w:r>
-      <w:proofErr w:type="spellStart"/>
-      <w:r>
-        <w:t>redirecet</w:t>
-      </w:r>
-      <w:proofErr w:type="spellEnd"/>
-      <w:r>
-        <w:t xml:space="preserve"> to orders (</w:t>
-      </w:r>
-      <w:proofErr w:type="spellStart"/>
-      <w:r>
-        <w:t>ie</w:t>
-      </w:r>
-      <w:proofErr w:type="spellEnd"/>
-      <w:r>
-        <w:t xml:space="preserve"> </w:t>
-      </w:r>
-      <w:proofErr w:type="spellStart"/>
-      <w:r>
-        <w:t>returing</w:t>
-      </w:r>
-      <w:proofErr w:type="spellEnd"/>
-      <w:r>
-        <w:t xml:space="preserve"> user after </w:t>
-      </w:r>
-      <w:proofErr w:type="gramStart"/>
-      <w:r>
-        <w:t>reinstall) .</w:t>
-      </w:r>
-      <w:proofErr w:type="gramEnd"/>
-      <w:r>
-        <w:t xml:space="preserve"> not exists then firs time user redirect to name entering</w:t>
+      <w:r>
+        <w:t>oh so the easy way is to check local token if that exists then redirect to orders page if deosnt exist for this app then red diecet to phone numeb page whihc is same for reislateld suers and new users same opt verifaiton. then this numebr is chekced in database if exists then redirecet to orders (ie returing user after reinstall) . not exists then firs time user redirect to name entering</w:t>
       </w:r>
       <w:r>
         <w:br/>
-        <w:t xml:space="preserve">but now two things where does local token be </w:t>
-      </w:r>
-      <w:proofErr w:type="gramStart"/>
-      <w:r>
-        <w:t>stored ?</w:t>
-      </w:r>
-      <w:proofErr w:type="gramEnd"/>
-      <w:r>
-        <w:t xml:space="preserve"> in </w:t>
-      </w:r>
-      <w:proofErr w:type="spellStart"/>
-      <w:r>
-        <w:t>db</w:t>
-      </w:r>
-      <w:proofErr w:type="spellEnd"/>
-      <w:r>
-        <w:t xml:space="preserve"> or what? </w:t>
-      </w:r>
-      <w:proofErr w:type="spellStart"/>
-      <w:r>
-        <w:t>seocndly</w:t>
-      </w:r>
-      <w:proofErr w:type="spellEnd"/>
-      <w:r>
-        <w:t xml:space="preserve"> does the local </w:t>
-      </w:r>
-      <w:proofErr w:type="spellStart"/>
-      <w:r>
-        <w:t>toekn</w:t>
-      </w:r>
-      <w:proofErr w:type="spellEnd"/>
-      <w:r>
-        <w:t xml:space="preserve"> also </w:t>
-      </w:r>
-      <w:proofErr w:type="spellStart"/>
-      <w:r>
-        <w:t>consits</w:t>
-      </w:r>
-      <w:proofErr w:type="spellEnd"/>
-      <w:r>
-        <w:t xml:space="preserve"> of user </w:t>
-      </w:r>
-      <w:proofErr w:type="gramStart"/>
-      <w:r>
-        <w:t>id ?</w:t>
-      </w:r>
-      <w:proofErr w:type="gramEnd"/>
-      <w:r>
-        <w:t xml:space="preserve"> because how will </w:t>
-      </w:r>
-      <w:proofErr w:type="spellStart"/>
-      <w:r>
-        <w:t>i</w:t>
-      </w:r>
-      <w:proofErr w:type="spellEnd"/>
-      <w:r>
-        <w:t xml:space="preserve"> know </w:t>
-      </w:r>
-      <w:proofErr w:type="spellStart"/>
-      <w:r>
-        <w:t>whihc</w:t>
-      </w:r>
-      <w:proofErr w:type="spellEnd"/>
-      <w:r>
-        <w:t xml:space="preserve"> user it is if </w:t>
-      </w:r>
-      <w:proofErr w:type="spellStart"/>
-      <w:r>
-        <w:t>i</w:t>
-      </w:r>
-      <w:proofErr w:type="spellEnd"/>
-      <w:r>
-        <w:t xml:space="preserve"> </w:t>
-      </w:r>
-      <w:proofErr w:type="spellStart"/>
-      <w:r>
-        <w:t>odnt</w:t>
-      </w:r>
-      <w:proofErr w:type="spellEnd"/>
-      <w:r>
-        <w:t xml:space="preserve"> </w:t>
-      </w:r>
-      <w:proofErr w:type="spellStart"/>
-      <w:r>
-        <w:t>ahve</w:t>
-      </w:r>
-      <w:proofErr w:type="spellEnd"/>
-      <w:r>
-        <w:t xml:space="preserve"> the user id</w:t>
+        <w:t>but now two things where does local token be stored ? in db or what? seocndly does the local toekn also consits of user id ? because how will i know whihc user it is if i odnt ahve the user id</w:t>
       </w:r>
     </w:p>
     <w:p/>
@@ -205,59 +16,17 @@
     <w:p/>
     <w:p>
       <w:r>
-        <w:t xml:space="preserve">Just check local token existence in the </w:t>
-      </w:r>
-      <w:proofErr w:type="spellStart"/>
-      <w:proofErr w:type="gramStart"/>
-      <w:r>
-        <w:t>db</w:t>
-      </w:r>
-      <w:proofErr w:type="spellEnd"/>
-      <w:r>
-        <w:t xml:space="preserve"> .</w:t>
-      </w:r>
-      <w:proofErr w:type="gramEnd"/>
-      <w:r>
-        <w:t xml:space="preserve"> </w:t>
-      </w:r>
-      <w:proofErr w:type="gramStart"/>
-      <w:r>
-        <w:t>if  it</w:t>
-      </w:r>
-      <w:proofErr w:type="gramEnd"/>
-      <w:r>
-        <w:t xml:space="preserve"> exists then redirect to orders</w:t>
-      </w:r>
-    </w:p>
-    <w:p>
-      <w:r>
-        <w:t xml:space="preserve">If it doesn’t then make them enter phone </w:t>
-      </w:r>
-      <w:proofErr w:type="spellStart"/>
-      <w:r>
-        <w:t>numeb</w:t>
-      </w:r>
-      <w:proofErr w:type="spellEnd"/>
-      <w:r>
-        <w:t xml:space="preserve"> and verify </w:t>
-      </w:r>
-      <w:proofErr w:type="spellStart"/>
-      <w:r>
-        <w:t>otp</w:t>
-      </w:r>
-      <w:proofErr w:type="spellEnd"/>
-    </w:p>
-    <w:p>
-      <w:r>
-        <w:t xml:space="preserve">If phone number exists then </w:t>
-      </w:r>
-      <w:proofErr w:type="spellStart"/>
-      <w:r>
-        <w:t>reidriect</w:t>
-      </w:r>
-      <w:proofErr w:type="spellEnd"/>
-      <w:r>
-        <w:t xml:space="preserve"> to orders page</w:t>
+        <w:t>Just check local token existence in the db . if  it exists then redirect to orders</w:t>
+      </w:r>
+    </w:p>
+    <w:p>
+      <w:r>
+        <w:t>If it doesn’t then make them enter phone numeb and verify otp</w:t>
+      </w:r>
+    </w:p>
+    <w:p>
+      <w:r>
+        <w:t>If phone number exists then reidriect to orders page</w:t>
       </w:r>
     </w:p>
     <w:p>
@@ -276,15 +45,7 @@
     </w:p>
     <w:p>
       <w:r>
-        <w:t>OTP will be generated and sent by backend to the email/</w:t>
-      </w:r>
-      <w:proofErr w:type="spellStart"/>
-      <w:r>
-        <w:t>sms</w:t>
-      </w:r>
-      <w:proofErr w:type="spellEnd"/>
-      <w:r>
-        <w:t xml:space="preserve"> and </w:t>
+        <w:t xml:space="preserve">OTP will be generated and sent by backend to the email/sms and </w:t>
       </w:r>
     </w:p>
     <w:p/>
@@ -311,172 +72,45 @@
     <w:p/>
     <w:p>
       <w:r>
-        <w:t xml:space="preserve">Phone </w:t>
-      </w:r>
-      <w:proofErr w:type="spellStart"/>
-      <w:r>
-        <w:t>number_exists</w:t>
-      </w:r>
-      <w:proofErr w:type="spellEnd"/>
-      <w:r>
-        <w:t xml:space="preserve"> fn:</w:t>
-      </w:r>
-    </w:p>
-    <w:p>
-      <w:proofErr w:type="gramStart"/>
-      <w:r>
-        <w:t>Checks  if</w:t>
-      </w:r>
-      <w:proofErr w:type="gramEnd"/>
-      <w:r>
-        <w:t xml:space="preserve"> the entered number already exists in the users table if it does, then set the verified Boolean to false in the </w:t>
-      </w:r>
-      <w:proofErr w:type="spellStart"/>
-      <w:r>
-        <w:t>user_id</w:t>
-      </w:r>
-      <w:proofErr w:type="spellEnd"/>
-      <w:r>
-        <w:t xml:space="preserve"> </w:t>
-      </w:r>
-      <w:proofErr w:type="gramStart"/>
-      <w:r>
-        <w:t>table :</w:t>
-      </w:r>
-      <w:proofErr w:type="gramEnd"/>
-      <w:r>
-        <w:t xml:space="preserve"> the user already exists but </w:t>
-      </w:r>
-      <w:proofErr w:type="gramStart"/>
-      <w:r>
-        <w:t>has to</w:t>
-      </w:r>
-      <w:proofErr w:type="gramEnd"/>
-      <w:r>
-        <w:t xml:space="preserve"> undergo verification of phone number again</w:t>
+        <w:t>Phone number_exists fn:</w:t>
+      </w:r>
+    </w:p>
+    <w:p>
+      <w:r>
+        <w:t>Checks  if the entered number already exists in the users table if it does, then set the verified Boolean to false in the user_id table : the user already exists but has to undergo verification of phone number again</w:t>
       </w:r>
     </w:p>
     <w:p>
       <w:r>
         <w:lastRenderedPageBreak/>
-        <w:t xml:space="preserve">Checks if the entered phone number exists in the pending users table, if it does then do </w:t>
-      </w:r>
-      <w:proofErr w:type="gramStart"/>
-      <w:r>
-        <w:t>nothing ,</w:t>
-      </w:r>
-      <w:proofErr w:type="gramEnd"/>
-      <w:r>
-        <w:t xml:space="preserve"> if it doesn’t then insert the number (This will be done for existing users too that are getting back to the application as they are currently pending (unverified) users too</w:t>
+        <w:t>Checks if the entered phone number exists in the pending users table, if it does then do nothing , if it doesn’t then insert the number (This will be done for existing users too that are getting back to the application as they are currently pending (unverified) users too</w:t>
       </w:r>
     </w:p>
     <w:p/>
     <w:p>
       <w:r>
-        <w:t xml:space="preserve">Store </w:t>
-      </w:r>
-      <w:proofErr w:type="spellStart"/>
-      <w:r>
-        <w:t>otp</w:t>
-      </w:r>
-      <w:proofErr w:type="spellEnd"/>
-      <w:r>
-        <w:t>:</w:t>
-      </w:r>
-    </w:p>
-    <w:p>
-      <w:r>
-        <w:t xml:space="preserve">Stores </w:t>
-      </w:r>
-      <w:proofErr w:type="spellStart"/>
-      <w:r>
-        <w:t>otp</w:t>
-      </w:r>
-      <w:proofErr w:type="spellEnd"/>
-      <w:r>
-        <w:t xml:space="preserve"> in the pending </w:t>
-      </w:r>
-      <w:proofErr w:type="gramStart"/>
-      <w:r>
-        <w:t>users</w:t>
-      </w:r>
-      <w:proofErr w:type="gramEnd"/>
-      <w:r>
-        <w:t xml:space="preserve"> table </w:t>
-      </w:r>
-    </w:p>
-    <w:p>
-      <w:r>
-        <w:t xml:space="preserve">If the </w:t>
-      </w:r>
-      <w:proofErr w:type="spellStart"/>
-      <w:r>
-        <w:t>otp</w:t>
-      </w:r>
-      <w:proofErr w:type="spellEnd"/>
-      <w:r>
-        <w:t xml:space="preserve"> already exists then </w:t>
-      </w:r>
-      <w:proofErr w:type="spellStart"/>
-      <w:r>
-        <w:t>upates</w:t>
-      </w:r>
-      <w:proofErr w:type="spellEnd"/>
-      <w:r>
-        <w:t xml:space="preserve"> the </w:t>
-      </w:r>
-      <w:proofErr w:type="spellStart"/>
-      <w:r>
-        <w:t>otp</w:t>
-      </w:r>
-      <w:proofErr w:type="spellEnd"/>
-      <w:r>
-        <w:t xml:space="preserve"> (can be because the user exited during the process came again, or that he requested a new </w:t>
-      </w:r>
-      <w:proofErr w:type="spellStart"/>
-      <w:r>
-        <w:t>otp</w:t>
-      </w:r>
-      <w:proofErr w:type="spellEnd"/>
-      <w:r>
-        <w:t>)</w:t>
+        <w:t>Store otp:</w:t>
+      </w:r>
+    </w:p>
+    <w:p>
+      <w:r>
+        <w:t xml:space="preserve">Stores otp in the pending users table </w:t>
+      </w:r>
+    </w:p>
+    <w:p>
+      <w:r>
+        <w:t>If the otp already exists then upates the otp (can be because the user exited during the process came again, or that he requested a new otp)</w:t>
       </w:r>
     </w:p>
     <w:p/>
     <w:p>
-      <w:proofErr w:type="spellStart"/>
-      <w:r>
-        <w:t>Verify_otp_and_activate_users</w:t>
-      </w:r>
-      <w:proofErr w:type="spellEnd"/>
-      <w:r>
-        <w:t xml:space="preserve"> fn:</w:t>
-      </w:r>
-    </w:p>
-    <w:p>
-      <w:r>
-        <w:t xml:space="preserve">Checks the </w:t>
-      </w:r>
-      <w:proofErr w:type="gramStart"/>
-      <w:r>
-        <w:t xml:space="preserve">entered  </w:t>
-      </w:r>
-      <w:proofErr w:type="spellStart"/>
-      <w:r>
-        <w:t>otp</w:t>
-      </w:r>
-      <w:proofErr w:type="spellEnd"/>
-      <w:proofErr w:type="gramEnd"/>
-      <w:r>
-        <w:t xml:space="preserve"> against the stored </w:t>
-      </w:r>
-      <w:proofErr w:type="spellStart"/>
-      <w:r>
-        <w:t>otp</w:t>
-      </w:r>
-      <w:proofErr w:type="spellEnd"/>
-      <w:r>
-        <w:t xml:space="preserve"> </w:t>
+      <w:r>
+        <w:t>Verify_otp_and_activate_users fn:</w:t>
+      </w:r>
+    </w:p>
+    <w:p>
+      <w:r>
+        <w:t xml:space="preserve">Checks the entered  otp against the stored otp </w:t>
       </w:r>
     </w:p>
     <w:p>
@@ -486,15 +120,7 @@
     </w:p>
     <w:p>
       <w:r>
-        <w:t xml:space="preserve">If new user, inserts the info from pending users table to new </w:t>
-      </w:r>
-      <w:proofErr w:type="gramStart"/>
-      <w:r>
-        <w:t>users</w:t>
-      </w:r>
-      <w:proofErr w:type="gramEnd"/>
-      <w:r>
-        <w:t xml:space="preserve"> table</w:t>
+        <w:t>If new user, inserts the info from pending users table to new users table</w:t>
       </w:r>
     </w:p>
     <w:p>
@@ -517,15 +143,7 @@
     </w:p>
     <w:p>
       <w:r>
-        <w:t xml:space="preserve">If both session and role </w:t>
-      </w:r>
-      <w:proofErr w:type="gramStart"/>
-      <w:r>
-        <w:t>exists</w:t>
-      </w:r>
-      <w:proofErr w:type="gramEnd"/>
-      <w:r>
-        <w:t>: Go to orders page</w:t>
+        <w:t>If both session and role exists: Go to orders page</w:t>
       </w:r>
     </w:p>
     <w:p>
@@ -546,15 +164,7 @@
     <w:p/>
     <w:p>
       <w:r>
-        <w:t xml:space="preserve">The common steps for all the users </w:t>
-      </w:r>
-      <w:proofErr w:type="spellStart"/>
-      <w:r>
-        <w:t>uptil</w:t>
-      </w:r>
-      <w:proofErr w:type="spellEnd"/>
-      <w:r>
-        <w:t xml:space="preserve"> OTP done.</w:t>
+        <w:t>The common steps for all the users uptil OTP done.</w:t>
       </w:r>
     </w:p>
     <w:p>
@@ -570,15 +180,7 @@
     <w:p>
       <w:r>
         <w:lastRenderedPageBreak/>
-        <w:t xml:space="preserve">Supplier: Two pages and therefore two procedures, one for entering fields and the other for entering the </w:t>
-      </w:r>
-      <w:proofErr w:type="spellStart"/>
-      <w:r>
-        <w:t>cnic</w:t>
-      </w:r>
-      <w:proofErr w:type="spellEnd"/>
-      <w:r>
-        <w:t xml:space="preserve"> images</w:t>
+        <w:t>Supplier: Two pages and therefore two procedures, one for entering fields and the other for entering the cnic images</w:t>
       </w:r>
     </w:p>
     <w:p/>
@@ -589,23 +191,7 @@
     </w:p>
     <w:p>
       <w:r>
-        <w:t xml:space="preserve">Upon entering the orders page, first his existence in the </w:t>
-      </w:r>
-      <w:proofErr w:type="spellStart"/>
-      <w:r>
-        <w:t>supplier_Drivers</w:t>
-      </w:r>
-      <w:proofErr w:type="spellEnd"/>
-      <w:r>
-        <w:t xml:space="preserve"> table will be checked, if he doesn’t exist there </w:t>
-      </w:r>
-      <w:proofErr w:type="gramStart"/>
-      <w:r>
-        <w:t>therefore</w:t>
-      </w:r>
-      <w:proofErr w:type="gramEnd"/>
-      <w:r>
-        <w:t xml:space="preserve"> he hasn’t defined one single driver, implying he is a new registration.</w:t>
+        <w:t>Upon entering the orders page, first his existence in the supplier_Drivers table will be checked, if he doesn’t exist there therefore he hasn’t defined one single driver, implying he is a new registration.</w:t>
       </w:r>
     </w:p>
     <w:p>
@@ -623,39 +209,7 @@
         <w:t xml:space="preserve">This will be checked by checking the </w:t>
       </w:r>
       <w:r>
-        <w:t xml:space="preserve">supplier drivers table again against the </w:t>
-      </w:r>
-      <w:proofErr w:type="gramStart"/>
-      <w:r>
-        <w:t>suppliers</w:t>
-      </w:r>
-      <w:proofErr w:type="gramEnd"/>
-      <w:r>
-        <w:t xml:space="preserve"> user </w:t>
-      </w:r>
-      <w:proofErr w:type="gramStart"/>
-      <w:r>
-        <w:t>id, and</w:t>
-      </w:r>
-      <w:proofErr w:type="gramEnd"/>
-      <w:r>
-        <w:t xml:space="preserve"> checking the </w:t>
-      </w:r>
-      <w:proofErr w:type="spellStart"/>
-      <w:r>
-        <w:t>driver_user_id</w:t>
-      </w:r>
-      <w:proofErr w:type="spellEnd"/>
-      <w:r>
-        <w:t xml:space="preserve"> there. If </w:t>
-      </w:r>
-      <w:proofErr w:type="spellStart"/>
-      <w:r>
-        <w:t>atleast</w:t>
-      </w:r>
-      <w:proofErr w:type="spellEnd"/>
-      <w:r>
-        <w:t xml:space="preserve"> one of them is not null he can view the orders page. Until then, the orders page remains inaccessible.</w:t>
+        <w:t>supplier drivers table again against the suppliers user id, and checking the driver_user_id there. If atleast one of them is not null he can view the orders page. Until then, the orders page remains inaccessible.</w:t>
       </w:r>
     </w:p>
     <w:p/>
@@ -671,23 +225,7 @@
     </w:p>
     <w:p>
       <w:r>
-        <w:t xml:space="preserve">When he comes back to the application, after verification, his session will be generated, upon entering his details it will be checked that if his role is already set to driver that </w:t>
-      </w:r>
-      <w:proofErr w:type="gramStart"/>
-      <w:r>
-        <w:t>implies</w:t>
-      </w:r>
-      <w:proofErr w:type="gramEnd"/>
-      <w:r>
-        <w:t xml:space="preserve"> he is an existing user therefore only set his id back into the supplier </w:t>
-      </w:r>
-      <w:proofErr w:type="gramStart"/>
-      <w:r>
-        <w:t>drivers</w:t>
-      </w:r>
-      <w:proofErr w:type="gramEnd"/>
-      <w:r>
-        <w:t xml:space="preserve"> table. </w:t>
+        <w:t xml:space="preserve">When he comes back to the application, after verification, his session will be generated, upon entering his details it will be checked that if his role is already set to driver that implies he is an existing user therefore only set his id back into the supplier drivers table. </w:t>
       </w:r>
     </w:p>
     <w:p/>
@@ -696,44 +234,12 @@
         <w:t xml:space="preserve">So </w:t>
       </w:r>
       <w:r>
-        <w:t xml:space="preserve">updated the enter </w:t>
-      </w:r>
-      <w:proofErr w:type="spellStart"/>
-      <w:r>
-        <w:t>deitals</w:t>
-      </w:r>
-      <w:proofErr w:type="spellEnd"/>
-      <w:r>
-        <w:t xml:space="preserve"> driver fn to remove re-linking of </w:t>
-      </w:r>
-      <w:proofErr w:type="spellStart"/>
-      <w:r>
-        <w:t>driver_id</w:t>
-      </w:r>
-      <w:proofErr w:type="spellEnd"/>
-      <w:r>
-        <w:t xml:space="preserve"> to the </w:t>
-      </w:r>
-      <w:proofErr w:type="spellStart"/>
-      <w:r>
-        <w:t>supplier_drivers</w:t>
-      </w:r>
-      <w:proofErr w:type="spellEnd"/>
-      <w:r>
-        <w:t xml:space="preserve"> table</w:t>
-      </w:r>
-    </w:p>
-    <w:p>
-      <w:r>
-        <w:t>Made a new trigger of re-</w:t>
-      </w:r>
-      <w:proofErr w:type="spellStart"/>
-      <w:r>
-        <w:t>link_driver_after_session</w:t>
-      </w:r>
-      <w:proofErr w:type="spellEnd"/>
-      <w:r>
-        <w:t xml:space="preserve"> generation</w:t>
+        <w:t>updated the enter deitals driver fn to remove re-linking of driver_id to the supplier_drivers table</w:t>
+      </w:r>
+    </w:p>
+    <w:p>
+      <w:r>
+        <w:t>Made a new trigger of re-link_driver_after_session generation</w:t>
       </w:r>
     </w:p>
     <w:p>
@@ -743,15 +249,7 @@
     </w:p>
     <w:p>
       <w:r>
-        <w:t xml:space="preserve">if it has then that means his details already exists </w:t>
-      </w:r>
-      <w:proofErr w:type="spellStart"/>
-      <w:r>
-        <w:t>jsut</w:t>
-      </w:r>
-      <w:proofErr w:type="spellEnd"/>
-      <w:r>
-        <w:t xml:space="preserve"> need to link his id to the suppliers table again</w:t>
+        <w:t>if it has then that means his details already exists jsut need to link his id to the suppliers table again</w:t>
       </w:r>
     </w:p>
     <w:p/>
@@ -774,13 +272,8 @@
       </w:r>
     </w:p>
     <w:p>
-      <w:proofErr w:type="spellStart"/>
-      <w:r>
-        <w:t>Check_supplier_has_drivers</w:t>
-      </w:r>
-      <w:proofErr w:type="spellEnd"/>
-      <w:r>
-        <w:t xml:space="preserve"> fn:</w:t>
+      <w:r>
+        <w:t>Check_supplier_has_drivers fn:</w:t>
       </w:r>
       <w:r>
         <w:tab/>
@@ -794,29 +287,13 @@
     </w:p>
     <w:p>
       <w:r>
-        <w:t xml:space="preserve">This will be checked by checked the </w:t>
-      </w:r>
-      <w:proofErr w:type="spellStart"/>
-      <w:r>
-        <w:t>supplier_drivers</w:t>
-      </w:r>
-      <w:proofErr w:type="spellEnd"/>
-      <w:r>
-        <w:t xml:space="preserve"> table</w:t>
+        <w:t>This will be checked by checked the supplier_drivers table</w:t>
       </w:r>
     </w:p>
     <w:p/>
     <w:p>
       <w:r>
-        <w:t xml:space="preserve">Check </w:t>
-      </w:r>
-      <w:proofErr w:type="spellStart"/>
-      <w:r>
-        <w:t>supplier_has_active_drivers</w:t>
-      </w:r>
-      <w:proofErr w:type="spellEnd"/>
-      <w:r>
-        <w:t>:</w:t>
+        <w:t>Check supplier_has_active_drivers:</w:t>
       </w:r>
       <w:r>
         <w:tab/>
@@ -825,65 +302,12 @@
     </w:p>
     <w:p>
       <w:r>
-        <w:t xml:space="preserve">This will be checked by checking the </w:t>
-      </w:r>
-      <w:proofErr w:type="spellStart"/>
-      <w:r>
-        <w:t>supplier_id</w:t>
-      </w:r>
-      <w:proofErr w:type="spellEnd"/>
-      <w:r>
-        <w:t xml:space="preserve"> and the </w:t>
-      </w:r>
-      <w:proofErr w:type="spellStart"/>
-      <w:r>
-        <w:t>driver_id</w:t>
-      </w:r>
-      <w:proofErr w:type="spellEnd"/>
-      <w:r>
-        <w:t xml:space="preserve"> against that supplier in the supplier </w:t>
-      </w:r>
-      <w:proofErr w:type="gramStart"/>
-      <w:r>
-        <w:t>drivers</w:t>
-      </w:r>
-      <w:proofErr w:type="gramEnd"/>
-      <w:r>
-        <w:t xml:space="preserve"> table</w:t>
-      </w:r>
-    </w:p>
-    <w:p>
-      <w:r>
-        <w:t xml:space="preserve">If, for that </w:t>
-      </w:r>
-      <w:proofErr w:type="spellStart"/>
-      <w:r>
-        <w:t>supplier_id</w:t>
-      </w:r>
-      <w:proofErr w:type="spellEnd"/>
-      <w:r>
-        <w:t xml:space="preserve">, even if one of the </w:t>
-      </w:r>
-      <w:proofErr w:type="spellStart"/>
-      <w:proofErr w:type="gramStart"/>
-      <w:r>
-        <w:t>driver</w:t>
-      </w:r>
-      <w:proofErr w:type="gramEnd"/>
-      <w:r>
-        <w:t>_id</w:t>
-      </w:r>
-      <w:proofErr w:type="spellEnd"/>
-      <w:r>
-        <w:t xml:space="preserve"> is not null, then that means </w:t>
-      </w:r>
-      <w:proofErr w:type="spellStart"/>
-      <w:r>
-        <w:t>atleast</w:t>
-      </w:r>
-      <w:proofErr w:type="spellEnd"/>
-      <w:r>
-        <w:t xml:space="preserve"> one of his drivers is active</w:t>
+        <w:t>This will be checked by checking the supplier_id and the driver_id against that supplier in the supplier drivers table</w:t>
+      </w:r>
+    </w:p>
+    <w:p>
+      <w:r>
+        <w:t>If, for that supplier_id, even if one of the driver_id is not null, then that means atleast one of his drivers is active</w:t>
       </w:r>
     </w:p>
     <w:p>
@@ -947,20 +371,7 @@
         </w:numPr>
       </w:pPr>
       <w:r>
-        <w:t>'</w:t>
-      </w:r>
-      <w:proofErr w:type="spellStart"/>
-      <w:proofErr w:type="gramStart"/>
-      <w:r>
-        <w:t>orders</w:t>
-      </w:r>
-      <w:proofErr w:type="gramEnd"/>
-      <w:r>
-        <w:t>_channel</w:t>
-      </w:r>
-      <w:proofErr w:type="spellEnd"/>
-      <w:r>
-        <w:t>' = The radio station name (you can name it anything)</w:t>
+        <w:t>'orders_channel' = The radio station name (you can name it anything)</w:t>
       </w:r>
     </w:p>
     <w:p>
@@ -1196,39 +607,7 @@
           <w:b/>
           <w:bCs/>
         </w:rPr>
-        <w:t xml:space="preserve">Step 5: Node.js calls </w:t>
-      </w:r>
-      <w:proofErr w:type="spellStart"/>
-      <w:r>
-        <w:rPr>
-          <w:b/>
-          <w:bCs/>
-        </w:rPr>
-        <w:t>view_available_</w:t>
-      </w:r>
-      <w:proofErr w:type="gramStart"/>
-      <w:r>
-        <w:rPr>
-          <w:b/>
-          <w:bCs/>
-        </w:rPr>
-        <w:t>orders</w:t>
-      </w:r>
-      <w:proofErr w:type="spellEnd"/>
-      <w:r>
-        <w:rPr>
-          <w:b/>
-          <w:bCs/>
-        </w:rPr>
-        <w:t>(</w:t>
-      </w:r>
-      <w:proofErr w:type="gramEnd"/>
-      <w:r>
-        <w:rPr>
-          <w:b/>
-          <w:bCs/>
-        </w:rPr>
-        <w:t>)</w:t>
+        <w:t>Step 5: Node.js calls view_available_orders()</w:t>
       </w:r>
     </w:p>
     <w:p>
@@ -1340,37 +719,12 @@
           <w:numId w:val="8"/>
         </w:numPr>
       </w:pPr>
-      <w:proofErr w:type="spellStart"/>
-      <w:r>
-        <w:rPr>
-          <w:b/>
-          <w:bCs/>
-        </w:rPr>
-        <w:t>view_available_</w:t>
-      </w:r>
-      <w:proofErr w:type="gramStart"/>
-      <w:r>
-        <w:rPr>
-          <w:b/>
-          <w:bCs/>
-        </w:rPr>
-        <w:t>orders</w:t>
-      </w:r>
-      <w:proofErr w:type="spellEnd"/>
-      <w:r>
-        <w:rPr>
-          <w:b/>
-          <w:bCs/>
-        </w:rPr>
-        <w:t>(</w:t>
-      </w:r>
-      <w:proofErr w:type="gramEnd"/>
-      <w:r>
-        <w:rPr>
-          <w:b/>
-          <w:bCs/>
-        </w:rPr>
-        <w:t>) is NOT called by the trigger</w:t>
+      <w:r>
+        <w:rPr>
+          <w:b/>
+          <w:bCs/>
+        </w:rPr>
+        <w:t>view_available_orders() is NOT called by the trigger</w:t>
       </w:r>
     </w:p>
     <w:p>
@@ -1494,38 +848,13 @@
       </w:r>
     </w:p>
     <w:p>
-      <w:proofErr w:type="spellStart"/>
-      <w:proofErr w:type="gramStart"/>
-      <w:r>
-        <w:t>client.on</w:t>
-      </w:r>
-      <w:proofErr w:type="spellEnd"/>
-      <w:proofErr w:type="gramEnd"/>
-      <w:r>
-        <w:t>('notification', (msg) =&gt; {</w:t>
-      </w:r>
-    </w:p>
-    <w:p>
-      <w:r>
-        <w:t>    if (</w:t>
-      </w:r>
-      <w:proofErr w:type="spellStart"/>
-      <w:proofErr w:type="gramStart"/>
-      <w:r>
-        <w:t>msg.channel</w:t>
-      </w:r>
-      <w:proofErr w:type="spellEnd"/>
-      <w:proofErr w:type="gramEnd"/>
-      <w:r>
-        <w:t xml:space="preserve"> === '</w:t>
-      </w:r>
-      <w:proofErr w:type="spellStart"/>
-      <w:r>
-        <w:t>orders_channel</w:t>
-      </w:r>
-      <w:proofErr w:type="spellEnd"/>
-      <w:r>
-        <w:t>') {</w:t>
+      <w:r>
+        <w:t>client.on('notification', (msg) =&gt; {</w:t>
+      </w:r>
+    </w:p>
+    <w:p>
+      <w:r>
+        <w:t>    if (msg.channel === 'orders_channel') {</w:t>
       </w:r>
     </w:p>
     <w:p>
@@ -1535,39 +864,8 @@
     </w:p>
     <w:p>
       <w:r>
-        <w:t xml:space="preserve">        const orders = await </w:t>
-      </w:r>
-      <w:proofErr w:type="spellStart"/>
-      <w:proofErr w:type="gramStart"/>
-      <w:r>
-        <w:t>db.query</w:t>
-      </w:r>
-      <w:proofErr w:type="spellEnd"/>
-      <w:proofErr w:type="gramEnd"/>
-      <w:r>
-        <w:t xml:space="preserve">('SELECT </w:t>
-      </w:r>
-      <w:proofErr w:type="spellStart"/>
-      <w:r>
-        <w:t>view_available_</w:t>
-      </w:r>
-      <w:proofErr w:type="gramStart"/>
-      <w:r>
-        <w:t>orders</w:t>
-      </w:r>
-      <w:proofErr w:type="spellEnd"/>
-      <w:r>
-        <w:t>(</w:t>
-      </w:r>
-      <w:proofErr w:type="gramEnd"/>
-      <w:r>
-        <w:t>)'</w:t>
-      </w:r>
-      <w:proofErr w:type="gramStart"/>
-      <w:r>
-        <w:t>);</w:t>
-      </w:r>
-      <w:proofErr w:type="gramEnd"/>
+        <w:t>        const orders = await db.query('SELECT view_available_orders()');</w:t>
+      </w:r>
     </w:p>
     <w:p>
       <w:r>
@@ -1581,31 +879,8 @@
     </w:p>
     <w:p>
       <w:r>
-        <w:t xml:space="preserve">        </w:t>
-      </w:r>
-      <w:proofErr w:type="spellStart"/>
-      <w:proofErr w:type="gramStart"/>
-      <w:r>
-        <w:t>io.emit</w:t>
-      </w:r>
-      <w:proofErr w:type="spellEnd"/>
-      <w:proofErr w:type="gramEnd"/>
-      <w:r>
-        <w:t>('</w:t>
-      </w:r>
-      <w:proofErr w:type="spellStart"/>
-      <w:r>
-        <w:t>orders_updated</w:t>
-      </w:r>
-      <w:proofErr w:type="spellEnd"/>
-      <w:r>
-        <w:t>', orders</w:t>
-      </w:r>
-      <w:proofErr w:type="gramStart"/>
-      <w:r>
-        <w:t>);</w:t>
-      </w:r>
-      <w:proofErr w:type="gramEnd"/>
+        <w:t>        io.emit('orders_updated', orders);</w:t>
+      </w:r>
     </w:p>
     <w:p>
       <w:r>
@@ -1614,34 +889,13 @@
     </w:p>
     <w:p>
       <w:r>
-        <w:t>}</w:t>
-      </w:r>
-      <w:proofErr w:type="gramStart"/>
-      <w:r>
-        <w:t>);</w:t>
-      </w:r>
-      <w:proofErr w:type="gramEnd"/>
+        <w:t>});</w:t>
+      </w:r>
     </w:p>
     <w:p/>
     <w:p>
       <w:r>
-        <w:t xml:space="preserve">Why not call directly the fn in trigger? Because trigger </w:t>
-      </w:r>
-      <w:proofErr w:type="gramStart"/>
-      <w:r>
-        <w:t>cant</w:t>
-      </w:r>
-      <w:proofErr w:type="gramEnd"/>
-      <w:r>
-        <w:t xml:space="preserve"> do anything with the data. It </w:t>
-      </w:r>
-      <w:proofErr w:type="gramStart"/>
-      <w:r>
-        <w:t>cant</w:t>
-      </w:r>
-      <w:proofErr w:type="gramEnd"/>
-      <w:r>
-        <w:t xml:space="preserve"> return the data back to backend</w:t>
+        <w:t>Why not call directly the fn in trigger? Because trigger cant do anything with the data. It cant return the data back to backend</w:t>
       </w:r>
     </w:p>
     <w:p>
@@ -1650,36 +904,7 @@
         <w:br/>
       </w:r>
       <w:r>
-        <w:t xml:space="preserve">ok so some updates there will be no </w:t>
-      </w:r>
-      <w:proofErr w:type="spellStart"/>
-      <w:r>
-        <w:t>transpation</w:t>
-      </w:r>
-      <w:proofErr w:type="spellEnd"/>
-      <w:r>
-        <w:t xml:space="preserve"> cost in my recommended fare calculation. we will only allow 7 </w:t>
-      </w:r>
-      <w:proofErr w:type="spellStart"/>
-      <w:proofErr w:type="gramStart"/>
-      <w:r>
-        <w:t>quantites</w:t>
-      </w:r>
-      <w:proofErr w:type="spellEnd"/>
-      <w:r>
-        <w:t xml:space="preserve">  to</w:t>
-      </w:r>
-      <w:proofErr w:type="gramEnd"/>
-      <w:r>
-        <w:t xml:space="preserve"> be </w:t>
-      </w:r>
-      <w:proofErr w:type="spellStart"/>
-      <w:r>
-        <w:t>choesn</w:t>
-      </w:r>
-      <w:proofErr w:type="spellEnd"/>
-      <w:r>
-        <w:t>.</w:t>
+        <w:t>ok so some updates there will be no transpation cost in my recommended fare calculation. we will only allow 7 quantites  to be choesn.</w:t>
       </w:r>
     </w:p>
     <w:p>
@@ -1750,21 +975,8 @@
         <w:t>Geocoding API</w:t>
       </w:r>
       <w:r>
-        <w:t xml:space="preserve"> → Convert address to </w:t>
-      </w:r>
-      <w:proofErr w:type="spellStart"/>
-      <w:r>
-        <w:t>lat</w:t>
-      </w:r>
-      <w:proofErr w:type="spellEnd"/>
-      <w:r>
-        <w:t>/</w:t>
-      </w:r>
-      <w:proofErr w:type="spellStart"/>
-      <w:r>
-        <w:t>lng</w:t>
-      </w:r>
-      <w:proofErr w:type="spellEnd"/>
+        <w:t> → Convert address to lat/lng</w:t>
+      </w:r>
     </w:p>
     <w:p>
       <w:pPr>
@@ -1929,13 +1141,8 @@
         <w:t>Geocoding:</w:t>
       </w:r>
       <w:r>
-        <w:t> </w:t>
-      </w:r>
-      <w:proofErr w:type="spellStart"/>
-      <w:r>
-        <w:t>Nominatim</w:t>
-      </w:r>
-      <w:proofErr w:type="spellEnd"/>
+        <w:t> Nominatim</w:t>
+      </w:r>
     </w:p>
     <w:p>
       <w:pPr>
@@ -1952,15 +1159,7 @@
         <w:t>Real-time:</w:t>
       </w:r>
       <w:r>
-        <w:t> </w:t>
-      </w:r>
-      <w:proofErr w:type="spellStart"/>
-      <w:r>
-        <w:t>WebSockets</w:t>
-      </w:r>
-      <w:proofErr w:type="spellEnd"/>
-      <w:r>
-        <w:t xml:space="preserve"> (you already planned this)</w:t>
+        <w:t> WebSockets (you already planned this)</w:t>
       </w:r>
     </w:p>
     <w:p>
@@ -2010,39 +1209,7 @@
     <w:p>
       <w:r>
         <w:lastRenderedPageBreak/>
-        <w:t xml:space="preserve">well </w:t>
-      </w:r>
-      <w:proofErr w:type="spellStart"/>
-      <w:r>
-        <w:t>i</w:t>
-      </w:r>
-      <w:proofErr w:type="spellEnd"/>
-      <w:r>
-        <w:t xml:space="preserve"> also wanted the frontend to </w:t>
-      </w:r>
-      <w:proofErr w:type="spellStart"/>
-      <w:r>
-        <w:t>dispaly</w:t>
-      </w:r>
-      <w:proofErr w:type="spellEnd"/>
-      <w:r>
-        <w:t xml:space="preserve"> the driver coming to a location so in real time his </w:t>
-      </w:r>
-      <w:proofErr w:type="spellStart"/>
-      <w:r>
-        <w:t>lication</w:t>
-      </w:r>
-      <w:proofErr w:type="spellEnd"/>
-      <w:r>
-        <w:t xml:space="preserve"> can be seen by the </w:t>
-      </w:r>
-      <w:proofErr w:type="spellStart"/>
-      <w:r>
-        <w:t>cusotmer</w:t>
-      </w:r>
-      <w:proofErr w:type="spellEnd"/>
-      <w:r>
-        <w:t xml:space="preserve"> when he is coming after acceptance of an order. can that also be free</w:t>
+        <w:t>well i also wanted the frontend to dispaly the driver coming to a location so in real time his lication can be seen by the cusotmer when he is coming after acceptance of an order. can that also be free</w:t>
       </w:r>
     </w:p>
     <w:p>
@@ -2173,23 +1340,7 @@
           <w:b/>
           <w:bCs/>
         </w:rPr>
-        <w:t xml:space="preserve">2. Backend (Node.js + </w:t>
-      </w:r>
-      <w:proofErr w:type="spellStart"/>
-      <w:r>
-        <w:rPr>
-          <w:b/>
-          <w:bCs/>
-        </w:rPr>
-        <w:t>WebSockets</w:t>
-      </w:r>
-      <w:proofErr w:type="spellEnd"/>
-      <w:r>
-        <w:rPr>
-          <w:b/>
-          <w:bCs/>
-        </w:rPr>
-        <w:t>)</w:t>
+        <w:t>2. Backend (Node.js + WebSockets)</w:t>
       </w:r>
     </w:p>
     <w:p>
@@ -2233,15 +1384,7 @@
         <w:t>Cost:</w:t>
       </w:r>
       <w:r>
-        <w:t xml:space="preserve"> $0 - </w:t>
-      </w:r>
-      <w:proofErr w:type="spellStart"/>
-      <w:r>
-        <w:t>WebSockets</w:t>
-      </w:r>
-      <w:proofErr w:type="spellEnd"/>
-      <w:r>
-        <w:t xml:space="preserve"> (socket.io) is free</w:t>
+        <w:t> $0 - WebSockets (socket.io) is free</w:t>
       </w:r>
     </w:p>
     <w:p>
@@ -2588,13 +1731,8 @@
             <w:hideMark/>
           </w:tcPr>
           <w:p>
-            <w:proofErr w:type="spellStart"/>
             <w:r>
-              <w:t>WebSockets</w:t>
-            </w:r>
-            <w:proofErr w:type="spellEnd"/>
-            <w:r>
-              <w:t xml:space="preserve"> (socket.io)</w:t>
+              <w:t>WebSockets (socket.io)</w:t>
             </w:r>
           </w:p>
         </w:tc>
@@ -2893,15 +2031,7 @@
         <w:t>Every 5-10 seconds</w:t>
       </w:r>
       <w:r>
-        <w:t xml:space="preserve"> - </w:t>
-      </w:r>
-      <w:proofErr w:type="gramStart"/>
-      <w:r>
-        <w:t>Good</w:t>
-      </w:r>
-      <w:proofErr w:type="gramEnd"/>
-      <w:r>
-        <w:t xml:space="preserve"> balance (not too much data)</w:t>
+        <w:t> - Good balance (not too much data)</w:t>
       </w:r>
     </w:p>
     <w:p>
@@ -2949,15 +2079,7 @@
     <w:p>
       <w:r>
         <w:lastRenderedPageBreak/>
-        <w:t xml:space="preserve">Added a </w:t>
-      </w:r>
-      <w:proofErr w:type="spellStart"/>
-      <w:r>
-        <w:t>constraitn</w:t>
-      </w:r>
-      <w:proofErr w:type="spellEnd"/>
-      <w:r>
-        <w:t xml:space="preserve"> on table of orders that there cannot be more than one order for a customer with status = ‘open’</w:t>
+        <w:t>Added a constraitn on table of orders that there cannot be more than one order for a customer with status = ‘open’</w:t>
       </w:r>
     </w:p>
     <w:p>
@@ -2974,28 +2096,12 @@
     </w:p>
     <w:p>
       <w:r>
-        <w:t xml:space="preserve">Supplier sends a bid using a submit bid fn were first it will be checked if that order status is still open and if the </w:t>
-      </w:r>
-      <w:proofErr w:type="spellStart"/>
-      <w:r>
-        <w:t>supplier_id</w:t>
-      </w:r>
-      <w:proofErr w:type="spellEnd"/>
-      <w:r>
-        <w:t xml:space="preserve"> for that order is null or not</w:t>
-      </w:r>
-    </w:p>
-    <w:p>
-      <w:r>
-        <w:t xml:space="preserve">If </w:t>
-      </w:r>
-      <w:proofErr w:type="gramStart"/>
-      <w:r>
-        <w:t>yes</w:t>
-      </w:r>
-      <w:proofErr w:type="gramEnd"/>
-      <w:r>
-        <w:t xml:space="preserve"> then submit bid </w:t>
+        <w:t>Supplier sends a bid using a submit bid fn were first it will be checked if that order status is still open and if the supplier_id for that order is null or not</w:t>
+      </w:r>
+    </w:p>
+    <w:p>
+      <w:r>
+        <w:t xml:space="preserve">If yes then submit bid </w:t>
       </w:r>
     </w:p>
     <w:p/>
@@ -3011,31 +2117,7 @@
     </w:p>
     <w:p>
       <w:r>
-        <w:t xml:space="preserve">If it is then </w:t>
-      </w:r>
-      <w:proofErr w:type="gramStart"/>
-      <w:r>
-        <w:t>update</w:t>
-      </w:r>
-      <w:proofErr w:type="gramEnd"/>
-      <w:r>
-        <w:t xml:space="preserve"> the supplier id, accepted price, </w:t>
-      </w:r>
-      <w:proofErr w:type="spellStart"/>
-      <w:r>
-        <w:t>order_accepted_by_supplier</w:t>
-      </w:r>
-      <w:proofErr w:type="spellEnd"/>
-      <w:r>
-        <w:t xml:space="preserve"> </w:t>
-      </w:r>
-      <w:proofErr w:type="gramStart"/>
-      <w:r>
-        <w:t>at  and</w:t>
-      </w:r>
-      <w:proofErr w:type="gramEnd"/>
-      <w:r>
-        <w:t xml:space="preserve"> </w:t>
+        <w:t xml:space="preserve">If it is then update the supplier id, accepted price, order_accepted_by_supplier at  and </w:t>
       </w:r>
     </w:p>
     <w:p>
@@ -3046,29 +2128,13 @@
     <w:p/>
     <w:p>
       <w:r>
-        <w:t xml:space="preserve">As soon as this status update happens a trigger will be called for this order where all the bids for that </w:t>
-      </w:r>
-      <w:proofErr w:type="gramStart"/>
-      <w:r>
-        <w:t>order  will</w:t>
-      </w:r>
-      <w:proofErr w:type="gramEnd"/>
-      <w:r>
-        <w:t xml:space="preserve"> be deleted instantly</w:t>
+        <w:t>As soon as this status update happens a trigger will be called for this order where all the bids for that order  will be deleted instantly</w:t>
       </w:r>
     </w:p>
     <w:p/>
     <w:p>
       <w:r>
-        <w:t xml:space="preserve">For accepting bid, the customer id will be sent using the session id from backend (this </w:t>
-      </w:r>
-      <w:proofErr w:type="gramStart"/>
-      <w:r>
-        <w:t>has to</w:t>
-      </w:r>
-      <w:proofErr w:type="gramEnd"/>
-      <w:r>
-        <w:t xml:space="preserve"> be done for others too, for other human/computer interactions</w:t>
+        <w:t>For accepting bid, the customer id will be sent using the session id from backend (this has to be done for others too, for other human/computer interactions</w:t>
       </w:r>
     </w:p>
     <w:p/>
@@ -3084,42 +2150,13 @@
       </w:r>
     </w:p>
     <w:p>
-      <w:proofErr w:type="gramStart"/>
-      <w:r>
-        <w:t>Have to</w:t>
-      </w:r>
-      <w:proofErr w:type="gramEnd"/>
-      <w:r>
-        <w:t xml:space="preserve"> </w:t>
-      </w:r>
-      <w:proofErr w:type="gramStart"/>
-      <w:r>
-        <w:t>remove  the</w:t>
-      </w:r>
-      <w:proofErr w:type="gramEnd"/>
-      <w:r>
-        <w:t xml:space="preserve"> order as soon as timer goes up.</w:t>
-      </w:r>
-    </w:p>
-    <w:p>
-      <w:r>
-        <w:t xml:space="preserve">From the </w:t>
-      </w:r>
-      <w:proofErr w:type="gramStart"/>
-      <w:r>
-        <w:t>orders  table</w:t>
-      </w:r>
-      <w:proofErr w:type="gramEnd"/>
-      <w:r>
-        <w:t xml:space="preserve"> and from </w:t>
-      </w:r>
-      <w:proofErr w:type="gramStart"/>
-      <w:r>
-        <w:t>drivers</w:t>
-      </w:r>
-      <w:proofErr w:type="gramEnd"/>
-      <w:r>
-        <w:t xml:space="preserve"> table</w:t>
+      <w:r>
+        <w:t>Have to remove  the order as soon as timer goes up.</w:t>
+      </w:r>
+    </w:p>
+    <w:p>
+      <w:r>
+        <w:t>From the orders  table and from drivers table</w:t>
       </w:r>
     </w:p>
     <w:p/>
@@ -3129,15 +2166,7 @@
         <w:t>Now remove order fn will be called that will remove the order from the orders side</w:t>
       </w:r>
       <w:r>
-        <w:t xml:space="preserve"> and from the </w:t>
-      </w:r>
-      <w:proofErr w:type="spellStart"/>
-      <w:r>
-        <w:t>driver_assignment</w:t>
-      </w:r>
-      <w:proofErr w:type="spellEnd"/>
-      <w:r>
-        <w:t xml:space="preserve"> table</w:t>
+        <w:t xml:space="preserve"> and from the driver_assignment table</w:t>
       </w:r>
     </w:p>
     <w:p>
@@ -3165,15 +2194,7 @@
     <w:p/>
     <w:p>
       <w:r>
-        <w:t xml:space="preserve">REMINDER: session id </w:t>
-      </w:r>
-      <w:proofErr w:type="gramStart"/>
-      <w:r>
-        <w:t>has to</w:t>
-      </w:r>
-      <w:proofErr w:type="gramEnd"/>
-      <w:r>
-        <w:t xml:space="preserve"> be checked in backend logic as it was not catered here</w:t>
+        <w:t>REMINDER: session id has to be checked in backend logic as it was not catered here</w:t>
       </w:r>
     </w:p>
     <w:p/>
@@ -3187,49 +2208,17 @@
     </w:p>
     <w:p>
       <w:r>
-        <w:t xml:space="preserve">Did this by adding </w:t>
-      </w:r>
-      <w:proofErr w:type="spellStart"/>
-      <w:r>
-        <w:t>anotrer</w:t>
-      </w:r>
-      <w:proofErr w:type="spellEnd"/>
-      <w:r>
-        <w:t xml:space="preserve"> field to </w:t>
-      </w:r>
-      <w:proofErr w:type="spellStart"/>
-      <w:r>
-        <w:t>thebtal</w:t>
-      </w:r>
-      <w:proofErr w:type="spellEnd"/>
-      <w:r>
-        <w:t xml:space="preserve"> called order rejected in driver assignment table</w:t>
-      </w:r>
-    </w:p>
-    <w:p>
-      <w:r>
-        <w:t xml:space="preserve">If assignment already existed but rejected field is </w:t>
-      </w:r>
-      <w:proofErr w:type="gramStart"/>
-      <w:r>
-        <w:t>false</w:t>
-      </w:r>
-      <w:proofErr w:type="gramEnd"/>
-      <w:r>
-        <w:t xml:space="preserve"> then delete that row and reassign and vice versa</w:t>
-      </w:r>
-    </w:p>
-    <w:p>
-      <w:r>
-        <w:t xml:space="preserve">For making button unavailable after </w:t>
-      </w:r>
-      <w:proofErr w:type="spellStart"/>
-      <w:r>
-        <w:t>assigining</w:t>
-      </w:r>
-      <w:proofErr w:type="spellEnd"/>
-      <w:r>
-        <w:t xml:space="preserve">, frontend will handle it in real time </w:t>
+        <w:t>Did this by adding anotrer field to thebtal called order rejected in driver assignment table</w:t>
+      </w:r>
+    </w:p>
+    <w:p>
+      <w:r>
+        <w:t>If assignment already existed but rejected field is false then delete that row and reassign and vice versa</w:t>
+      </w:r>
+    </w:p>
+    <w:p>
+      <w:r>
+        <w:t xml:space="preserve">For making button unavailable after assigining, frontend will handle it in real time </w:t>
       </w:r>
     </w:p>
     <w:p/>
@@ -3270,36 +2259,7 @@
         <w:t>Fetch driver list</w:t>
       </w:r>
       <w:r>
-        <w:t> with </w:t>
-      </w:r>
-      <w:proofErr w:type="spellStart"/>
-      <w:r>
-        <w:t>get_available_drivers_for_</w:t>
-      </w:r>
-      <w:proofErr w:type="gramStart"/>
-      <w:r>
-        <w:t>supplier</w:t>
-      </w:r>
-      <w:proofErr w:type="spellEnd"/>
-      <w:r>
-        <w:t>(</w:t>
-      </w:r>
-      <w:proofErr w:type="spellStart"/>
-      <w:proofErr w:type="gramEnd"/>
-      <w:r>
-        <w:t>supplier_id</w:t>
-      </w:r>
-      <w:proofErr w:type="spellEnd"/>
-      <w:r>
-        <w:t xml:space="preserve">, </w:t>
-      </w:r>
-      <w:proofErr w:type="spellStart"/>
-      <w:r>
-        <w:t>order_id</w:t>
-      </w:r>
-      <w:proofErr w:type="spellEnd"/>
-      <w:r>
-        <w:t>)</w:t>
+        <w:t> with get_available_drivers_for_supplier(supplier_id, order_id)</w:t>
       </w:r>
     </w:p>
     <w:p>
@@ -3310,13 +2270,8 @@
         </w:numPr>
       </w:pPr>
       <w:r>
-        <w:t>Returns each driver with status and </w:t>
-      </w:r>
-      <w:proofErr w:type="spellStart"/>
-      <w:r>
-        <w:t>time_limit</w:t>
-      </w:r>
-      <w:proofErr w:type="spellEnd"/>
+        <w:t>Returns each driver with status and time_limit</w:t>
+      </w:r>
     </w:p>
     <w:p>
       <w:pPr>
@@ -3376,8 +2331,6 @@
         </w:rPr>
         <w:t xml:space="preserve"> (</w:t>
       </w:r>
-      <w:proofErr w:type="spellStart"/>
-      <w:proofErr w:type="gramStart"/>
       <w:r>
         <w:rPr>
           <w:rFonts w:ascii="Consolas" w:eastAsia="Times New Roman" w:hAnsi="Consolas" w:cs="Times New Roman"/>
@@ -3414,8 +2367,6 @@
         </w:rPr>
         <w:t>status</w:t>
       </w:r>
-      <w:proofErr w:type="spellEnd"/>
-      <w:proofErr w:type="gramEnd"/>
       <w:r>
         <w:rPr>
           <w:rFonts w:ascii="Consolas" w:eastAsia="Times New Roman" w:hAnsi="Consolas" w:cs="Times New Roman"/>
@@ -3524,7 +2475,6 @@
         </w:rPr>
         <w:t xml:space="preserve"> </w:t>
       </w:r>
-      <w:proofErr w:type="gramStart"/>
       <w:r>
         <w:rPr>
           <w:rFonts w:ascii="Consolas" w:eastAsia="Times New Roman" w:hAnsi="Consolas" w:cs="Times New Roman"/>
@@ -3547,9 +2497,20 @@
           <w:lang w:eastAsia="en-PK"/>
           <w14:ligatures w14:val="none"/>
         </w:rPr>
-        <w:t>(</w:t>
-      </w:r>
-      <w:proofErr w:type="gramEnd"/>
+        <w:t xml:space="preserve">() &lt; new </w:t>
+      </w:r>
+      <w:r>
+        <w:rPr>
+          <w:rFonts w:ascii="Consolas" w:eastAsia="Times New Roman" w:hAnsi="Consolas" w:cs="Times New Roman"/>
+          <w:color w:val="4EC9B0"/>
+          <w:kern w:val="0"/>
+          <w:sz w:val="21"/>
+          <w:szCs w:val="21"/>
+          <w:lang w:eastAsia="en-PK"/>
+          <w14:ligatures w14:val="none"/>
+        </w:rPr>
+        <w:t>Date</w:t>
+      </w:r>
       <w:r>
         <w:rPr>
           <w:rFonts w:ascii="Consolas" w:eastAsia="Times New Roman" w:hAnsi="Consolas" w:cs="Times New Roman"/>
@@ -3560,71 +2521,7 @@
           <w:lang w:eastAsia="en-PK"/>
           <w14:ligatures w14:val="none"/>
         </w:rPr>
-        <w:t xml:space="preserve">) &lt; new </w:t>
-      </w:r>
-      <w:r>
-        <w:rPr>
-          <w:rFonts w:ascii="Consolas" w:eastAsia="Times New Roman" w:hAnsi="Consolas" w:cs="Times New Roman"/>
-          <w:color w:val="4EC9B0"/>
-          <w:kern w:val="0"/>
-          <w:sz w:val="21"/>
-          <w:szCs w:val="21"/>
-          <w:lang w:eastAsia="en-PK"/>
-          <w14:ligatures w14:val="none"/>
-        </w:rPr>
-        <w:t>Date</w:t>
-      </w:r>
-      <w:r>
-        <w:rPr>
-          <w:rFonts w:ascii="Consolas" w:eastAsia="Times New Roman" w:hAnsi="Consolas" w:cs="Times New Roman"/>
-          <w:color w:val="CCCCCC"/>
-          <w:kern w:val="0"/>
-          <w:sz w:val="21"/>
-          <w:szCs w:val="21"/>
-          <w:lang w:eastAsia="en-PK"/>
-          <w14:ligatures w14:val="none"/>
-        </w:rPr>
-        <w:t>(</w:t>
-      </w:r>
-      <w:proofErr w:type="spellStart"/>
-      <w:proofErr w:type="gramStart"/>
-      <w:r>
-        <w:rPr>
-          <w:rFonts w:ascii="Consolas" w:eastAsia="Times New Roman" w:hAnsi="Consolas" w:cs="Times New Roman"/>
-          <w:color w:val="CCCCCC"/>
-          <w:kern w:val="0"/>
-          <w:sz w:val="21"/>
-          <w:szCs w:val="21"/>
-          <w:lang w:eastAsia="en-PK"/>
-          <w14:ligatures w14:val="none"/>
-        </w:rPr>
-        <w:t>driver.time</w:t>
-      </w:r>
-      <w:proofErr w:type="gramEnd"/>
-      <w:r>
-        <w:rPr>
-          <w:rFonts w:ascii="Consolas" w:eastAsia="Times New Roman" w:hAnsi="Consolas" w:cs="Times New Roman"/>
-          <w:color w:val="CCCCCC"/>
-          <w:kern w:val="0"/>
-          <w:sz w:val="21"/>
-          <w:szCs w:val="21"/>
-          <w:lang w:eastAsia="en-PK"/>
-          <w14:ligatures w14:val="none"/>
-        </w:rPr>
-        <w:t>_limit</w:t>
-      </w:r>
-      <w:proofErr w:type="spellEnd"/>
-      <w:r>
-        <w:rPr>
-          <w:rFonts w:ascii="Consolas" w:eastAsia="Times New Roman" w:hAnsi="Consolas" w:cs="Times New Roman"/>
-          <w:color w:val="CCCCCC"/>
-          <w:kern w:val="0"/>
-          <w:sz w:val="21"/>
-          <w:szCs w:val="21"/>
-          <w:lang w:eastAsia="en-PK"/>
-          <w14:ligatures w14:val="none"/>
-        </w:rPr>
-        <w:t>)) {</w:t>
+        <w:t>(driver.time_limit)) {</w:t>
       </w:r>
     </w:p>
     <w:p>
@@ -3703,8 +2600,6 @@
         <w:lastRenderedPageBreak/>
         <w:t xml:space="preserve">  </w:t>
       </w:r>
-      <w:proofErr w:type="spellStart"/>
-      <w:proofErr w:type="gramStart"/>
       <w:r>
         <w:rPr>
           <w:rFonts w:ascii="Consolas" w:eastAsia="Times New Roman" w:hAnsi="Consolas" w:cs="Times New Roman"/>
@@ -3741,8 +2636,6 @@
         </w:rPr>
         <w:t>disabled</w:t>
       </w:r>
-      <w:proofErr w:type="spellEnd"/>
-      <w:proofErr w:type="gramEnd"/>
       <w:r>
         <w:rPr>
           <w:rFonts w:ascii="Consolas" w:eastAsia="Times New Roman" w:hAnsi="Consolas" w:cs="Times New Roman"/>
@@ -3779,7 +2672,6 @@
         </w:rPr>
         <w:t xml:space="preserve"> </w:t>
       </w:r>
-      <w:proofErr w:type="gramStart"/>
       <w:r>
         <w:rPr>
           <w:rFonts w:ascii="Consolas" w:eastAsia="Times New Roman" w:hAnsi="Consolas" w:cs="Times New Roman"/>
@@ -3804,7 +2696,6 @@
         </w:rPr>
         <w:t>;</w:t>
       </w:r>
-      <w:proofErr w:type="gramEnd"/>
     </w:p>
     <w:p>
       <w:pPr>
@@ -3885,8 +2776,6 @@
         </w:rPr>
         <w:t xml:space="preserve"> (</w:t>
       </w:r>
-      <w:proofErr w:type="spellStart"/>
-      <w:proofErr w:type="gramStart"/>
       <w:r>
         <w:rPr>
           <w:rFonts w:ascii="Consolas" w:eastAsia="Times New Roman" w:hAnsi="Consolas" w:cs="Times New Roman"/>
@@ -3923,8 +2812,6 @@
         </w:rPr>
         <w:t>status</w:t>
       </w:r>
-      <w:proofErr w:type="spellEnd"/>
-      <w:proofErr w:type="gramEnd"/>
       <w:r>
         <w:rPr>
           <w:rFonts w:ascii="Consolas" w:eastAsia="Times New Roman" w:hAnsi="Consolas" w:cs="Times New Roman"/>
@@ -4061,8 +2948,6 @@
         </w:rPr>
         <w:t xml:space="preserve">  </w:t>
       </w:r>
-      <w:proofErr w:type="spellStart"/>
-      <w:proofErr w:type="gramStart"/>
       <w:r>
         <w:rPr>
           <w:rFonts w:ascii="Consolas" w:eastAsia="Times New Roman" w:hAnsi="Consolas" w:cs="Times New Roman"/>
@@ -4099,8 +2984,6 @@
         </w:rPr>
         <w:t>disabled</w:t>
       </w:r>
-      <w:proofErr w:type="spellEnd"/>
-      <w:proofErr w:type="gramEnd"/>
       <w:r>
         <w:rPr>
           <w:rFonts w:ascii="Consolas" w:eastAsia="Times New Roman" w:hAnsi="Consolas" w:cs="Times New Roman"/>
@@ -4137,7 +3020,6 @@
         </w:rPr>
         <w:t xml:space="preserve"> </w:t>
       </w:r>
-      <w:proofErr w:type="gramStart"/>
       <w:r>
         <w:rPr>
           <w:rFonts w:ascii="Consolas" w:eastAsia="Times New Roman" w:hAnsi="Consolas" w:cs="Times New Roman"/>
@@ -4162,7 +3044,6 @@
         </w:rPr>
         <w:t>;</w:t>
       </w:r>
-      <w:proofErr w:type="gramEnd"/>
     </w:p>
     <w:p>
       <w:pPr>
@@ -4195,7 +3076,6 @@
         </w:rPr>
         <w:t xml:space="preserve">  </w:t>
       </w:r>
-      <w:proofErr w:type="spellStart"/>
       <w:r>
         <w:rPr>
           <w:rFonts w:ascii="Consolas" w:eastAsia="Times New Roman" w:hAnsi="Consolas" w:cs="Times New Roman"/>
@@ -4256,7 +3136,6 @@
         </w:rPr>
         <w:t>add</w:t>
       </w:r>
-      <w:proofErr w:type="spellEnd"/>
       <w:r>
         <w:rPr>
           <w:rFonts w:ascii="Consolas" w:eastAsia="Times New Roman" w:hAnsi="Consolas" w:cs="Times New Roman"/>
@@ -4281,7 +3160,6 @@
         </w:rPr>
         <w:t>'rejected'</w:t>
       </w:r>
-      <w:proofErr w:type="gramStart"/>
       <w:r>
         <w:rPr>
           <w:rFonts w:ascii="Consolas" w:eastAsia="Times New Roman" w:hAnsi="Consolas" w:cs="Times New Roman"/>
@@ -4294,7 +3172,6 @@
         </w:rPr>
         <w:t>);</w:t>
       </w:r>
-      <w:proofErr w:type="gramEnd"/>
     </w:p>
     <w:p>
       <w:pPr>
@@ -4427,8 +3304,6 @@
         </w:rPr>
         <w:t xml:space="preserve">  </w:t>
       </w:r>
-      <w:proofErr w:type="spellStart"/>
-      <w:proofErr w:type="gramStart"/>
       <w:r>
         <w:rPr>
           <w:rFonts w:ascii="Consolas" w:eastAsia="Times New Roman" w:hAnsi="Consolas" w:cs="Times New Roman"/>
@@ -4465,8 +3340,6 @@
         </w:rPr>
         <w:t>disabled</w:t>
       </w:r>
-      <w:proofErr w:type="spellEnd"/>
-      <w:proofErr w:type="gramEnd"/>
       <w:r>
         <w:rPr>
           <w:rFonts w:ascii="Consolas" w:eastAsia="Times New Roman" w:hAnsi="Consolas" w:cs="Times New Roman"/>
@@ -4503,7 +3376,6 @@
         </w:rPr>
         <w:t xml:space="preserve"> </w:t>
       </w:r>
-      <w:proofErr w:type="gramStart"/>
       <w:r>
         <w:rPr>
           <w:rFonts w:ascii="Consolas" w:eastAsia="Times New Roman" w:hAnsi="Consolas" w:cs="Times New Roman"/>
@@ -4528,7 +3400,6 @@
         </w:rPr>
         <w:t>;</w:t>
       </w:r>
-      <w:proofErr w:type="gramEnd"/>
     </w:p>
     <w:p>
       <w:pPr>
@@ -4593,23 +3464,7 @@
         </w:numPr>
       </w:pPr>
       <w:r>
-        <w:t>Frontend just calls </w:t>
-      </w:r>
-      <w:proofErr w:type="spellStart"/>
-      <w:r>
-        <w:t>assign_driver_to_</w:t>
-      </w:r>
-      <w:proofErr w:type="gramStart"/>
-      <w:r>
-        <w:t>order</w:t>
-      </w:r>
-      <w:proofErr w:type="spellEnd"/>
-      <w:r>
-        <w:t>(</w:t>
-      </w:r>
-      <w:proofErr w:type="gramEnd"/>
-      <w:r>
-        <w:t>)</w:t>
+        <w:t>Frontend just calls assign_driver_to_order()</w:t>
       </w:r>
     </w:p>
     <w:p>
@@ -4631,15 +3486,7 @@
         </w:numPr>
       </w:pPr>
       <w:r>
-        <w:t>Rejects if </w:t>
-      </w:r>
-      <w:proofErr w:type="spellStart"/>
-      <w:r>
-        <w:t>order_rejected</w:t>
-      </w:r>
-      <w:proofErr w:type="spellEnd"/>
-      <w:r>
-        <w:t xml:space="preserve"> = TRUE</w:t>
+        <w:t>Rejects if order_rejected = TRUE</w:t>
       </w:r>
     </w:p>
     <w:p>
@@ -4650,15 +3497,7 @@
         </w:numPr>
       </w:pPr>
       <w:r>
-        <w:t xml:space="preserve">Deletes </w:t>
-      </w:r>
-      <w:proofErr w:type="gramStart"/>
-      <w:r>
-        <w:t>old expired</w:t>
-      </w:r>
-      <w:proofErr w:type="gramEnd"/>
-      <w:r>
-        <w:t xml:space="preserve"> assignment</w:t>
+        <w:t>Deletes old expired assignment</w:t>
       </w:r>
     </w:p>
     <w:p>
@@ -4695,23 +3534,7 @@
         <w:t>✅</w:t>
       </w:r>
       <w:r>
-        <w:t> </w:t>
-      </w:r>
-      <w:proofErr w:type="spellStart"/>
-      <w:r>
-        <w:t>confirm_order_</w:t>
-      </w:r>
-      <w:proofErr w:type="gramStart"/>
-      <w:r>
-        <w:t>driver</w:t>
-      </w:r>
-      <w:proofErr w:type="spellEnd"/>
-      <w:r>
-        <w:t>(</w:t>
-      </w:r>
-      <w:proofErr w:type="gramEnd"/>
-      <w:r>
-        <w:t>) - checks driver's timer</w:t>
+        <w:t> confirm_order_driver() - checks driver's timer</w:t>
       </w:r>
     </w:p>
     <w:p>
@@ -4728,23 +3551,7 @@
         <w:t>✅</w:t>
       </w:r>
       <w:r>
-        <w:t> </w:t>
-      </w:r>
-      <w:proofErr w:type="spellStart"/>
-      <w:r>
-        <w:t>assign_driver_to_</w:t>
-      </w:r>
-      <w:proofErr w:type="gramStart"/>
-      <w:r>
-        <w:t>order</w:t>
-      </w:r>
-      <w:proofErr w:type="spellEnd"/>
-      <w:r>
-        <w:t>(</w:t>
-      </w:r>
-      <w:proofErr w:type="gramEnd"/>
-      <w:r>
-        <w:t>) - checks rejection status</w:t>
+        <w:t> assign_driver_to_order() - checks rejection status</w:t>
       </w:r>
     </w:p>
     <w:p>
@@ -4773,15 +3580,7 @@
         <w:t>Perfect architecture! No backend timer polling needed.</w:t>
       </w:r>
       <w:r>
-        <w:t> Frontend calculates based on </w:t>
-      </w:r>
-      <w:proofErr w:type="spellStart"/>
-      <w:r>
-        <w:t>time_limit</w:t>
-      </w:r>
-      <w:proofErr w:type="spellEnd"/>
-      <w:r>
-        <w:t> timestamp.</w:t>
+        <w:t> Frontend calculates based on time_limit timestamp.</w:t>
       </w:r>
     </w:p>
     <w:p/>
@@ -4827,15 +3626,7 @@
         <w:t>Initially:</w:t>
       </w:r>
       <w:r>
-        <w:t xml:space="preserve"> All drivers available (no </w:t>
-      </w:r>
-      <w:proofErr w:type="spellStart"/>
-      <w:r>
-        <w:t>driver_assignment</w:t>
-      </w:r>
-      <w:proofErr w:type="spellEnd"/>
-      <w:r>
-        <w:t xml:space="preserve"> rows exist)</w:t>
+        <w:t> All drivers available (no driver_assignment rows exist)</w:t>
       </w:r>
     </w:p>
     <w:p>
@@ -4861,13 +3652,8 @@
         </w:numPr>
       </w:pPr>
       <w:r>
-        <w:t xml:space="preserve">INSERT into </w:t>
-      </w:r>
-      <w:proofErr w:type="spellStart"/>
-      <w:r>
-        <w:t>driver_assignment</w:t>
-      </w:r>
-      <w:proofErr w:type="spellEnd"/>
+        <w:t>INSERT into driver_assignment</w:t>
+      </w:r>
     </w:p>
     <w:p>
       <w:pPr>
@@ -4904,23 +3690,7 @@
       </w:pPr>
       <w:r>
         <w:lastRenderedPageBreak/>
-        <w:t xml:space="preserve">UPDATE </w:t>
-      </w:r>
-      <w:proofErr w:type="spellStart"/>
-      <w:r>
-        <w:t>driver_assignment</w:t>
-      </w:r>
-      <w:proofErr w:type="spellEnd"/>
-      <w:r>
-        <w:t xml:space="preserve"> SET </w:t>
-      </w:r>
-      <w:proofErr w:type="spellStart"/>
-      <w:r>
-        <w:t>order_rejected</w:t>
-      </w:r>
-      <w:proofErr w:type="spellEnd"/>
-      <w:r>
-        <w:t xml:space="preserve"> = TRUE</w:t>
+        <w:t>UPDATE driver_assignment SET order_rejected = TRUE</w:t>
       </w:r>
     </w:p>
     <w:p>
@@ -4978,44 +3748,18 @@
           <w:b/>
           <w:bCs/>
         </w:rPr>
-        <w:t xml:space="preserve">Add TRIGGER on </w:t>
-      </w:r>
-      <w:proofErr w:type="spellStart"/>
-      <w:r>
-        <w:rPr>
-          <w:b/>
-          <w:bCs/>
-        </w:rPr>
-        <w:t>driver_assignment</w:t>
-      </w:r>
-      <w:proofErr w:type="spellEnd"/>
-      <w:r>
-        <w:rPr>
-          <w:b/>
-          <w:bCs/>
-        </w:rPr>
-        <w:t xml:space="preserve"> (like we have for orders):</w:t>
-      </w:r>
-    </w:p>
-    <w:p>
-      <w:r>
-        <w:t xml:space="preserve">CREATE TRIGGER </w:t>
-      </w:r>
-      <w:proofErr w:type="spellStart"/>
-      <w:r>
-        <w:t>trigger_notify_driver_assignment_updated</w:t>
-      </w:r>
-      <w:proofErr w:type="spellEnd"/>
-    </w:p>
-    <w:p>
-      <w:r>
-        <w:t xml:space="preserve">    AFTER INSERT OR UPDATE OR DELETE ON </w:t>
-      </w:r>
-      <w:proofErr w:type="spellStart"/>
-      <w:r>
-        <w:t>driver_assignment</w:t>
-      </w:r>
-      <w:proofErr w:type="spellEnd"/>
+        <w:t>Add TRIGGER on driver_assignment (like we have for orders):</w:t>
+      </w:r>
+    </w:p>
+    <w:p>
+      <w:r>
+        <w:t>CREATE TRIGGER trigger_notify_driver_assignment_updated</w:t>
+      </w:r>
+    </w:p>
+    <w:p>
+      <w:r>
+        <w:t xml:space="preserve">    AFTER INSERT OR UPDATE OR DELETE ON driver_assignment</w:t>
+      </w:r>
     </w:p>
     <w:p>
       <w:r>
@@ -5024,21 +3768,8 @@
     </w:p>
     <w:p>
       <w:r>
-        <w:t xml:space="preserve">    EXECUTE FUNCTION </w:t>
-      </w:r>
-      <w:proofErr w:type="spellStart"/>
-      <w:r>
-        <w:t>notify_driver_assignment_</w:t>
-      </w:r>
-      <w:proofErr w:type="gramStart"/>
-      <w:r>
-        <w:t>updated</w:t>
-      </w:r>
-      <w:proofErr w:type="spellEnd"/>
-      <w:r>
-        <w:t>();</w:t>
-      </w:r>
-      <w:proofErr w:type="gramEnd"/>
+        <w:t xml:space="preserve">    EXECUTE FUNCTION notify_driver_assignment_updated();</w:t>
+      </w:r>
     </w:p>
     <w:p/>
     <w:p>
@@ -5058,92 +3789,23 @@
     </w:p>
     <w:p>
       <w:r>
-        <w:t xml:space="preserve">// Listen to </w:t>
-      </w:r>
-      <w:proofErr w:type="spellStart"/>
-      <w:r>
-        <w:t>driver_assignment_channel</w:t>
-      </w:r>
-      <w:proofErr w:type="spellEnd"/>
-    </w:p>
-    <w:p>
-      <w:proofErr w:type="spellStart"/>
-      <w:proofErr w:type="gramStart"/>
-      <w:r>
-        <w:t>client.on</w:t>
-      </w:r>
-      <w:proofErr w:type="spellEnd"/>
-      <w:proofErr w:type="gramEnd"/>
-      <w:r>
-        <w:t>('notification', (msg) =&gt; {</w:t>
-      </w:r>
-    </w:p>
-    <w:p>
-      <w:r>
-        <w:t>  if (</w:t>
-      </w:r>
-      <w:proofErr w:type="spellStart"/>
-      <w:proofErr w:type="gramStart"/>
-      <w:r>
-        <w:t>msg.channel</w:t>
-      </w:r>
-      <w:proofErr w:type="spellEnd"/>
-      <w:proofErr w:type="gramEnd"/>
-      <w:r>
-        <w:t xml:space="preserve"> === '</w:t>
-      </w:r>
-      <w:proofErr w:type="spellStart"/>
-      <w:r>
-        <w:t>driver_assignment_channel</w:t>
-      </w:r>
-      <w:proofErr w:type="spellEnd"/>
-      <w:r>
-        <w:t>') {</w:t>
-      </w:r>
-    </w:p>
-    <w:p>
-      <w:r>
-        <w:t xml:space="preserve">    </w:t>
-      </w:r>
-      <w:proofErr w:type="spellStart"/>
-      <w:proofErr w:type="gramStart"/>
-      <w:r>
-        <w:t>io.emit</w:t>
-      </w:r>
-      <w:proofErr w:type="spellEnd"/>
-      <w:proofErr w:type="gramEnd"/>
-      <w:r>
-        <w:t>('</w:t>
-      </w:r>
-      <w:proofErr w:type="spellStart"/>
-      <w:r>
-        <w:t>driver_assignment_update</w:t>
-      </w:r>
-      <w:proofErr w:type="spellEnd"/>
-      <w:r>
-        <w:t xml:space="preserve">', </w:t>
-      </w:r>
-      <w:proofErr w:type="gramStart"/>
-      <w:r>
-        <w:t xml:space="preserve">{ </w:t>
-      </w:r>
-      <w:proofErr w:type="spellStart"/>
-      <w:r>
-        <w:t>order</w:t>
-      </w:r>
-      <w:proofErr w:type="gramEnd"/>
-      <w:r>
-        <w:t>_id</w:t>
-      </w:r>
-      <w:proofErr w:type="spellEnd"/>
-      <w:r>
-        <w:t xml:space="preserve">: </w:t>
-      </w:r>
-      <w:proofErr w:type="gramStart"/>
-      <w:r>
-        <w:t>... });</w:t>
-      </w:r>
-      <w:proofErr w:type="gramEnd"/>
+        <w:t>// Listen to driver_assignment_channel</w:t>
+      </w:r>
+    </w:p>
+    <w:p>
+      <w:r>
+        <w:t>client.on('notification', (msg) =&gt; {</w:t>
+      </w:r>
+    </w:p>
+    <w:p>
+      <w:r>
+        <w:t>  if (msg.channel === 'driver_assignment_channel') {</w:t>
+      </w:r>
+    </w:p>
+    <w:p>
+      <w:r>
+        <w:t>    io.emit('driver_assignment_update', { order_id: ... });</w:t>
+      </w:r>
     </w:p>
     <w:p>
       <w:r>
@@ -5152,13 +3814,8 @@
     </w:p>
     <w:p>
       <w:r>
-        <w:t>}</w:t>
-      </w:r>
-      <w:proofErr w:type="gramStart"/>
-      <w:r>
-        <w:t>);</w:t>
-      </w:r>
-      <w:proofErr w:type="gramEnd"/>
+        <w:t>});</w:t>
+      </w:r>
     </w:p>
     <w:p>
       <w:pPr>
@@ -5203,23 +3860,7 @@
           <w:b/>
           <w:bCs/>
         </w:rPr>
-        <w:t xml:space="preserve">Added available flag in </w:t>
-      </w:r>
-      <w:proofErr w:type="spellStart"/>
-      <w:r>
-        <w:rPr>
-          <w:b/>
-          <w:bCs/>
-        </w:rPr>
-        <w:t>supplier_Driver</w:t>
-      </w:r>
-      <w:proofErr w:type="spellEnd"/>
-      <w:r>
-        <w:rPr>
-          <w:b/>
-          <w:bCs/>
-        </w:rPr>
-        <w:t xml:space="preserve"> table which is set to false when a driver has been assigned to an order</w:t>
+        <w:t>Added available flag in supplier_Driver table which is set to false when a driver has been assigned to an order</w:t>
       </w:r>
     </w:p>
     <w:p>
@@ -5276,15 +3917,7 @@
     </w:p>
     <w:p>
       <w:r>
-        <w:t xml:space="preserve">Now only the delivery process and the ride finish </w:t>
-      </w:r>
-      <w:proofErr w:type="gramStart"/>
-      <w:r>
-        <w:t>has</w:t>
-      </w:r>
-      <w:proofErr w:type="gramEnd"/>
-      <w:r>
-        <w:t xml:space="preserve"> to be taken care of as well as order history</w:t>
+        <w:t>Now only the delivery process and the ride finish has to be taken care of as well as order history</w:t>
       </w:r>
     </w:p>
     <w:p>
@@ -5300,23 +3933,7 @@
     <w:p/>
     <w:p>
       <w:r>
-        <w:t xml:space="preserve">The real time changes on tables and other things on </w:t>
-      </w:r>
-      <w:proofErr w:type="spellStart"/>
-      <w:r>
-        <w:t>db</w:t>
-      </w:r>
-      <w:proofErr w:type="spellEnd"/>
-      <w:r>
-        <w:t xml:space="preserve"> side will be only noticed used trigger on </w:t>
-      </w:r>
-      <w:proofErr w:type="spellStart"/>
-      <w:r>
-        <w:t>db</w:t>
-      </w:r>
-      <w:proofErr w:type="spellEnd"/>
-      <w:r>
-        <w:t xml:space="preserve"> logic.</w:t>
+        <w:t>The real time changes on tables and other things on db side will be only noticed used trigger on db logic.</w:t>
       </w:r>
     </w:p>
     <w:p>
@@ -5327,80 +3944,16 @@
     <w:p/>
     <w:p>
       <w:r>
-        <w:t xml:space="preserve">Now rating is added but for cancellation we </w:t>
-      </w:r>
-      <w:proofErr w:type="gramStart"/>
-      <w:r>
-        <w:t>have to</w:t>
-      </w:r>
-      <w:proofErr w:type="gramEnd"/>
-      <w:r>
-        <w:t xml:space="preserve"> take care of rating too if driver or supplier cancels it rating falls by 0</w:t>
-      </w:r>
-      <w:r>
-        <w:t xml:space="preserve">.2 for supplier side rating drop will happen if the status was accepted or </w:t>
-      </w:r>
-      <w:proofErr w:type="spellStart"/>
-      <w:r>
-        <w:t>ride_</w:t>
-      </w:r>
-      <w:proofErr w:type="gramStart"/>
-      <w:r>
-        <w:t>started</w:t>
-      </w:r>
-      <w:proofErr w:type="spellEnd"/>
-      <w:r>
-        <w:t xml:space="preserve">  same</w:t>
-      </w:r>
-      <w:proofErr w:type="gramEnd"/>
-      <w:r>
-        <w:t xml:space="preserve"> for </w:t>
-      </w:r>
-      <w:proofErr w:type="gramStart"/>
-      <w:r>
-        <w:t>driver .</w:t>
-      </w:r>
-      <w:proofErr w:type="gramEnd"/>
-      <w:r>
-        <w:t xml:space="preserve"> if customer does it at the accepted or </w:t>
-      </w:r>
-      <w:proofErr w:type="spellStart"/>
-      <w:r>
-        <w:t>ride_started</w:t>
-      </w:r>
-      <w:proofErr w:type="spellEnd"/>
-      <w:r>
-        <w:t xml:space="preserve"> stage then no rating will be updated but reason will be logged in rating table if customer or supplier does it at any stage before accepted then no problem</w:t>
+        <w:t>Now rating is added but for cancellation we have to take care of rating too if driver or supplier cancels it rating falls by 0</w:t>
+      </w:r>
+      <w:r>
+        <w:t>.2 for supplier side rating drop will happen if the status was accepted or ride_started  same for driver . if customer does it at the accepted or ride_started stage then no rating will be updated but reason will be logged in rating table if customer or supplier does it at any stage before accepted then no problem</w:t>
       </w:r>
     </w:p>
     <w:p/>
     <w:p>
       <w:r>
-        <w:t xml:space="preserve">Ok first, if any party </w:t>
-      </w:r>
-      <w:proofErr w:type="gramStart"/>
-      <w:r>
-        <w:t>cancelled  on</w:t>
-      </w:r>
-      <w:proofErr w:type="gramEnd"/>
-      <w:r>
-        <w:t xml:space="preserve"> status that was not accepted or ride started then </w:t>
-      </w:r>
-      <w:proofErr w:type="spellStart"/>
-      <w:r>
-        <w:t>dont</w:t>
-      </w:r>
-      <w:proofErr w:type="spellEnd"/>
-      <w:r>
-        <w:t xml:space="preserve"> log it into </w:t>
-      </w:r>
-      <w:proofErr w:type="spellStart"/>
-      <w:r>
-        <w:t>oder</w:t>
-      </w:r>
-      <w:proofErr w:type="spellEnd"/>
-      <w:r>
-        <w:t xml:space="preserve"> history</w:t>
+        <w:t>Ok first, if any party cancelled  on status that was not accepted or ride started then dont log it into oder history</w:t>
       </w:r>
     </w:p>
     <w:p>
@@ -5410,40 +3963,19 @@
     </w:p>
     <w:p>
       <w:r>
-        <w:t xml:space="preserve">If rider or </w:t>
-      </w:r>
-      <w:proofErr w:type="gramStart"/>
-      <w:r>
-        <w:t>supplier</w:t>
-      </w:r>
-      <w:proofErr w:type="gramEnd"/>
-      <w:r>
-        <w:t xml:space="preserve"> does it, log the reason into ratings table, rating of supplier affected</w:t>
+        <w:t>If rider or supplier does it, log the reason into ratings table, rating of supplier affected</w:t>
       </w:r>
     </w:p>
     <w:p/>
     <w:p/>
     <w:p>
       <w:r>
-        <w:t xml:space="preserve">View past orders list has implemented in </w:t>
-      </w:r>
-      <w:proofErr w:type="spellStart"/>
-      <w:r>
-        <w:t>schema.sql</w:t>
-      </w:r>
-      <w:proofErr w:type="spellEnd"/>
-      <w:r>
-        <w:t xml:space="preserve"> as it is same for all </w:t>
-      </w:r>
-    </w:p>
-    <w:p>
-      <w:proofErr w:type="spellStart"/>
-      <w:r>
-        <w:t>Seperate</w:t>
-      </w:r>
-      <w:proofErr w:type="spellEnd"/>
-      <w:r>
-        <w:t xml:space="preserve"> implementations of view past order details is done due to fetching different data </w:t>
+        <w:t xml:space="preserve">View past orders list has implemented in schema.sql as it is same for all </w:t>
+      </w:r>
+    </w:p>
+    <w:p>
+      <w:r>
+        <w:t xml:space="preserve">Seperate implementations of view past order details is done due to fetching different data </w:t>
       </w:r>
       <w:r>
         <w:t xml:space="preserve">for each user </w:t>
@@ -5463,15 +3995,7 @@
     </w:p>
     <w:p>
       <w:r>
-        <w:t xml:space="preserve">Have made the basic version with middleware and the basic </w:t>
-      </w:r>
-      <w:proofErr w:type="spellStart"/>
-      <w:r>
-        <w:t>apis</w:t>
-      </w:r>
-      <w:proofErr w:type="spellEnd"/>
-      <w:r>
-        <w:t xml:space="preserve"> set up.</w:t>
+        <w:t>Have made the basic version with middleware and the basic apis set up.</w:t>
       </w:r>
     </w:p>
     <w:p>
@@ -5527,47 +4051,7 @@
     <w:p/>
     <w:p>
       <w:r>
-        <w:t xml:space="preserve">I implemented a strict role-lock in the database profile functions so users can set role details only </w:t>
-      </w:r>
-      <w:proofErr w:type="gramStart"/>
-      <w:r>
-        <w:t>once, and</w:t>
-      </w:r>
-      <w:proofErr w:type="gramEnd"/>
-      <w:r>
-        <w:t xml:space="preserve"> never change or update role details afterward. I updated the role check in `</w:t>
-      </w:r>
-      <w:proofErr w:type="spellStart"/>
-      <w:r>
-        <w:t>enter_details_customer</w:t>
-      </w:r>
-      <w:proofErr w:type="spellEnd"/>
-      <w:r>
-        <w:t>`, `</w:t>
-      </w:r>
-      <w:proofErr w:type="spellStart"/>
-      <w:r>
-        <w:t>enter_details_driver</w:t>
-      </w:r>
-      <w:proofErr w:type="spellEnd"/>
-      <w:r>
-        <w:t>`, and `</w:t>
-      </w:r>
-      <w:proofErr w:type="spellStart"/>
-      <w:r>
-        <w:t>enter_details_supplier</w:t>
-      </w:r>
-      <w:proofErr w:type="spellEnd"/>
-      <w:r>
-        <w:t>` to reject when the current role is not `undefined</w:t>
-      </w:r>
-      <w:proofErr w:type="gramStart"/>
-      <w:r>
-        <w:t>`, and</w:t>
-      </w:r>
-      <w:proofErr w:type="gramEnd"/>
-      <w:r>
-        <w:t xml:space="preserve"> standardized the rejection message to: "Role already assigned. Details update is not allowed." I did this </w:t>
+        <w:t xml:space="preserve">I implemented a strict role-lock in the database profile functions so users can set role details only once, and never change or update role details afterward. I updated the role check in `enter_details_customer`, `enter_details_driver`, and `enter_details_supplier` to reject when the current role is not `undefined`, and standardized the rejection message to: "Role already assigned. Details update is not allowed." I did this </w:t>
       </w:r>
       <w:r>
         <w:t>to ensure</w:t>
@@ -5590,114 +4074,66 @@
     <w:p/>
     <w:p/>
     <w:p>
-      <w:pPr>
-        <w:rPr>
-          <w:lang w:val="en-PK"/>
-        </w:rPr>
-      </w:pPr>
       <w:r>
         <w:t xml:space="preserve">I </w:t>
       </w:r>
       <w:r>
-        <w:rPr>
-          <w:lang w:val="en-PK"/>
-        </w:rPr>
         <w:t>added two new supplier-side functions.</w:t>
       </w:r>
     </w:p>
     <w:p>
-      <w:pPr>
-        <w:rPr>
-          <w:lang w:val="en-PK"/>
-        </w:rPr>
-      </w:pPr>
-      <w:r>
-        <w:rPr>
-          <w:lang w:val="en-PK"/>
-        </w:rPr>
+      <w:r>
         <w:t>The first function lets a supplier add a driver phone number to their roster with validation so only a valid supplier can add, duplicate entries are blocked, and phones already tied to another supplier are rejected.</w:t>
       </w:r>
     </w:p>
     <w:p>
-      <w:pPr>
-        <w:rPr>
-          <w:lang w:val="en-PK"/>
-        </w:rPr>
-      </w:pPr>
-      <w:r>
-        <w:rPr>
-          <w:lang w:val="en-PK"/>
-        </w:rPr>
+      <w:r>
         <w:lastRenderedPageBreak/>
         <w:t>The second function lets a supplier remove a driver. It first verifies the driver belongs to that supplier. If the row is only a phone placeholder, it removes just that row. If the driver is linked, it enforces a safety check that the driver must not appear in orders before allowing deletion. After that, it cleans the linked driver data from relevant live tables, deletes sessions, removes the supplier-driver linkage, and deletes the driver user while preserving history.</w:t>
       </w:r>
     </w:p>
     <w:p>
-      <w:pPr>
-        <w:rPr>
-          <w:lang w:val="en-PK"/>
-        </w:rPr>
-      </w:pPr>
-      <w:r>
-        <w:rPr>
-          <w:lang w:val="en-PK"/>
-        </w:rPr>
+      <w:r>
         <w:t>C</w:t>
       </w:r>
       <w:r>
-        <w:rPr>
-          <w:lang w:val="en-PK"/>
-        </w:rPr>
         <w:t>hanged the order history model to store customer, supplier, and driver names and phones directly instead of relying on foreign-key IDs.</w:t>
       </w:r>
     </w:p>
     <w:p>
-      <w:pPr>
-        <w:rPr>
-          <w:lang w:val="en-PK"/>
-        </w:rPr>
-      </w:pPr>
-      <w:r>
-        <w:rPr>
-          <w:lang w:val="en-PK"/>
-        </w:rPr>
+      <w:r>
         <w:t>U</w:t>
       </w:r>
       <w:r>
-        <w:rPr>
-          <w:lang w:val="en-PK"/>
-        </w:rPr>
         <w:t>pdated all related history-writing and history-reading SQL logic so completed and cancelled orders now snapshot names and phones at write time, and later history lookups use those stored values rather than depending on current user records.</w:t>
       </w:r>
     </w:p>
     <w:p>
-      <w:pPr>
-        <w:rPr>
-          <w:lang w:val="en-PK"/>
-        </w:rPr>
-      </w:pPr>
-      <w:r>
-        <w:rPr>
-          <w:lang w:val="en-PK"/>
-        </w:rPr>
+      <w:r>
         <w:t>I also removed the earlier order history driver-id nulling step in the remove-driver function since history now keeps stable name and phone snapshots.</w:t>
       </w:r>
     </w:p>
     <w:p/>
     <w:p/>
     <w:p>
-      <w:proofErr w:type="gramStart"/>
-      <w:r>
-        <w:t>Lastly ,</w:t>
-      </w:r>
-      <w:proofErr w:type="gramEnd"/>
-      <w:r>
-        <w:t xml:space="preserve"> now on driver onboarding, if he exists in the supplier driver table then allow him in.</w:t>
+      <w:r>
+        <w:t>Lastly , now on driver onboarding, if he exists in the supplier driver table then allow him in.</w:t>
       </w:r>
     </w:p>
     <w:p>
       <w:r>
         <w:t>If he doesn’t then remove him from users table and sessions table, force him to re onboard.</w:t>
+      </w:r>
+    </w:p>
+    <w:p/>
+    <w:p>
+      <w:r>
+        <w:t>Rigorous code testing with tweaks done. The authentication and onboarding logic is done and tested.</w:t>
+      </w:r>
+    </w:p>
+    <w:p>
+      <w:r>
+        <w:t>Now onto the frontend to securely complete the feature</w:t>
       </w:r>
     </w:p>
     <w:sectPr>
@@ -9346,6 +7782,7 @@
   <w:style w:type="character" w:default="1" w:styleId="DefaultParagraphFont">
     <w:name w:val="Default Paragraph Font"/>
     <w:uiPriority w:val="1"/>
+    <w:semiHidden/>
     <w:unhideWhenUsed/>
   </w:style>
   <w:style w:type="table" w:default="1" w:styleId="TableNormal">

</xml_diff>

<commit_message>
Added authentication frontend, made and tested driver addition, list viewing and starting an order
</commit_message>
<xml_diff>
--- a/documents/code logic.docx
+++ b/documents/code logic.docx
@@ -4134,6 +4134,37 @@
     <w:p>
       <w:r>
         <w:t>Now onto the frontend to securely complete the feature</w:t>
+      </w:r>
+    </w:p>
+    <w:p/>
+    <w:p/>
+    <w:p/>
+    <w:p/>
+    <w:p>
+      <w:r>
+        <w:t>22/03/2026:</w:t>
+      </w:r>
+    </w:p>
+    <w:p>
+      <w:r>
+        <w:t>Made the frontend using react native and tested the authentication flow</w:t>
+      </w:r>
+    </w:p>
+    <w:p/>
+    <w:p>
+      <w:r>
+        <w:t>Switching back to backend (Moving step by step):</w:t>
+      </w:r>
+    </w:p>
+    <w:p>
+      <w:r>
+        <w:t>Supplier adding and removing drivers and viewing orders and drivers list</w:t>
+      </w:r>
+    </w:p>
+    <w:p>
+      <w:r>
+        <w:lastRenderedPageBreak/>
+        <w:t>Customer starting an order</w:t>
       </w:r>
     </w:p>
     <w:sectPr>

</xml_diff>

<commit_message>
Done and tested: Supplier bids and can view order, customer accepts
</commit_message>
<xml_diff>
--- a/documents/code logic.docx
+++ b/documents/code logic.docx
@@ -4158,13 +4158,76 @@
     </w:p>
     <w:p>
       <w:r>
-        <w:t>Supplier adding and removing drivers and viewing orders and drivers list</w:t>
+        <w:t>Supplier adding and removing drivers and viewing drivers list</w:t>
       </w:r>
     </w:p>
     <w:p>
       <w:r>
         <w:lastRenderedPageBreak/>
         <w:t>Customer starting an order</w:t>
+      </w:r>
+      <w:r>
+        <w:br/>
+      </w:r>
+      <w:r>
+        <w:br/>
+      </w:r>
+      <w:r>
+        <w:br/>
+      </w:r>
+      <w:r>
+        <w:br/>
+        <w:t>24/03/2026:</w:t>
+      </w:r>
+    </w:p>
+    <w:p>
+      <w:r>
+        <w:t>I implemented customer order start with active-order guard so a customer can have only one open order at a time. I added both backend and DB enforcement in START_ORDER to prevent bypass.</w:t>
+      </w:r>
+    </w:p>
+    <w:p/>
+    <w:p>
+      <w:r>
+        <w:t>I enforced supplier bidding eligibility. Supplier can view marketplace list and details, but cannot bid unless they have at least one linked and currently available driver. This is enforced in backend and in send_bid DB function.</w:t>
+      </w:r>
+    </w:p>
+    <w:p/>
+    <w:p>
+      <w:r>
+        <w:t>I made the marketplace list privacy-safe. Supplier available orders now return only order_id, requested_capacity, and customer_bid_price. Full details including customer name and delivery location are returned only to bid-eligible suppliers, implemented in view_order_details with supplier_id check.</w:t>
+      </w:r>
+    </w:p>
+    <w:p/>
+    <w:p>
+      <w:r>
+        <w:t>Also</w:t>
+      </w:r>
+      <w:r>
+        <w:t xml:space="preserve"> implemented supplier bid cooldown and expiry window of 90 seconds in send_bid. Customer bid visibility and acceptance use the same 90-second window, enforced in customer.sql.</w:t>
+      </w:r>
+    </w:p>
+    <w:p>
+      <w:r>
+        <w:t>The window is subject to change. Currently it was increased for testing purposes</w:t>
+      </w:r>
+    </w:p>
+    <w:p>
+      <w:r>
+        <w:t xml:space="preserve">Tested all the new features rigorously </w:t>
+      </w:r>
+      <w:r>
+        <w:br/>
+        <w:t>So far they are working</w:t>
+      </w:r>
+    </w:p>
+    <w:p>
+      <w:r>
+        <w:t>Done till customer accepts order</w:t>
+      </w:r>
+    </w:p>
+    <w:p>
+      <w:r>
+        <w:t>Moving on.</w:t>
       </w:r>
     </w:p>
     <w:sectPr>

</xml_diff>

<commit_message>
Supplier assigning drivers and drivers response: Done and Tested
</commit_message>
<xml_diff>
--- a/documents/code logic.docx
+++ b/documents/code logic.docx
@@ -4177,57 +4177,167 @@
       </w:r>
       <w:r>
         <w:br/>
+        <w:t>2</w:t>
+      </w:r>
+      <w:r>
+        <w:t>3</w:t>
+      </w:r>
+      <w:r>
+        <w:t>/03/2026:</w:t>
+      </w:r>
+    </w:p>
+    <w:p>
+      <w:r>
+        <w:t>I implemented customer order start with active-order guard so a customer can have only one open order at a time. I added both backend and DB enforcement in START_ORDER to prevent bypass.</w:t>
+      </w:r>
+    </w:p>
+    <w:p/>
+    <w:p>
+      <w:r>
+        <w:t xml:space="preserve">I enforced supplier bidding eligibility. Supplier can view marketplace list and </w:t>
+      </w:r>
+      <w:proofErr w:type="gramStart"/>
+      <w:r>
+        <w:t>details, but</w:t>
+      </w:r>
+      <w:proofErr w:type="gramEnd"/>
+      <w:r>
+        <w:t xml:space="preserve"> cannot bid unless they have at least one linked and currently available driver. This is enforced in backend and in </w:t>
+      </w:r>
+      <w:proofErr w:type="spellStart"/>
+      <w:r>
+        <w:t>send_bid</w:t>
+      </w:r>
+      <w:proofErr w:type="spellEnd"/>
+      <w:r>
+        <w:t xml:space="preserve"> DB function.</w:t>
+      </w:r>
+    </w:p>
+    <w:p/>
+    <w:p>
+      <w:r>
+        <w:t xml:space="preserve">I made the marketplace list </w:t>
+      </w:r>
+      <w:proofErr w:type="gramStart"/>
+      <w:r>
+        <w:t>privacy-safe</w:t>
+      </w:r>
+      <w:proofErr w:type="gramEnd"/>
+      <w:r>
+        <w:t xml:space="preserve">. Supplier available orders now return only </w:t>
+      </w:r>
+      <w:proofErr w:type="spellStart"/>
+      <w:r>
+        <w:t>order_id</w:t>
+      </w:r>
+      <w:proofErr w:type="spellEnd"/>
+      <w:r>
+        <w:t xml:space="preserve">, </w:t>
+      </w:r>
+      <w:proofErr w:type="spellStart"/>
+      <w:r>
+        <w:t>requested_capacity</w:t>
+      </w:r>
+      <w:proofErr w:type="spellEnd"/>
+      <w:r>
+        <w:t xml:space="preserve">, and </w:t>
+      </w:r>
+      <w:proofErr w:type="spellStart"/>
+      <w:r>
+        <w:t>customer_bid_price</w:t>
+      </w:r>
+      <w:proofErr w:type="spellEnd"/>
+      <w:r>
+        <w:t xml:space="preserve">. Full details including customer name and delivery location are returned only to bid-eligible suppliers, implemented in </w:t>
+      </w:r>
+      <w:proofErr w:type="spellStart"/>
+      <w:r>
+        <w:t>view_order_details</w:t>
+      </w:r>
+      <w:proofErr w:type="spellEnd"/>
+      <w:r>
+        <w:t xml:space="preserve"> with </w:t>
+      </w:r>
+      <w:proofErr w:type="spellStart"/>
+      <w:r>
+        <w:t>supplier_id</w:t>
+      </w:r>
+      <w:proofErr w:type="spellEnd"/>
+      <w:r>
+        <w:t xml:space="preserve"> check.</w:t>
+      </w:r>
+    </w:p>
+    <w:p/>
+    <w:p>
+      <w:r>
+        <w:t>Also</w:t>
+      </w:r>
+      <w:r>
+        <w:t xml:space="preserve"> implemented supplier bid cooldown and expiry window of 90 seconds in </w:t>
+      </w:r>
+      <w:proofErr w:type="spellStart"/>
+      <w:r>
+        <w:t>send_bid</w:t>
+      </w:r>
+      <w:proofErr w:type="spellEnd"/>
+      <w:r>
+        <w:t xml:space="preserve">. Customer bid visibility and acceptance use the same 90-second window, enforced in </w:t>
+      </w:r>
+      <w:proofErr w:type="spellStart"/>
+      <w:r>
+        <w:t>customer.sql</w:t>
+      </w:r>
+      <w:proofErr w:type="spellEnd"/>
+      <w:r>
+        <w:t>.</w:t>
+      </w:r>
+    </w:p>
+    <w:p>
+      <w:r>
+        <w:t>The window is subject to change. Currently it was increased for testing purposes</w:t>
+      </w:r>
+    </w:p>
+    <w:p>
+      <w:r>
+        <w:t xml:space="preserve">Tested all the new features rigorously </w:t>
+      </w:r>
+      <w:r>
+        <w:br/>
+        <w:t xml:space="preserve">So </w:t>
+      </w:r>
+      <w:proofErr w:type="gramStart"/>
+      <w:r>
+        <w:t>far</w:t>
+      </w:r>
+      <w:proofErr w:type="gramEnd"/>
+      <w:r>
+        <w:t xml:space="preserve"> they are working</w:t>
+      </w:r>
+    </w:p>
+    <w:p>
+      <w:r>
+        <w:t>Done till customer accepts order</w:t>
+      </w:r>
+    </w:p>
+    <w:p>
+      <w:r>
+        <w:t>Moving on.</w:t>
+      </w:r>
+    </w:p>
+    <w:p/>
+    <w:p>
+      <w:r>
         <w:t>24/03/2026:</w:t>
       </w:r>
     </w:p>
     <w:p>
-      <w:r>
-        <w:t>I implemented customer order start with active-order guard so a customer can have only one open order at a time. I added both backend and DB enforcement in START_ORDER to prevent bypass.</w:t>
-      </w:r>
-    </w:p>
-    <w:p/>
-    <w:p>
-      <w:r>
-        <w:t>I enforced supplier bidding eligibility. Supplier can view marketplace list and details, but cannot bid unless they have at least one linked and currently available driver. This is enforced in backend and in send_bid DB function.</w:t>
-      </w:r>
-    </w:p>
-    <w:p/>
-    <w:p>
-      <w:r>
-        <w:t>I made the marketplace list privacy-safe. Supplier available orders now return only order_id, requested_capacity, and customer_bid_price. Full details including customer name and delivery location are returned only to bid-eligible suppliers, implemented in view_order_details with supplier_id check.</w:t>
-      </w:r>
-    </w:p>
-    <w:p/>
-    <w:p>
-      <w:r>
-        <w:t>Also</w:t>
-      </w:r>
-      <w:r>
-        <w:t xml:space="preserve"> implemented supplier bid cooldown and expiry window of 90 seconds in send_bid. Customer bid visibility and acceptance use the same 90-second window, enforced in customer.sql.</w:t>
-      </w:r>
-    </w:p>
-    <w:p>
-      <w:r>
-        <w:t>The window is subject to change. Currently it was increased for testing purposes</w:t>
-      </w:r>
-    </w:p>
-    <w:p>
-      <w:r>
-        <w:t xml:space="preserve">Tested all the new features rigorously </w:t>
-      </w:r>
-      <w:r>
-        <w:br/>
-        <w:t>So far they are working</w:t>
-      </w:r>
-    </w:p>
-    <w:p>
-      <w:r>
-        <w:t>Done till customer accepts order</w:t>
-      </w:r>
-    </w:p>
-    <w:p>
-      <w:r>
-        <w:t>Moving on.</w:t>
+      <w:proofErr w:type="spellStart"/>
+      <w:r>
+        <w:t>Implennted</w:t>
+      </w:r>
+      <w:proofErr w:type="spellEnd"/>
+      <w:r>
+        <w:t xml:space="preserve"> supplier assignment and driver accepting/rejecting order all in their own time limits</w:t>
       </w:r>
     </w:p>
     <w:sectPr>

</xml_diff>

<commit_message>
Added ratings and fixed few errors: Done and Tested... for now
</commit_message>
<xml_diff>
--- a/documents/code logic.docx
+++ b/documents/code logic.docx
@@ -4194,77 +4194,13 @@
     <w:p/>
     <w:p>
       <w:r>
-        <w:t xml:space="preserve">I enforced supplier bidding eligibility. Supplier can view marketplace list and </w:t>
-      </w:r>
-      <w:proofErr w:type="gramStart"/>
-      <w:r>
-        <w:t>details, but</w:t>
-      </w:r>
-      <w:proofErr w:type="gramEnd"/>
-      <w:r>
-        <w:t xml:space="preserve"> cannot bid unless they have at least one linked and currently available driver. This is enforced in backend and in </w:t>
-      </w:r>
-      <w:proofErr w:type="spellStart"/>
-      <w:r>
-        <w:t>send_bid</w:t>
-      </w:r>
-      <w:proofErr w:type="spellEnd"/>
-      <w:r>
-        <w:t xml:space="preserve"> DB function.</w:t>
+        <w:t>I enforced supplier bidding eligibility. Supplier can view marketplace list and details, but cannot bid unless they have at least one linked and currently available driver. This is enforced in backend and in send_bid DB function.</w:t>
       </w:r>
     </w:p>
     <w:p/>
     <w:p>
       <w:r>
-        <w:t xml:space="preserve">I made the marketplace list </w:t>
-      </w:r>
-      <w:proofErr w:type="gramStart"/>
-      <w:r>
-        <w:t>privacy-safe</w:t>
-      </w:r>
-      <w:proofErr w:type="gramEnd"/>
-      <w:r>
-        <w:t xml:space="preserve">. Supplier available orders now return only </w:t>
-      </w:r>
-      <w:proofErr w:type="spellStart"/>
-      <w:r>
-        <w:t>order_id</w:t>
-      </w:r>
-      <w:proofErr w:type="spellEnd"/>
-      <w:r>
-        <w:t xml:space="preserve">, </w:t>
-      </w:r>
-      <w:proofErr w:type="spellStart"/>
-      <w:r>
-        <w:t>requested_capacity</w:t>
-      </w:r>
-      <w:proofErr w:type="spellEnd"/>
-      <w:r>
-        <w:t xml:space="preserve">, and </w:t>
-      </w:r>
-      <w:proofErr w:type="spellStart"/>
-      <w:r>
-        <w:t>customer_bid_price</w:t>
-      </w:r>
-      <w:proofErr w:type="spellEnd"/>
-      <w:r>
-        <w:t xml:space="preserve">. Full details including customer name and delivery location are returned only to bid-eligible suppliers, implemented in </w:t>
-      </w:r>
-      <w:proofErr w:type="spellStart"/>
-      <w:r>
-        <w:t>view_order_details</w:t>
-      </w:r>
-      <w:proofErr w:type="spellEnd"/>
-      <w:r>
-        <w:t xml:space="preserve"> with </w:t>
-      </w:r>
-      <w:proofErr w:type="spellStart"/>
-      <w:r>
-        <w:t>supplier_id</w:t>
-      </w:r>
-      <w:proofErr w:type="spellEnd"/>
-      <w:r>
-        <w:t xml:space="preserve"> check.</w:t>
+        <w:t>I made the marketplace list privacy-safe. Supplier available orders now return only order_id, requested_capacity, and customer_bid_price. Full details including customer name and delivery location are returned only to bid-eligible suppliers, implemented in view_order_details with supplier_id check.</w:t>
       </w:r>
     </w:p>
     <w:p/>
@@ -4273,23 +4209,7 @@
         <w:t>Also</w:t>
       </w:r>
       <w:r>
-        <w:t xml:space="preserve"> implemented supplier bid cooldown and expiry window of 90 seconds in </w:t>
-      </w:r>
-      <w:proofErr w:type="spellStart"/>
-      <w:r>
-        <w:t>send_bid</w:t>
-      </w:r>
-      <w:proofErr w:type="spellEnd"/>
-      <w:r>
-        <w:t xml:space="preserve">. Customer bid visibility and acceptance use the same 90-second window, enforced in </w:t>
-      </w:r>
-      <w:proofErr w:type="spellStart"/>
-      <w:r>
-        <w:t>customer.sql</w:t>
-      </w:r>
-      <w:proofErr w:type="spellEnd"/>
-      <w:r>
-        <w:t>.</w:t>
+        <w:t xml:space="preserve"> implemented supplier bid cooldown and expiry window of 90 seconds in send_bid. Customer bid visibility and acceptance use the same 90-second window, enforced in customer.sql.</w:t>
       </w:r>
     </w:p>
     <w:p>
@@ -4303,15 +4223,7 @@
       </w:r>
       <w:r>
         <w:br/>
-        <w:t xml:space="preserve">So </w:t>
-      </w:r>
-      <w:proofErr w:type="gramStart"/>
-      <w:r>
-        <w:t>far</w:t>
-      </w:r>
-      <w:proofErr w:type="gramEnd"/>
-      <w:r>
-        <w:t xml:space="preserve"> they are working</w:t>
+        <w:t>So far they are working</w:t>
       </w:r>
     </w:p>
     <w:p>
@@ -4331,13 +4243,90 @@
       </w:r>
     </w:p>
     <w:p>
-      <w:proofErr w:type="spellStart"/>
-      <w:r>
-        <w:t>Implennted</w:t>
-      </w:r>
-      <w:proofErr w:type="spellEnd"/>
-      <w:r>
-        <w:t xml:space="preserve"> supplier assignment and driver accepting/rejecting order all in their own time limits</w:t>
+      <w:r>
+        <w:t>Implennted supplier assignment and driver accepting/rejecting order all in their own time limits</w:t>
+      </w:r>
+    </w:p>
+    <w:p>
+      <w:r>
+        <w:t>I implemented supplier assignment and driver accept/reject endpoints with their own time limits.</w:t>
+      </w:r>
+    </w:p>
+    <w:p/>
+    <w:p>
+      <w:r>
+        <w:lastRenderedPageBreak/>
+        <w:t>Hardened</w:t>
+      </w:r>
+      <w:r>
+        <w:t xml:space="preserve"> timeout behavior across the full flow because </w:t>
+      </w:r>
+      <w:r>
+        <w:t>I</w:t>
+      </w:r>
+      <w:r>
+        <w:t xml:space="preserve"> discovered inconsistent edge cases during testing. </w:t>
+      </w:r>
+      <w:r>
+        <w:t>A</w:t>
+      </w:r>
+      <w:r>
+        <w:t>dded supplier time limit visibility in the supplier order details response so the expiry was explicit. I enforced that once the supplier timer expires, the supplier can no longer view assignable drivers, cannot assign a driver, and cannot access the expired order as an active order.</w:t>
+      </w:r>
+    </w:p>
+    <w:p>
+      <w:r>
+        <w:t>F</w:t>
+      </w:r>
+      <w:r>
+        <w:t xml:space="preserve">ixed the active-orders listing behavior so expired supplier-timer orders no longer appear there. </w:t>
+      </w:r>
+    </w:p>
+    <w:p>
+      <w:r>
+        <w:t>I did a consistency pass to remove split logic between controller-side queries and database-side functions so both layers enforced the same timeout constraints.</w:t>
+      </w:r>
+    </w:p>
+    <w:p>
+      <w:r>
+        <w:t>I</w:t>
+      </w:r>
+      <w:r>
+        <w:t xml:space="preserve">mplemented failure cleanup logic so timeout failures are cleaned from active tables. Expired supplier-timer orders are removed from the orders table without being written to order history. </w:t>
+      </w:r>
+    </w:p>
+    <w:p/>
+    <w:p>
+      <w:r>
+        <w:t>A</w:t>
+      </w:r>
+      <w:r>
+        <w:t xml:space="preserve">dded customer rating endpoints with both rating and skip functionality. When a customer rates an order, the supplier’s rating is updated with a weighted average based on all completed orders, and the order is archived in order_history with the rating snapshot. When a customer skips rating, only the total orders count is incremented and the order is archived without a rating. </w:t>
+      </w:r>
+    </w:p>
+    <w:p>
+      <w:r>
+        <w:t>A</w:t>
+      </w:r>
+      <w:r>
+        <w:t xml:space="preserve">lso fixed the database function to properly archive orders after finish, handling the </w:t>
+      </w:r>
+      <w:r>
+        <w:t>record</w:t>
+      </w:r>
+      <w:r>
+        <w:t xml:space="preserve"> and scalar variable conflict in the SELECT INTO statement.</w:t>
+      </w:r>
+    </w:p>
+    <w:p/>
+    <w:p>
+      <w:r>
+        <w:t>Ran a complete test cycle starting from account creation and doing both rating an order and not rating it.</w:t>
+      </w:r>
+    </w:p>
+    <w:p>
+      <w:r>
+        <w:t>Worked.</w:t>
       </w:r>
     </w:p>
     <w:sectPr>

</xml_diff>

<commit_message>
Implemented deletion: Now testing is only left
</commit_message>
<xml_diff>
--- a/documents/code logic.docx
+++ b/documents/code logic.docx
@@ -4206,10 +4206,7 @@
     <w:p/>
     <w:p>
       <w:r>
-        <w:t>Also</w:t>
-      </w:r>
-      <w:r>
-        <w:t xml:space="preserve"> implemented supplier bid cooldown and expiry window of 90 seconds in send_bid. Customer bid visibility and acceptance use the same 90-second window, enforced in customer.sql.</w:t>
+        <w:t>Also implemented supplier bid cooldown and expiry window of 90 seconds in send_bid. Customer bid visibility and acceptance use the same 90-second window, enforced in customer.sql.</w:t>
       </w:r>
     </w:p>
     <w:p>
@@ -4256,30 +4253,12 @@
     <w:p>
       <w:r>
         <w:lastRenderedPageBreak/>
-        <w:t>Hardened</w:t>
-      </w:r>
-      <w:r>
-        <w:t xml:space="preserve"> timeout behavior across the full flow because </w:t>
-      </w:r>
-      <w:r>
-        <w:t>I</w:t>
-      </w:r>
-      <w:r>
-        <w:t xml:space="preserve"> discovered inconsistent edge cases during testing. </w:t>
-      </w:r>
-      <w:r>
-        <w:t>A</w:t>
-      </w:r>
-      <w:r>
-        <w:t>dded supplier time limit visibility in the supplier order details response so the expiry was explicit. I enforced that once the supplier timer expires, the supplier can no longer view assignable drivers, cannot assign a driver, and cannot access the expired order as an active order.</w:t>
-      </w:r>
-    </w:p>
-    <w:p>
-      <w:r>
-        <w:t>F</w:t>
-      </w:r>
-      <w:r>
-        <w:t xml:space="preserve">ixed the active-orders listing behavior so expired supplier-timer orders no longer appear there. </w:t>
+        <w:t>Hardened timeout behavior across the full flow because I discovered inconsistent edge cases during testing. Added supplier time limit visibility in the supplier order details response so the expiry was explicit. I enforced that once the supplier timer expires, the supplier can no longer view assignable drivers, cannot assign a driver, and cannot access the expired order as an active order.</w:t>
+      </w:r>
+    </w:p>
+    <w:p>
+      <w:r>
+        <w:t xml:space="preserve">Fixed the active-orders listing behavior so expired supplier-timer orders no longer appear there. </w:t>
       </w:r>
     </w:p>
     <w:p>
@@ -4289,33 +4268,18 @@
     </w:p>
     <w:p>
       <w:r>
-        <w:t>I</w:t>
-      </w:r>
-      <w:r>
-        <w:t xml:space="preserve">mplemented failure cleanup logic so timeout failures are cleaned from active tables. Expired supplier-timer orders are removed from the orders table without being written to order history. </w:t>
+        <w:t xml:space="preserve">Implemented failure cleanup logic so timeout failures are cleaned from active tables. Expired supplier-timer orders are removed from the orders table without being written to order history. </w:t>
       </w:r>
     </w:p>
     <w:p/>
     <w:p>
       <w:r>
-        <w:t>A</w:t>
-      </w:r>
-      <w:r>
-        <w:t xml:space="preserve">dded customer rating endpoints with both rating and skip functionality. When a customer rates an order, the supplier’s rating is updated with a weighted average based on all completed orders, and the order is archived in order_history with the rating snapshot. When a customer skips rating, only the total orders count is incremented and the order is archived without a rating. </w:t>
-      </w:r>
-    </w:p>
-    <w:p>
-      <w:r>
-        <w:t>A</w:t>
-      </w:r>
-      <w:r>
-        <w:t xml:space="preserve">lso fixed the database function to properly archive orders after finish, handling the </w:t>
-      </w:r>
-      <w:r>
-        <w:t>record</w:t>
-      </w:r>
-      <w:r>
-        <w:t xml:space="preserve"> and scalar variable conflict in the SELECT INTO statement.</w:t>
+        <w:t xml:space="preserve">Added customer rating endpoints with both rating and skip functionality. When a customer rates an order, the supplier’s rating is updated with a weighted average based on all completed orders, and the order is archived in order_history with the rating snapshot. When a customer skips rating, only the total orders count is incremented and the order is archived without a rating. </w:t>
+      </w:r>
+    </w:p>
+    <w:p>
+      <w:r>
+        <w:t>Also fixed the database function to properly archive orders after finish, handling the record and scalar variable conflict in the SELECT INTO statement.</w:t>
       </w:r>
     </w:p>
     <w:p/>
@@ -4329,6 +4293,58 @@
         <w:t>Worked.</w:t>
       </w:r>
     </w:p>
+    <w:p/>
+    <w:p/>
+    <w:p>
+      <w:r>
+        <w:t>26/03/2026:</w:t>
+      </w:r>
+    </w:p>
+    <w:p>
+      <w:r>
+        <w:t>Implemented the order history system in backend for all past orders, and one specific order</w:t>
+      </w:r>
+    </w:p>
+    <w:p>
+      <w:r>
+        <w:t>Implemetned logout and deletion of each role</w:t>
+      </w:r>
+    </w:p>
+    <w:p>
+      <w:r>
+        <w:t>Testing is all that is left now... if I dont think of any more stuff to add.</w:t>
+      </w:r>
+      <w:r>
+        <w:br/>
+      </w:r>
+      <w:r>
+        <w:br/>
+      </w:r>
+      <w:r>
+        <w:br/>
+        <w:t>Testing still left.</w:t>
+      </w:r>
+      <w:r>
+        <w:br/>
+      </w:r>
+      <w:r>
+        <w:lastRenderedPageBreak/>
+        <w:t>Code was updated in many places I forgot to write here</w:t>
+      </w:r>
+      <w:r>
+        <w:br/>
+        <w:t>But no major changes, just to incorporate a new feature or implementation</w:t>
+      </w:r>
+      <w:r>
+        <w:br/>
+        <w:t>eg recently added supplier id to order history as to prevent no access of supplier’s info when a driver deletes his account when he has had an order on finished state and the customer hasn’t rated it.</w:t>
+      </w:r>
+      <w:r>
+        <w:br/>
+        <w:t>This allowed the supplier’s id to still be used for ratings later on when the order was deleted on cascade due to deleting the driver’s info.</w:t>
+      </w:r>
+    </w:p>
+    <w:p/>
     <w:sectPr>
       <w:pgSz w:w="11906" w:h="16838"/>
       <w:pgMar w:top="1440" w:right="1440" w:bottom="1440" w:left="1440" w:header="708" w:footer="708" w:gutter="0"/>

</xml_diff>

<commit_message>
Tested everything I could
</commit_message>
<xml_diff>
--- a/documents/code logic.docx
+++ b/documents/code logic.docx
@@ -4342,6 +4342,28 @@
       <w:r>
         <w:br/>
         <w:t>This allowed the supplier’s id to still be used for ratings later on when the order was deleted on cascade due to deleting the driver’s info.</w:t>
+      </w:r>
+      <w:r>
+        <w:br/>
+      </w:r>
+      <w:r>
+        <w:br/>
+      </w:r>
+      <w:r>
+        <w:br/>
+      </w:r>
+      <w:r>
+        <w:br/>
+        <w:t>27/03/2026:</w:t>
+      </w:r>
+    </w:p>
+    <w:p>
+      <w:r>
+        <w:t>Tweaks here and there during testing.</w:t>
+      </w:r>
+      <w:r>
+        <w:br/>
+        <w:t>But finally the backend is completed and tested.</w:t>
       </w:r>
     </w:p>
     <w:p/>

</xml_diff>

<commit_message>
Updated driver availability logic in database
</commit_message>
<xml_diff>
--- a/documents/code logic.docx
+++ b/documents/code logic.docx
@@ -3,12 +3,201 @@
 <w:document xmlns:wpc="http://schemas.microsoft.com/office/word/2010/wordprocessingCanvas" xmlns:cx="http://schemas.microsoft.com/office/drawing/2014/chartex" xmlns:cx1="http://schemas.microsoft.com/office/drawing/2015/9/8/chartex" xmlns:cx2="http://schemas.microsoft.com/office/drawing/2015/10/21/chartex" xmlns:cx3="http://schemas.microsoft.com/office/drawing/2016/5/9/chartex" xmlns:cx4="http://schemas.microsoft.com/office/drawing/2016/5/10/chartex" xmlns:cx5="http://schemas.microsoft.com/office/drawing/2016/5/11/chartex" xmlns:cx6="http://schemas.microsoft.com/office/drawing/2016/5/12/chartex" xmlns:cx7="http://schemas.microsoft.com/office/drawing/2016/5/13/chartex" xmlns:cx8="http://schemas.microsoft.com/office/drawing/2016/5/14/chartex" xmlns:mc="http://schemas.openxmlformats.org/markup-compatibility/2006" xmlns:aink="http://schemas.microsoft.com/office/drawing/2016/ink" xmlns:am3d="http://schemas.microsoft.com/office/drawing/2017/model3d" xmlns:o="urn:schemas-microsoft-com:office:office" xmlns:oel="http://schemas.microsoft.com/office/2019/extlst" xmlns:r="http://schemas.openxmlformats.org/officeDocument/2006/relationships" xmlns:m="http://schemas.openxmlformats.org/officeDocument/2006/math" xmlns:v="urn:schemas-microsoft-com:vml" xmlns:wp14="http://schemas.microsoft.com/office/word/2010/wordprocessingDrawing" xmlns:wp="http://schemas.openxmlformats.org/drawingml/2006/wordprocessingDrawing" xmlns:w10="urn:schemas-microsoft-com:office:word" xmlns:w="http://schemas.openxmlformats.org/wordprocessingml/2006/main" xmlns:w14="http://schemas.microsoft.com/office/word/2010/wordml" xmlns:w15="http://schemas.microsoft.com/office/word/2012/wordml" xmlns:w16cex="http://schemas.microsoft.com/office/word/2018/wordml/cex" xmlns:w16cid="http://schemas.microsoft.com/office/word/2016/wordml/cid" xmlns:w16="http://schemas.microsoft.com/office/word/2018/wordml" xmlns:w16du="http://schemas.microsoft.com/office/word/2023/wordml/word16du" xmlns:w16sdtdh="http://schemas.microsoft.com/office/word/2020/wordml/sdtdatahash" xmlns:w16sdtfl="http://schemas.microsoft.com/office/word/2024/wordml/sdtformatlock" xmlns:w16se="http://schemas.microsoft.com/office/word/2015/wordml/symex" xmlns:wpg="http://schemas.microsoft.com/office/word/2010/wordprocessingGroup" xmlns:wpi="http://schemas.microsoft.com/office/word/2010/wordprocessingInk" xmlns:wne="http://schemas.microsoft.com/office/word/2006/wordml" xmlns:wps="http://schemas.microsoft.com/office/word/2010/wordprocessingShape" mc:Ignorable="w14 w15 w16se w16cid w16 w16cex w16sdtdh w16sdtfl w16du wp14">
   <w:body>
     <w:p>
-      <w:r>
-        <w:t>oh so the easy way is to check local token if that exists then redirect to orders page if deosnt exist for this app then red diecet to phone numeb page whihc is same for reislateld suers and new users same opt verifaiton. then this numebr is chekced in database if exists then redirecet to orders (ie returing user after reinstall) . not exists then firs time user redirect to name entering</w:t>
+      <w:proofErr w:type="gramStart"/>
+      <w:r>
+        <w:t>oh</w:t>
+      </w:r>
+      <w:proofErr w:type="gramEnd"/>
+      <w:r>
+        <w:t xml:space="preserve"> so the easy way is to check local token if that exists then redirect to orders page if </w:t>
+      </w:r>
+      <w:proofErr w:type="spellStart"/>
+      <w:r>
+        <w:t>deosnt</w:t>
+      </w:r>
+      <w:proofErr w:type="spellEnd"/>
+      <w:r>
+        <w:t xml:space="preserve"> exist for this app then red </w:t>
+      </w:r>
+      <w:proofErr w:type="spellStart"/>
+      <w:r>
+        <w:t>diecet</w:t>
+      </w:r>
+      <w:proofErr w:type="spellEnd"/>
+      <w:r>
+        <w:t xml:space="preserve"> to phone </w:t>
+      </w:r>
+      <w:proofErr w:type="spellStart"/>
+      <w:r>
+        <w:t>numeb</w:t>
+      </w:r>
+      <w:proofErr w:type="spellEnd"/>
+      <w:r>
+        <w:t xml:space="preserve"> page </w:t>
+      </w:r>
+      <w:proofErr w:type="spellStart"/>
+      <w:r>
+        <w:t>whihc</w:t>
+      </w:r>
+      <w:proofErr w:type="spellEnd"/>
+      <w:r>
+        <w:t xml:space="preserve"> is same for </w:t>
+      </w:r>
+      <w:proofErr w:type="spellStart"/>
+      <w:r>
+        <w:t>reislateld</w:t>
+      </w:r>
+      <w:proofErr w:type="spellEnd"/>
+      <w:r>
+        <w:t xml:space="preserve"> suers and new users same opt </w:t>
+      </w:r>
+      <w:proofErr w:type="spellStart"/>
+      <w:r>
+        <w:t>verifaiton</w:t>
+      </w:r>
+      <w:proofErr w:type="spellEnd"/>
+      <w:r>
+        <w:t xml:space="preserve">. then this </w:t>
+      </w:r>
+      <w:proofErr w:type="spellStart"/>
+      <w:r>
+        <w:t>numebr</w:t>
+      </w:r>
+      <w:proofErr w:type="spellEnd"/>
+      <w:r>
+        <w:t xml:space="preserve"> is </w:t>
+      </w:r>
+      <w:proofErr w:type="spellStart"/>
+      <w:r>
+        <w:t>chekced</w:t>
+      </w:r>
+      <w:proofErr w:type="spellEnd"/>
+      <w:r>
+        <w:t xml:space="preserve"> in database if exists then </w:t>
+      </w:r>
+      <w:proofErr w:type="spellStart"/>
+      <w:r>
+        <w:t>redirecet</w:t>
+      </w:r>
+      <w:proofErr w:type="spellEnd"/>
+      <w:r>
+        <w:t xml:space="preserve"> to orders (</w:t>
+      </w:r>
+      <w:proofErr w:type="spellStart"/>
+      <w:r>
+        <w:t>ie</w:t>
+      </w:r>
+      <w:proofErr w:type="spellEnd"/>
+      <w:r>
+        <w:t xml:space="preserve"> </w:t>
+      </w:r>
+      <w:proofErr w:type="spellStart"/>
+      <w:r>
+        <w:t>returing</w:t>
+      </w:r>
+      <w:proofErr w:type="spellEnd"/>
+      <w:r>
+        <w:t xml:space="preserve"> user after </w:t>
+      </w:r>
+      <w:proofErr w:type="gramStart"/>
+      <w:r>
+        <w:t>reinstall) .</w:t>
+      </w:r>
+      <w:proofErr w:type="gramEnd"/>
+      <w:r>
+        <w:t xml:space="preserve"> not exists then firs time user redirect to name entering</w:t>
       </w:r>
       <w:r>
         <w:br/>
-        <w:t>but now two things where does local token be stored ? in db or what? seocndly does the local toekn also consits of user id ? because how will i know whihc user it is if i odnt ahve the user id</w:t>
+        <w:t xml:space="preserve">but now two things where does local token be </w:t>
+      </w:r>
+      <w:proofErr w:type="gramStart"/>
+      <w:r>
+        <w:t>stored ?</w:t>
+      </w:r>
+      <w:proofErr w:type="gramEnd"/>
+      <w:r>
+        <w:t xml:space="preserve"> in </w:t>
+      </w:r>
+      <w:proofErr w:type="spellStart"/>
+      <w:r>
+        <w:t>db</w:t>
+      </w:r>
+      <w:proofErr w:type="spellEnd"/>
+      <w:r>
+        <w:t xml:space="preserve"> or what? </w:t>
+      </w:r>
+      <w:proofErr w:type="spellStart"/>
+      <w:r>
+        <w:t>seocndly</w:t>
+      </w:r>
+      <w:proofErr w:type="spellEnd"/>
+      <w:r>
+        <w:t xml:space="preserve"> does the local </w:t>
+      </w:r>
+      <w:proofErr w:type="spellStart"/>
+      <w:r>
+        <w:t>toekn</w:t>
+      </w:r>
+      <w:proofErr w:type="spellEnd"/>
+      <w:r>
+        <w:t xml:space="preserve"> also </w:t>
+      </w:r>
+      <w:proofErr w:type="spellStart"/>
+      <w:r>
+        <w:t>consits</w:t>
+      </w:r>
+      <w:proofErr w:type="spellEnd"/>
+      <w:r>
+        <w:t xml:space="preserve"> of user </w:t>
+      </w:r>
+      <w:proofErr w:type="gramStart"/>
+      <w:r>
+        <w:t>id ?</w:t>
+      </w:r>
+      <w:proofErr w:type="gramEnd"/>
+      <w:r>
+        <w:t xml:space="preserve"> because how will </w:t>
+      </w:r>
+      <w:proofErr w:type="spellStart"/>
+      <w:r>
+        <w:t>i</w:t>
+      </w:r>
+      <w:proofErr w:type="spellEnd"/>
+      <w:r>
+        <w:t xml:space="preserve"> know </w:t>
+      </w:r>
+      <w:proofErr w:type="spellStart"/>
+      <w:r>
+        <w:t>whihc</w:t>
+      </w:r>
+      <w:proofErr w:type="spellEnd"/>
+      <w:r>
+        <w:t xml:space="preserve"> user it is if </w:t>
+      </w:r>
+      <w:proofErr w:type="spellStart"/>
+      <w:r>
+        <w:t>i</w:t>
+      </w:r>
+      <w:proofErr w:type="spellEnd"/>
+      <w:r>
+        <w:t xml:space="preserve"> </w:t>
+      </w:r>
+      <w:proofErr w:type="spellStart"/>
+      <w:r>
+        <w:t>odnt</w:t>
+      </w:r>
+      <w:proofErr w:type="spellEnd"/>
+      <w:r>
+        <w:t xml:space="preserve"> </w:t>
+      </w:r>
+      <w:proofErr w:type="spellStart"/>
+      <w:r>
+        <w:t>ahve</w:t>
+      </w:r>
+      <w:proofErr w:type="spellEnd"/>
+      <w:r>
+        <w:t xml:space="preserve"> the user id</w:t>
       </w:r>
     </w:p>
     <w:p/>
@@ -16,17 +205,67 @@
     <w:p/>
     <w:p>
       <w:r>
-        <w:t>Just check local token existence in the db . if  it exists then redirect to orders</w:t>
-      </w:r>
-    </w:p>
-    <w:p>
-      <w:r>
-        <w:t>If it doesn’t then make them enter phone numeb and verify otp</w:t>
-      </w:r>
-    </w:p>
-    <w:p>
-      <w:r>
-        <w:t>If phone number exists then reidriect to orders page</w:t>
+        <w:t xml:space="preserve">Just check local token existence in the </w:t>
+      </w:r>
+      <w:proofErr w:type="spellStart"/>
+      <w:proofErr w:type="gramStart"/>
+      <w:r>
+        <w:t>db</w:t>
+      </w:r>
+      <w:proofErr w:type="spellEnd"/>
+      <w:r>
+        <w:t xml:space="preserve"> .</w:t>
+      </w:r>
+      <w:proofErr w:type="gramEnd"/>
+      <w:r>
+        <w:t xml:space="preserve"> </w:t>
+      </w:r>
+      <w:proofErr w:type="gramStart"/>
+      <w:r>
+        <w:t>if  it</w:t>
+      </w:r>
+      <w:proofErr w:type="gramEnd"/>
+      <w:r>
+        <w:t xml:space="preserve"> exists then redirect to orders</w:t>
+      </w:r>
+    </w:p>
+    <w:p>
+      <w:r>
+        <w:t xml:space="preserve">If it doesn’t then make them enter phone </w:t>
+      </w:r>
+      <w:proofErr w:type="spellStart"/>
+      <w:r>
+        <w:t>numeb</w:t>
+      </w:r>
+      <w:proofErr w:type="spellEnd"/>
+      <w:r>
+        <w:t xml:space="preserve"> and verify </w:t>
+      </w:r>
+      <w:proofErr w:type="spellStart"/>
+      <w:r>
+        <w:t>otp</w:t>
+      </w:r>
+      <w:proofErr w:type="spellEnd"/>
+    </w:p>
+    <w:p>
+      <w:r>
+        <w:t xml:space="preserve">If phone number </w:t>
+      </w:r>
+      <w:proofErr w:type="gramStart"/>
+      <w:r>
+        <w:t>exists</w:t>
+      </w:r>
+      <w:proofErr w:type="gramEnd"/>
+      <w:r>
+        <w:t xml:space="preserve"> then </w:t>
+      </w:r>
+      <w:proofErr w:type="spellStart"/>
+      <w:r>
+        <w:t>reidriect</w:t>
+      </w:r>
+      <w:proofErr w:type="spellEnd"/>
+      <w:r>
+        <w:t xml:space="preserve"> to orders page</w:t>
       </w:r>
     </w:p>
     <w:p>
@@ -45,7 +284,15 @@
     </w:p>
     <w:p>
       <w:r>
-        <w:t xml:space="preserve">OTP will be generated and sent by backend to the email/sms and </w:t>
+        <w:t>OTP will be generated and sent by backend to the email/</w:t>
+      </w:r>
+      <w:proofErr w:type="spellStart"/>
+      <w:r>
+        <w:t>sms</w:t>
+      </w:r>
+      <w:proofErr w:type="spellEnd"/>
+      <w:r>
+        <w:t xml:space="preserve"> and </w:t>
       </w:r>
     </w:p>
     <w:p/>
@@ -72,45 +319,172 @@
     <w:p/>
     <w:p>
       <w:r>
-        <w:t>Phone number_exists fn:</w:t>
-      </w:r>
-    </w:p>
-    <w:p>
-      <w:r>
-        <w:t>Checks  if the entered number already exists in the users table if it does, then set the verified Boolean to false in the user_id table : the user already exists but has to undergo verification of phone number again</w:t>
+        <w:t xml:space="preserve">Phone </w:t>
+      </w:r>
+      <w:proofErr w:type="spellStart"/>
+      <w:r>
+        <w:t>number_exists</w:t>
+      </w:r>
+      <w:proofErr w:type="spellEnd"/>
+      <w:r>
+        <w:t xml:space="preserve"> fn:</w:t>
+      </w:r>
+    </w:p>
+    <w:p>
+      <w:proofErr w:type="gramStart"/>
+      <w:r>
+        <w:t>Checks  if</w:t>
+      </w:r>
+      <w:proofErr w:type="gramEnd"/>
+      <w:r>
+        <w:t xml:space="preserve"> the entered number already exists in the users table if it does, then set the verified Boolean to false in the </w:t>
+      </w:r>
+      <w:proofErr w:type="spellStart"/>
+      <w:r>
+        <w:t>user_id</w:t>
+      </w:r>
+      <w:proofErr w:type="spellEnd"/>
+      <w:r>
+        <w:t xml:space="preserve"> </w:t>
+      </w:r>
+      <w:proofErr w:type="gramStart"/>
+      <w:r>
+        <w:t>table :</w:t>
+      </w:r>
+      <w:proofErr w:type="gramEnd"/>
+      <w:r>
+        <w:t xml:space="preserve"> the user already exists but </w:t>
+      </w:r>
+      <w:proofErr w:type="gramStart"/>
+      <w:r>
+        <w:t>has to</w:t>
+      </w:r>
+      <w:proofErr w:type="gramEnd"/>
+      <w:r>
+        <w:t xml:space="preserve"> undergo verification of phone number again</w:t>
       </w:r>
     </w:p>
     <w:p>
       <w:r>
         <w:lastRenderedPageBreak/>
-        <w:t>Checks if the entered phone number exists in the pending users table, if it does then do nothing , if it doesn’t then insert the number (This will be done for existing users too that are getting back to the application as they are currently pending (unverified) users too</w:t>
+        <w:t xml:space="preserve">Checks if the entered phone number exists in the pending users table, if it does then do </w:t>
+      </w:r>
+      <w:proofErr w:type="gramStart"/>
+      <w:r>
+        <w:t>nothing ,</w:t>
+      </w:r>
+      <w:proofErr w:type="gramEnd"/>
+      <w:r>
+        <w:t xml:space="preserve"> if it doesn’t then insert the number (This will be done for existing users too that are getting back to the application as they are currently pending (unverified) users too</w:t>
       </w:r>
     </w:p>
     <w:p/>
     <w:p>
       <w:r>
-        <w:t>Store otp:</w:t>
-      </w:r>
-    </w:p>
-    <w:p>
-      <w:r>
-        <w:t xml:space="preserve">Stores otp in the pending users table </w:t>
-      </w:r>
-    </w:p>
-    <w:p>
-      <w:r>
-        <w:t>If the otp already exists then upates the otp (can be because the user exited during the process came again, or that he requested a new otp)</w:t>
+        <w:t xml:space="preserve">Store </w:t>
+      </w:r>
+      <w:proofErr w:type="spellStart"/>
+      <w:r>
+        <w:t>otp</w:t>
+      </w:r>
+      <w:proofErr w:type="spellEnd"/>
+      <w:r>
+        <w:t>:</w:t>
+      </w:r>
+    </w:p>
+    <w:p>
+      <w:r>
+        <w:t xml:space="preserve">Stores </w:t>
+      </w:r>
+      <w:proofErr w:type="spellStart"/>
+      <w:r>
+        <w:t>otp</w:t>
+      </w:r>
+      <w:proofErr w:type="spellEnd"/>
+      <w:r>
+        <w:t xml:space="preserve"> in the pending </w:t>
+      </w:r>
+      <w:proofErr w:type="gramStart"/>
+      <w:r>
+        <w:t>users</w:t>
+      </w:r>
+      <w:proofErr w:type="gramEnd"/>
+      <w:r>
+        <w:t xml:space="preserve"> table </w:t>
+      </w:r>
+    </w:p>
+    <w:p>
+      <w:r>
+        <w:t xml:space="preserve">If the </w:t>
+      </w:r>
+      <w:proofErr w:type="spellStart"/>
+      <w:r>
+        <w:t>otp</w:t>
+      </w:r>
+      <w:proofErr w:type="spellEnd"/>
+      <w:r>
+        <w:t xml:space="preserve"> already exists then </w:t>
+      </w:r>
+      <w:proofErr w:type="spellStart"/>
+      <w:r>
+        <w:t>upates</w:t>
+      </w:r>
+      <w:proofErr w:type="spellEnd"/>
+      <w:r>
+        <w:t xml:space="preserve"> the </w:t>
+      </w:r>
+      <w:proofErr w:type="spellStart"/>
+      <w:r>
+        <w:t>otp</w:t>
+      </w:r>
+      <w:proofErr w:type="spellEnd"/>
+      <w:r>
+        <w:t xml:space="preserve"> (can be because the user exited during the process came again, or that he requested a new </w:t>
+      </w:r>
+      <w:proofErr w:type="spellStart"/>
+      <w:r>
+        <w:t>otp</w:t>
+      </w:r>
+      <w:proofErr w:type="spellEnd"/>
+      <w:r>
+        <w:t>)</w:t>
       </w:r>
     </w:p>
     <w:p/>
     <w:p>
-      <w:r>
-        <w:t>Verify_otp_and_activate_users fn:</w:t>
-      </w:r>
-    </w:p>
-    <w:p>
-      <w:r>
-        <w:t xml:space="preserve">Checks the entered  otp against the stored otp </w:t>
+      <w:proofErr w:type="spellStart"/>
+      <w:r>
+        <w:t>Verify_otp_and_activate_users</w:t>
+      </w:r>
+      <w:proofErr w:type="spellEnd"/>
+      <w:r>
+        <w:t xml:space="preserve"> fn:</w:t>
+      </w:r>
+    </w:p>
+    <w:p>
+      <w:r>
+        <w:t xml:space="preserve">Checks the </w:t>
+      </w:r>
+      <w:proofErr w:type="gramStart"/>
+      <w:r>
+        <w:t xml:space="preserve">entered  </w:t>
+      </w:r>
+      <w:proofErr w:type="spellStart"/>
+      <w:r>
+        <w:t>otp</w:t>
+      </w:r>
+      <w:proofErr w:type="spellEnd"/>
+      <w:proofErr w:type="gramEnd"/>
+      <w:r>
+        <w:t xml:space="preserve"> against the stored </w:t>
+      </w:r>
+      <w:proofErr w:type="spellStart"/>
+      <w:r>
+        <w:t>otp</w:t>
+      </w:r>
+      <w:proofErr w:type="spellEnd"/>
+      <w:r>
+        <w:t xml:space="preserve"> </w:t>
       </w:r>
     </w:p>
     <w:p>
@@ -120,7 +494,15 @@
     </w:p>
     <w:p>
       <w:r>
-        <w:t>If new user, inserts the info from pending users table to new users table</w:t>
+        <w:t xml:space="preserve">If new user, inserts the info from pending users table to new </w:t>
+      </w:r>
+      <w:proofErr w:type="gramStart"/>
+      <w:r>
+        <w:t>users</w:t>
+      </w:r>
+      <w:proofErr w:type="gramEnd"/>
+      <w:r>
+        <w:t xml:space="preserve"> table</w:t>
       </w:r>
     </w:p>
     <w:p>
@@ -143,7 +525,15 @@
     </w:p>
     <w:p>
       <w:r>
-        <w:t>If both session and role exists: Go to orders page</w:t>
+        <w:t xml:space="preserve">If both session and role </w:t>
+      </w:r>
+      <w:proofErr w:type="gramStart"/>
+      <w:r>
+        <w:t>exists</w:t>
+      </w:r>
+      <w:proofErr w:type="gramEnd"/>
+      <w:r>
+        <w:t>: Go to orders page</w:t>
       </w:r>
     </w:p>
     <w:p>
@@ -164,7 +554,15 @@
     <w:p/>
     <w:p>
       <w:r>
-        <w:t>The common steps for all the users uptil OTP done.</w:t>
+        <w:t xml:space="preserve">The common steps for all the users </w:t>
+      </w:r>
+      <w:proofErr w:type="spellStart"/>
+      <w:r>
+        <w:t>uptil</w:t>
+      </w:r>
+      <w:proofErr w:type="spellEnd"/>
+      <w:r>
+        <w:t xml:space="preserve"> OTP done.</w:t>
       </w:r>
     </w:p>
     <w:p>
@@ -180,7 +578,15 @@
     <w:p>
       <w:r>
         <w:lastRenderedPageBreak/>
-        <w:t>Supplier: Two pages and therefore two procedures, one for entering fields and the other for entering the cnic images</w:t>
+        <w:t xml:space="preserve">Supplier: Two pages and therefore two procedures, one for entering fields and the other for entering the </w:t>
+      </w:r>
+      <w:proofErr w:type="spellStart"/>
+      <w:r>
+        <w:t>cnic</w:t>
+      </w:r>
+      <w:proofErr w:type="spellEnd"/>
+      <w:r>
+        <w:t xml:space="preserve"> images</w:t>
       </w:r>
     </w:p>
     <w:p/>
@@ -191,7 +597,23 @@
     </w:p>
     <w:p>
       <w:r>
-        <w:t>Upon entering the orders page, first his existence in the supplier_Drivers table will be checked, if he doesn’t exist there therefore he hasn’t defined one single driver, implying he is a new registration.</w:t>
+        <w:t xml:space="preserve">Upon entering the orders page, first his existence in the </w:t>
+      </w:r>
+      <w:proofErr w:type="spellStart"/>
+      <w:r>
+        <w:t>supplier_Drivers</w:t>
+      </w:r>
+      <w:proofErr w:type="spellEnd"/>
+      <w:r>
+        <w:t xml:space="preserve"> table will be checked, if he doesn’t exist there </w:t>
+      </w:r>
+      <w:proofErr w:type="gramStart"/>
+      <w:r>
+        <w:t>therefore</w:t>
+      </w:r>
+      <w:proofErr w:type="gramEnd"/>
+      <w:r>
+        <w:t xml:space="preserve"> he hasn’t defined one single driver, implying he is a new registration.</w:t>
       </w:r>
     </w:p>
     <w:p>
@@ -209,7 +631,39 @@
         <w:t xml:space="preserve">This will be checked by checking the </w:t>
       </w:r>
       <w:r>
-        <w:t>supplier drivers table again against the suppliers user id, and checking the driver_user_id there. If atleast one of them is not null he can view the orders page. Until then, the orders page remains inaccessible.</w:t>
+        <w:t xml:space="preserve">supplier drivers table again against the </w:t>
+      </w:r>
+      <w:proofErr w:type="gramStart"/>
+      <w:r>
+        <w:t>suppliers</w:t>
+      </w:r>
+      <w:proofErr w:type="gramEnd"/>
+      <w:r>
+        <w:t xml:space="preserve"> user </w:t>
+      </w:r>
+      <w:proofErr w:type="gramStart"/>
+      <w:r>
+        <w:t>id, and</w:t>
+      </w:r>
+      <w:proofErr w:type="gramEnd"/>
+      <w:r>
+        <w:t xml:space="preserve"> checking the </w:t>
+      </w:r>
+      <w:proofErr w:type="spellStart"/>
+      <w:r>
+        <w:t>driver_user_id</w:t>
+      </w:r>
+      <w:proofErr w:type="spellEnd"/>
+      <w:r>
+        <w:t xml:space="preserve"> there. If </w:t>
+      </w:r>
+      <w:proofErr w:type="spellStart"/>
+      <w:r>
+        <w:t>atleast</w:t>
+      </w:r>
+      <w:proofErr w:type="spellEnd"/>
+      <w:r>
+        <w:t xml:space="preserve"> one of them is not null he can view the orders page. Until then, the orders page remains inaccessible.</w:t>
       </w:r>
     </w:p>
     <w:p/>
@@ -225,7 +679,15 @@
     </w:p>
     <w:p>
       <w:r>
-        <w:t xml:space="preserve">When he comes back to the application, after verification, his session will be generated, upon entering his details it will be checked that if his role is already set to driver that implies he is an existing user therefore only set his id back into the supplier drivers table. </w:t>
+        <w:t xml:space="preserve">When he comes back to the application, after verification, his session will be generated, upon entering his details it will be checked that if his role is already set to driver that implies he is an existing user therefore only set his id back into the supplier </w:t>
+      </w:r>
+      <w:proofErr w:type="gramStart"/>
+      <w:r>
+        <w:t>drivers</w:t>
+      </w:r>
+      <w:proofErr w:type="gramEnd"/>
+      <w:r>
+        <w:t xml:space="preserve"> table. </w:t>
       </w:r>
     </w:p>
     <w:p/>
@@ -234,12 +696,44 @@
         <w:t xml:space="preserve">So </w:t>
       </w:r>
       <w:r>
-        <w:t>updated the enter deitals driver fn to remove re-linking of driver_id to the supplier_drivers table</w:t>
-      </w:r>
-    </w:p>
-    <w:p>
-      <w:r>
-        <w:t>Made a new trigger of re-link_driver_after_session generation</w:t>
+        <w:t xml:space="preserve">updated the enter </w:t>
+      </w:r>
+      <w:proofErr w:type="spellStart"/>
+      <w:r>
+        <w:t>deitals</w:t>
+      </w:r>
+      <w:proofErr w:type="spellEnd"/>
+      <w:r>
+        <w:t xml:space="preserve"> driver fn to remove re-linking of </w:t>
+      </w:r>
+      <w:proofErr w:type="spellStart"/>
+      <w:r>
+        <w:t>driver_id</w:t>
+      </w:r>
+      <w:proofErr w:type="spellEnd"/>
+      <w:r>
+        <w:t xml:space="preserve"> to the </w:t>
+      </w:r>
+      <w:proofErr w:type="spellStart"/>
+      <w:r>
+        <w:t>supplier_drivers</w:t>
+      </w:r>
+      <w:proofErr w:type="spellEnd"/>
+      <w:r>
+        <w:t xml:space="preserve"> table</w:t>
+      </w:r>
+    </w:p>
+    <w:p>
+      <w:r>
+        <w:t>Made a new trigger of re-</w:t>
+      </w:r>
+      <w:proofErr w:type="spellStart"/>
+      <w:r>
+        <w:t>link_driver_after_session</w:t>
+      </w:r>
+      <w:proofErr w:type="spellEnd"/>
+      <w:r>
+        <w:t xml:space="preserve"> generation</w:t>
       </w:r>
     </w:p>
     <w:p>
@@ -249,7 +743,15 @@
     </w:p>
     <w:p>
       <w:r>
-        <w:t>if it has then that means his details already exists jsut need to link his id to the suppliers table again</w:t>
+        <w:t xml:space="preserve">if it has then that means his details already exists </w:t>
+      </w:r>
+      <w:proofErr w:type="spellStart"/>
+      <w:r>
+        <w:t>jsut</w:t>
+      </w:r>
+      <w:proofErr w:type="spellEnd"/>
+      <w:r>
+        <w:t xml:space="preserve"> need to link his id to the suppliers table again</w:t>
       </w:r>
     </w:p>
     <w:p/>
@@ -272,8 +774,13 @@
       </w:r>
     </w:p>
     <w:p>
-      <w:r>
-        <w:t>Check_supplier_has_drivers fn:</w:t>
+      <w:proofErr w:type="spellStart"/>
+      <w:r>
+        <w:t>Check_supplier_has_drivers</w:t>
+      </w:r>
+      <w:proofErr w:type="spellEnd"/>
+      <w:r>
+        <w:t xml:space="preserve"> fn:</w:t>
       </w:r>
       <w:r>
         <w:tab/>
@@ -287,13 +794,29 @@
     </w:p>
     <w:p>
       <w:r>
-        <w:t>This will be checked by checked the supplier_drivers table</w:t>
+        <w:t xml:space="preserve">This will be checked by checked the </w:t>
+      </w:r>
+      <w:proofErr w:type="spellStart"/>
+      <w:r>
+        <w:t>supplier_drivers</w:t>
+      </w:r>
+      <w:proofErr w:type="spellEnd"/>
+      <w:r>
+        <w:t xml:space="preserve"> table</w:t>
       </w:r>
     </w:p>
     <w:p/>
     <w:p>
       <w:r>
-        <w:t>Check supplier_has_active_drivers:</w:t>
+        <w:t xml:space="preserve">Check </w:t>
+      </w:r>
+      <w:proofErr w:type="spellStart"/>
+      <w:r>
+        <w:t>supplier_has_active_drivers</w:t>
+      </w:r>
+      <w:proofErr w:type="spellEnd"/>
+      <w:r>
+        <w:t>:</w:t>
       </w:r>
       <w:r>
         <w:tab/>
@@ -302,12 +825,65 @@
     </w:p>
     <w:p>
       <w:r>
-        <w:t>This will be checked by checking the supplier_id and the driver_id against that supplier in the supplier drivers table</w:t>
-      </w:r>
-    </w:p>
-    <w:p>
-      <w:r>
-        <w:t>If, for that supplier_id, even if one of the driver_id is not null, then that means atleast one of his drivers is active</w:t>
+        <w:t xml:space="preserve">This will be checked by checking the </w:t>
+      </w:r>
+      <w:proofErr w:type="spellStart"/>
+      <w:r>
+        <w:t>supplier_id</w:t>
+      </w:r>
+      <w:proofErr w:type="spellEnd"/>
+      <w:r>
+        <w:t xml:space="preserve"> and the </w:t>
+      </w:r>
+      <w:proofErr w:type="spellStart"/>
+      <w:r>
+        <w:t>driver_id</w:t>
+      </w:r>
+      <w:proofErr w:type="spellEnd"/>
+      <w:r>
+        <w:t xml:space="preserve"> against that supplier in the supplier </w:t>
+      </w:r>
+      <w:proofErr w:type="gramStart"/>
+      <w:r>
+        <w:t>drivers</w:t>
+      </w:r>
+      <w:proofErr w:type="gramEnd"/>
+      <w:r>
+        <w:t xml:space="preserve"> table</w:t>
+      </w:r>
+    </w:p>
+    <w:p>
+      <w:r>
+        <w:t xml:space="preserve">If, for that </w:t>
+      </w:r>
+      <w:proofErr w:type="spellStart"/>
+      <w:r>
+        <w:t>supplier_id</w:t>
+      </w:r>
+      <w:proofErr w:type="spellEnd"/>
+      <w:r>
+        <w:t xml:space="preserve">, even if one of the </w:t>
+      </w:r>
+      <w:proofErr w:type="spellStart"/>
+      <w:proofErr w:type="gramStart"/>
+      <w:r>
+        <w:t>driver</w:t>
+      </w:r>
+      <w:proofErr w:type="gramEnd"/>
+      <w:r>
+        <w:t>_id</w:t>
+      </w:r>
+      <w:proofErr w:type="spellEnd"/>
+      <w:r>
+        <w:t xml:space="preserve"> is not null, then that means </w:t>
+      </w:r>
+      <w:proofErr w:type="spellStart"/>
+      <w:r>
+        <w:t>atleast</w:t>
+      </w:r>
+      <w:proofErr w:type="spellEnd"/>
+      <w:r>
+        <w:t xml:space="preserve"> one of his drivers is active</w:t>
       </w:r>
     </w:p>
     <w:p>
@@ -371,7 +947,20 @@
         </w:numPr>
       </w:pPr>
       <w:r>
-        <w:t>'orders_channel' = The radio station name (you can name it anything)</w:t>
+        <w:t>'</w:t>
+      </w:r>
+      <w:proofErr w:type="spellStart"/>
+      <w:proofErr w:type="gramStart"/>
+      <w:r>
+        <w:t>orders</w:t>
+      </w:r>
+      <w:proofErr w:type="gramEnd"/>
+      <w:r>
+        <w:t>_channel</w:t>
+      </w:r>
+      <w:proofErr w:type="spellEnd"/>
+      <w:r>
+        <w:t>' = The radio station name (you can name it anything)</w:t>
       </w:r>
     </w:p>
     <w:p>
@@ -607,7 +1196,39 @@
           <w:b/>
           <w:bCs/>
         </w:rPr>
-        <w:t>Step 5: Node.js calls view_available_orders()</w:t>
+        <w:t xml:space="preserve">Step 5: Node.js calls </w:t>
+      </w:r>
+      <w:proofErr w:type="spellStart"/>
+      <w:r>
+        <w:rPr>
+          <w:b/>
+          <w:bCs/>
+        </w:rPr>
+        <w:t>view_available_</w:t>
+      </w:r>
+      <w:proofErr w:type="gramStart"/>
+      <w:r>
+        <w:rPr>
+          <w:b/>
+          <w:bCs/>
+        </w:rPr>
+        <w:t>orders</w:t>
+      </w:r>
+      <w:proofErr w:type="spellEnd"/>
+      <w:r>
+        <w:rPr>
+          <w:b/>
+          <w:bCs/>
+        </w:rPr>
+        <w:t>(</w:t>
+      </w:r>
+      <w:proofErr w:type="gramEnd"/>
+      <w:r>
+        <w:rPr>
+          <w:b/>
+          <w:bCs/>
+        </w:rPr>
+        <w:t>)</w:t>
       </w:r>
     </w:p>
     <w:p>
@@ -719,12 +1340,37 @@
           <w:numId w:val="8"/>
         </w:numPr>
       </w:pPr>
-      <w:r>
-        <w:rPr>
-          <w:b/>
-          <w:bCs/>
-        </w:rPr>
-        <w:t>view_available_orders() is NOT called by the trigger</w:t>
+      <w:proofErr w:type="spellStart"/>
+      <w:r>
+        <w:rPr>
+          <w:b/>
+          <w:bCs/>
+        </w:rPr>
+        <w:t>view_available_</w:t>
+      </w:r>
+      <w:proofErr w:type="gramStart"/>
+      <w:r>
+        <w:rPr>
+          <w:b/>
+          <w:bCs/>
+        </w:rPr>
+        <w:t>orders</w:t>
+      </w:r>
+      <w:proofErr w:type="spellEnd"/>
+      <w:r>
+        <w:rPr>
+          <w:b/>
+          <w:bCs/>
+        </w:rPr>
+        <w:t>(</w:t>
+      </w:r>
+      <w:proofErr w:type="gramEnd"/>
+      <w:r>
+        <w:rPr>
+          <w:b/>
+          <w:bCs/>
+        </w:rPr>
+        <w:t>) is NOT called by the trigger</w:t>
       </w:r>
     </w:p>
     <w:p>
@@ -848,13 +1494,38 @@
       </w:r>
     </w:p>
     <w:p>
-      <w:r>
-        <w:t>client.on('notification', (msg) =&gt; {</w:t>
-      </w:r>
-    </w:p>
-    <w:p>
-      <w:r>
-        <w:t>    if (msg.channel === 'orders_channel') {</w:t>
+      <w:proofErr w:type="spellStart"/>
+      <w:proofErr w:type="gramStart"/>
+      <w:r>
+        <w:t>client.on</w:t>
+      </w:r>
+      <w:proofErr w:type="spellEnd"/>
+      <w:proofErr w:type="gramEnd"/>
+      <w:r>
+        <w:t>('notification', (msg) =&gt; {</w:t>
+      </w:r>
+    </w:p>
+    <w:p>
+      <w:r>
+        <w:t>    if (</w:t>
+      </w:r>
+      <w:proofErr w:type="spellStart"/>
+      <w:proofErr w:type="gramStart"/>
+      <w:r>
+        <w:t>msg.channel</w:t>
+      </w:r>
+      <w:proofErr w:type="spellEnd"/>
+      <w:proofErr w:type="gramEnd"/>
+      <w:r>
+        <w:t xml:space="preserve"> === '</w:t>
+      </w:r>
+      <w:proofErr w:type="spellStart"/>
+      <w:r>
+        <w:t>orders_channel</w:t>
+      </w:r>
+      <w:proofErr w:type="spellEnd"/>
+      <w:r>
+        <w:t>') {</w:t>
       </w:r>
     </w:p>
     <w:p>
@@ -864,8 +1535,39 @@
     </w:p>
     <w:p>
       <w:r>
-        <w:t>        const orders = await db.query('SELECT view_available_orders()');</w:t>
-      </w:r>
+        <w:t xml:space="preserve">        const orders = await </w:t>
+      </w:r>
+      <w:proofErr w:type="spellStart"/>
+      <w:proofErr w:type="gramStart"/>
+      <w:r>
+        <w:t>db.query</w:t>
+      </w:r>
+      <w:proofErr w:type="spellEnd"/>
+      <w:proofErr w:type="gramEnd"/>
+      <w:r>
+        <w:t xml:space="preserve">('SELECT </w:t>
+      </w:r>
+      <w:proofErr w:type="spellStart"/>
+      <w:r>
+        <w:t>view_available_</w:t>
+      </w:r>
+      <w:proofErr w:type="gramStart"/>
+      <w:r>
+        <w:t>orders</w:t>
+      </w:r>
+      <w:proofErr w:type="spellEnd"/>
+      <w:r>
+        <w:t>(</w:t>
+      </w:r>
+      <w:proofErr w:type="gramEnd"/>
+      <w:r>
+        <w:t>)'</w:t>
+      </w:r>
+      <w:proofErr w:type="gramStart"/>
+      <w:r>
+        <w:t>);</w:t>
+      </w:r>
+      <w:proofErr w:type="gramEnd"/>
     </w:p>
     <w:p>
       <w:r>
@@ -879,8 +1581,31 @@
     </w:p>
     <w:p>
       <w:r>
-        <w:t>        io.emit('orders_updated', orders);</w:t>
-      </w:r>
+        <w:t xml:space="preserve">        </w:t>
+      </w:r>
+      <w:proofErr w:type="spellStart"/>
+      <w:proofErr w:type="gramStart"/>
+      <w:r>
+        <w:t>io.emit</w:t>
+      </w:r>
+      <w:proofErr w:type="spellEnd"/>
+      <w:proofErr w:type="gramEnd"/>
+      <w:r>
+        <w:t>('</w:t>
+      </w:r>
+      <w:proofErr w:type="spellStart"/>
+      <w:r>
+        <w:t>orders_updated</w:t>
+      </w:r>
+      <w:proofErr w:type="spellEnd"/>
+      <w:r>
+        <w:t>', orders</w:t>
+      </w:r>
+      <w:proofErr w:type="gramStart"/>
+      <w:r>
+        <w:t>);</w:t>
+      </w:r>
+      <w:proofErr w:type="gramEnd"/>
     </w:p>
     <w:p>
       <w:r>
@@ -889,13 +1614,34 @@
     </w:p>
     <w:p>
       <w:r>
-        <w:t>});</w:t>
-      </w:r>
+        <w:t>}</w:t>
+      </w:r>
+      <w:proofErr w:type="gramStart"/>
+      <w:r>
+        <w:t>);</w:t>
+      </w:r>
+      <w:proofErr w:type="gramEnd"/>
     </w:p>
     <w:p/>
     <w:p>
       <w:r>
-        <w:t>Why not call directly the fn in trigger? Because trigger cant do anything with the data. It cant return the data back to backend</w:t>
+        <w:t xml:space="preserve">Why not call directly the fn in trigger? Because trigger </w:t>
+      </w:r>
+      <w:proofErr w:type="gramStart"/>
+      <w:r>
+        <w:t>cant</w:t>
+      </w:r>
+      <w:proofErr w:type="gramEnd"/>
+      <w:r>
+        <w:t xml:space="preserve"> do anything with the data. It </w:t>
+      </w:r>
+      <w:proofErr w:type="gramStart"/>
+      <w:r>
+        <w:t>cant</w:t>
+      </w:r>
+      <w:proofErr w:type="gramEnd"/>
+      <w:r>
+        <w:t xml:space="preserve"> return the data back to backend</w:t>
       </w:r>
     </w:p>
     <w:p>
@@ -904,7 +1650,36 @@
         <w:br/>
       </w:r>
       <w:r>
-        <w:t>ok so some updates there will be no transpation cost in my recommended fare calculation. we will only allow 7 quantites  to be choesn.</w:t>
+        <w:t xml:space="preserve">ok so some updates there will be no </w:t>
+      </w:r>
+      <w:proofErr w:type="spellStart"/>
+      <w:r>
+        <w:t>transpation</w:t>
+      </w:r>
+      <w:proofErr w:type="spellEnd"/>
+      <w:r>
+        <w:t xml:space="preserve"> cost in my recommended fare calculation. we will only allow 7 </w:t>
+      </w:r>
+      <w:proofErr w:type="spellStart"/>
+      <w:proofErr w:type="gramStart"/>
+      <w:r>
+        <w:t>quantites</w:t>
+      </w:r>
+      <w:proofErr w:type="spellEnd"/>
+      <w:r>
+        <w:t xml:space="preserve">  to</w:t>
+      </w:r>
+      <w:proofErr w:type="gramEnd"/>
+      <w:r>
+        <w:t xml:space="preserve"> be </w:t>
+      </w:r>
+      <w:proofErr w:type="spellStart"/>
+      <w:r>
+        <w:t>choesn</w:t>
+      </w:r>
+      <w:proofErr w:type="spellEnd"/>
+      <w:r>
+        <w:t>.</w:t>
       </w:r>
     </w:p>
     <w:p>
@@ -975,8 +1750,21 @@
         <w:t>Geocoding API</w:t>
       </w:r>
       <w:r>
-        <w:t> → Convert address to lat/lng</w:t>
-      </w:r>
+        <w:t xml:space="preserve"> → Convert address to </w:t>
+      </w:r>
+      <w:proofErr w:type="spellStart"/>
+      <w:r>
+        <w:t>lat</w:t>
+      </w:r>
+      <w:proofErr w:type="spellEnd"/>
+      <w:r>
+        <w:t>/</w:t>
+      </w:r>
+      <w:proofErr w:type="spellStart"/>
+      <w:r>
+        <w:t>lng</w:t>
+      </w:r>
+      <w:proofErr w:type="spellEnd"/>
     </w:p>
     <w:p>
       <w:pPr>
@@ -1141,8 +1929,13 @@
         <w:t>Geocoding:</w:t>
       </w:r>
       <w:r>
-        <w:t> Nominatim</w:t>
-      </w:r>
+        <w:t> </w:t>
+      </w:r>
+      <w:proofErr w:type="spellStart"/>
+      <w:r>
+        <w:t>Nominatim</w:t>
+      </w:r>
+      <w:proofErr w:type="spellEnd"/>
     </w:p>
     <w:p>
       <w:pPr>
@@ -1159,7 +1952,15 @@
         <w:t>Real-time:</w:t>
       </w:r>
       <w:r>
-        <w:t> WebSockets (you already planned this)</w:t>
+        <w:t> </w:t>
+      </w:r>
+      <w:proofErr w:type="spellStart"/>
+      <w:r>
+        <w:t>WebSockets</w:t>
+      </w:r>
+      <w:proofErr w:type="spellEnd"/>
+      <w:r>
+        <w:t xml:space="preserve"> (you already planned this)</w:t>
       </w:r>
     </w:p>
     <w:p>
@@ -1209,7 +2010,39 @@
     <w:p>
       <w:r>
         <w:lastRenderedPageBreak/>
-        <w:t>well i also wanted the frontend to dispaly the driver coming to a location so in real time his lication can be seen by the cusotmer when he is coming after acceptance of an order. can that also be free</w:t>
+        <w:t xml:space="preserve">well </w:t>
+      </w:r>
+      <w:proofErr w:type="spellStart"/>
+      <w:r>
+        <w:t>i</w:t>
+      </w:r>
+      <w:proofErr w:type="spellEnd"/>
+      <w:r>
+        <w:t xml:space="preserve"> also wanted the frontend to </w:t>
+      </w:r>
+      <w:proofErr w:type="spellStart"/>
+      <w:r>
+        <w:t>dispaly</w:t>
+      </w:r>
+      <w:proofErr w:type="spellEnd"/>
+      <w:r>
+        <w:t xml:space="preserve"> the driver coming to a location so in real time his </w:t>
+      </w:r>
+      <w:proofErr w:type="spellStart"/>
+      <w:r>
+        <w:t>lication</w:t>
+      </w:r>
+      <w:proofErr w:type="spellEnd"/>
+      <w:r>
+        <w:t xml:space="preserve"> can be seen by the </w:t>
+      </w:r>
+      <w:proofErr w:type="spellStart"/>
+      <w:r>
+        <w:t>cusotmer</w:t>
+      </w:r>
+      <w:proofErr w:type="spellEnd"/>
+      <w:r>
+        <w:t xml:space="preserve"> when he is coming after acceptance of an order. can that also be free</w:t>
       </w:r>
     </w:p>
     <w:p>
@@ -1340,7 +2173,23 @@
           <w:b/>
           <w:bCs/>
         </w:rPr>
-        <w:t>2. Backend (Node.js + WebSockets)</w:t>
+        <w:t xml:space="preserve">2. Backend (Node.js + </w:t>
+      </w:r>
+      <w:proofErr w:type="spellStart"/>
+      <w:r>
+        <w:rPr>
+          <w:b/>
+          <w:bCs/>
+        </w:rPr>
+        <w:t>WebSockets</w:t>
+      </w:r>
+      <w:proofErr w:type="spellEnd"/>
+      <w:r>
+        <w:rPr>
+          <w:b/>
+          <w:bCs/>
+        </w:rPr>
+        <w:t>)</w:t>
       </w:r>
     </w:p>
     <w:p>
@@ -1384,7 +2233,15 @@
         <w:t>Cost:</w:t>
       </w:r>
       <w:r>
-        <w:t> $0 - WebSockets (socket.io) is free</w:t>
+        <w:t xml:space="preserve"> $0 - </w:t>
+      </w:r>
+      <w:proofErr w:type="spellStart"/>
+      <w:r>
+        <w:t>WebSockets</w:t>
+      </w:r>
+      <w:proofErr w:type="spellEnd"/>
+      <w:r>
+        <w:t xml:space="preserve"> (socket.io) is free</w:t>
       </w:r>
     </w:p>
     <w:p>
@@ -1731,8 +2588,13 @@
             <w:hideMark/>
           </w:tcPr>
           <w:p>
+            <w:proofErr w:type="spellStart"/>
             <w:r>
-              <w:t>WebSockets (socket.io)</w:t>
+              <w:t>WebSockets</w:t>
+            </w:r>
+            <w:proofErr w:type="spellEnd"/>
+            <w:r>
+              <w:t xml:space="preserve"> (socket.io)</w:t>
             </w:r>
           </w:p>
         </w:tc>
@@ -2031,7 +2893,15 @@
         <w:t>Every 5-10 seconds</w:t>
       </w:r>
       <w:r>
-        <w:t> - Good balance (not too much data)</w:t>
+        <w:t xml:space="preserve"> - </w:t>
+      </w:r>
+      <w:proofErr w:type="gramStart"/>
+      <w:r>
+        <w:t>Good</w:t>
+      </w:r>
+      <w:proofErr w:type="gramEnd"/>
+      <w:r>
+        <w:t xml:space="preserve"> balance (not too much data)</w:t>
       </w:r>
     </w:p>
     <w:p>
@@ -2079,7 +2949,15 @@
     <w:p>
       <w:r>
         <w:lastRenderedPageBreak/>
-        <w:t>Added a constraitn on table of orders that there cannot be more than one order for a customer with status = ‘open’</w:t>
+        <w:t xml:space="preserve">Added a </w:t>
+      </w:r>
+      <w:proofErr w:type="spellStart"/>
+      <w:r>
+        <w:t>constraitn</w:t>
+      </w:r>
+      <w:proofErr w:type="spellEnd"/>
+      <w:r>
+        <w:t xml:space="preserve"> on table of orders that there cannot be more than one order for a customer with status = ‘open’</w:t>
       </w:r>
     </w:p>
     <w:p>
@@ -2096,12 +2974,28 @@
     </w:p>
     <w:p>
       <w:r>
-        <w:t>Supplier sends a bid using a submit bid fn were first it will be checked if that order status is still open and if the supplier_id for that order is null or not</w:t>
-      </w:r>
-    </w:p>
-    <w:p>
-      <w:r>
-        <w:t xml:space="preserve">If yes then submit bid </w:t>
+        <w:t xml:space="preserve">Supplier sends a bid using a submit bid fn were first it will be checked if that order status is still open and if the </w:t>
+      </w:r>
+      <w:proofErr w:type="spellStart"/>
+      <w:r>
+        <w:t>supplier_id</w:t>
+      </w:r>
+      <w:proofErr w:type="spellEnd"/>
+      <w:r>
+        <w:t xml:space="preserve"> for that order is null or not</w:t>
+      </w:r>
+    </w:p>
+    <w:p>
+      <w:r>
+        <w:t xml:space="preserve">If </w:t>
+      </w:r>
+      <w:proofErr w:type="gramStart"/>
+      <w:r>
+        <w:t>yes</w:t>
+      </w:r>
+      <w:proofErr w:type="gramEnd"/>
+      <w:r>
+        <w:t xml:space="preserve"> then submit bid </w:t>
       </w:r>
     </w:p>
     <w:p/>
@@ -2117,7 +3011,31 @@
     </w:p>
     <w:p>
       <w:r>
-        <w:t xml:space="preserve">If it is then update the supplier id, accepted price, order_accepted_by_supplier at  and </w:t>
+        <w:t xml:space="preserve">If it is then </w:t>
+      </w:r>
+      <w:proofErr w:type="gramStart"/>
+      <w:r>
+        <w:t>update</w:t>
+      </w:r>
+      <w:proofErr w:type="gramEnd"/>
+      <w:r>
+        <w:t xml:space="preserve"> the supplier id, accepted price, </w:t>
+      </w:r>
+      <w:proofErr w:type="spellStart"/>
+      <w:r>
+        <w:t>order_accepted_by_supplier</w:t>
+      </w:r>
+      <w:proofErr w:type="spellEnd"/>
+      <w:r>
+        <w:t xml:space="preserve"> </w:t>
+      </w:r>
+      <w:proofErr w:type="gramStart"/>
+      <w:r>
+        <w:t>at  and</w:t>
+      </w:r>
+      <w:proofErr w:type="gramEnd"/>
+      <w:r>
+        <w:t xml:space="preserve"> </w:t>
       </w:r>
     </w:p>
     <w:p>
@@ -2128,13 +3046,29 @@
     <w:p/>
     <w:p>
       <w:r>
-        <w:t>As soon as this status update happens a trigger will be called for this order where all the bids for that order  will be deleted instantly</w:t>
+        <w:t xml:space="preserve">As soon as this status update happens a trigger will be called for this order where all the bids for that </w:t>
+      </w:r>
+      <w:proofErr w:type="gramStart"/>
+      <w:r>
+        <w:t>order  will</w:t>
+      </w:r>
+      <w:proofErr w:type="gramEnd"/>
+      <w:r>
+        <w:t xml:space="preserve"> be deleted instantly</w:t>
       </w:r>
     </w:p>
     <w:p/>
     <w:p>
       <w:r>
-        <w:t>For accepting bid, the customer id will be sent using the session id from backend (this has to be done for others too, for other human/computer interactions</w:t>
+        <w:t xml:space="preserve">For accepting bid, the customer id will be sent using the session id from backend (this </w:t>
+      </w:r>
+      <w:proofErr w:type="gramStart"/>
+      <w:r>
+        <w:t>has to</w:t>
+      </w:r>
+      <w:proofErr w:type="gramEnd"/>
+      <w:r>
+        <w:t xml:space="preserve"> be done for others too, for other human/computer interactions</w:t>
       </w:r>
     </w:p>
     <w:p/>
@@ -2150,13 +3084,42 @@
       </w:r>
     </w:p>
     <w:p>
-      <w:r>
-        <w:t>Have to remove  the order as soon as timer goes up.</w:t>
-      </w:r>
-    </w:p>
-    <w:p>
-      <w:r>
-        <w:t>From the orders  table and from drivers table</w:t>
+      <w:proofErr w:type="gramStart"/>
+      <w:r>
+        <w:t>Have to</w:t>
+      </w:r>
+      <w:proofErr w:type="gramEnd"/>
+      <w:r>
+        <w:t xml:space="preserve"> </w:t>
+      </w:r>
+      <w:proofErr w:type="gramStart"/>
+      <w:r>
+        <w:t>remove  the</w:t>
+      </w:r>
+      <w:proofErr w:type="gramEnd"/>
+      <w:r>
+        <w:t xml:space="preserve"> order as soon as timer goes up.</w:t>
+      </w:r>
+    </w:p>
+    <w:p>
+      <w:r>
+        <w:t xml:space="preserve">From the </w:t>
+      </w:r>
+      <w:proofErr w:type="gramStart"/>
+      <w:r>
+        <w:t>orders  table</w:t>
+      </w:r>
+      <w:proofErr w:type="gramEnd"/>
+      <w:r>
+        <w:t xml:space="preserve"> and from </w:t>
+      </w:r>
+      <w:proofErr w:type="gramStart"/>
+      <w:r>
+        <w:t>drivers</w:t>
+      </w:r>
+      <w:proofErr w:type="gramEnd"/>
+      <w:r>
+        <w:t xml:space="preserve"> table</w:t>
       </w:r>
     </w:p>
     <w:p/>
@@ -2166,7 +3129,15 @@
         <w:t>Now remove order fn will be called that will remove the order from the orders side</w:t>
       </w:r>
       <w:r>
-        <w:t xml:space="preserve"> and from the driver_assignment table</w:t>
+        <w:t xml:space="preserve"> and from the </w:t>
+      </w:r>
+      <w:proofErr w:type="spellStart"/>
+      <w:r>
+        <w:t>driver_assignment</w:t>
+      </w:r>
+      <w:proofErr w:type="spellEnd"/>
+      <w:r>
+        <w:t xml:space="preserve"> table</w:t>
       </w:r>
     </w:p>
     <w:p>
@@ -2194,7 +3165,15 @@
     <w:p/>
     <w:p>
       <w:r>
-        <w:t>REMINDER: session id has to be checked in backend logic as it was not catered here</w:t>
+        <w:t xml:space="preserve">REMINDER: session id </w:t>
+      </w:r>
+      <w:proofErr w:type="gramStart"/>
+      <w:r>
+        <w:t>has to</w:t>
+      </w:r>
+      <w:proofErr w:type="gramEnd"/>
+      <w:r>
+        <w:t xml:space="preserve"> be checked in backend logic as it was not catered here</w:t>
       </w:r>
     </w:p>
     <w:p/>
@@ -2208,17 +3187,49 @@
     </w:p>
     <w:p>
       <w:r>
-        <w:t>Did this by adding anotrer field to thebtal called order rejected in driver assignment table</w:t>
-      </w:r>
-    </w:p>
-    <w:p>
-      <w:r>
-        <w:t>If assignment already existed but rejected field is false then delete that row and reassign and vice versa</w:t>
-      </w:r>
-    </w:p>
-    <w:p>
-      <w:r>
-        <w:t xml:space="preserve">For making button unavailable after assigining, frontend will handle it in real time </w:t>
+        <w:t xml:space="preserve">Did this by adding </w:t>
+      </w:r>
+      <w:proofErr w:type="spellStart"/>
+      <w:r>
+        <w:t>anotrer</w:t>
+      </w:r>
+      <w:proofErr w:type="spellEnd"/>
+      <w:r>
+        <w:t xml:space="preserve"> field to </w:t>
+      </w:r>
+      <w:proofErr w:type="spellStart"/>
+      <w:r>
+        <w:t>thebtal</w:t>
+      </w:r>
+      <w:proofErr w:type="spellEnd"/>
+      <w:r>
+        <w:t xml:space="preserve"> called order rejected in driver assignment table</w:t>
+      </w:r>
+    </w:p>
+    <w:p>
+      <w:r>
+        <w:t xml:space="preserve">If assignment already existed but rejected field is </w:t>
+      </w:r>
+      <w:proofErr w:type="gramStart"/>
+      <w:r>
+        <w:t>false</w:t>
+      </w:r>
+      <w:proofErr w:type="gramEnd"/>
+      <w:r>
+        <w:t xml:space="preserve"> then delete that row and reassign and vice versa</w:t>
+      </w:r>
+    </w:p>
+    <w:p>
+      <w:r>
+        <w:t xml:space="preserve">For making button unavailable after </w:t>
+      </w:r>
+      <w:proofErr w:type="spellStart"/>
+      <w:r>
+        <w:t>assigining</w:t>
+      </w:r>
+      <w:proofErr w:type="spellEnd"/>
+      <w:r>
+        <w:t xml:space="preserve">, frontend will handle it in real time </w:t>
       </w:r>
     </w:p>
     <w:p/>
@@ -2259,7 +3270,36 @@
         <w:t>Fetch driver list</w:t>
       </w:r>
       <w:r>
-        <w:t> with get_available_drivers_for_supplier(supplier_id, order_id)</w:t>
+        <w:t> with </w:t>
+      </w:r>
+      <w:proofErr w:type="spellStart"/>
+      <w:r>
+        <w:t>get_available_drivers_for_</w:t>
+      </w:r>
+      <w:proofErr w:type="gramStart"/>
+      <w:r>
+        <w:t>supplier</w:t>
+      </w:r>
+      <w:proofErr w:type="spellEnd"/>
+      <w:r>
+        <w:t>(</w:t>
+      </w:r>
+      <w:proofErr w:type="spellStart"/>
+      <w:proofErr w:type="gramEnd"/>
+      <w:r>
+        <w:t>supplier_id</w:t>
+      </w:r>
+      <w:proofErr w:type="spellEnd"/>
+      <w:r>
+        <w:t xml:space="preserve">, </w:t>
+      </w:r>
+      <w:proofErr w:type="spellStart"/>
+      <w:r>
+        <w:t>order_id</w:t>
+      </w:r>
+      <w:proofErr w:type="spellEnd"/>
+      <w:r>
+        <w:t>)</w:t>
       </w:r>
     </w:p>
     <w:p>
@@ -2270,8 +3310,13 @@
         </w:numPr>
       </w:pPr>
       <w:r>
-        <w:t>Returns each driver with status and time_limit</w:t>
-      </w:r>
+        <w:t>Returns each driver with status and </w:t>
+      </w:r>
+      <w:proofErr w:type="spellStart"/>
+      <w:r>
+        <w:t>time_limit</w:t>
+      </w:r>
+      <w:proofErr w:type="spellEnd"/>
     </w:p>
     <w:p>
       <w:pPr>
@@ -2331,6 +3376,8 @@
         </w:rPr>
         <w:t xml:space="preserve"> (</w:t>
       </w:r>
+      <w:proofErr w:type="spellStart"/>
+      <w:proofErr w:type="gramStart"/>
       <w:r>
         <w:rPr>
           <w:rFonts w:ascii="Consolas" w:eastAsia="Times New Roman" w:hAnsi="Consolas" w:cs="Times New Roman"/>
@@ -2367,6 +3414,8 @@
         </w:rPr>
         <w:t>status</w:t>
       </w:r>
+      <w:proofErr w:type="spellEnd"/>
+      <w:proofErr w:type="gramEnd"/>
       <w:r>
         <w:rPr>
           <w:rFonts w:ascii="Consolas" w:eastAsia="Times New Roman" w:hAnsi="Consolas" w:cs="Times New Roman"/>
@@ -2475,6 +3524,7 @@
         </w:rPr>
         <w:t xml:space="preserve"> </w:t>
       </w:r>
+      <w:proofErr w:type="gramStart"/>
       <w:r>
         <w:rPr>
           <w:rFonts w:ascii="Consolas" w:eastAsia="Times New Roman" w:hAnsi="Consolas" w:cs="Times New Roman"/>
@@ -2497,7 +3547,20 @@
           <w:lang w:eastAsia="en-PK"/>
           <w14:ligatures w14:val="none"/>
         </w:rPr>
-        <w:t xml:space="preserve">() &lt; new </w:t>
+        <w:t>(</w:t>
+      </w:r>
+      <w:proofErr w:type="gramEnd"/>
+      <w:r>
+        <w:rPr>
+          <w:rFonts w:ascii="Consolas" w:eastAsia="Times New Roman" w:hAnsi="Consolas" w:cs="Times New Roman"/>
+          <w:color w:val="CCCCCC"/>
+          <w:kern w:val="0"/>
+          <w:sz w:val="21"/>
+          <w:szCs w:val="21"/>
+          <w:lang w:eastAsia="en-PK"/>
+          <w14:ligatures w14:val="none"/>
+        </w:rPr>
+        <w:t xml:space="preserve">) &lt; new </w:t>
       </w:r>
       <w:r>
         <w:rPr>
@@ -2521,7 +3584,47 @@
           <w:lang w:eastAsia="en-PK"/>
           <w14:ligatures w14:val="none"/>
         </w:rPr>
-        <w:t>(driver.time_limit)) {</w:t>
+        <w:t>(</w:t>
+      </w:r>
+      <w:proofErr w:type="spellStart"/>
+      <w:proofErr w:type="gramStart"/>
+      <w:r>
+        <w:rPr>
+          <w:rFonts w:ascii="Consolas" w:eastAsia="Times New Roman" w:hAnsi="Consolas" w:cs="Times New Roman"/>
+          <w:color w:val="CCCCCC"/>
+          <w:kern w:val="0"/>
+          <w:sz w:val="21"/>
+          <w:szCs w:val="21"/>
+          <w:lang w:eastAsia="en-PK"/>
+          <w14:ligatures w14:val="none"/>
+        </w:rPr>
+        <w:t>driver.time</w:t>
+      </w:r>
+      <w:proofErr w:type="gramEnd"/>
+      <w:r>
+        <w:rPr>
+          <w:rFonts w:ascii="Consolas" w:eastAsia="Times New Roman" w:hAnsi="Consolas" w:cs="Times New Roman"/>
+          <w:color w:val="CCCCCC"/>
+          <w:kern w:val="0"/>
+          <w:sz w:val="21"/>
+          <w:szCs w:val="21"/>
+          <w:lang w:eastAsia="en-PK"/>
+          <w14:ligatures w14:val="none"/>
+        </w:rPr>
+        <w:t>_limit</w:t>
+      </w:r>
+      <w:proofErr w:type="spellEnd"/>
+      <w:r>
+        <w:rPr>
+          <w:rFonts w:ascii="Consolas" w:eastAsia="Times New Roman" w:hAnsi="Consolas" w:cs="Times New Roman"/>
+          <w:color w:val="CCCCCC"/>
+          <w:kern w:val="0"/>
+          <w:sz w:val="21"/>
+          <w:szCs w:val="21"/>
+          <w:lang w:eastAsia="en-PK"/>
+          <w14:ligatures w14:val="none"/>
+        </w:rPr>
+        <w:t>)) {</w:t>
       </w:r>
     </w:p>
     <w:p>
@@ -2600,6 +3703,8 @@
         <w:lastRenderedPageBreak/>
         <w:t xml:space="preserve">  </w:t>
       </w:r>
+      <w:proofErr w:type="spellStart"/>
+      <w:proofErr w:type="gramStart"/>
       <w:r>
         <w:rPr>
           <w:rFonts w:ascii="Consolas" w:eastAsia="Times New Roman" w:hAnsi="Consolas" w:cs="Times New Roman"/>
@@ -2636,6 +3741,8 @@
         </w:rPr>
         <w:t>disabled</w:t>
       </w:r>
+      <w:proofErr w:type="spellEnd"/>
+      <w:proofErr w:type="gramEnd"/>
       <w:r>
         <w:rPr>
           <w:rFonts w:ascii="Consolas" w:eastAsia="Times New Roman" w:hAnsi="Consolas" w:cs="Times New Roman"/>
@@ -2672,6 +3779,7 @@
         </w:rPr>
         <w:t xml:space="preserve"> </w:t>
       </w:r>
+      <w:proofErr w:type="gramStart"/>
       <w:r>
         <w:rPr>
           <w:rFonts w:ascii="Consolas" w:eastAsia="Times New Roman" w:hAnsi="Consolas" w:cs="Times New Roman"/>
@@ -2696,6 +3804,7 @@
         </w:rPr>
         <w:t>;</w:t>
       </w:r>
+      <w:proofErr w:type="gramEnd"/>
     </w:p>
     <w:p>
       <w:pPr>
@@ -2776,6 +3885,8 @@
         </w:rPr>
         <w:t xml:space="preserve"> (</w:t>
       </w:r>
+      <w:proofErr w:type="spellStart"/>
+      <w:proofErr w:type="gramStart"/>
       <w:r>
         <w:rPr>
           <w:rFonts w:ascii="Consolas" w:eastAsia="Times New Roman" w:hAnsi="Consolas" w:cs="Times New Roman"/>
@@ -2812,6 +3923,8 @@
         </w:rPr>
         <w:t>status</w:t>
       </w:r>
+      <w:proofErr w:type="spellEnd"/>
+      <w:proofErr w:type="gramEnd"/>
       <w:r>
         <w:rPr>
           <w:rFonts w:ascii="Consolas" w:eastAsia="Times New Roman" w:hAnsi="Consolas" w:cs="Times New Roman"/>
@@ -2948,6 +4061,8 @@
         </w:rPr>
         <w:t xml:space="preserve">  </w:t>
       </w:r>
+      <w:proofErr w:type="spellStart"/>
+      <w:proofErr w:type="gramStart"/>
       <w:r>
         <w:rPr>
           <w:rFonts w:ascii="Consolas" w:eastAsia="Times New Roman" w:hAnsi="Consolas" w:cs="Times New Roman"/>
@@ -2984,6 +4099,8 @@
         </w:rPr>
         <w:t>disabled</w:t>
       </w:r>
+      <w:proofErr w:type="spellEnd"/>
+      <w:proofErr w:type="gramEnd"/>
       <w:r>
         <w:rPr>
           <w:rFonts w:ascii="Consolas" w:eastAsia="Times New Roman" w:hAnsi="Consolas" w:cs="Times New Roman"/>
@@ -3020,6 +4137,7 @@
         </w:rPr>
         <w:t xml:space="preserve"> </w:t>
       </w:r>
+      <w:proofErr w:type="gramStart"/>
       <w:r>
         <w:rPr>
           <w:rFonts w:ascii="Consolas" w:eastAsia="Times New Roman" w:hAnsi="Consolas" w:cs="Times New Roman"/>
@@ -3044,6 +4162,7 @@
         </w:rPr>
         <w:t>;</w:t>
       </w:r>
+      <w:proofErr w:type="gramEnd"/>
     </w:p>
     <w:p>
       <w:pPr>
@@ -3076,6 +4195,7 @@
         </w:rPr>
         <w:t xml:space="preserve">  </w:t>
       </w:r>
+      <w:proofErr w:type="spellStart"/>
       <w:r>
         <w:rPr>
           <w:rFonts w:ascii="Consolas" w:eastAsia="Times New Roman" w:hAnsi="Consolas" w:cs="Times New Roman"/>
@@ -3136,6 +4256,7 @@
         </w:rPr>
         <w:t>add</w:t>
       </w:r>
+      <w:proofErr w:type="spellEnd"/>
       <w:r>
         <w:rPr>
           <w:rFonts w:ascii="Consolas" w:eastAsia="Times New Roman" w:hAnsi="Consolas" w:cs="Times New Roman"/>
@@ -3160,6 +4281,7 @@
         </w:rPr>
         <w:t>'rejected'</w:t>
       </w:r>
+      <w:proofErr w:type="gramStart"/>
       <w:r>
         <w:rPr>
           <w:rFonts w:ascii="Consolas" w:eastAsia="Times New Roman" w:hAnsi="Consolas" w:cs="Times New Roman"/>
@@ -3172,6 +4294,7 @@
         </w:rPr>
         <w:t>);</w:t>
       </w:r>
+      <w:proofErr w:type="gramEnd"/>
     </w:p>
     <w:p>
       <w:pPr>
@@ -3304,6 +4427,8 @@
         </w:rPr>
         <w:t xml:space="preserve">  </w:t>
       </w:r>
+      <w:proofErr w:type="spellStart"/>
+      <w:proofErr w:type="gramStart"/>
       <w:r>
         <w:rPr>
           <w:rFonts w:ascii="Consolas" w:eastAsia="Times New Roman" w:hAnsi="Consolas" w:cs="Times New Roman"/>
@@ -3340,6 +4465,8 @@
         </w:rPr>
         <w:t>disabled</w:t>
       </w:r>
+      <w:proofErr w:type="spellEnd"/>
+      <w:proofErr w:type="gramEnd"/>
       <w:r>
         <w:rPr>
           <w:rFonts w:ascii="Consolas" w:eastAsia="Times New Roman" w:hAnsi="Consolas" w:cs="Times New Roman"/>
@@ -3376,6 +4503,7 @@
         </w:rPr>
         <w:t xml:space="preserve"> </w:t>
       </w:r>
+      <w:proofErr w:type="gramStart"/>
       <w:r>
         <w:rPr>
           <w:rFonts w:ascii="Consolas" w:eastAsia="Times New Roman" w:hAnsi="Consolas" w:cs="Times New Roman"/>
@@ -3400,6 +4528,7 @@
         </w:rPr>
         <w:t>;</w:t>
       </w:r>
+      <w:proofErr w:type="gramEnd"/>
     </w:p>
     <w:p>
       <w:pPr>
@@ -3464,7 +4593,23 @@
         </w:numPr>
       </w:pPr>
       <w:r>
-        <w:t>Frontend just calls assign_driver_to_order()</w:t>
+        <w:t>Frontend just calls </w:t>
+      </w:r>
+      <w:proofErr w:type="spellStart"/>
+      <w:r>
+        <w:t>assign_driver_to_</w:t>
+      </w:r>
+      <w:proofErr w:type="gramStart"/>
+      <w:r>
+        <w:t>order</w:t>
+      </w:r>
+      <w:proofErr w:type="spellEnd"/>
+      <w:r>
+        <w:t>(</w:t>
+      </w:r>
+      <w:proofErr w:type="gramEnd"/>
+      <w:r>
+        <w:t>)</w:t>
       </w:r>
     </w:p>
     <w:p>
@@ -3486,7 +4631,15 @@
         </w:numPr>
       </w:pPr>
       <w:r>
-        <w:t>Rejects if order_rejected = TRUE</w:t>
+        <w:t>Rejects if </w:t>
+      </w:r>
+      <w:proofErr w:type="spellStart"/>
+      <w:r>
+        <w:t>order_rejected</w:t>
+      </w:r>
+      <w:proofErr w:type="spellEnd"/>
+      <w:r>
+        <w:t xml:space="preserve"> = TRUE</w:t>
       </w:r>
     </w:p>
     <w:p>
@@ -3497,7 +4650,15 @@
         </w:numPr>
       </w:pPr>
       <w:r>
-        <w:t>Deletes old expired assignment</w:t>
+        <w:t xml:space="preserve">Deletes </w:t>
+      </w:r>
+      <w:proofErr w:type="gramStart"/>
+      <w:r>
+        <w:t>old expired</w:t>
+      </w:r>
+      <w:proofErr w:type="gramEnd"/>
+      <w:r>
+        <w:t xml:space="preserve"> assignment</w:t>
       </w:r>
     </w:p>
     <w:p>
@@ -3534,7 +4695,23 @@
         <w:t>✅</w:t>
       </w:r>
       <w:r>
-        <w:t> confirm_order_driver() - checks driver's timer</w:t>
+        <w:t> </w:t>
+      </w:r>
+      <w:proofErr w:type="spellStart"/>
+      <w:r>
+        <w:t>confirm_order_</w:t>
+      </w:r>
+      <w:proofErr w:type="gramStart"/>
+      <w:r>
+        <w:t>driver</w:t>
+      </w:r>
+      <w:proofErr w:type="spellEnd"/>
+      <w:r>
+        <w:t>(</w:t>
+      </w:r>
+      <w:proofErr w:type="gramEnd"/>
+      <w:r>
+        <w:t>) - checks driver's timer</w:t>
       </w:r>
     </w:p>
     <w:p>
@@ -3551,7 +4728,23 @@
         <w:t>✅</w:t>
       </w:r>
       <w:r>
-        <w:t> assign_driver_to_order() - checks rejection status</w:t>
+        <w:t> </w:t>
+      </w:r>
+      <w:proofErr w:type="spellStart"/>
+      <w:r>
+        <w:t>assign_driver_to_</w:t>
+      </w:r>
+      <w:proofErr w:type="gramStart"/>
+      <w:r>
+        <w:t>order</w:t>
+      </w:r>
+      <w:proofErr w:type="spellEnd"/>
+      <w:r>
+        <w:t>(</w:t>
+      </w:r>
+      <w:proofErr w:type="gramEnd"/>
+      <w:r>
+        <w:t>) - checks rejection status</w:t>
       </w:r>
     </w:p>
     <w:p>
@@ -3580,7 +4773,15 @@
         <w:t>Perfect architecture! No backend timer polling needed.</w:t>
       </w:r>
       <w:r>
-        <w:t> Frontend calculates based on time_limit timestamp.</w:t>
+        <w:t> Frontend calculates based on </w:t>
+      </w:r>
+      <w:proofErr w:type="spellStart"/>
+      <w:r>
+        <w:t>time_limit</w:t>
+      </w:r>
+      <w:proofErr w:type="spellEnd"/>
+      <w:r>
+        <w:t> timestamp.</w:t>
       </w:r>
     </w:p>
     <w:p/>
@@ -3626,7 +4827,15 @@
         <w:t>Initially:</w:t>
       </w:r>
       <w:r>
-        <w:t> All drivers available (no driver_assignment rows exist)</w:t>
+        <w:t xml:space="preserve"> All drivers available (no </w:t>
+      </w:r>
+      <w:proofErr w:type="spellStart"/>
+      <w:r>
+        <w:t>driver_assignment</w:t>
+      </w:r>
+      <w:proofErr w:type="spellEnd"/>
+      <w:r>
+        <w:t xml:space="preserve"> rows exist)</w:t>
       </w:r>
     </w:p>
     <w:p>
@@ -3652,8 +4861,13 @@
         </w:numPr>
       </w:pPr>
       <w:r>
-        <w:t>INSERT into driver_assignment</w:t>
-      </w:r>
+        <w:t xml:space="preserve">INSERT into </w:t>
+      </w:r>
+      <w:proofErr w:type="spellStart"/>
+      <w:r>
+        <w:t>driver_assignment</w:t>
+      </w:r>
+      <w:proofErr w:type="spellEnd"/>
     </w:p>
     <w:p>
       <w:pPr>
@@ -3690,7 +4904,23 @@
       </w:pPr>
       <w:r>
         <w:lastRenderedPageBreak/>
-        <w:t>UPDATE driver_assignment SET order_rejected = TRUE</w:t>
+        <w:t xml:space="preserve">UPDATE </w:t>
+      </w:r>
+      <w:proofErr w:type="spellStart"/>
+      <w:r>
+        <w:t>driver_assignment</w:t>
+      </w:r>
+      <w:proofErr w:type="spellEnd"/>
+      <w:r>
+        <w:t xml:space="preserve"> SET </w:t>
+      </w:r>
+      <w:proofErr w:type="spellStart"/>
+      <w:r>
+        <w:t>order_rejected</w:t>
+      </w:r>
+      <w:proofErr w:type="spellEnd"/>
+      <w:r>
+        <w:t xml:space="preserve"> = TRUE</w:t>
       </w:r>
     </w:p>
     <w:p>
@@ -3748,18 +4978,44 @@
           <w:b/>
           <w:bCs/>
         </w:rPr>
-        <w:t>Add TRIGGER on driver_assignment (like we have for orders):</w:t>
-      </w:r>
-    </w:p>
-    <w:p>
-      <w:r>
-        <w:t>CREATE TRIGGER trigger_notify_driver_assignment_updated</w:t>
-      </w:r>
-    </w:p>
-    <w:p>
-      <w:r>
-        <w:t xml:space="preserve">    AFTER INSERT OR UPDATE OR DELETE ON driver_assignment</w:t>
-      </w:r>
+        <w:t xml:space="preserve">Add TRIGGER on </w:t>
+      </w:r>
+      <w:proofErr w:type="spellStart"/>
+      <w:r>
+        <w:rPr>
+          <w:b/>
+          <w:bCs/>
+        </w:rPr>
+        <w:t>driver_assignment</w:t>
+      </w:r>
+      <w:proofErr w:type="spellEnd"/>
+      <w:r>
+        <w:rPr>
+          <w:b/>
+          <w:bCs/>
+        </w:rPr>
+        <w:t xml:space="preserve"> (like we have for orders):</w:t>
+      </w:r>
+    </w:p>
+    <w:p>
+      <w:r>
+        <w:t xml:space="preserve">CREATE TRIGGER </w:t>
+      </w:r>
+      <w:proofErr w:type="spellStart"/>
+      <w:r>
+        <w:t>trigger_notify_driver_assignment_updated</w:t>
+      </w:r>
+      <w:proofErr w:type="spellEnd"/>
+    </w:p>
+    <w:p>
+      <w:r>
+        <w:t xml:space="preserve">    AFTER INSERT OR UPDATE OR DELETE ON </w:t>
+      </w:r>
+      <w:proofErr w:type="spellStart"/>
+      <w:r>
+        <w:t>driver_assignment</w:t>
+      </w:r>
+      <w:proofErr w:type="spellEnd"/>
     </w:p>
     <w:p>
       <w:r>
@@ -3768,8 +5024,21 @@
     </w:p>
     <w:p>
       <w:r>
-        <w:t xml:space="preserve">    EXECUTE FUNCTION notify_driver_assignment_updated();</w:t>
-      </w:r>
+        <w:t xml:space="preserve">    EXECUTE FUNCTION </w:t>
+      </w:r>
+      <w:proofErr w:type="spellStart"/>
+      <w:r>
+        <w:t>notify_driver_assignment_</w:t>
+      </w:r>
+      <w:proofErr w:type="gramStart"/>
+      <w:r>
+        <w:t>updated</w:t>
+      </w:r>
+      <w:proofErr w:type="spellEnd"/>
+      <w:r>
+        <w:t>();</w:t>
+      </w:r>
+      <w:proofErr w:type="gramEnd"/>
     </w:p>
     <w:p/>
     <w:p>
@@ -3789,23 +5058,92 @@
     </w:p>
     <w:p>
       <w:r>
-        <w:t>// Listen to driver_assignment_channel</w:t>
-      </w:r>
-    </w:p>
-    <w:p>
-      <w:r>
-        <w:t>client.on('notification', (msg) =&gt; {</w:t>
-      </w:r>
-    </w:p>
-    <w:p>
-      <w:r>
-        <w:t>  if (msg.channel === 'driver_assignment_channel') {</w:t>
-      </w:r>
-    </w:p>
-    <w:p>
-      <w:r>
-        <w:t>    io.emit('driver_assignment_update', { order_id: ... });</w:t>
-      </w:r>
+        <w:t xml:space="preserve">// Listen to </w:t>
+      </w:r>
+      <w:proofErr w:type="spellStart"/>
+      <w:r>
+        <w:t>driver_assignment_channel</w:t>
+      </w:r>
+      <w:proofErr w:type="spellEnd"/>
+    </w:p>
+    <w:p>
+      <w:proofErr w:type="spellStart"/>
+      <w:proofErr w:type="gramStart"/>
+      <w:r>
+        <w:t>client.on</w:t>
+      </w:r>
+      <w:proofErr w:type="spellEnd"/>
+      <w:proofErr w:type="gramEnd"/>
+      <w:r>
+        <w:t>('notification', (msg) =&gt; {</w:t>
+      </w:r>
+    </w:p>
+    <w:p>
+      <w:r>
+        <w:t>  if (</w:t>
+      </w:r>
+      <w:proofErr w:type="spellStart"/>
+      <w:proofErr w:type="gramStart"/>
+      <w:r>
+        <w:t>msg.channel</w:t>
+      </w:r>
+      <w:proofErr w:type="spellEnd"/>
+      <w:proofErr w:type="gramEnd"/>
+      <w:r>
+        <w:t xml:space="preserve"> === '</w:t>
+      </w:r>
+      <w:proofErr w:type="spellStart"/>
+      <w:r>
+        <w:t>driver_assignment_channel</w:t>
+      </w:r>
+      <w:proofErr w:type="spellEnd"/>
+      <w:r>
+        <w:t>') {</w:t>
+      </w:r>
+    </w:p>
+    <w:p>
+      <w:r>
+        <w:t xml:space="preserve">    </w:t>
+      </w:r>
+      <w:proofErr w:type="spellStart"/>
+      <w:proofErr w:type="gramStart"/>
+      <w:r>
+        <w:t>io.emit</w:t>
+      </w:r>
+      <w:proofErr w:type="spellEnd"/>
+      <w:proofErr w:type="gramEnd"/>
+      <w:r>
+        <w:t>('</w:t>
+      </w:r>
+      <w:proofErr w:type="spellStart"/>
+      <w:r>
+        <w:t>driver_assignment_update</w:t>
+      </w:r>
+      <w:proofErr w:type="spellEnd"/>
+      <w:r>
+        <w:t xml:space="preserve">', </w:t>
+      </w:r>
+      <w:proofErr w:type="gramStart"/>
+      <w:r>
+        <w:t xml:space="preserve">{ </w:t>
+      </w:r>
+      <w:proofErr w:type="spellStart"/>
+      <w:r>
+        <w:t>order</w:t>
+      </w:r>
+      <w:proofErr w:type="gramEnd"/>
+      <w:r>
+        <w:t>_id</w:t>
+      </w:r>
+      <w:proofErr w:type="spellEnd"/>
+      <w:r>
+        <w:t xml:space="preserve">: </w:t>
+      </w:r>
+      <w:proofErr w:type="gramStart"/>
+      <w:r>
+        <w:t>... });</w:t>
+      </w:r>
+      <w:proofErr w:type="gramEnd"/>
     </w:p>
     <w:p>
       <w:r>
@@ -3814,8 +5152,13 @@
     </w:p>
     <w:p>
       <w:r>
-        <w:t>});</w:t>
-      </w:r>
+        <w:t>}</w:t>
+      </w:r>
+      <w:proofErr w:type="gramStart"/>
+      <w:r>
+        <w:t>);</w:t>
+      </w:r>
+      <w:proofErr w:type="gramEnd"/>
     </w:p>
     <w:p>
       <w:pPr>
@@ -3860,7 +5203,23 @@
           <w:b/>
           <w:bCs/>
         </w:rPr>
-        <w:t>Added available flag in supplier_Driver table which is set to false when a driver has been assigned to an order</w:t>
+        <w:t xml:space="preserve">Added available flag in </w:t>
+      </w:r>
+      <w:proofErr w:type="spellStart"/>
+      <w:r>
+        <w:rPr>
+          <w:b/>
+          <w:bCs/>
+        </w:rPr>
+        <w:t>supplier_Driver</w:t>
+      </w:r>
+      <w:proofErr w:type="spellEnd"/>
+      <w:r>
+        <w:rPr>
+          <w:b/>
+          <w:bCs/>
+        </w:rPr>
+        <w:t xml:space="preserve"> table which is set to false when a driver has been assigned to an order</w:t>
       </w:r>
     </w:p>
     <w:p>
@@ -3917,7 +5276,15 @@
     </w:p>
     <w:p>
       <w:r>
-        <w:t>Now only the delivery process and the ride finish has to be taken care of as well as order history</w:t>
+        <w:t xml:space="preserve">Now only the delivery process and the ride finish </w:t>
+      </w:r>
+      <w:proofErr w:type="gramStart"/>
+      <w:r>
+        <w:t>has</w:t>
+      </w:r>
+      <w:proofErr w:type="gramEnd"/>
+      <w:r>
+        <w:t xml:space="preserve"> to be taken care of as well as order history</w:t>
       </w:r>
     </w:p>
     <w:p>
@@ -3933,7 +5300,23 @@
     <w:p/>
     <w:p>
       <w:r>
-        <w:t>The real time changes on tables and other things on db side will be only noticed used trigger on db logic.</w:t>
+        <w:t xml:space="preserve">The real time changes on tables and other things on </w:t>
+      </w:r>
+      <w:proofErr w:type="spellStart"/>
+      <w:r>
+        <w:t>db</w:t>
+      </w:r>
+      <w:proofErr w:type="spellEnd"/>
+      <w:r>
+        <w:t xml:space="preserve"> side will be only noticed used trigger on </w:t>
+      </w:r>
+      <w:proofErr w:type="spellStart"/>
+      <w:r>
+        <w:t>db</w:t>
+      </w:r>
+      <w:proofErr w:type="spellEnd"/>
+      <w:r>
+        <w:t xml:space="preserve"> logic.</w:t>
       </w:r>
     </w:p>
     <w:p>
@@ -3944,16 +5327,80 @@
     <w:p/>
     <w:p>
       <w:r>
-        <w:t>Now rating is added but for cancellation we have to take care of rating too if driver or supplier cancels it rating falls by 0</w:t>
-      </w:r>
-      <w:r>
-        <w:t>.2 for supplier side rating drop will happen if the status was accepted or ride_started  same for driver . if customer does it at the accepted or ride_started stage then no rating will be updated but reason will be logged in rating table if customer or supplier does it at any stage before accepted then no problem</w:t>
+        <w:t xml:space="preserve">Now rating is added but for cancellation we </w:t>
+      </w:r>
+      <w:proofErr w:type="gramStart"/>
+      <w:r>
+        <w:t>have to</w:t>
+      </w:r>
+      <w:proofErr w:type="gramEnd"/>
+      <w:r>
+        <w:t xml:space="preserve"> take care of rating too if driver or supplier cancels it rating falls by 0</w:t>
+      </w:r>
+      <w:r>
+        <w:t xml:space="preserve">.2 for supplier side rating drop will happen if the status was accepted or </w:t>
+      </w:r>
+      <w:proofErr w:type="spellStart"/>
+      <w:r>
+        <w:t>ride_</w:t>
+      </w:r>
+      <w:proofErr w:type="gramStart"/>
+      <w:r>
+        <w:t>started</w:t>
+      </w:r>
+      <w:proofErr w:type="spellEnd"/>
+      <w:r>
+        <w:t xml:space="preserve">  same</w:t>
+      </w:r>
+      <w:proofErr w:type="gramEnd"/>
+      <w:r>
+        <w:t xml:space="preserve"> for </w:t>
+      </w:r>
+      <w:proofErr w:type="gramStart"/>
+      <w:r>
+        <w:t>driver .</w:t>
+      </w:r>
+      <w:proofErr w:type="gramEnd"/>
+      <w:r>
+        <w:t xml:space="preserve"> if customer does it at the accepted or </w:t>
+      </w:r>
+      <w:proofErr w:type="spellStart"/>
+      <w:r>
+        <w:t>ride_started</w:t>
+      </w:r>
+      <w:proofErr w:type="spellEnd"/>
+      <w:r>
+        <w:t xml:space="preserve"> stage then no rating will be updated but reason will be logged in rating table if customer or supplier does it at any stage before accepted then no problem</w:t>
       </w:r>
     </w:p>
     <w:p/>
     <w:p>
       <w:r>
-        <w:t>Ok first, if any party cancelled  on status that was not accepted or ride started then dont log it into oder history</w:t>
+        <w:t xml:space="preserve">Ok first, if any party </w:t>
+      </w:r>
+      <w:proofErr w:type="gramStart"/>
+      <w:r>
+        <w:t>cancelled  on</w:t>
+      </w:r>
+      <w:proofErr w:type="gramEnd"/>
+      <w:r>
+        <w:t xml:space="preserve"> status that was not accepted or ride started then </w:t>
+      </w:r>
+      <w:proofErr w:type="spellStart"/>
+      <w:r>
+        <w:t>dont</w:t>
+      </w:r>
+      <w:proofErr w:type="spellEnd"/>
+      <w:r>
+        <w:t xml:space="preserve"> log it into </w:t>
+      </w:r>
+      <w:proofErr w:type="spellStart"/>
+      <w:r>
+        <w:t>oder</w:t>
+      </w:r>
+      <w:proofErr w:type="spellEnd"/>
+      <w:r>
+        <w:t xml:space="preserve"> history</w:t>
       </w:r>
     </w:p>
     <w:p>
@@ -3963,19 +5410,40 @@
     </w:p>
     <w:p>
       <w:r>
-        <w:t>If rider or supplier does it, log the reason into ratings table, rating of supplier affected</w:t>
+        <w:t xml:space="preserve">If rider or </w:t>
+      </w:r>
+      <w:proofErr w:type="gramStart"/>
+      <w:r>
+        <w:t>supplier</w:t>
+      </w:r>
+      <w:proofErr w:type="gramEnd"/>
+      <w:r>
+        <w:t xml:space="preserve"> does it, log the reason into ratings table, rating of supplier affected</w:t>
       </w:r>
     </w:p>
     <w:p/>
     <w:p/>
     <w:p>
       <w:r>
-        <w:t xml:space="preserve">View past orders list has implemented in schema.sql as it is same for all </w:t>
-      </w:r>
-    </w:p>
-    <w:p>
-      <w:r>
-        <w:t xml:space="preserve">Seperate implementations of view past order details is done due to fetching different data </w:t>
+        <w:t xml:space="preserve">View past orders list has implemented in </w:t>
+      </w:r>
+      <w:proofErr w:type="spellStart"/>
+      <w:r>
+        <w:t>schema.sql</w:t>
+      </w:r>
+      <w:proofErr w:type="spellEnd"/>
+      <w:r>
+        <w:t xml:space="preserve"> as it is same for all </w:t>
+      </w:r>
+    </w:p>
+    <w:p>
+      <w:proofErr w:type="spellStart"/>
+      <w:r>
+        <w:t>Seperate</w:t>
+      </w:r>
+      <w:proofErr w:type="spellEnd"/>
+      <w:r>
+        <w:t xml:space="preserve"> implementations of view past order details is done due to fetching different data </w:t>
       </w:r>
       <w:r>
         <w:t xml:space="preserve">for each user </w:t>
@@ -3995,7 +5463,15 @@
     </w:p>
     <w:p>
       <w:r>
-        <w:t>Have made the basic version with middleware and the basic apis set up.</w:t>
+        <w:t xml:space="preserve">Have made the basic version with middleware and the basic </w:t>
+      </w:r>
+      <w:proofErr w:type="spellStart"/>
+      <w:r>
+        <w:t>apis</w:t>
+      </w:r>
+      <w:proofErr w:type="spellEnd"/>
+      <w:r>
+        <w:t xml:space="preserve"> set up.</w:t>
       </w:r>
     </w:p>
     <w:p>
@@ -4051,7 +5527,47 @@
     <w:p/>
     <w:p>
       <w:r>
-        <w:t xml:space="preserve">I implemented a strict role-lock in the database profile functions so users can set role details only once, and never change or update role details afterward. I updated the role check in `enter_details_customer`, `enter_details_driver`, and `enter_details_supplier` to reject when the current role is not `undefined`, and standardized the rejection message to: "Role already assigned. Details update is not allowed." I did this </w:t>
+        <w:t xml:space="preserve">I implemented a strict role-lock in the database profile functions so users can set role details only </w:t>
+      </w:r>
+      <w:proofErr w:type="gramStart"/>
+      <w:r>
+        <w:t>once, and</w:t>
+      </w:r>
+      <w:proofErr w:type="gramEnd"/>
+      <w:r>
+        <w:t xml:space="preserve"> never change or update role details afterward. I updated the role check in `</w:t>
+      </w:r>
+      <w:proofErr w:type="spellStart"/>
+      <w:r>
+        <w:t>enter_details_customer</w:t>
+      </w:r>
+      <w:proofErr w:type="spellEnd"/>
+      <w:r>
+        <w:t>`, `</w:t>
+      </w:r>
+      <w:proofErr w:type="spellStart"/>
+      <w:r>
+        <w:t>enter_details_driver</w:t>
+      </w:r>
+      <w:proofErr w:type="spellEnd"/>
+      <w:r>
+        <w:t>`, and `</w:t>
+      </w:r>
+      <w:proofErr w:type="spellStart"/>
+      <w:r>
+        <w:t>enter_details_supplier</w:t>
+      </w:r>
+      <w:proofErr w:type="spellEnd"/>
+      <w:r>
+        <w:t>` to reject when the current role is not `undefined</w:t>
+      </w:r>
+      <w:proofErr w:type="gramStart"/>
+      <w:r>
+        <w:t>`, and</w:t>
+      </w:r>
+      <w:proofErr w:type="gramEnd"/>
+      <w:r>
+        <w:t xml:space="preserve"> standardized the rejection message to: "Role already assigned. Details update is not allowed." I did this </w:t>
       </w:r>
       <w:r>
         <w:t>to ensure</w:t>
@@ -4116,8 +5632,13 @@
     <w:p/>
     <w:p/>
     <w:p>
-      <w:r>
-        <w:t>Lastly , now on driver onboarding, if he exists in the supplier driver table then allow him in.</w:t>
+      <w:proofErr w:type="gramStart"/>
+      <w:r>
+        <w:t>Lastly ,</w:t>
+      </w:r>
+      <w:proofErr w:type="gramEnd"/>
+      <w:r>
+        <w:t xml:space="preserve"> now on driver onboarding, if he exists in the supplier driver table then allow him in.</w:t>
       </w:r>
     </w:p>
     <w:p>
@@ -4128,7 +5649,15 @@
     <w:p/>
     <w:p>
       <w:r>
-        <w:t>Rigorous code testing with tweaks done. The authentication and onboarding logic is done and tested.</w:t>
+        <w:t xml:space="preserve">Rigorous code testing with tweaks done. The authentication and onboarding logic </w:t>
+      </w:r>
+      <w:proofErr w:type="gramStart"/>
+      <w:r>
+        <w:t>is</w:t>
+      </w:r>
+      <w:proofErr w:type="gramEnd"/>
+      <w:r>
+        <w:t xml:space="preserve"> done and tested.</w:t>
       </w:r>
     </w:p>
     <w:p>
@@ -4194,19 +5723,99 @@
     <w:p/>
     <w:p>
       <w:r>
-        <w:t>I enforced supplier bidding eligibility. Supplier can view marketplace list and details, but cannot bid unless they have at least one linked and currently available driver. This is enforced in backend and in send_bid DB function.</w:t>
+        <w:t xml:space="preserve">I enforced supplier bidding eligibility. Supplier can view marketplace list and </w:t>
+      </w:r>
+      <w:proofErr w:type="gramStart"/>
+      <w:r>
+        <w:t>details, but</w:t>
+      </w:r>
+      <w:proofErr w:type="gramEnd"/>
+      <w:r>
+        <w:t xml:space="preserve"> cannot bid unless they have at least one linked and currently available driver. This is enforced in backend and in </w:t>
+      </w:r>
+      <w:proofErr w:type="spellStart"/>
+      <w:r>
+        <w:t>send_bid</w:t>
+      </w:r>
+      <w:proofErr w:type="spellEnd"/>
+      <w:r>
+        <w:t xml:space="preserve"> DB function.</w:t>
       </w:r>
     </w:p>
     <w:p/>
     <w:p>
       <w:r>
-        <w:t>I made the marketplace list privacy-safe. Supplier available orders now return only order_id, requested_capacity, and customer_bid_price. Full details including customer name and delivery location are returned only to bid-eligible suppliers, implemented in view_order_details with supplier_id check.</w:t>
+        <w:t xml:space="preserve">I made the marketplace list </w:t>
+      </w:r>
+      <w:proofErr w:type="gramStart"/>
+      <w:r>
+        <w:t>privacy-safe</w:t>
+      </w:r>
+      <w:proofErr w:type="gramEnd"/>
+      <w:r>
+        <w:t xml:space="preserve">. Supplier available orders now return only </w:t>
+      </w:r>
+      <w:proofErr w:type="spellStart"/>
+      <w:r>
+        <w:t>order_id</w:t>
+      </w:r>
+      <w:proofErr w:type="spellEnd"/>
+      <w:r>
+        <w:t xml:space="preserve">, </w:t>
+      </w:r>
+      <w:proofErr w:type="spellStart"/>
+      <w:r>
+        <w:t>requested_capacity</w:t>
+      </w:r>
+      <w:proofErr w:type="spellEnd"/>
+      <w:r>
+        <w:t xml:space="preserve">, and </w:t>
+      </w:r>
+      <w:proofErr w:type="spellStart"/>
+      <w:r>
+        <w:t>customer_bid_price</w:t>
+      </w:r>
+      <w:proofErr w:type="spellEnd"/>
+      <w:r>
+        <w:t xml:space="preserve">. Full details including customer name and delivery location are returned only to bid-eligible suppliers, implemented in </w:t>
+      </w:r>
+      <w:proofErr w:type="spellStart"/>
+      <w:r>
+        <w:t>view_order_details</w:t>
+      </w:r>
+      <w:proofErr w:type="spellEnd"/>
+      <w:r>
+        <w:t xml:space="preserve"> with </w:t>
+      </w:r>
+      <w:proofErr w:type="spellStart"/>
+      <w:r>
+        <w:t>supplier_id</w:t>
+      </w:r>
+      <w:proofErr w:type="spellEnd"/>
+      <w:r>
+        <w:t xml:space="preserve"> check.</w:t>
       </w:r>
     </w:p>
     <w:p/>
     <w:p>
       <w:r>
-        <w:t>Also implemented supplier bid cooldown and expiry window of 90 seconds in send_bid. Customer bid visibility and acceptance use the same 90-second window, enforced in customer.sql.</w:t>
+        <w:t xml:space="preserve">Also implemented supplier bid cooldown and expiry window of 90 seconds in </w:t>
+      </w:r>
+      <w:proofErr w:type="spellStart"/>
+      <w:r>
+        <w:t>send_bid</w:t>
+      </w:r>
+      <w:proofErr w:type="spellEnd"/>
+      <w:r>
+        <w:t xml:space="preserve">. Customer bid visibility and acceptance use the same 90-second window, enforced in </w:t>
+      </w:r>
+      <w:proofErr w:type="spellStart"/>
+      <w:r>
+        <w:t>customer.sql</w:t>
+      </w:r>
+      <w:proofErr w:type="spellEnd"/>
+      <w:r>
+        <w:t>.</w:t>
       </w:r>
     </w:p>
     <w:p>
@@ -4220,7 +5829,15 @@
       </w:r>
       <w:r>
         <w:br/>
-        <w:t>So far they are working</w:t>
+        <w:t xml:space="preserve">So </w:t>
+      </w:r>
+      <w:proofErr w:type="gramStart"/>
+      <w:r>
+        <w:t>far</w:t>
+      </w:r>
+      <w:proofErr w:type="gramEnd"/>
+      <w:r>
+        <w:t xml:space="preserve"> they are working</w:t>
       </w:r>
     </w:p>
     <w:p>
@@ -4240,8 +5857,13 @@
       </w:r>
     </w:p>
     <w:p>
-      <w:r>
-        <w:t>Implennted supplier assignment and driver accepting/rejecting order all in their own time limits</w:t>
+      <w:proofErr w:type="spellStart"/>
+      <w:r>
+        <w:t>Implennted</w:t>
+      </w:r>
+      <w:proofErr w:type="spellEnd"/>
+      <w:r>
+        <w:t xml:space="preserve"> supplier assignment and driver accepting/rejecting order all in their own time limits</w:t>
       </w:r>
     </w:p>
     <w:p>
@@ -4253,12 +5875,28 @@
     <w:p>
       <w:r>
         <w:lastRenderedPageBreak/>
-        <w:t>Hardened timeout behavior across the full flow because I discovered inconsistent edge cases during testing. Added supplier time limit visibility in the supplier order details response so the expiry was explicit. I enforced that once the supplier timer expires, the supplier can no longer view assignable drivers, cannot assign a driver, and cannot access the expired order as an active order.</w:t>
-      </w:r>
-    </w:p>
-    <w:p>
-      <w:r>
-        <w:t xml:space="preserve">Fixed the active-orders listing behavior so expired supplier-timer orders no longer appear there. </w:t>
+        <w:t xml:space="preserve">Hardened timeout </w:t>
+      </w:r>
+      <w:proofErr w:type="spellStart"/>
+      <w:r>
+        <w:t>behavior</w:t>
+      </w:r>
+      <w:proofErr w:type="spellEnd"/>
+      <w:r>
+        <w:t xml:space="preserve"> across the full flow because I discovered inconsistent edge cases during testing. Added supplier time limit visibility in the supplier order details response so the expiry was explicit. I enforced that once the supplier timer expires, the supplier can no longer view assignable drivers, cannot assign a driver, and cannot access the expired order as an active order.</w:t>
+      </w:r>
+    </w:p>
+    <w:p>
+      <w:r>
+        <w:t xml:space="preserve">Fixed the active-orders listing </w:t>
+      </w:r>
+      <w:proofErr w:type="spellStart"/>
+      <w:r>
+        <w:t>behavior</w:t>
+      </w:r>
+      <w:proofErr w:type="spellEnd"/>
+      <w:r>
+        <w:t xml:space="preserve"> so expired supplier-timer orders no longer appear there. </w:t>
       </w:r>
     </w:p>
     <w:p>
@@ -4274,7 +5912,23 @@
     <w:p/>
     <w:p>
       <w:r>
-        <w:t xml:space="preserve">Added customer rating endpoints with both rating and skip functionality. When a customer rates an order, the supplier’s rating is updated with a weighted average based on all completed orders, and the order is archived in order_history with the rating snapshot. When a customer skips rating, only the total orders count is incremented and the order is archived without a rating. </w:t>
+        <w:t xml:space="preserve">Added customer rating endpoints with both rating and skip functionality. When a customer rates an order, the supplier’s rating is updated with a weighted average based on all completed orders, and the order is archived in </w:t>
+      </w:r>
+      <w:proofErr w:type="spellStart"/>
+      <w:r>
+        <w:t>order_history</w:t>
+      </w:r>
+      <w:proofErr w:type="spellEnd"/>
+      <w:r>
+        <w:t xml:space="preserve"> with the rating snapshot. When a customer skips rating, only the total orders count is </w:t>
+      </w:r>
+      <w:proofErr w:type="gramStart"/>
+      <w:r>
+        <w:t>incremented</w:t>
+      </w:r>
+      <w:proofErr w:type="gramEnd"/>
+      <w:r>
+        <w:t xml:space="preserve"> and the order is archived without a rating. </w:t>
       </w:r>
     </w:p>
     <w:p>
@@ -4306,13 +5960,26 @@
       </w:r>
     </w:p>
     <w:p>
-      <w:r>
-        <w:t>Implemetned logout and deletion of each role</w:t>
-      </w:r>
-    </w:p>
-    <w:p>
-      <w:r>
-        <w:t>Testing is all that is left now... if I dont think of any more stuff to add.</w:t>
+      <w:proofErr w:type="spellStart"/>
+      <w:r>
+        <w:t>Implemetned</w:t>
+      </w:r>
+      <w:proofErr w:type="spellEnd"/>
+      <w:r>
+        <w:t xml:space="preserve"> logout and deletion of each role</w:t>
+      </w:r>
+    </w:p>
+    <w:p>
+      <w:r>
+        <w:t xml:space="preserve">Testing is all that is left now... if I </w:t>
+      </w:r>
+      <w:proofErr w:type="spellStart"/>
+      <w:r>
+        <w:t>dont</w:t>
+      </w:r>
+      <w:proofErr w:type="spellEnd"/>
+      <w:r>
+        <w:t xml:space="preserve"> think of any more stuff to add.</w:t>
       </w:r>
       <w:r>
         <w:br/>
@@ -4337,7 +6004,14 @@
       </w:r>
       <w:r>
         <w:br/>
-        <w:t>eg recently added supplier id to order history as to prevent no access of supplier’s info when a driver deletes his account when he has had an order on finished state and the customer hasn’t rated it.</w:t>
+      </w:r>
+      <w:proofErr w:type="spellStart"/>
+      <w:r>
+        <w:t>eg</w:t>
+      </w:r>
+      <w:proofErr w:type="spellEnd"/>
+      <w:r>
+        <w:t xml:space="preserve"> recently added supplier id to order history as to prevent no access of supplier’s info when a driver deletes his account when he has had an order on finished state and the customer hasn’t rated it.</w:t>
       </w:r>
       <w:r>
         <w:br/>
@@ -4384,9 +6058,143 @@
       </w:r>
     </w:p>
     <w:p>
+      <w:pPr>
+        <w:rPr>
+          <w:lang w:val="en-PK"/>
+        </w:rPr>
+      </w:pPr>
       <w:r>
         <w:t>And boy is it hard.</w:t>
       </w:r>
+      <w:r>
+        <w:br/>
+      </w:r>
+      <w:r>
+        <w:br/>
+      </w:r>
+      <w:r>
+        <w:rPr>
+          <w:b/>
+          <w:bCs/>
+          <w:lang w:val="en-PK"/>
+        </w:rPr>
+        <w:t>Summary / Quick Rule of Thumb:</w:t>
+      </w:r>
+    </w:p>
+    <w:p>
+      <w:pPr>
+        <w:numPr>
+          <w:ilvl w:val="0"/>
+          <w:numId w:val="22"/>
+        </w:numPr>
+        <w:rPr>
+          <w:lang w:val="en-PK"/>
+        </w:rPr>
+      </w:pPr>
+      <w:r>
+        <w:rPr>
+          <w:lang w:val="en-PK"/>
+        </w:rPr>
+        <w:t>Is it a full page? -&gt; </w:t>
+      </w:r>
+      <w:r>
+        <w:rPr>
+          <w:b/>
+          <w:bCs/>
+          <w:lang w:val="en-PK"/>
+        </w:rPr>
+        <w:t>screens/</w:t>
+      </w:r>
+    </w:p>
+    <w:p>
+      <w:pPr>
+        <w:numPr>
+          <w:ilvl w:val="0"/>
+          <w:numId w:val="22"/>
+        </w:numPr>
+        <w:rPr>
+          <w:lang w:val="en-PK"/>
+        </w:rPr>
+      </w:pPr>
+      <w:r>
+        <w:rPr>
+          <w:lang w:val="en-PK"/>
+        </w:rPr>
+        <w:t>Is it a small reusable UI piece? -&gt; </w:t>
+      </w:r>
+      <w:r>
+        <w:rPr>
+          <w:b/>
+          <w:bCs/>
+          <w:lang w:val="en-PK"/>
+        </w:rPr>
+        <w:t>components/</w:t>
+      </w:r>
+    </w:p>
+    <w:p>
+      <w:pPr>
+        <w:numPr>
+          <w:ilvl w:val="0"/>
+          <w:numId w:val="22"/>
+        </w:numPr>
+        <w:rPr>
+          <w:lang w:val="en-PK"/>
+        </w:rPr>
+      </w:pPr>
+      <w:r>
+        <w:rPr>
+          <w:lang w:val="en-PK"/>
+        </w:rPr>
+        <w:t>Is it an internet request to your server? -&gt; </w:t>
+      </w:r>
+      <w:proofErr w:type="spellStart"/>
+      <w:r>
+        <w:rPr>
+          <w:b/>
+          <w:bCs/>
+          <w:lang w:val="en-PK"/>
+        </w:rPr>
+        <w:t>api</w:t>
+      </w:r>
+      <w:proofErr w:type="spellEnd"/>
+      <w:r>
+        <w:rPr>
+          <w:b/>
+          <w:bCs/>
+          <w:lang w:val="en-PK"/>
+        </w:rPr>
+        <w:t>/</w:t>
+      </w:r>
+    </w:p>
+    <w:p>
+      <w:pPr>
+        <w:numPr>
+          <w:ilvl w:val="0"/>
+          <w:numId w:val="22"/>
+        </w:numPr>
+        <w:rPr>
+          <w:lang w:val="en-PK"/>
+        </w:rPr>
+      </w:pPr>
+      <w:r>
+        <w:rPr>
+          <w:lang w:val="en-PK"/>
+        </w:rPr>
+        <w:t>Is it data that the whole app needs to share? -&gt; </w:t>
+      </w:r>
+      <w:r>
+        <w:rPr>
+          <w:b/>
+          <w:bCs/>
+          <w:lang w:val="en-PK"/>
+        </w:rPr>
+        <w:t>state/</w:t>
+      </w:r>
+    </w:p>
+    <w:p>
+      <w:pPr>
+        <w:jc w:val="center"/>
+      </w:pPr>
     </w:p>
     <w:sectPr>
       <w:pgSz w:w="11906" w:h="16838"/>
@@ -6770,6 +8578,155 @@
     </w:lvl>
   </w:abstractNum>
   <w:abstractNum w:abstractNumId="17" w15:restartNumberingAfterBreak="0">
+    <w:nsid w:val="6C4B3B44"/>
+    <w:multiLevelType w:val="multilevel"/>
+    <w:tmpl w:val="AED25150"/>
+    <w:lvl w:ilvl="0">
+      <w:start w:val="1"/>
+      <w:numFmt w:val="bullet"/>
+      <w:lvlText w:val=""/>
+      <w:lvlJc w:val="left"/>
+      <w:pPr>
+        <w:tabs>
+          <w:tab w:val="num" w:pos="720"/>
+        </w:tabs>
+        <w:ind w:left="720" w:hanging="360"/>
+      </w:pPr>
+      <w:rPr>
+        <w:rFonts w:ascii="Symbol" w:hAnsi="Symbol" w:hint="default"/>
+        <w:sz w:val="20"/>
+      </w:rPr>
+    </w:lvl>
+    <w:lvl w:ilvl="1" w:tentative="1">
+      <w:start w:val="1"/>
+      <w:numFmt w:val="bullet"/>
+      <w:lvlText w:val="o"/>
+      <w:lvlJc w:val="left"/>
+      <w:pPr>
+        <w:tabs>
+          <w:tab w:val="num" w:pos="1440"/>
+        </w:tabs>
+        <w:ind w:left="1440" w:hanging="360"/>
+      </w:pPr>
+      <w:rPr>
+        <w:rFonts w:ascii="Courier New" w:hAnsi="Courier New" w:hint="default"/>
+        <w:sz w:val="20"/>
+      </w:rPr>
+    </w:lvl>
+    <w:lvl w:ilvl="2" w:tentative="1">
+      <w:start w:val="1"/>
+      <w:numFmt w:val="bullet"/>
+      <w:lvlText w:val=""/>
+      <w:lvlJc w:val="left"/>
+      <w:pPr>
+        <w:tabs>
+          <w:tab w:val="num" w:pos="2160"/>
+        </w:tabs>
+        <w:ind w:left="2160" w:hanging="360"/>
+      </w:pPr>
+      <w:rPr>
+        <w:rFonts w:ascii="Wingdings" w:hAnsi="Wingdings" w:hint="default"/>
+        <w:sz w:val="20"/>
+      </w:rPr>
+    </w:lvl>
+    <w:lvl w:ilvl="3" w:tentative="1">
+      <w:start w:val="1"/>
+      <w:numFmt w:val="bullet"/>
+      <w:lvlText w:val=""/>
+      <w:lvlJc w:val="left"/>
+      <w:pPr>
+        <w:tabs>
+          <w:tab w:val="num" w:pos="2880"/>
+        </w:tabs>
+        <w:ind w:left="2880" w:hanging="360"/>
+      </w:pPr>
+      <w:rPr>
+        <w:rFonts w:ascii="Wingdings" w:hAnsi="Wingdings" w:hint="default"/>
+        <w:sz w:val="20"/>
+      </w:rPr>
+    </w:lvl>
+    <w:lvl w:ilvl="4" w:tentative="1">
+      <w:start w:val="1"/>
+      <w:numFmt w:val="bullet"/>
+      <w:lvlText w:val=""/>
+      <w:lvlJc w:val="left"/>
+      <w:pPr>
+        <w:tabs>
+          <w:tab w:val="num" w:pos="3600"/>
+        </w:tabs>
+        <w:ind w:left="3600" w:hanging="360"/>
+      </w:pPr>
+      <w:rPr>
+        <w:rFonts w:ascii="Wingdings" w:hAnsi="Wingdings" w:hint="default"/>
+        <w:sz w:val="20"/>
+      </w:rPr>
+    </w:lvl>
+    <w:lvl w:ilvl="5" w:tentative="1">
+      <w:start w:val="1"/>
+      <w:numFmt w:val="bullet"/>
+      <w:lvlText w:val=""/>
+      <w:lvlJc w:val="left"/>
+      <w:pPr>
+        <w:tabs>
+          <w:tab w:val="num" w:pos="4320"/>
+        </w:tabs>
+        <w:ind w:left="4320" w:hanging="360"/>
+      </w:pPr>
+      <w:rPr>
+        <w:rFonts w:ascii="Wingdings" w:hAnsi="Wingdings" w:hint="default"/>
+        <w:sz w:val="20"/>
+      </w:rPr>
+    </w:lvl>
+    <w:lvl w:ilvl="6" w:tentative="1">
+      <w:start w:val="1"/>
+      <w:numFmt w:val="bullet"/>
+      <w:lvlText w:val=""/>
+      <w:lvlJc w:val="left"/>
+      <w:pPr>
+        <w:tabs>
+          <w:tab w:val="num" w:pos="5040"/>
+        </w:tabs>
+        <w:ind w:left="5040" w:hanging="360"/>
+      </w:pPr>
+      <w:rPr>
+        <w:rFonts w:ascii="Wingdings" w:hAnsi="Wingdings" w:hint="default"/>
+        <w:sz w:val="20"/>
+      </w:rPr>
+    </w:lvl>
+    <w:lvl w:ilvl="7" w:tentative="1">
+      <w:start w:val="1"/>
+      <w:numFmt w:val="bullet"/>
+      <w:lvlText w:val=""/>
+      <w:lvlJc w:val="left"/>
+      <w:pPr>
+        <w:tabs>
+          <w:tab w:val="num" w:pos="5760"/>
+        </w:tabs>
+        <w:ind w:left="5760" w:hanging="360"/>
+      </w:pPr>
+      <w:rPr>
+        <w:rFonts w:ascii="Wingdings" w:hAnsi="Wingdings" w:hint="default"/>
+        <w:sz w:val="20"/>
+      </w:rPr>
+    </w:lvl>
+    <w:lvl w:ilvl="8" w:tentative="1">
+      <w:start w:val="1"/>
+      <w:numFmt w:val="bullet"/>
+      <w:lvlText w:val=""/>
+      <w:lvlJc w:val="left"/>
+      <w:pPr>
+        <w:tabs>
+          <w:tab w:val="num" w:pos="6480"/>
+        </w:tabs>
+        <w:ind w:left="6480" w:hanging="360"/>
+      </w:pPr>
+      <w:rPr>
+        <w:rFonts w:ascii="Wingdings" w:hAnsi="Wingdings" w:hint="default"/>
+        <w:sz w:val="20"/>
+      </w:rPr>
+    </w:lvl>
+  </w:abstractNum>
+  <w:abstractNum w:abstractNumId="18" w15:restartNumberingAfterBreak="0">
     <w:nsid w:val="71853DF4"/>
     <w:multiLevelType w:val="multilevel"/>
     <w:tmpl w:val="EBE2E6B8"/>
@@ -6918,7 +8875,7 @@
       </w:rPr>
     </w:lvl>
   </w:abstractNum>
-  <w:abstractNum w:abstractNumId="18" w15:restartNumberingAfterBreak="0">
+  <w:abstractNum w:abstractNumId="19" w15:restartNumberingAfterBreak="0">
     <w:nsid w:val="759F2936"/>
     <w:multiLevelType w:val="multilevel"/>
     <w:tmpl w:val="78F83FA8"/>
@@ -7067,7 +9024,7 @@
       </w:rPr>
     </w:lvl>
   </w:abstractNum>
-  <w:abstractNum w:abstractNumId="19" w15:restartNumberingAfterBreak="0">
+  <w:abstractNum w:abstractNumId="20" w15:restartNumberingAfterBreak="0">
     <w:nsid w:val="764E6096"/>
     <w:multiLevelType w:val="multilevel"/>
     <w:tmpl w:val="3496C7FA"/>
@@ -7216,7 +9173,7 @@
       </w:rPr>
     </w:lvl>
   </w:abstractNum>
-  <w:abstractNum w:abstractNumId="20" w15:restartNumberingAfterBreak="0">
+  <w:abstractNum w:abstractNumId="21" w15:restartNumberingAfterBreak="0">
     <w:nsid w:val="78663FB0"/>
     <w:multiLevelType w:val="multilevel"/>
     <w:tmpl w:val="1AF20B34"/>
@@ -7396,13 +9353,13 @@
     <w:abstractNumId w:val="9"/>
   </w:num>
   <w:num w:numId="11" w16cid:durableId="1070611809">
-    <w:abstractNumId w:val="18"/>
+    <w:abstractNumId w:val="19"/>
   </w:num>
   <w:num w:numId="12" w16cid:durableId="136530270">
-    <w:abstractNumId w:val="20"/>
+    <w:abstractNumId w:val="21"/>
   </w:num>
   <w:num w:numId="13" w16cid:durableId="1914772766">
-    <w:abstractNumId w:val="17"/>
+    <w:abstractNumId w:val="18"/>
   </w:num>
   <w:num w:numId="14" w16cid:durableId="565147990">
     <w:abstractNumId w:val="12"/>
@@ -7414,7 +9371,7 @@
     <w:abstractNumId w:val="11"/>
   </w:num>
   <w:num w:numId="17" w16cid:durableId="925189652">
-    <w:abstractNumId w:val="19"/>
+    <w:abstractNumId w:val="20"/>
   </w:num>
   <w:num w:numId="18" w16cid:durableId="958414538">
     <w:abstractNumId w:val="3"/>
@@ -7427,6 +9384,9 @@
   </w:num>
   <w:num w:numId="21" w16cid:durableId="546920592">
     <w:abstractNumId w:val="6"/>
+  </w:num>
+  <w:num w:numId="22" w16cid:durableId="1833181709">
+    <w:abstractNumId w:val="17"/>
   </w:num>
 </w:numbering>
 </file>
@@ -8034,7 +9994,6 @@
   <w:style w:type="character" w:default="1" w:styleId="DefaultParagraphFont">
     <w:name w:val="Default Paragraph Font"/>
     <w:uiPriority w:val="1"/>
-    <w:semiHidden/>
     <w:unhideWhenUsed/>
   </w:style>
   <w:style w:type="table" w:default="1" w:styleId="TableNormal">

</xml_diff>

<commit_message>
Feature: Supplier dashboard with live markets, driver assignment and order history
</commit_message>
<xml_diff>
--- a/documents/code logic.docx
+++ b/documents/code logic.docx
@@ -3,201 +3,12 @@
 <w:document xmlns:wpc="http://schemas.microsoft.com/office/word/2010/wordprocessingCanvas" xmlns:cx="http://schemas.microsoft.com/office/drawing/2014/chartex" xmlns:cx1="http://schemas.microsoft.com/office/drawing/2015/9/8/chartex" xmlns:cx2="http://schemas.microsoft.com/office/drawing/2015/10/21/chartex" xmlns:cx3="http://schemas.microsoft.com/office/drawing/2016/5/9/chartex" xmlns:cx4="http://schemas.microsoft.com/office/drawing/2016/5/10/chartex" xmlns:cx5="http://schemas.microsoft.com/office/drawing/2016/5/11/chartex" xmlns:cx6="http://schemas.microsoft.com/office/drawing/2016/5/12/chartex" xmlns:cx7="http://schemas.microsoft.com/office/drawing/2016/5/13/chartex" xmlns:cx8="http://schemas.microsoft.com/office/drawing/2016/5/14/chartex" xmlns:mc="http://schemas.openxmlformats.org/markup-compatibility/2006" xmlns:aink="http://schemas.microsoft.com/office/drawing/2016/ink" xmlns:am3d="http://schemas.microsoft.com/office/drawing/2017/model3d" xmlns:o="urn:schemas-microsoft-com:office:office" xmlns:oel="http://schemas.microsoft.com/office/2019/extlst" xmlns:r="http://schemas.openxmlformats.org/officeDocument/2006/relationships" xmlns:m="http://schemas.openxmlformats.org/officeDocument/2006/math" xmlns:v="urn:schemas-microsoft-com:vml" xmlns:wp14="http://schemas.microsoft.com/office/word/2010/wordprocessingDrawing" xmlns:wp="http://schemas.openxmlformats.org/drawingml/2006/wordprocessingDrawing" xmlns:w10="urn:schemas-microsoft-com:office:word" xmlns:w="http://schemas.openxmlformats.org/wordprocessingml/2006/main" xmlns:w14="http://schemas.microsoft.com/office/word/2010/wordml" xmlns:w15="http://schemas.microsoft.com/office/word/2012/wordml" xmlns:w16cex="http://schemas.microsoft.com/office/word/2018/wordml/cex" xmlns:w16cid="http://schemas.microsoft.com/office/word/2016/wordml/cid" xmlns:w16="http://schemas.microsoft.com/office/word/2018/wordml" xmlns:w16du="http://schemas.microsoft.com/office/word/2023/wordml/word16du" xmlns:w16sdtdh="http://schemas.microsoft.com/office/word/2020/wordml/sdtdatahash" xmlns:w16sdtfl="http://schemas.microsoft.com/office/word/2024/wordml/sdtformatlock" xmlns:w16se="http://schemas.microsoft.com/office/word/2015/wordml/symex" xmlns:wpg="http://schemas.microsoft.com/office/word/2010/wordprocessingGroup" xmlns:wpi="http://schemas.microsoft.com/office/word/2010/wordprocessingInk" xmlns:wne="http://schemas.microsoft.com/office/word/2006/wordml" xmlns:wps="http://schemas.microsoft.com/office/word/2010/wordprocessingShape" mc:Ignorable="w14 w15 w16se w16cid w16 w16cex w16sdtdh w16sdtfl w16du wp14">
   <w:body>
     <w:p>
-      <w:proofErr w:type="gramStart"/>
-      <w:r>
-        <w:t>oh</w:t>
-      </w:r>
-      <w:proofErr w:type="gramEnd"/>
-      <w:r>
-        <w:t xml:space="preserve"> so the easy way is to check local token if that exists then redirect to orders page if </w:t>
-      </w:r>
-      <w:proofErr w:type="spellStart"/>
-      <w:r>
-        <w:t>deosnt</w:t>
-      </w:r>
-      <w:proofErr w:type="spellEnd"/>
-      <w:r>
-        <w:t xml:space="preserve"> exist for this app then red </w:t>
-      </w:r>
-      <w:proofErr w:type="spellStart"/>
-      <w:r>
-        <w:t>diecet</w:t>
-      </w:r>
-      <w:proofErr w:type="spellEnd"/>
-      <w:r>
-        <w:t xml:space="preserve"> to phone </w:t>
-      </w:r>
-      <w:proofErr w:type="spellStart"/>
-      <w:r>
-        <w:t>numeb</w:t>
-      </w:r>
-      <w:proofErr w:type="spellEnd"/>
-      <w:r>
-        <w:t xml:space="preserve"> page </w:t>
-      </w:r>
-      <w:proofErr w:type="spellStart"/>
-      <w:r>
-        <w:t>whihc</w:t>
-      </w:r>
-      <w:proofErr w:type="spellEnd"/>
-      <w:r>
-        <w:t xml:space="preserve"> is same for </w:t>
-      </w:r>
-      <w:proofErr w:type="spellStart"/>
-      <w:r>
-        <w:t>reislateld</w:t>
-      </w:r>
-      <w:proofErr w:type="spellEnd"/>
-      <w:r>
-        <w:t xml:space="preserve"> suers and new users same opt </w:t>
-      </w:r>
-      <w:proofErr w:type="spellStart"/>
-      <w:r>
-        <w:t>verifaiton</w:t>
-      </w:r>
-      <w:proofErr w:type="spellEnd"/>
-      <w:r>
-        <w:t xml:space="preserve">. then this </w:t>
-      </w:r>
-      <w:proofErr w:type="spellStart"/>
-      <w:r>
-        <w:t>numebr</w:t>
-      </w:r>
-      <w:proofErr w:type="spellEnd"/>
-      <w:r>
-        <w:t xml:space="preserve"> is </w:t>
-      </w:r>
-      <w:proofErr w:type="spellStart"/>
-      <w:r>
-        <w:t>chekced</w:t>
-      </w:r>
-      <w:proofErr w:type="spellEnd"/>
-      <w:r>
-        <w:t xml:space="preserve"> in database if exists then </w:t>
-      </w:r>
-      <w:proofErr w:type="spellStart"/>
-      <w:r>
-        <w:t>redirecet</w:t>
-      </w:r>
-      <w:proofErr w:type="spellEnd"/>
-      <w:r>
-        <w:t xml:space="preserve"> to orders (</w:t>
-      </w:r>
-      <w:proofErr w:type="spellStart"/>
-      <w:r>
-        <w:t>ie</w:t>
-      </w:r>
-      <w:proofErr w:type="spellEnd"/>
-      <w:r>
-        <w:t xml:space="preserve"> </w:t>
-      </w:r>
-      <w:proofErr w:type="spellStart"/>
-      <w:r>
-        <w:t>returing</w:t>
-      </w:r>
-      <w:proofErr w:type="spellEnd"/>
-      <w:r>
-        <w:t xml:space="preserve"> user after </w:t>
-      </w:r>
-      <w:proofErr w:type="gramStart"/>
-      <w:r>
-        <w:t>reinstall) .</w:t>
-      </w:r>
-      <w:proofErr w:type="gramEnd"/>
-      <w:r>
-        <w:t xml:space="preserve"> not exists then firs time user redirect to name entering</w:t>
+      <w:r>
+        <w:t>oh so the easy way is to check local token if that exists then redirect to orders page if deosnt exist for this app then red diecet to phone numeb page whihc is same for reislateld suers and new users same opt verifaiton. then this numebr is chekced in database if exists then redirecet to orders (ie returing user after reinstall) . not exists then firs time user redirect to name entering</w:t>
       </w:r>
       <w:r>
         <w:br/>
-        <w:t xml:space="preserve">but now two things where does local token be </w:t>
-      </w:r>
-      <w:proofErr w:type="gramStart"/>
-      <w:r>
-        <w:t>stored ?</w:t>
-      </w:r>
-      <w:proofErr w:type="gramEnd"/>
-      <w:r>
-        <w:t xml:space="preserve"> in </w:t>
-      </w:r>
-      <w:proofErr w:type="spellStart"/>
-      <w:r>
-        <w:t>db</w:t>
-      </w:r>
-      <w:proofErr w:type="spellEnd"/>
-      <w:r>
-        <w:t xml:space="preserve"> or what? </w:t>
-      </w:r>
-      <w:proofErr w:type="spellStart"/>
-      <w:r>
-        <w:t>seocndly</w:t>
-      </w:r>
-      <w:proofErr w:type="spellEnd"/>
-      <w:r>
-        <w:t xml:space="preserve"> does the local </w:t>
-      </w:r>
-      <w:proofErr w:type="spellStart"/>
-      <w:r>
-        <w:t>toekn</w:t>
-      </w:r>
-      <w:proofErr w:type="spellEnd"/>
-      <w:r>
-        <w:t xml:space="preserve"> also </w:t>
-      </w:r>
-      <w:proofErr w:type="spellStart"/>
-      <w:r>
-        <w:t>consits</w:t>
-      </w:r>
-      <w:proofErr w:type="spellEnd"/>
-      <w:r>
-        <w:t xml:space="preserve"> of user </w:t>
-      </w:r>
-      <w:proofErr w:type="gramStart"/>
-      <w:r>
-        <w:t>id ?</w:t>
-      </w:r>
-      <w:proofErr w:type="gramEnd"/>
-      <w:r>
-        <w:t xml:space="preserve"> because how will </w:t>
-      </w:r>
-      <w:proofErr w:type="spellStart"/>
-      <w:r>
-        <w:t>i</w:t>
-      </w:r>
-      <w:proofErr w:type="spellEnd"/>
-      <w:r>
-        <w:t xml:space="preserve"> know </w:t>
-      </w:r>
-      <w:proofErr w:type="spellStart"/>
-      <w:r>
-        <w:t>whihc</w:t>
-      </w:r>
-      <w:proofErr w:type="spellEnd"/>
-      <w:r>
-        <w:t xml:space="preserve"> user it is if </w:t>
-      </w:r>
-      <w:proofErr w:type="spellStart"/>
-      <w:r>
-        <w:t>i</w:t>
-      </w:r>
-      <w:proofErr w:type="spellEnd"/>
-      <w:r>
-        <w:t xml:space="preserve"> </w:t>
-      </w:r>
-      <w:proofErr w:type="spellStart"/>
-      <w:r>
-        <w:t>odnt</w:t>
-      </w:r>
-      <w:proofErr w:type="spellEnd"/>
-      <w:r>
-        <w:t xml:space="preserve"> </w:t>
-      </w:r>
-      <w:proofErr w:type="spellStart"/>
-      <w:r>
-        <w:t>ahve</w:t>
-      </w:r>
-      <w:proofErr w:type="spellEnd"/>
-      <w:r>
-        <w:t xml:space="preserve"> the user id</w:t>
+        <w:t>but now two things where does local token be stored ? in db or what? seocndly does the local toekn also consits of user id ? because how will i know whihc user it is if i odnt ahve the user id</w:t>
       </w:r>
     </w:p>
     <w:p/>
@@ -205,67 +16,17 @@
     <w:p/>
     <w:p>
       <w:r>
-        <w:t xml:space="preserve">Just check local token existence in the </w:t>
-      </w:r>
-      <w:proofErr w:type="spellStart"/>
-      <w:proofErr w:type="gramStart"/>
-      <w:r>
-        <w:t>db</w:t>
-      </w:r>
-      <w:proofErr w:type="spellEnd"/>
-      <w:r>
-        <w:t xml:space="preserve"> .</w:t>
-      </w:r>
-      <w:proofErr w:type="gramEnd"/>
-      <w:r>
-        <w:t xml:space="preserve"> </w:t>
-      </w:r>
-      <w:proofErr w:type="gramStart"/>
-      <w:r>
-        <w:t>if  it</w:t>
-      </w:r>
-      <w:proofErr w:type="gramEnd"/>
-      <w:r>
-        <w:t xml:space="preserve"> exists then redirect to orders</w:t>
-      </w:r>
-    </w:p>
-    <w:p>
-      <w:r>
-        <w:t xml:space="preserve">If it doesn’t then make them enter phone </w:t>
-      </w:r>
-      <w:proofErr w:type="spellStart"/>
-      <w:r>
-        <w:t>numeb</w:t>
-      </w:r>
-      <w:proofErr w:type="spellEnd"/>
-      <w:r>
-        <w:t xml:space="preserve"> and verify </w:t>
-      </w:r>
-      <w:proofErr w:type="spellStart"/>
-      <w:r>
-        <w:t>otp</w:t>
-      </w:r>
-      <w:proofErr w:type="spellEnd"/>
-    </w:p>
-    <w:p>
-      <w:r>
-        <w:t xml:space="preserve">If phone number </w:t>
-      </w:r>
-      <w:proofErr w:type="gramStart"/>
-      <w:r>
-        <w:t>exists</w:t>
-      </w:r>
-      <w:proofErr w:type="gramEnd"/>
-      <w:r>
-        <w:t xml:space="preserve"> then </w:t>
-      </w:r>
-      <w:proofErr w:type="spellStart"/>
-      <w:r>
-        <w:t>reidriect</w:t>
-      </w:r>
-      <w:proofErr w:type="spellEnd"/>
-      <w:r>
-        <w:t xml:space="preserve"> to orders page</w:t>
+        <w:t>Just check local token existence in the db . if  it exists then redirect to orders</w:t>
+      </w:r>
+    </w:p>
+    <w:p>
+      <w:r>
+        <w:t>If it doesn’t then make them enter phone numeb and verify otp</w:t>
+      </w:r>
+    </w:p>
+    <w:p>
+      <w:r>
+        <w:t>If phone number exists then reidriect to orders page</w:t>
       </w:r>
     </w:p>
     <w:p>
@@ -284,15 +45,7 @@
     </w:p>
     <w:p>
       <w:r>
-        <w:t>OTP will be generated and sent by backend to the email/</w:t>
-      </w:r>
-      <w:proofErr w:type="spellStart"/>
-      <w:r>
-        <w:t>sms</w:t>
-      </w:r>
-      <w:proofErr w:type="spellEnd"/>
-      <w:r>
-        <w:t xml:space="preserve"> and </w:t>
+        <w:t xml:space="preserve">OTP will be generated and sent by backend to the email/sms and </w:t>
       </w:r>
     </w:p>
     <w:p/>
@@ -319,172 +72,45 @@
     <w:p/>
     <w:p>
       <w:r>
-        <w:t xml:space="preserve">Phone </w:t>
-      </w:r>
-      <w:proofErr w:type="spellStart"/>
-      <w:r>
-        <w:t>number_exists</w:t>
-      </w:r>
-      <w:proofErr w:type="spellEnd"/>
-      <w:r>
-        <w:t xml:space="preserve"> fn:</w:t>
-      </w:r>
-    </w:p>
-    <w:p>
-      <w:proofErr w:type="gramStart"/>
-      <w:r>
-        <w:t>Checks  if</w:t>
-      </w:r>
-      <w:proofErr w:type="gramEnd"/>
-      <w:r>
-        <w:t xml:space="preserve"> the entered number already exists in the users table if it does, then set the verified Boolean to false in the </w:t>
-      </w:r>
-      <w:proofErr w:type="spellStart"/>
-      <w:r>
-        <w:t>user_id</w:t>
-      </w:r>
-      <w:proofErr w:type="spellEnd"/>
-      <w:r>
-        <w:t xml:space="preserve"> </w:t>
-      </w:r>
-      <w:proofErr w:type="gramStart"/>
-      <w:r>
-        <w:t>table :</w:t>
-      </w:r>
-      <w:proofErr w:type="gramEnd"/>
-      <w:r>
-        <w:t xml:space="preserve"> the user already exists but </w:t>
-      </w:r>
-      <w:proofErr w:type="gramStart"/>
-      <w:r>
-        <w:t>has to</w:t>
-      </w:r>
-      <w:proofErr w:type="gramEnd"/>
-      <w:r>
-        <w:t xml:space="preserve"> undergo verification of phone number again</w:t>
+        <w:t>Phone number_exists fn:</w:t>
+      </w:r>
+    </w:p>
+    <w:p>
+      <w:r>
+        <w:t>Checks  if the entered number already exists in the users table if it does, then set the verified Boolean to false in the user_id table : the user already exists but has to undergo verification of phone number again</w:t>
       </w:r>
     </w:p>
     <w:p>
       <w:r>
         <w:lastRenderedPageBreak/>
-        <w:t xml:space="preserve">Checks if the entered phone number exists in the pending users table, if it does then do </w:t>
-      </w:r>
-      <w:proofErr w:type="gramStart"/>
-      <w:r>
-        <w:t>nothing ,</w:t>
-      </w:r>
-      <w:proofErr w:type="gramEnd"/>
-      <w:r>
-        <w:t xml:space="preserve"> if it doesn’t then insert the number (This will be done for existing users too that are getting back to the application as they are currently pending (unverified) users too</w:t>
+        <w:t>Checks if the entered phone number exists in the pending users table, if it does then do nothing , if it doesn’t then insert the number (This will be done for existing users too that are getting back to the application as they are currently pending (unverified) users too</w:t>
       </w:r>
     </w:p>
     <w:p/>
     <w:p>
       <w:r>
-        <w:t xml:space="preserve">Store </w:t>
-      </w:r>
-      <w:proofErr w:type="spellStart"/>
-      <w:r>
-        <w:t>otp</w:t>
-      </w:r>
-      <w:proofErr w:type="spellEnd"/>
-      <w:r>
-        <w:t>:</w:t>
-      </w:r>
-    </w:p>
-    <w:p>
-      <w:r>
-        <w:t xml:space="preserve">Stores </w:t>
-      </w:r>
-      <w:proofErr w:type="spellStart"/>
-      <w:r>
-        <w:t>otp</w:t>
-      </w:r>
-      <w:proofErr w:type="spellEnd"/>
-      <w:r>
-        <w:t xml:space="preserve"> in the pending </w:t>
-      </w:r>
-      <w:proofErr w:type="gramStart"/>
-      <w:r>
-        <w:t>users</w:t>
-      </w:r>
-      <w:proofErr w:type="gramEnd"/>
-      <w:r>
-        <w:t xml:space="preserve"> table </w:t>
-      </w:r>
-    </w:p>
-    <w:p>
-      <w:r>
-        <w:t xml:space="preserve">If the </w:t>
-      </w:r>
-      <w:proofErr w:type="spellStart"/>
-      <w:r>
-        <w:t>otp</w:t>
-      </w:r>
-      <w:proofErr w:type="spellEnd"/>
-      <w:r>
-        <w:t xml:space="preserve"> already exists then </w:t>
-      </w:r>
-      <w:proofErr w:type="spellStart"/>
-      <w:r>
-        <w:t>upates</w:t>
-      </w:r>
-      <w:proofErr w:type="spellEnd"/>
-      <w:r>
-        <w:t xml:space="preserve"> the </w:t>
-      </w:r>
-      <w:proofErr w:type="spellStart"/>
-      <w:r>
-        <w:t>otp</w:t>
-      </w:r>
-      <w:proofErr w:type="spellEnd"/>
-      <w:r>
-        <w:t xml:space="preserve"> (can be because the user exited during the process came again, or that he requested a new </w:t>
-      </w:r>
-      <w:proofErr w:type="spellStart"/>
-      <w:r>
-        <w:t>otp</w:t>
-      </w:r>
-      <w:proofErr w:type="spellEnd"/>
-      <w:r>
-        <w:t>)</w:t>
+        <w:t>Store otp:</w:t>
+      </w:r>
+    </w:p>
+    <w:p>
+      <w:r>
+        <w:t xml:space="preserve">Stores otp in the pending users table </w:t>
+      </w:r>
+    </w:p>
+    <w:p>
+      <w:r>
+        <w:t>If the otp already exists then upates the otp (can be because the user exited during the process came again, or that he requested a new otp)</w:t>
       </w:r>
     </w:p>
     <w:p/>
     <w:p>
-      <w:proofErr w:type="spellStart"/>
-      <w:r>
-        <w:t>Verify_otp_and_activate_users</w:t>
-      </w:r>
-      <w:proofErr w:type="spellEnd"/>
-      <w:r>
-        <w:t xml:space="preserve"> fn:</w:t>
-      </w:r>
-    </w:p>
-    <w:p>
-      <w:r>
-        <w:t xml:space="preserve">Checks the </w:t>
-      </w:r>
-      <w:proofErr w:type="gramStart"/>
-      <w:r>
-        <w:t xml:space="preserve">entered  </w:t>
-      </w:r>
-      <w:proofErr w:type="spellStart"/>
-      <w:r>
-        <w:t>otp</w:t>
-      </w:r>
-      <w:proofErr w:type="spellEnd"/>
-      <w:proofErr w:type="gramEnd"/>
-      <w:r>
-        <w:t xml:space="preserve"> against the stored </w:t>
-      </w:r>
-      <w:proofErr w:type="spellStart"/>
-      <w:r>
-        <w:t>otp</w:t>
-      </w:r>
-      <w:proofErr w:type="spellEnd"/>
-      <w:r>
-        <w:t xml:space="preserve"> </w:t>
+      <w:r>
+        <w:t>Verify_otp_and_activate_users fn:</w:t>
+      </w:r>
+    </w:p>
+    <w:p>
+      <w:r>
+        <w:t xml:space="preserve">Checks the entered  otp against the stored otp </w:t>
       </w:r>
     </w:p>
     <w:p>
@@ -494,15 +120,7 @@
     </w:p>
     <w:p>
       <w:r>
-        <w:t xml:space="preserve">If new user, inserts the info from pending users table to new </w:t>
-      </w:r>
-      <w:proofErr w:type="gramStart"/>
-      <w:r>
-        <w:t>users</w:t>
-      </w:r>
-      <w:proofErr w:type="gramEnd"/>
-      <w:r>
-        <w:t xml:space="preserve"> table</w:t>
+        <w:t>If new user, inserts the info from pending users table to new users table</w:t>
       </w:r>
     </w:p>
     <w:p>
@@ -525,15 +143,7 @@
     </w:p>
     <w:p>
       <w:r>
-        <w:t xml:space="preserve">If both session and role </w:t>
-      </w:r>
-      <w:proofErr w:type="gramStart"/>
-      <w:r>
-        <w:t>exists</w:t>
-      </w:r>
-      <w:proofErr w:type="gramEnd"/>
-      <w:r>
-        <w:t>: Go to orders page</w:t>
+        <w:t>If both session and role exists: Go to orders page</w:t>
       </w:r>
     </w:p>
     <w:p>
@@ -554,15 +164,7 @@
     <w:p/>
     <w:p>
       <w:r>
-        <w:t xml:space="preserve">The common steps for all the users </w:t>
-      </w:r>
-      <w:proofErr w:type="spellStart"/>
-      <w:r>
-        <w:t>uptil</w:t>
-      </w:r>
-      <w:proofErr w:type="spellEnd"/>
-      <w:r>
-        <w:t xml:space="preserve"> OTP done.</w:t>
+        <w:t>The common steps for all the users uptil OTP done.</w:t>
       </w:r>
     </w:p>
     <w:p>
@@ -578,15 +180,7 @@
     <w:p>
       <w:r>
         <w:lastRenderedPageBreak/>
-        <w:t xml:space="preserve">Supplier: Two pages and therefore two procedures, one for entering fields and the other for entering the </w:t>
-      </w:r>
-      <w:proofErr w:type="spellStart"/>
-      <w:r>
-        <w:t>cnic</w:t>
-      </w:r>
-      <w:proofErr w:type="spellEnd"/>
-      <w:r>
-        <w:t xml:space="preserve"> images</w:t>
+        <w:t>Supplier: Two pages and therefore two procedures, one for entering fields and the other for entering the cnic images</w:t>
       </w:r>
     </w:p>
     <w:p/>
@@ -597,23 +191,7 @@
     </w:p>
     <w:p>
       <w:r>
-        <w:t xml:space="preserve">Upon entering the orders page, first his existence in the </w:t>
-      </w:r>
-      <w:proofErr w:type="spellStart"/>
-      <w:r>
-        <w:t>supplier_Drivers</w:t>
-      </w:r>
-      <w:proofErr w:type="spellEnd"/>
-      <w:r>
-        <w:t xml:space="preserve"> table will be checked, if he doesn’t exist there </w:t>
-      </w:r>
-      <w:proofErr w:type="gramStart"/>
-      <w:r>
-        <w:t>therefore</w:t>
-      </w:r>
-      <w:proofErr w:type="gramEnd"/>
-      <w:r>
-        <w:t xml:space="preserve"> he hasn’t defined one single driver, implying he is a new registration.</w:t>
+        <w:t>Upon entering the orders page, first his existence in the supplier_Drivers table will be checked, if he doesn’t exist there therefore he hasn’t defined one single driver, implying he is a new registration.</w:t>
       </w:r>
     </w:p>
     <w:p>
@@ -631,39 +209,7 @@
         <w:t xml:space="preserve">This will be checked by checking the </w:t>
       </w:r>
       <w:r>
-        <w:t xml:space="preserve">supplier drivers table again against the </w:t>
-      </w:r>
-      <w:proofErr w:type="gramStart"/>
-      <w:r>
-        <w:t>suppliers</w:t>
-      </w:r>
-      <w:proofErr w:type="gramEnd"/>
-      <w:r>
-        <w:t xml:space="preserve"> user </w:t>
-      </w:r>
-      <w:proofErr w:type="gramStart"/>
-      <w:r>
-        <w:t>id, and</w:t>
-      </w:r>
-      <w:proofErr w:type="gramEnd"/>
-      <w:r>
-        <w:t xml:space="preserve"> checking the </w:t>
-      </w:r>
-      <w:proofErr w:type="spellStart"/>
-      <w:r>
-        <w:t>driver_user_id</w:t>
-      </w:r>
-      <w:proofErr w:type="spellEnd"/>
-      <w:r>
-        <w:t xml:space="preserve"> there. If </w:t>
-      </w:r>
-      <w:proofErr w:type="spellStart"/>
-      <w:r>
-        <w:t>atleast</w:t>
-      </w:r>
-      <w:proofErr w:type="spellEnd"/>
-      <w:r>
-        <w:t xml:space="preserve"> one of them is not null he can view the orders page. Until then, the orders page remains inaccessible.</w:t>
+        <w:t>supplier drivers table again against the suppliers user id, and checking the driver_user_id there. If atleast one of them is not null he can view the orders page. Until then, the orders page remains inaccessible.</w:t>
       </w:r>
     </w:p>
     <w:p/>
@@ -679,15 +225,7 @@
     </w:p>
     <w:p>
       <w:r>
-        <w:t xml:space="preserve">When he comes back to the application, after verification, his session will be generated, upon entering his details it will be checked that if his role is already set to driver that implies he is an existing user therefore only set his id back into the supplier </w:t>
-      </w:r>
-      <w:proofErr w:type="gramStart"/>
-      <w:r>
-        <w:t>drivers</w:t>
-      </w:r>
-      <w:proofErr w:type="gramEnd"/>
-      <w:r>
-        <w:t xml:space="preserve"> table. </w:t>
+        <w:t xml:space="preserve">When he comes back to the application, after verification, his session will be generated, upon entering his details it will be checked that if his role is already set to driver that implies he is an existing user therefore only set his id back into the supplier drivers table. </w:t>
       </w:r>
     </w:p>
     <w:p/>
@@ -696,44 +234,12 @@
         <w:t xml:space="preserve">So </w:t>
       </w:r>
       <w:r>
-        <w:t xml:space="preserve">updated the enter </w:t>
-      </w:r>
-      <w:proofErr w:type="spellStart"/>
-      <w:r>
-        <w:t>deitals</w:t>
-      </w:r>
-      <w:proofErr w:type="spellEnd"/>
-      <w:r>
-        <w:t xml:space="preserve"> driver fn to remove re-linking of </w:t>
-      </w:r>
-      <w:proofErr w:type="spellStart"/>
-      <w:r>
-        <w:t>driver_id</w:t>
-      </w:r>
-      <w:proofErr w:type="spellEnd"/>
-      <w:r>
-        <w:t xml:space="preserve"> to the </w:t>
-      </w:r>
-      <w:proofErr w:type="spellStart"/>
-      <w:r>
-        <w:t>supplier_drivers</w:t>
-      </w:r>
-      <w:proofErr w:type="spellEnd"/>
-      <w:r>
-        <w:t xml:space="preserve"> table</w:t>
-      </w:r>
-    </w:p>
-    <w:p>
-      <w:r>
-        <w:t>Made a new trigger of re-</w:t>
-      </w:r>
-      <w:proofErr w:type="spellStart"/>
-      <w:r>
-        <w:t>link_driver_after_session</w:t>
-      </w:r>
-      <w:proofErr w:type="spellEnd"/>
-      <w:r>
-        <w:t xml:space="preserve"> generation</w:t>
+        <w:t>updated the enter deitals driver fn to remove re-linking of driver_id to the supplier_drivers table</w:t>
+      </w:r>
+    </w:p>
+    <w:p>
+      <w:r>
+        <w:t>Made a new trigger of re-link_driver_after_session generation</w:t>
       </w:r>
     </w:p>
     <w:p>
@@ -743,15 +249,7 @@
     </w:p>
     <w:p>
       <w:r>
-        <w:t xml:space="preserve">if it has then that means his details already exists </w:t>
-      </w:r>
-      <w:proofErr w:type="spellStart"/>
-      <w:r>
-        <w:t>jsut</w:t>
-      </w:r>
-      <w:proofErr w:type="spellEnd"/>
-      <w:r>
-        <w:t xml:space="preserve"> need to link his id to the suppliers table again</w:t>
+        <w:t>if it has then that means his details already exists jsut need to link his id to the suppliers table again</w:t>
       </w:r>
     </w:p>
     <w:p/>
@@ -774,13 +272,8 @@
       </w:r>
     </w:p>
     <w:p>
-      <w:proofErr w:type="spellStart"/>
-      <w:r>
-        <w:t>Check_supplier_has_drivers</w:t>
-      </w:r>
-      <w:proofErr w:type="spellEnd"/>
-      <w:r>
-        <w:t xml:space="preserve"> fn:</w:t>
+      <w:r>
+        <w:t>Check_supplier_has_drivers fn:</w:t>
       </w:r>
       <w:r>
         <w:tab/>
@@ -794,29 +287,13 @@
     </w:p>
     <w:p>
       <w:r>
-        <w:t xml:space="preserve">This will be checked by checked the </w:t>
-      </w:r>
-      <w:proofErr w:type="spellStart"/>
-      <w:r>
-        <w:t>supplier_drivers</w:t>
-      </w:r>
-      <w:proofErr w:type="spellEnd"/>
-      <w:r>
-        <w:t xml:space="preserve"> table</w:t>
+        <w:t>This will be checked by checked the supplier_drivers table</w:t>
       </w:r>
     </w:p>
     <w:p/>
     <w:p>
       <w:r>
-        <w:t xml:space="preserve">Check </w:t>
-      </w:r>
-      <w:proofErr w:type="spellStart"/>
-      <w:r>
-        <w:t>supplier_has_active_drivers</w:t>
-      </w:r>
-      <w:proofErr w:type="spellEnd"/>
-      <w:r>
-        <w:t>:</w:t>
+        <w:t>Check supplier_has_active_drivers:</w:t>
       </w:r>
       <w:r>
         <w:tab/>
@@ -825,65 +302,12 @@
     </w:p>
     <w:p>
       <w:r>
-        <w:t xml:space="preserve">This will be checked by checking the </w:t>
-      </w:r>
-      <w:proofErr w:type="spellStart"/>
-      <w:r>
-        <w:t>supplier_id</w:t>
-      </w:r>
-      <w:proofErr w:type="spellEnd"/>
-      <w:r>
-        <w:t xml:space="preserve"> and the </w:t>
-      </w:r>
-      <w:proofErr w:type="spellStart"/>
-      <w:r>
-        <w:t>driver_id</w:t>
-      </w:r>
-      <w:proofErr w:type="spellEnd"/>
-      <w:r>
-        <w:t xml:space="preserve"> against that supplier in the supplier </w:t>
-      </w:r>
-      <w:proofErr w:type="gramStart"/>
-      <w:r>
-        <w:t>drivers</w:t>
-      </w:r>
-      <w:proofErr w:type="gramEnd"/>
-      <w:r>
-        <w:t xml:space="preserve"> table</w:t>
-      </w:r>
-    </w:p>
-    <w:p>
-      <w:r>
-        <w:t xml:space="preserve">If, for that </w:t>
-      </w:r>
-      <w:proofErr w:type="spellStart"/>
-      <w:r>
-        <w:t>supplier_id</w:t>
-      </w:r>
-      <w:proofErr w:type="spellEnd"/>
-      <w:r>
-        <w:t xml:space="preserve">, even if one of the </w:t>
-      </w:r>
-      <w:proofErr w:type="spellStart"/>
-      <w:proofErr w:type="gramStart"/>
-      <w:r>
-        <w:t>driver</w:t>
-      </w:r>
-      <w:proofErr w:type="gramEnd"/>
-      <w:r>
-        <w:t>_id</w:t>
-      </w:r>
-      <w:proofErr w:type="spellEnd"/>
-      <w:r>
-        <w:t xml:space="preserve"> is not null, then that means </w:t>
-      </w:r>
-      <w:proofErr w:type="spellStart"/>
-      <w:r>
-        <w:t>atleast</w:t>
-      </w:r>
-      <w:proofErr w:type="spellEnd"/>
-      <w:r>
-        <w:t xml:space="preserve"> one of his drivers is active</w:t>
+        <w:t>This will be checked by checking the supplier_id and the driver_id against that supplier in the supplier drivers table</w:t>
+      </w:r>
+    </w:p>
+    <w:p>
+      <w:r>
+        <w:t>If, for that supplier_id, even if one of the driver_id is not null, then that means atleast one of his drivers is active</w:t>
       </w:r>
     </w:p>
     <w:p>
@@ -947,20 +371,7 @@
         </w:numPr>
       </w:pPr>
       <w:r>
-        <w:t>'</w:t>
-      </w:r>
-      <w:proofErr w:type="spellStart"/>
-      <w:proofErr w:type="gramStart"/>
-      <w:r>
-        <w:t>orders</w:t>
-      </w:r>
-      <w:proofErr w:type="gramEnd"/>
-      <w:r>
-        <w:t>_channel</w:t>
-      </w:r>
-      <w:proofErr w:type="spellEnd"/>
-      <w:r>
-        <w:t>' = The radio station name (you can name it anything)</w:t>
+        <w:t>'orders_channel' = The radio station name (you can name it anything)</w:t>
       </w:r>
     </w:p>
     <w:p>
@@ -1196,39 +607,7 @@
           <w:b/>
           <w:bCs/>
         </w:rPr>
-        <w:t xml:space="preserve">Step 5: Node.js calls </w:t>
-      </w:r>
-      <w:proofErr w:type="spellStart"/>
-      <w:r>
-        <w:rPr>
-          <w:b/>
-          <w:bCs/>
-        </w:rPr>
-        <w:t>view_available_</w:t>
-      </w:r>
-      <w:proofErr w:type="gramStart"/>
-      <w:r>
-        <w:rPr>
-          <w:b/>
-          <w:bCs/>
-        </w:rPr>
-        <w:t>orders</w:t>
-      </w:r>
-      <w:proofErr w:type="spellEnd"/>
-      <w:r>
-        <w:rPr>
-          <w:b/>
-          <w:bCs/>
-        </w:rPr>
-        <w:t>(</w:t>
-      </w:r>
-      <w:proofErr w:type="gramEnd"/>
-      <w:r>
-        <w:rPr>
-          <w:b/>
-          <w:bCs/>
-        </w:rPr>
-        <w:t>)</w:t>
+        <w:t>Step 5: Node.js calls view_available_orders()</w:t>
       </w:r>
     </w:p>
     <w:p>
@@ -1340,37 +719,12 @@
           <w:numId w:val="8"/>
         </w:numPr>
       </w:pPr>
-      <w:proofErr w:type="spellStart"/>
-      <w:r>
-        <w:rPr>
-          <w:b/>
-          <w:bCs/>
-        </w:rPr>
-        <w:t>view_available_</w:t>
-      </w:r>
-      <w:proofErr w:type="gramStart"/>
-      <w:r>
-        <w:rPr>
-          <w:b/>
-          <w:bCs/>
-        </w:rPr>
-        <w:t>orders</w:t>
-      </w:r>
-      <w:proofErr w:type="spellEnd"/>
-      <w:r>
-        <w:rPr>
-          <w:b/>
-          <w:bCs/>
-        </w:rPr>
-        <w:t>(</w:t>
-      </w:r>
-      <w:proofErr w:type="gramEnd"/>
-      <w:r>
-        <w:rPr>
-          <w:b/>
-          <w:bCs/>
-        </w:rPr>
-        <w:t>) is NOT called by the trigger</w:t>
+      <w:r>
+        <w:rPr>
+          <w:b/>
+          <w:bCs/>
+        </w:rPr>
+        <w:t>view_available_orders() is NOT called by the trigger</w:t>
       </w:r>
     </w:p>
     <w:p>
@@ -1494,38 +848,13 @@
       </w:r>
     </w:p>
     <w:p>
-      <w:proofErr w:type="spellStart"/>
-      <w:proofErr w:type="gramStart"/>
-      <w:r>
-        <w:t>client.on</w:t>
-      </w:r>
-      <w:proofErr w:type="spellEnd"/>
-      <w:proofErr w:type="gramEnd"/>
-      <w:r>
-        <w:t>('notification', (msg) =&gt; {</w:t>
-      </w:r>
-    </w:p>
-    <w:p>
-      <w:r>
-        <w:t>    if (</w:t>
-      </w:r>
-      <w:proofErr w:type="spellStart"/>
-      <w:proofErr w:type="gramStart"/>
-      <w:r>
-        <w:t>msg.channel</w:t>
-      </w:r>
-      <w:proofErr w:type="spellEnd"/>
-      <w:proofErr w:type="gramEnd"/>
-      <w:r>
-        <w:t xml:space="preserve"> === '</w:t>
-      </w:r>
-      <w:proofErr w:type="spellStart"/>
-      <w:r>
-        <w:t>orders_channel</w:t>
-      </w:r>
-      <w:proofErr w:type="spellEnd"/>
-      <w:r>
-        <w:t>') {</w:t>
+      <w:r>
+        <w:t>client.on('notification', (msg) =&gt; {</w:t>
+      </w:r>
+    </w:p>
+    <w:p>
+      <w:r>
+        <w:t>    if (msg.channel === 'orders_channel') {</w:t>
       </w:r>
     </w:p>
     <w:p>
@@ -1535,39 +864,8 @@
     </w:p>
     <w:p>
       <w:r>
-        <w:t xml:space="preserve">        const orders = await </w:t>
-      </w:r>
-      <w:proofErr w:type="spellStart"/>
-      <w:proofErr w:type="gramStart"/>
-      <w:r>
-        <w:t>db.query</w:t>
-      </w:r>
-      <w:proofErr w:type="spellEnd"/>
-      <w:proofErr w:type="gramEnd"/>
-      <w:r>
-        <w:t xml:space="preserve">('SELECT </w:t>
-      </w:r>
-      <w:proofErr w:type="spellStart"/>
-      <w:r>
-        <w:t>view_available_</w:t>
-      </w:r>
-      <w:proofErr w:type="gramStart"/>
-      <w:r>
-        <w:t>orders</w:t>
-      </w:r>
-      <w:proofErr w:type="spellEnd"/>
-      <w:r>
-        <w:t>(</w:t>
-      </w:r>
-      <w:proofErr w:type="gramEnd"/>
-      <w:r>
-        <w:t>)'</w:t>
-      </w:r>
-      <w:proofErr w:type="gramStart"/>
-      <w:r>
-        <w:t>);</w:t>
-      </w:r>
-      <w:proofErr w:type="gramEnd"/>
+        <w:t>        const orders = await db.query('SELECT view_available_orders()');</w:t>
+      </w:r>
     </w:p>
     <w:p>
       <w:r>
@@ -1581,31 +879,8 @@
     </w:p>
     <w:p>
       <w:r>
-        <w:t xml:space="preserve">        </w:t>
-      </w:r>
-      <w:proofErr w:type="spellStart"/>
-      <w:proofErr w:type="gramStart"/>
-      <w:r>
-        <w:t>io.emit</w:t>
-      </w:r>
-      <w:proofErr w:type="spellEnd"/>
-      <w:proofErr w:type="gramEnd"/>
-      <w:r>
-        <w:t>('</w:t>
-      </w:r>
-      <w:proofErr w:type="spellStart"/>
-      <w:r>
-        <w:t>orders_updated</w:t>
-      </w:r>
-      <w:proofErr w:type="spellEnd"/>
-      <w:r>
-        <w:t>', orders</w:t>
-      </w:r>
-      <w:proofErr w:type="gramStart"/>
-      <w:r>
-        <w:t>);</w:t>
-      </w:r>
-      <w:proofErr w:type="gramEnd"/>
+        <w:t>        io.emit('orders_updated', orders);</w:t>
+      </w:r>
     </w:p>
     <w:p>
       <w:r>
@@ -1614,34 +889,13 @@
     </w:p>
     <w:p>
       <w:r>
-        <w:t>}</w:t>
-      </w:r>
-      <w:proofErr w:type="gramStart"/>
-      <w:r>
-        <w:t>);</w:t>
-      </w:r>
-      <w:proofErr w:type="gramEnd"/>
+        <w:t>});</w:t>
+      </w:r>
     </w:p>
     <w:p/>
     <w:p>
       <w:r>
-        <w:t xml:space="preserve">Why not call directly the fn in trigger? Because trigger </w:t>
-      </w:r>
-      <w:proofErr w:type="gramStart"/>
-      <w:r>
-        <w:t>cant</w:t>
-      </w:r>
-      <w:proofErr w:type="gramEnd"/>
-      <w:r>
-        <w:t xml:space="preserve"> do anything with the data. It </w:t>
-      </w:r>
-      <w:proofErr w:type="gramStart"/>
-      <w:r>
-        <w:t>cant</w:t>
-      </w:r>
-      <w:proofErr w:type="gramEnd"/>
-      <w:r>
-        <w:t xml:space="preserve"> return the data back to backend</w:t>
+        <w:t>Why not call directly the fn in trigger? Because trigger cant do anything with the data. It cant return the data back to backend</w:t>
       </w:r>
     </w:p>
     <w:p>
@@ -1650,36 +904,7 @@
         <w:br/>
       </w:r>
       <w:r>
-        <w:t xml:space="preserve">ok so some updates there will be no </w:t>
-      </w:r>
-      <w:proofErr w:type="spellStart"/>
-      <w:r>
-        <w:t>transpation</w:t>
-      </w:r>
-      <w:proofErr w:type="spellEnd"/>
-      <w:r>
-        <w:t xml:space="preserve"> cost in my recommended fare calculation. we will only allow 7 </w:t>
-      </w:r>
-      <w:proofErr w:type="spellStart"/>
-      <w:proofErr w:type="gramStart"/>
-      <w:r>
-        <w:t>quantites</w:t>
-      </w:r>
-      <w:proofErr w:type="spellEnd"/>
-      <w:r>
-        <w:t xml:space="preserve">  to</w:t>
-      </w:r>
-      <w:proofErr w:type="gramEnd"/>
-      <w:r>
-        <w:t xml:space="preserve"> be </w:t>
-      </w:r>
-      <w:proofErr w:type="spellStart"/>
-      <w:r>
-        <w:t>choesn</w:t>
-      </w:r>
-      <w:proofErr w:type="spellEnd"/>
-      <w:r>
-        <w:t>.</w:t>
+        <w:t>ok so some updates there will be no transpation cost in my recommended fare calculation. we will only allow 7 quantites  to be choesn.</w:t>
       </w:r>
     </w:p>
     <w:p>
@@ -1750,21 +975,8 @@
         <w:t>Geocoding API</w:t>
       </w:r>
       <w:r>
-        <w:t xml:space="preserve"> → Convert address to </w:t>
-      </w:r>
-      <w:proofErr w:type="spellStart"/>
-      <w:r>
-        <w:t>lat</w:t>
-      </w:r>
-      <w:proofErr w:type="spellEnd"/>
-      <w:r>
-        <w:t>/</w:t>
-      </w:r>
-      <w:proofErr w:type="spellStart"/>
-      <w:r>
-        <w:t>lng</w:t>
-      </w:r>
-      <w:proofErr w:type="spellEnd"/>
+        <w:t> → Convert address to lat/lng</w:t>
+      </w:r>
     </w:p>
     <w:p>
       <w:pPr>
@@ -1929,13 +1141,8 @@
         <w:t>Geocoding:</w:t>
       </w:r>
       <w:r>
-        <w:t> </w:t>
-      </w:r>
-      <w:proofErr w:type="spellStart"/>
-      <w:r>
-        <w:t>Nominatim</w:t>
-      </w:r>
-      <w:proofErr w:type="spellEnd"/>
+        <w:t> Nominatim</w:t>
+      </w:r>
     </w:p>
     <w:p>
       <w:pPr>
@@ -1952,15 +1159,7 @@
         <w:t>Real-time:</w:t>
       </w:r>
       <w:r>
-        <w:t> </w:t>
-      </w:r>
-      <w:proofErr w:type="spellStart"/>
-      <w:r>
-        <w:t>WebSockets</w:t>
-      </w:r>
-      <w:proofErr w:type="spellEnd"/>
-      <w:r>
-        <w:t xml:space="preserve"> (you already planned this)</w:t>
+        <w:t> WebSockets (you already planned this)</w:t>
       </w:r>
     </w:p>
     <w:p>
@@ -2010,39 +1209,7 @@
     <w:p>
       <w:r>
         <w:lastRenderedPageBreak/>
-        <w:t xml:space="preserve">well </w:t>
-      </w:r>
-      <w:proofErr w:type="spellStart"/>
-      <w:r>
-        <w:t>i</w:t>
-      </w:r>
-      <w:proofErr w:type="spellEnd"/>
-      <w:r>
-        <w:t xml:space="preserve"> also wanted the frontend to </w:t>
-      </w:r>
-      <w:proofErr w:type="spellStart"/>
-      <w:r>
-        <w:t>dispaly</w:t>
-      </w:r>
-      <w:proofErr w:type="spellEnd"/>
-      <w:r>
-        <w:t xml:space="preserve"> the driver coming to a location so in real time his </w:t>
-      </w:r>
-      <w:proofErr w:type="spellStart"/>
-      <w:r>
-        <w:t>lication</w:t>
-      </w:r>
-      <w:proofErr w:type="spellEnd"/>
-      <w:r>
-        <w:t xml:space="preserve"> can be seen by the </w:t>
-      </w:r>
-      <w:proofErr w:type="spellStart"/>
-      <w:r>
-        <w:t>cusotmer</w:t>
-      </w:r>
-      <w:proofErr w:type="spellEnd"/>
-      <w:r>
-        <w:t xml:space="preserve"> when he is coming after acceptance of an order. can that also be free</w:t>
+        <w:t>well i also wanted the frontend to dispaly the driver coming to a location so in real time his lication can be seen by the cusotmer when he is coming after acceptance of an order. can that also be free</w:t>
       </w:r>
     </w:p>
     <w:p>
@@ -2173,23 +1340,7 @@
           <w:b/>
           <w:bCs/>
         </w:rPr>
-        <w:t xml:space="preserve">2. Backend (Node.js + </w:t>
-      </w:r>
-      <w:proofErr w:type="spellStart"/>
-      <w:r>
-        <w:rPr>
-          <w:b/>
-          <w:bCs/>
-        </w:rPr>
-        <w:t>WebSockets</w:t>
-      </w:r>
-      <w:proofErr w:type="spellEnd"/>
-      <w:r>
-        <w:rPr>
-          <w:b/>
-          <w:bCs/>
-        </w:rPr>
-        <w:t>)</w:t>
+        <w:t>2. Backend (Node.js + WebSockets)</w:t>
       </w:r>
     </w:p>
     <w:p>
@@ -2233,15 +1384,7 @@
         <w:t>Cost:</w:t>
       </w:r>
       <w:r>
-        <w:t xml:space="preserve"> $0 - </w:t>
-      </w:r>
-      <w:proofErr w:type="spellStart"/>
-      <w:r>
-        <w:t>WebSockets</w:t>
-      </w:r>
-      <w:proofErr w:type="spellEnd"/>
-      <w:r>
-        <w:t xml:space="preserve"> (socket.io) is free</w:t>
+        <w:t> $0 - WebSockets (socket.io) is free</w:t>
       </w:r>
     </w:p>
     <w:p>
@@ -2588,13 +1731,8 @@
             <w:hideMark/>
           </w:tcPr>
           <w:p>
-            <w:proofErr w:type="spellStart"/>
             <w:r>
-              <w:t>WebSockets</w:t>
-            </w:r>
-            <w:proofErr w:type="spellEnd"/>
-            <w:r>
-              <w:t xml:space="preserve"> (socket.io)</w:t>
+              <w:t>WebSockets (socket.io)</w:t>
             </w:r>
           </w:p>
         </w:tc>
@@ -2893,15 +2031,7 @@
         <w:t>Every 5-10 seconds</w:t>
       </w:r>
       <w:r>
-        <w:t xml:space="preserve"> - </w:t>
-      </w:r>
-      <w:proofErr w:type="gramStart"/>
-      <w:r>
-        <w:t>Good</w:t>
-      </w:r>
-      <w:proofErr w:type="gramEnd"/>
-      <w:r>
-        <w:t xml:space="preserve"> balance (not too much data)</w:t>
+        <w:t> - Good balance (not too much data)</w:t>
       </w:r>
     </w:p>
     <w:p>
@@ -2949,15 +2079,7 @@
     <w:p>
       <w:r>
         <w:lastRenderedPageBreak/>
-        <w:t xml:space="preserve">Added a </w:t>
-      </w:r>
-      <w:proofErr w:type="spellStart"/>
-      <w:r>
-        <w:t>constraitn</w:t>
-      </w:r>
-      <w:proofErr w:type="spellEnd"/>
-      <w:r>
-        <w:t xml:space="preserve"> on table of orders that there cannot be more than one order for a customer with status = ‘open’</w:t>
+        <w:t>Added a constraitn on table of orders that there cannot be more than one order for a customer with status = ‘open’</w:t>
       </w:r>
     </w:p>
     <w:p>
@@ -2974,28 +2096,12 @@
     </w:p>
     <w:p>
       <w:r>
-        <w:t xml:space="preserve">Supplier sends a bid using a submit bid fn were first it will be checked if that order status is still open and if the </w:t>
-      </w:r>
-      <w:proofErr w:type="spellStart"/>
-      <w:r>
-        <w:t>supplier_id</w:t>
-      </w:r>
-      <w:proofErr w:type="spellEnd"/>
-      <w:r>
-        <w:t xml:space="preserve"> for that order is null or not</w:t>
-      </w:r>
-    </w:p>
-    <w:p>
-      <w:r>
-        <w:t xml:space="preserve">If </w:t>
-      </w:r>
-      <w:proofErr w:type="gramStart"/>
-      <w:r>
-        <w:t>yes</w:t>
-      </w:r>
-      <w:proofErr w:type="gramEnd"/>
-      <w:r>
-        <w:t xml:space="preserve"> then submit bid </w:t>
+        <w:t>Supplier sends a bid using a submit bid fn were first it will be checked if that order status is still open and if the supplier_id for that order is null or not</w:t>
+      </w:r>
+    </w:p>
+    <w:p>
+      <w:r>
+        <w:t xml:space="preserve">If yes then submit bid </w:t>
       </w:r>
     </w:p>
     <w:p/>
@@ -3011,31 +2117,7 @@
     </w:p>
     <w:p>
       <w:r>
-        <w:t xml:space="preserve">If it is then </w:t>
-      </w:r>
-      <w:proofErr w:type="gramStart"/>
-      <w:r>
-        <w:t>update</w:t>
-      </w:r>
-      <w:proofErr w:type="gramEnd"/>
-      <w:r>
-        <w:t xml:space="preserve"> the supplier id, accepted price, </w:t>
-      </w:r>
-      <w:proofErr w:type="spellStart"/>
-      <w:r>
-        <w:t>order_accepted_by_supplier</w:t>
-      </w:r>
-      <w:proofErr w:type="spellEnd"/>
-      <w:r>
-        <w:t xml:space="preserve"> </w:t>
-      </w:r>
-      <w:proofErr w:type="gramStart"/>
-      <w:r>
-        <w:t>at  and</w:t>
-      </w:r>
-      <w:proofErr w:type="gramEnd"/>
-      <w:r>
-        <w:t xml:space="preserve"> </w:t>
+        <w:t xml:space="preserve">If it is then update the supplier id, accepted price, order_accepted_by_supplier at  and </w:t>
       </w:r>
     </w:p>
     <w:p>
@@ -3046,29 +2128,13 @@
     <w:p/>
     <w:p>
       <w:r>
-        <w:t xml:space="preserve">As soon as this status update happens a trigger will be called for this order where all the bids for that </w:t>
-      </w:r>
-      <w:proofErr w:type="gramStart"/>
-      <w:r>
-        <w:t>order  will</w:t>
-      </w:r>
-      <w:proofErr w:type="gramEnd"/>
-      <w:r>
-        <w:t xml:space="preserve"> be deleted instantly</w:t>
+        <w:t>As soon as this status update happens a trigger will be called for this order where all the bids for that order  will be deleted instantly</w:t>
       </w:r>
     </w:p>
     <w:p/>
     <w:p>
       <w:r>
-        <w:t xml:space="preserve">For accepting bid, the customer id will be sent using the session id from backend (this </w:t>
-      </w:r>
-      <w:proofErr w:type="gramStart"/>
-      <w:r>
-        <w:t>has to</w:t>
-      </w:r>
-      <w:proofErr w:type="gramEnd"/>
-      <w:r>
-        <w:t xml:space="preserve"> be done for others too, for other human/computer interactions</w:t>
+        <w:t>For accepting bid, the customer id will be sent using the session id from backend (this has to be done for others too, for other human/computer interactions</w:t>
       </w:r>
     </w:p>
     <w:p/>
@@ -3084,42 +2150,13 @@
       </w:r>
     </w:p>
     <w:p>
-      <w:proofErr w:type="gramStart"/>
-      <w:r>
-        <w:t>Have to</w:t>
-      </w:r>
-      <w:proofErr w:type="gramEnd"/>
-      <w:r>
-        <w:t xml:space="preserve"> </w:t>
-      </w:r>
-      <w:proofErr w:type="gramStart"/>
-      <w:r>
-        <w:t>remove  the</w:t>
-      </w:r>
-      <w:proofErr w:type="gramEnd"/>
-      <w:r>
-        <w:t xml:space="preserve"> order as soon as timer goes up.</w:t>
-      </w:r>
-    </w:p>
-    <w:p>
-      <w:r>
-        <w:t xml:space="preserve">From the </w:t>
-      </w:r>
-      <w:proofErr w:type="gramStart"/>
-      <w:r>
-        <w:t>orders  table</w:t>
-      </w:r>
-      <w:proofErr w:type="gramEnd"/>
-      <w:r>
-        <w:t xml:space="preserve"> and from </w:t>
-      </w:r>
-      <w:proofErr w:type="gramStart"/>
-      <w:r>
-        <w:t>drivers</w:t>
-      </w:r>
-      <w:proofErr w:type="gramEnd"/>
-      <w:r>
-        <w:t xml:space="preserve"> table</w:t>
+      <w:r>
+        <w:t>Have to remove  the order as soon as timer goes up.</w:t>
+      </w:r>
+    </w:p>
+    <w:p>
+      <w:r>
+        <w:t>From the orders  table and from drivers table</w:t>
       </w:r>
     </w:p>
     <w:p/>
@@ -3129,15 +2166,7 @@
         <w:t>Now remove order fn will be called that will remove the order from the orders side</w:t>
       </w:r>
       <w:r>
-        <w:t xml:space="preserve"> and from the </w:t>
-      </w:r>
-      <w:proofErr w:type="spellStart"/>
-      <w:r>
-        <w:t>driver_assignment</w:t>
-      </w:r>
-      <w:proofErr w:type="spellEnd"/>
-      <w:r>
-        <w:t xml:space="preserve"> table</w:t>
+        <w:t xml:space="preserve"> and from the driver_assignment table</w:t>
       </w:r>
     </w:p>
     <w:p>
@@ -3165,15 +2194,7 @@
     <w:p/>
     <w:p>
       <w:r>
-        <w:t xml:space="preserve">REMINDER: session id </w:t>
-      </w:r>
-      <w:proofErr w:type="gramStart"/>
-      <w:r>
-        <w:t>has to</w:t>
-      </w:r>
-      <w:proofErr w:type="gramEnd"/>
-      <w:r>
-        <w:t xml:space="preserve"> be checked in backend logic as it was not catered here</w:t>
+        <w:t>REMINDER: session id has to be checked in backend logic as it was not catered here</w:t>
       </w:r>
     </w:p>
     <w:p/>
@@ -3187,49 +2208,17 @@
     </w:p>
     <w:p>
       <w:r>
-        <w:t xml:space="preserve">Did this by adding </w:t>
-      </w:r>
-      <w:proofErr w:type="spellStart"/>
-      <w:r>
-        <w:t>anotrer</w:t>
-      </w:r>
-      <w:proofErr w:type="spellEnd"/>
-      <w:r>
-        <w:t xml:space="preserve"> field to </w:t>
-      </w:r>
-      <w:proofErr w:type="spellStart"/>
-      <w:r>
-        <w:t>thebtal</w:t>
-      </w:r>
-      <w:proofErr w:type="spellEnd"/>
-      <w:r>
-        <w:t xml:space="preserve"> called order rejected in driver assignment table</w:t>
-      </w:r>
-    </w:p>
-    <w:p>
-      <w:r>
-        <w:t xml:space="preserve">If assignment already existed but rejected field is </w:t>
-      </w:r>
-      <w:proofErr w:type="gramStart"/>
-      <w:r>
-        <w:t>false</w:t>
-      </w:r>
-      <w:proofErr w:type="gramEnd"/>
-      <w:r>
-        <w:t xml:space="preserve"> then delete that row and reassign and vice versa</w:t>
-      </w:r>
-    </w:p>
-    <w:p>
-      <w:r>
-        <w:t xml:space="preserve">For making button unavailable after </w:t>
-      </w:r>
-      <w:proofErr w:type="spellStart"/>
-      <w:r>
-        <w:t>assigining</w:t>
-      </w:r>
-      <w:proofErr w:type="spellEnd"/>
-      <w:r>
-        <w:t xml:space="preserve">, frontend will handle it in real time </w:t>
+        <w:t>Did this by adding anotrer field to thebtal called order rejected in driver assignment table</w:t>
+      </w:r>
+    </w:p>
+    <w:p>
+      <w:r>
+        <w:t>If assignment already existed but rejected field is false then delete that row and reassign and vice versa</w:t>
+      </w:r>
+    </w:p>
+    <w:p>
+      <w:r>
+        <w:t xml:space="preserve">For making button unavailable after assigining, frontend will handle it in real time </w:t>
       </w:r>
     </w:p>
     <w:p/>
@@ -3270,36 +2259,7 @@
         <w:t>Fetch driver list</w:t>
       </w:r>
       <w:r>
-        <w:t> with </w:t>
-      </w:r>
-      <w:proofErr w:type="spellStart"/>
-      <w:r>
-        <w:t>get_available_drivers_for_</w:t>
-      </w:r>
-      <w:proofErr w:type="gramStart"/>
-      <w:r>
-        <w:t>supplier</w:t>
-      </w:r>
-      <w:proofErr w:type="spellEnd"/>
-      <w:r>
-        <w:t>(</w:t>
-      </w:r>
-      <w:proofErr w:type="spellStart"/>
-      <w:proofErr w:type="gramEnd"/>
-      <w:r>
-        <w:t>supplier_id</w:t>
-      </w:r>
-      <w:proofErr w:type="spellEnd"/>
-      <w:r>
-        <w:t xml:space="preserve">, </w:t>
-      </w:r>
-      <w:proofErr w:type="spellStart"/>
-      <w:r>
-        <w:t>order_id</w:t>
-      </w:r>
-      <w:proofErr w:type="spellEnd"/>
-      <w:r>
-        <w:t>)</w:t>
+        <w:t> with get_available_drivers_for_supplier(supplier_id, order_id)</w:t>
       </w:r>
     </w:p>
     <w:p>
@@ -3310,13 +2270,8 @@
         </w:numPr>
       </w:pPr>
       <w:r>
-        <w:t>Returns each driver with status and </w:t>
-      </w:r>
-      <w:proofErr w:type="spellStart"/>
-      <w:r>
-        <w:t>time_limit</w:t>
-      </w:r>
-      <w:proofErr w:type="spellEnd"/>
+        <w:t>Returns each driver with status and time_limit</w:t>
+      </w:r>
     </w:p>
     <w:p>
       <w:pPr>
@@ -3376,8 +2331,6 @@
         </w:rPr>
         <w:t xml:space="preserve"> (</w:t>
       </w:r>
-      <w:proofErr w:type="spellStart"/>
-      <w:proofErr w:type="gramStart"/>
       <w:r>
         <w:rPr>
           <w:rFonts w:ascii="Consolas" w:eastAsia="Times New Roman" w:hAnsi="Consolas" w:cs="Times New Roman"/>
@@ -3414,8 +2367,6 @@
         </w:rPr>
         <w:t>status</w:t>
       </w:r>
-      <w:proofErr w:type="spellEnd"/>
-      <w:proofErr w:type="gramEnd"/>
       <w:r>
         <w:rPr>
           <w:rFonts w:ascii="Consolas" w:eastAsia="Times New Roman" w:hAnsi="Consolas" w:cs="Times New Roman"/>
@@ -3524,7 +2475,6 @@
         </w:rPr>
         <w:t xml:space="preserve"> </w:t>
       </w:r>
-      <w:proofErr w:type="gramStart"/>
       <w:r>
         <w:rPr>
           <w:rFonts w:ascii="Consolas" w:eastAsia="Times New Roman" w:hAnsi="Consolas" w:cs="Times New Roman"/>
@@ -3547,9 +2497,20 @@
           <w:lang w:eastAsia="en-PK"/>
           <w14:ligatures w14:val="none"/>
         </w:rPr>
-        <w:t>(</w:t>
-      </w:r>
-      <w:proofErr w:type="gramEnd"/>
+        <w:t xml:space="preserve">() &lt; new </w:t>
+      </w:r>
+      <w:r>
+        <w:rPr>
+          <w:rFonts w:ascii="Consolas" w:eastAsia="Times New Roman" w:hAnsi="Consolas" w:cs="Times New Roman"/>
+          <w:color w:val="4EC9B0"/>
+          <w:kern w:val="0"/>
+          <w:sz w:val="21"/>
+          <w:szCs w:val="21"/>
+          <w:lang w:eastAsia="en-PK"/>
+          <w14:ligatures w14:val="none"/>
+        </w:rPr>
+        <w:t>Date</w:t>
+      </w:r>
       <w:r>
         <w:rPr>
           <w:rFonts w:ascii="Consolas" w:eastAsia="Times New Roman" w:hAnsi="Consolas" w:cs="Times New Roman"/>
@@ -3560,21 +2521,18 @@
           <w:lang w:eastAsia="en-PK"/>
           <w14:ligatures w14:val="none"/>
         </w:rPr>
-        <w:t xml:space="preserve">) &lt; new </w:t>
-      </w:r>
-      <w:r>
-        <w:rPr>
-          <w:rFonts w:ascii="Consolas" w:eastAsia="Times New Roman" w:hAnsi="Consolas" w:cs="Times New Roman"/>
-          <w:color w:val="4EC9B0"/>
-          <w:kern w:val="0"/>
-          <w:sz w:val="21"/>
-          <w:szCs w:val="21"/>
-          <w:lang w:eastAsia="en-PK"/>
-          <w14:ligatures w14:val="none"/>
-        </w:rPr>
-        <w:t>Date</w:t>
-      </w:r>
-      <w:r>
+        <w:t>(driver.time_limit)) {</w:t>
+      </w:r>
+    </w:p>
+    <w:p>
+      <w:pPr>
+        <w:pStyle w:val="ListParagraph"/>
+        <w:numPr>
+          <w:ilvl w:val="0"/>
+          <w:numId w:val="18"/>
+        </w:numPr>
+        <w:shd w:val="clear" w:color="auto" w:fill="1F1F1F"/>
+        <w:spacing w:after="0" w:line="300" w:lineRule="atLeast"/>
         <w:rPr>
           <w:rFonts w:ascii="Consolas" w:eastAsia="Times New Roman" w:hAnsi="Consolas" w:cs="Times New Roman"/>
           <w:color w:val="CCCCCC"/>
@@ -3584,10 +2542,7 @@
           <w:lang w:eastAsia="en-PK"/>
           <w14:ligatures w14:val="none"/>
         </w:rPr>
-        <w:t>(</w:t>
-      </w:r>
-      <w:proofErr w:type="spellStart"/>
-      <w:proofErr w:type="gramStart"/>
+      </w:pPr>
       <w:r>
         <w:rPr>
           <w:rFonts w:ascii="Consolas" w:eastAsia="Times New Roman" w:hAnsi="Consolas" w:cs="Times New Roman"/>
@@ -3598,10 +2553,30 @@
           <w:lang w:eastAsia="en-PK"/>
           <w14:ligatures w14:val="none"/>
         </w:rPr>
-        <w:t>driver.time</w:t>
-      </w:r>
-      <w:proofErr w:type="gramEnd"/>
-      <w:r>
+        <w:t xml:space="preserve">  </w:t>
+      </w:r>
+      <w:r>
+        <w:rPr>
+          <w:rFonts w:ascii="Consolas" w:eastAsia="Times New Roman" w:hAnsi="Consolas" w:cs="Times New Roman"/>
+          <w:color w:val="6A9955"/>
+          <w:kern w:val="0"/>
+          <w:sz w:val="21"/>
+          <w:szCs w:val="21"/>
+          <w:lang w:eastAsia="en-PK"/>
+          <w14:ligatures w14:val="none"/>
+        </w:rPr>
+        <w:t>// Disable button, show countdown timer</w:t>
+      </w:r>
+    </w:p>
+    <w:p>
+      <w:pPr>
+        <w:pStyle w:val="ListParagraph"/>
+        <w:numPr>
+          <w:ilvl w:val="0"/>
+          <w:numId w:val="18"/>
+        </w:numPr>
+        <w:shd w:val="clear" w:color="auto" w:fill="1F1F1F"/>
+        <w:spacing w:after="0" w:line="300" w:lineRule="atLeast"/>
         <w:rPr>
           <w:rFonts w:ascii="Consolas" w:eastAsia="Times New Roman" w:hAnsi="Consolas" w:cs="Times New Roman"/>
           <w:color w:val="CCCCCC"/>
@@ -3611,9 +2586,7 @@
           <w:lang w:eastAsia="en-PK"/>
           <w14:ligatures w14:val="none"/>
         </w:rPr>
-        <w:t>_limit</w:t>
-      </w:r>
-      <w:proofErr w:type="spellEnd"/>
+      </w:pPr>
       <w:r>
         <w:rPr>
           <w:rFonts w:ascii="Consolas" w:eastAsia="Times New Roman" w:hAnsi="Consolas" w:cs="Times New Roman"/>
@@ -3624,18 +2597,22 @@
           <w:lang w:eastAsia="en-PK"/>
           <w14:ligatures w14:val="none"/>
         </w:rPr>
-        <w:t>)) {</w:t>
-      </w:r>
-    </w:p>
-    <w:p>
-      <w:pPr>
-        <w:pStyle w:val="ListParagraph"/>
-        <w:numPr>
-          <w:ilvl w:val="0"/>
-          <w:numId w:val="18"/>
-        </w:numPr>
-        <w:shd w:val="clear" w:color="auto" w:fill="1F1F1F"/>
-        <w:spacing w:after="0" w:line="300" w:lineRule="atLeast"/>
+        <w:lastRenderedPageBreak/>
+        <w:t xml:space="preserve">  </w:t>
+      </w:r>
+      <w:r>
+        <w:rPr>
+          <w:rFonts w:ascii="Consolas" w:eastAsia="Times New Roman" w:hAnsi="Consolas" w:cs="Times New Roman"/>
+          <w:color w:val="9CDCFE"/>
+          <w:kern w:val="0"/>
+          <w:sz w:val="21"/>
+          <w:szCs w:val="21"/>
+          <w:lang w:eastAsia="en-PK"/>
+          <w14:ligatures w14:val="none"/>
+        </w:rPr>
+        <w:t>button</w:t>
+      </w:r>
+      <w:r>
         <w:rPr>
           <w:rFonts w:ascii="Consolas" w:eastAsia="Times New Roman" w:hAnsi="Consolas" w:cs="Times New Roman"/>
           <w:color w:val="CCCCCC"/>
@@ -3645,7 +2622,20 @@
           <w:lang w:eastAsia="en-PK"/>
           <w14:ligatures w14:val="none"/>
         </w:rPr>
-      </w:pPr>
+        <w:t>.</w:t>
+      </w:r>
+      <w:r>
+        <w:rPr>
+          <w:rFonts w:ascii="Consolas" w:eastAsia="Times New Roman" w:hAnsi="Consolas" w:cs="Times New Roman"/>
+          <w:color w:val="9CDCFE"/>
+          <w:kern w:val="0"/>
+          <w:sz w:val="21"/>
+          <w:szCs w:val="21"/>
+          <w:lang w:eastAsia="en-PK"/>
+          <w14:ligatures w14:val="none"/>
+        </w:rPr>
+        <w:t>disabled</w:t>
+      </w:r>
       <w:r>
         <w:rPr>
           <w:rFonts w:ascii="Consolas" w:eastAsia="Times New Roman" w:hAnsi="Consolas" w:cs="Times New Roman"/>
@@ -3656,6 +2646,262 @@
           <w:lang w:eastAsia="en-PK"/>
           <w14:ligatures w14:val="none"/>
         </w:rPr>
+        <w:t xml:space="preserve"> </w:t>
+      </w:r>
+      <w:r>
+        <w:rPr>
+          <w:rFonts w:ascii="Consolas" w:eastAsia="Times New Roman" w:hAnsi="Consolas" w:cs="Times New Roman"/>
+          <w:color w:val="D4D4D4"/>
+          <w:kern w:val="0"/>
+          <w:sz w:val="21"/>
+          <w:szCs w:val="21"/>
+          <w:lang w:eastAsia="en-PK"/>
+          <w14:ligatures w14:val="none"/>
+        </w:rPr>
+        <w:t>=</w:t>
+      </w:r>
+      <w:r>
+        <w:rPr>
+          <w:rFonts w:ascii="Consolas" w:eastAsia="Times New Roman" w:hAnsi="Consolas" w:cs="Times New Roman"/>
+          <w:color w:val="CCCCCC"/>
+          <w:kern w:val="0"/>
+          <w:sz w:val="21"/>
+          <w:szCs w:val="21"/>
+          <w:lang w:eastAsia="en-PK"/>
+          <w14:ligatures w14:val="none"/>
+        </w:rPr>
+        <w:t xml:space="preserve"> </w:t>
+      </w:r>
+      <w:r>
+        <w:rPr>
+          <w:rFonts w:ascii="Consolas" w:eastAsia="Times New Roman" w:hAnsi="Consolas" w:cs="Times New Roman"/>
+          <w:color w:val="569CD6"/>
+          <w:kern w:val="0"/>
+          <w:sz w:val="21"/>
+          <w:szCs w:val="21"/>
+          <w:lang w:eastAsia="en-PK"/>
+          <w14:ligatures w14:val="none"/>
+        </w:rPr>
+        <w:t>true</w:t>
+      </w:r>
+      <w:r>
+        <w:rPr>
+          <w:rFonts w:ascii="Consolas" w:eastAsia="Times New Roman" w:hAnsi="Consolas" w:cs="Times New Roman"/>
+          <w:color w:val="CCCCCC"/>
+          <w:kern w:val="0"/>
+          <w:sz w:val="21"/>
+          <w:szCs w:val="21"/>
+          <w:lang w:eastAsia="en-PK"/>
+          <w14:ligatures w14:val="none"/>
+        </w:rPr>
+        <w:t>;</w:t>
+      </w:r>
+    </w:p>
+    <w:p>
+      <w:pPr>
+        <w:pStyle w:val="ListParagraph"/>
+        <w:numPr>
+          <w:ilvl w:val="0"/>
+          <w:numId w:val="18"/>
+        </w:numPr>
+        <w:shd w:val="clear" w:color="auto" w:fill="1F1F1F"/>
+        <w:spacing w:after="0" w:line="300" w:lineRule="atLeast"/>
+        <w:rPr>
+          <w:rFonts w:ascii="Consolas" w:eastAsia="Times New Roman" w:hAnsi="Consolas" w:cs="Times New Roman"/>
+          <w:color w:val="CCCCCC"/>
+          <w:kern w:val="0"/>
+          <w:sz w:val="21"/>
+          <w:szCs w:val="21"/>
+          <w:lang w:eastAsia="en-PK"/>
+          <w14:ligatures w14:val="none"/>
+        </w:rPr>
+      </w:pPr>
+      <w:r>
+        <w:rPr>
+          <w:rFonts w:ascii="Consolas" w:eastAsia="Times New Roman" w:hAnsi="Consolas" w:cs="Times New Roman"/>
+          <w:color w:val="CCCCCC"/>
+          <w:kern w:val="0"/>
+          <w:sz w:val="21"/>
+          <w:szCs w:val="21"/>
+          <w:lang w:eastAsia="en-PK"/>
+          <w14:ligatures w14:val="none"/>
+        </w:rPr>
+        <w:t xml:space="preserve">} </w:t>
+      </w:r>
+      <w:r>
+        <w:rPr>
+          <w:rFonts w:ascii="Consolas" w:eastAsia="Times New Roman" w:hAnsi="Consolas" w:cs="Times New Roman"/>
+          <w:color w:val="C586C0"/>
+          <w:kern w:val="0"/>
+          <w:sz w:val="21"/>
+          <w:szCs w:val="21"/>
+          <w:lang w:eastAsia="en-PK"/>
+          <w14:ligatures w14:val="none"/>
+        </w:rPr>
+        <w:t>else</w:t>
+      </w:r>
+      <w:r>
+        <w:rPr>
+          <w:rFonts w:ascii="Consolas" w:eastAsia="Times New Roman" w:hAnsi="Consolas" w:cs="Times New Roman"/>
+          <w:color w:val="CCCCCC"/>
+          <w:kern w:val="0"/>
+          <w:sz w:val="21"/>
+          <w:szCs w:val="21"/>
+          <w:lang w:eastAsia="en-PK"/>
+          <w14:ligatures w14:val="none"/>
+        </w:rPr>
+        <w:t xml:space="preserve"> </w:t>
+      </w:r>
+      <w:r>
+        <w:rPr>
+          <w:rFonts w:ascii="Consolas" w:eastAsia="Times New Roman" w:hAnsi="Consolas" w:cs="Times New Roman"/>
+          <w:color w:val="C586C0"/>
+          <w:kern w:val="0"/>
+          <w:sz w:val="21"/>
+          <w:szCs w:val="21"/>
+          <w:lang w:eastAsia="en-PK"/>
+          <w14:ligatures w14:val="none"/>
+        </w:rPr>
+        <w:t>if</w:t>
+      </w:r>
+      <w:r>
+        <w:rPr>
+          <w:rFonts w:ascii="Consolas" w:eastAsia="Times New Roman" w:hAnsi="Consolas" w:cs="Times New Roman"/>
+          <w:color w:val="CCCCCC"/>
+          <w:kern w:val="0"/>
+          <w:sz w:val="21"/>
+          <w:szCs w:val="21"/>
+          <w:lang w:eastAsia="en-PK"/>
+          <w14:ligatures w14:val="none"/>
+        </w:rPr>
+        <w:t xml:space="preserve"> (</w:t>
+      </w:r>
+      <w:r>
+        <w:rPr>
+          <w:rFonts w:ascii="Consolas" w:eastAsia="Times New Roman" w:hAnsi="Consolas" w:cs="Times New Roman"/>
+          <w:color w:val="9CDCFE"/>
+          <w:kern w:val="0"/>
+          <w:sz w:val="21"/>
+          <w:szCs w:val="21"/>
+          <w:lang w:eastAsia="en-PK"/>
+          <w14:ligatures w14:val="none"/>
+        </w:rPr>
+        <w:t>driver</w:t>
+      </w:r>
+      <w:r>
+        <w:rPr>
+          <w:rFonts w:ascii="Consolas" w:eastAsia="Times New Roman" w:hAnsi="Consolas" w:cs="Times New Roman"/>
+          <w:color w:val="CCCCCC"/>
+          <w:kern w:val="0"/>
+          <w:sz w:val="21"/>
+          <w:szCs w:val="21"/>
+          <w:lang w:eastAsia="en-PK"/>
+          <w14:ligatures w14:val="none"/>
+        </w:rPr>
+        <w:t>.</w:t>
+      </w:r>
+      <w:r>
+        <w:rPr>
+          <w:rFonts w:ascii="Consolas" w:eastAsia="Times New Roman" w:hAnsi="Consolas" w:cs="Times New Roman"/>
+          <w:color w:val="9CDCFE"/>
+          <w:kern w:val="0"/>
+          <w:sz w:val="21"/>
+          <w:szCs w:val="21"/>
+          <w:lang w:eastAsia="en-PK"/>
+          <w14:ligatures w14:val="none"/>
+        </w:rPr>
+        <w:t>status</w:t>
+      </w:r>
+      <w:r>
+        <w:rPr>
+          <w:rFonts w:ascii="Consolas" w:eastAsia="Times New Roman" w:hAnsi="Consolas" w:cs="Times New Roman"/>
+          <w:color w:val="CCCCCC"/>
+          <w:kern w:val="0"/>
+          <w:sz w:val="21"/>
+          <w:szCs w:val="21"/>
+          <w:lang w:eastAsia="en-PK"/>
+          <w14:ligatures w14:val="none"/>
+        </w:rPr>
+        <w:t xml:space="preserve"> </w:t>
+      </w:r>
+      <w:r>
+        <w:rPr>
+          <w:rFonts w:ascii="Consolas" w:eastAsia="Times New Roman" w:hAnsi="Consolas" w:cs="Times New Roman"/>
+          <w:color w:val="D4D4D4"/>
+          <w:kern w:val="0"/>
+          <w:sz w:val="21"/>
+          <w:szCs w:val="21"/>
+          <w:lang w:eastAsia="en-PK"/>
+          <w14:ligatures w14:val="none"/>
+        </w:rPr>
+        <w:t>===</w:t>
+      </w:r>
+      <w:r>
+        <w:rPr>
+          <w:rFonts w:ascii="Consolas" w:eastAsia="Times New Roman" w:hAnsi="Consolas" w:cs="Times New Roman"/>
+          <w:color w:val="CCCCCC"/>
+          <w:kern w:val="0"/>
+          <w:sz w:val="21"/>
+          <w:szCs w:val="21"/>
+          <w:lang w:eastAsia="en-PK"/>
+          <w14:ligatures w14:val="none"/>
+        </w:rPr>
+        <w:t xml:space="preserve"> </w:t>
+      </w:r>
+      <w:r>
+        <w:rPr>
+          <w:rFonts w:ascii="Consolas" w:eastAsia="Times New Roman" w:hAnsi="Consolas" w:cs="Times New Roman"/>
+          <w:color w:val="CE9178"/>
+          <w:kern w:val="0"/>
+          <w:sz w:val="21"/>
+          <w:szCs w:val="21"/>
+          <w:lang w:eastAsia="en-PK"/>
+          <w14:ligatures w14:val="none"/>
+        </w:rPr>
+        <w:t>'rejected'</w:t>
+      </w:r>
+      <w:r>
+        <w:rPr>
+          <w:rFonts w:ascii="Consolas" w:eastAsia="Times New Roman" w:hAnsi="Consolas" w:cs="Times New Roman"/>
+          <w:color w:val="CCCCCC"/>
+          <w:kern w:val="0"/>
+          <w:sz w:val="21"/>
+          <w:szCs w:val="21"/>
+          <w:lang w:eastAsia="en-PK"/>
+          <w14:ligatures w14:val="none"/>
+        </w:rPr>
+        <w:t>) {</w:t>
+      </w:r>
+    </w:p>
+    <w:p>
+      <w:pPr>
+        <w:pStyle w:val="ListParagraph"/>
+        <w:numPr>
+          <w:ilvl w:val="0"/>
+          <w:numId w:val="18"/>
+        </w:numPr>
+        <w:shd w:val="clear" w:color="auto" w:fill="1F1F1F"/>
+        <w:spacing w:after="0" w:line="300" w:lineRule="atLeast"/>
+        <w:rPr>
+          <w:rFonts w:ascii="Consolas" w:eastAsia="Times New Roman" w:hAnsi="Consolas" w:cs="Times New Roman"/>
+          <w:color w:val="CCCCCC"/>
+          <w:kern w:val="0"/>
+          <w:sz w:val="21"/>
+          <w:szCs w:val="21"/>
+          <w:lang w:eastAsia="en-PK"/>
+          <w14:ligatures w14:val="none"/>
+        </w:rPr>
+      </w:pPr>
+      <w:r>
+        <w:rPr>
+          <w:rFonts w:ascii="Consolas" w:eastAsia="Times New Roman" w:hAnsi="Consolas" w:cs="Times New Roman"/>
+          <w:color w:val="CCCCCC"/>
+          <w:kern w:val="0"/>
+          <w:sz w:val="21"/>
+          <w:szCs w:val="21"/>
+          <w:lang w:eastAsia="en-PK"/>
+          <w14:ligatures w14:val="none"/>
+        </w:rPr>
         <w:t xml:space="preserve">  </w:t>
       </w:r>
       <w:r>
@@ -3668,7 +2914,7 @@
           <w:lang w:eastAsia="en-PK"/>
           <w14:ligatures w14:val="none"/>
         </w:rPr>
-        <w:t>// Disable button, show countdown timer</w:t>
+        <w:t>// Grey out, disable button permanently for this order</w:t>
       </w:r>
     </w:p>
     <w:p>
@@ -3700,11 +2946,8 @@
           <w:lang w:eastAsia="en-PK"/>
           <w14:ligatures w14:val="none"/>
         </w:rPr>
-        <w:lastRenderedPageBreak/>
         <w:t xml:space="preserve">  </w:t>
       </w:r>
-      <w:proofErr w:type="spellStart"/>
-      <w:proofErr w:type="gramStart"/>
       <w:r>
         <w:rPr>
           <w:rFonts w:ascii="Consolas" w:eastAsia="Times New Roman" w:hAnsi="Consolas" w:cs="Times New Roman"/>
@@ -3741,8 +2984,6 @@
         </w:rPr>
         <w:t>disabled</w:t>
       </w:r>
-      <w:proofErr w:type="spellEnd"/>
-      <w:proofErr w:type="gramEnd"/>
       <w:r>
         <w:rPr>
           <w:rFonts w:ascii="Consolas" w:eastAsia="Times New Roman" w:hAnsi="Consolas" w:cs="Times New Roman"/>
@@ -3779,7 +3020,6 @@
         </w:rPr>
         <w:t xml:space="preserve"> </w:t>
       </w:r>
-      <w:proofErr w:type="gramStart"/>
       <w:r>
         <w:rPr>
           <w:rFonts w:ascii="Consolas" w:eastAsia="Times New Roman" w:hAnsi="Consolas" w:cs="Times New Roman"/>
@@ -3804,7 +3044,6 @@
         </w:rPr>
         <w:t>;</w:t>
       </w:r>
-      <w:proofErr w:type="gramEnd"/>
     </w:p>
     <w:p>
       <w:pPr>
@@ -3835,6 +3074,134 @@
           <w:lang w:eastAsia="en-PK"/>
           <w14:ligatures w14:val="none"/>
         </w:rPr>
+        <w:t xml:space="preserve">  </w:t>
+      </w:r>
+      <w:r>
+        <w:rPr>
+          <w:rFonts w:ascii="Consolas" w:eastAsia="Times New Roman" w:hAnsi="Consolas" w:cs="Times New Roman"/>
+          <w:color w:val="9CDCFE"/>
+          <w:kern w:val="0"/>
+          <w:sz w:val="21"/>
+          <w:szCs w:val="21"/>
+          <w:lang w:eastAsia="en-PK"/>
+          <w14:ligatures w14:val="none"/>
+        </w:rPr>
+        <w:t>button</w:t>
+      </w:r>
+      <w:r>
+        <w:rPr>
+          <w:rFonts w:ascii="Consolas" w:eastAsia="Times New Roman" w:hAnsi="Consolas" w:cs="Times New Roman"/>
+          <w:color w:val="CCCCCC"/>
+          <w:kern w:val="0"/>
+          <w:sz w:val="21"/>
+          <w:szCs w:val="21"/>
+          <w:lang w:eastAsia="en-PK"/>
+          <w14:ligatures w14:val="none"/>
+        </w:rPr>
+        <w:t>.</w:t>
+      </w:r>
+      <w:r>
+        <w:rPr>
+          <w:rFonts w:ascii="Consolas" w:eastAsia="Times New Roman" w:hAnsi="Consolas" w:cs="Times New Roman"/>
+          <w:color w:val="9CDCFE"/>
+          <w:kern w:val="0"/>
+          <w:sz w:val="21"/>
+          <w:szCs w:val="21"/>
+          <w:lang w:eastAsia="en-PK"/>
+          <w14:ligatures w14:val="none"/>
+        </w:rPr>
+        <w:t>classList</w:t>
+      </w:r>
+      <w:r>
+        <w:rPr>
+          <w:rFonts w:ascii="Consolas" w:eastAsia="Times New Roman" w:hAnsi="Consolas" w:cs="Times New Roman"/>
+          <w:color w:val="CCCCCC"/>
+          <w:kern w:val="0"/>
+          <w:sz w:val="21"/>
+          <w:szCs w:val="21"/>
+          <w:lang w:eastAsia="en-PK"/>
+          <w14:ligatures w14:val="none"/>
+        </w:rPr>
+        <w:t>.</w:t>
+      </w:r>
+      <w:r>
+        <w:rPr>
+          <w:rFonts w:ascii="Consolas" w:eastAsia="Times New Roman" w:hAnsi="Consolas" w:cs="Times New Roman"/>
+          <w:color w:val="DCDCAA"/>
+          <w:kern w:val="0"/>
+          <w:sz w:val="21"/>
+          <w:szCs w:val="21"/>
+          <w:lang w:eastAsia="en-PK"/>
+          <w14:ligatures w14:val="none"/>
+        </w:rPr>
+        <w:t>add</w:t>
+      </w:r>
+      <w:r>
+        <w:rPr>
+          <w:rFonts w:ascii="Consolas" w:eastAsia="Times New Roman" w:hAnsi="Consolas" w:cs="Times New Roman"/>
+          <w:color w:val="CCCCCC"/>
+          <w:kern w:val="0"/>
+          <w:sz w:val="21"/>
+          <w:szCs w:val="21"/>
+          <w:lang w:eastAsia="en-PK"/>
+          <w14:ligatures w14:val="none"/>
+        </w:rPr>
+        <w:t>(</w:t>
+      </w:r>
+      <w:r>
+        <w:rPr>
+          <w:rFonts w:ascii="Consolas" w:eastAsia="Times New Roman" w:hAnsi="Consolas" w:cs="Times New Roman"/>
+          <w:color w:val="CE9178"/>
+          <w:kern w:val="0"/>
+          <w:sz w:val="21"/>
+          <w:szCs w:val="21"/>
+          <w:lang w:eastAsia="en-PK"/>
+          <w14:ligatures w14:val="none"/>
+        </w:rPr>
+        <w:t>'rejected'</w:t>
+      </w:r>
+      <w:r>
+        <w:rPr>
+          <w:rFonts w:ascii="Consolas" w:eastAsia="Times New Roman" w:hAnsi="Consolas" w:cs="Times New Roman"/>
+          <w:color w:val="CCCCCC"/>
+          <w:kern w:val="0"/>
+          <w:sz w:val="21"/>
+          <w:szCs w:val="21"/>
+          <w:lang w:eastAsia="en-PK"/>
+          <w14:ligatures w14:val="none"/>
+        </w:rPr>
+        <w:t>);</w:t>
+      </w:r>
+    </w:p>
+    <w:p>
+      <w:pPr>
+        <w:pStyle w:val="ListParagraph"/>
+        <w:numPr>
+          <w:ilvl w:val="0"/>
+          <w:numId w:val="18"/>
+        </w:numPr>
+        <w:shd w:val="clear" w:color="auto" w:fill="1F1F1F"/>
+        <w:spacing w:after="0" w:line="300" w:lineRule="atLeast"/>
+        <w:rPr>
+          <w:rFonts w:ascii="Consolas" w:eastAsia="Times New Roman" w:hAnsi="Consolas" w:cs="Times New Roman"/>
+          <w:color w:val="CCCCCC"/>
+          <w:kern w:val="0"/>
+          <w:sz w:val="21"/>
+          <w:szCs w:val="21"/>
+          <w:lang w:eastAsia="en-PK"/>
+          <w14:ligatures w14:val="none"/>
+        </w:rPr>
+      </w:pPr>
+      <w:r>
+        <w:rPr>
+          <w:rFonts w:ascii="Consolas" w:eastAsia="Times New Roman" w:hAnsi="Consolas" w:cs="Times New Roman"/>
+          <w:color w:val="CCCCCC"/>
+          <w:kern w:val="0"/>
+          <w:sz w:val="21"/>
+          <w:szCs w:val="21"/>
+          <w:lang w:eastAsia="en-PK"/>
+          <w14:ligatures w14:val="none"/>
+        </w:rPr>
         <w:t xml:space="preserve">} </w:t>
       </w:r>
       <w:r>
@@ -3859,21 +3226,18 @@
           <w:lang w:eastAsia="en-PK"/>
           <w14:ligatures w14:val="none"/>
         </w:rPr>
-        <w:t xml:space="preserve"> </w:t>
-      </w:r>
-      <w:r>
-        <w:rPr>
-          <w:rFonts w:ascii="Consolas" w:eastAsia="Times New Roman" w:hAnsi="Consolas" w:cs="Times New Roman"/>
-          <w:color w:val="C586C0"/>
-          <w:kern w:val="0"/>
-          <w:sz w:val="21"/>
-          <w:szCs w:val="21"/>
-          <w:lang w:eastAsia="en-PK"/>
-          <w14:ligatures w14:val="none"/>
-        </w:rPr>
-        <w:t>if</w:t>
-      </w:r>
-      <w:r>
+        <w:t xml:space="preserve"> {</w:t>
+      </w:r>
+    </w:p>
+    <w:p>
+      <w:pPr>
+        <w:pStyle w:val="ListParagraph"/>
+        <w:numPr>
+          <w:ilvl w:val="0"/>
+          <w:numId w:val="18"/>
+        </w:numPr>
+        <w:shd w:val="clear" w:color="auto" w:fill="1F1F1F"/>
+        <w:spacing w:after="0" w:line="300" w:lineRule="atLeast"/>
         <w:rPr>
           <w:rFonts w:ascii="Consolas" w:eastAsia="Times New Roman" w:hAnsi="Consolas" w:cs="Times New Roman"/>
           <w:color w:val="CCCCCC"/>
@@ -3883,10 +3247,63 @@
           <w:lang w:eastAsia="en-PK"/>
           <w14:ligatures w14:val="none"/>
         </w:rPr>
-        <w:t xml:space="preserve"> (</w:t>
-      </w:r>
-      <w:proofErr w:type="spellStart"/>
-      <w:proofErr w:type="gramStart"/>
+      </w:pPr>
+      <w:r>
+        <w:rPr>
+          <w:rFonts w:ascii="Consolas" w:eastAsia="Times New Roman" w:hAnsi="Consolas" w:cs="Times New Roman"/>
+          <w:color w:val="CCCCCC"/>
+          <w:kern w:val="0"/>
+          <w:sz w:val="21"/>
+          <w:szCs w:val="21"/>
+          <w:lang w:eastAsia="en-PK"/>
+          <w14:ligatures w14:val="none"/>
+        </w:rPr>
+        <w:t xml:space="preserve">  </w:t>
+      </w:r>
+      <w:r>
+        <w:rPr>
+          <w:rFonts w:ascii="Consolas" w:eastAsia="Times New Roman" w:hAnsi="Consolas" w:cs="Times New Roman"/>
+          <w:color w:val="6A9955"/>
+          <w:kern w:val="0"/>
+          <w:sz w:val="21"/>
+          <w:szCs w:val="21"/>
+          <w:lang w:eastAsia="en-PK"/>
+          <w14:ligatures w14:val="none"/>
+        </w:rPr>
+        <w:t>// status === 'available' or timer expired</w:t>
+      </w:r>
+    </w:p>
+    <w:p>
+      <w:pPr>
+        <w:pStyle w:val="ListParagraph"/>
+        <w:numPr>
+          <w:ilvl w:val="0"/>
+          <w:numId w:val="18"/>
+        </w:numPr>
+        <w:shd w:val="clear" w:color="auto" w:fill="1F1F1F"/>
+        <w:spacing w:after="0" w:line="300" w:lineRule="atLeast"/>
+        <w:rPr>
+          <w:rFonts w:ascii="Consolas" w:eastAsia="Times New Roman" w:hAnsi="Consolas" w:cs="Times New Roman"/>
+          <w:color w:val="CCCCCC"/>
+          <w:kern w:val="0"/>
+          <w:sz w:val="21"/>
+          <w:szCs w:val="21"/>
+          <w:lang w:eastAsia="en-PK"/>
+          <w14:ligatures w14:val="none"/>
+        </w:rPr>
+      </w:pPr>
+      <w:r>
+        <w:rPr>
+          <w:rFonts w:ascii="Consolas" w:eastAsia="Times New Roman" w:hAnsi="Consolas" w:cs="Times New Roman"/>
+          <w:color w:val="CCCCCC"/>
+          <w:kern w:val="0"/>
+          <w:sz w:val="21"/>
+          <w:szCs w:val="21"/>
+          <w:lang w:eastAsia="en-PK"/>
+          <w14:ligatures w14:val="none"/>
+        </w:rPr>
+        <w:t xml:space="preserve">  </w:t>
+      </w:r>
       <w:r>
         <w:rPr>
           <w:rFonts w:ascii="Consolas" w:eastAsia="Times New Roman" w:hAnsi="Consolas" w:cs="Times New Roman"/>
@@ -3897,7 +3314,7 @@
           <w:lang w:eastAsia="en-PK"/>
           <w14:ligatures w14:val="none"/>
         </w:rPr>
-        <w:t>driver</w:t>
+        <w:t>button</w:t>
       </w:r>
       <w:r>
         <w:rPr>
@@ -3921,10 +3338,8 @@
           <w:lang w:eastAsia="en-PK"/>
           <w14:ligatures w14:val="none"/>
         </w:rPr>
-        <w:t>status</w:t>
-      </w:r>
-      <w:proofErr w:type="spellEnd"/>
-      <w:proofErr w:type="gramEnd"/>
+        <w:t>disabled</w:t>
+      </w:r>
       <w:r>
         <w:rPr>
           <w:rFonts w:ascii="Consolas" w:eastAsia="Times New Roman" w:hAnsi="Consolas" w:cs="Times New Roman"/>
@@ -3947,7 +3362,7 @@
           <w:lang w:eastAsia="en-PK"/>
           <w14:ligatures w14:val="none"/>
         </w:rPr>
-        <w:t>===</w:t>
+        <w:t>=</w:t>
       </w:r>
       <w:r>
         <w:rPr>
@@ -3964,14 +3379,14 @@
       <w:r>
         <w:rPr>
           <w:rFonts w:ascii="Consolas" w:eastAsia="Times New Roman" w:hAnsi="Consolas" w:cs="Times New Roman"/>
-          <w:color w:val="CE9178"/>
+          <w:color w:val="569CD6"/>
           <w:kern w:val="0"/>
           <w:sz w:val="21"/>
           <w:szCs w:val="21"/>
           <w:lang w:eastAsia="en-PK"/>
           <w14:ligatures w14:val="none"/>
         </w:rPr>
-        <w:t>'rejected'</w:t>
+        <w:t>false</w:t>
       </w:r>
       <w:r>
         <w:rPr>
@@ -3983,7 +3398,7 @@
           <w:lang w:eastAsia="en-PK"/>
           <w14:ligatures w14:val="none"/>
         </w:rPr>
-        <w:t>) {</w:t>
+        <w:t>;</w:t>
       </w:r>
     </w:p>
     <w:p>
@@ -4015,551 +3430,30 @@
           <w:lang w:eastAsia="en-PK"/>
           <w14:ligatures w14:val="none"/>
         </w:rPr>
-        <w:t xml:space="preserve">  </w:t>
-      </w:r>
-      <w:r>
-        <w:rPr>
-          <w:rFonts w:ascii="Consolas" w:eastAsia="Times New Roman" w:hAnsi="Consolas" w:cs="Times New Roman"/>
-          <w:color w:val="6A9955"/>
-          <w:kern w:val="0"/>
-          <w:sz w:val="21"/>
-          <w:szCs w:val="21"/>
-          <w:lang w:eastAsia="en-PK"/>
-          <w14:ligatures w14:val="none"/>
-        </w:rPr>
-        <w:t>// Grey out, disable button permanently for this order</w:t>
-      </w:r>
-    </w:p>
-    <w:p>
-      <w:pPr>
-        <w:pStyle w:val="ListParagraph"/>
+        <w:t>}</w:t>
+      </w:r>
+    </w:p>
+    <w:p>
+      <w:pPr>
+        <w:numPr>
+          <w:ilvl w:val="1"/>
+          <w:numId w:val="18"/>
+        </w:numPr>
+      </w:pPr>
+    </w:p>
+    <w:p>
+      <w:pPr>
         <w:numPr>
           <w:ilvl w:val="0"/>
           <w:numId w:val="18"/>
         </w:numPr>
-        <w:shd w:val="clear" w:color="auto" w:fill="1F1F1F"/>
-        <w:spacing w:after="0" w:line="300" w:lineRule="atLeast"/>
-        <w:rPr>
-          <w:rFonts w:ascii="Consolas" w:eastAsia="Times New Roman" w:hAnsi="Consolas" w:cs="Times New Roman"/>
-          <w:color w:val="CCCCCC"/>
-          <w:kern w:val="0"/>
-          <w:sz w:val="21"/>
-          <w:szCs w:val="21"/>
-          <w:lang w:eastAsia="en-PK"/>
-          <w14:ligatures w14:val="none"/>
-        </w:rPr>
-      </w:pPr>
-      <w:r>
-        <w:rPr>
-          <w:rFonts w:ascii="Consolas" w:eastAsia="Times New Roman" w:hAnsi="Consolas" w:cs="Times New Roman"/>
-          <w:color w:val="CCCCCC"/>
-          <w:kern w:val="0"/>
-          <w:sz w:val="21"/>
-          <w:szCs w:val="21"/>
-          <w:lang w:eastAsia="en-PK"/>
-          <w14:ligatures w14:val="none"/>
-        </w:rPr>
-        <w:t xml:space="preserve">  </w:t>
-      </w:r>
-      <w:proofErr w:type="spellStart"/>
-      <w:proofErr w:type="gramStart"/>
-      <w:r>
-        <w:rPr>
-          <w:rFonts w:ascii="Consolas" w:eastAsia="Times New Roman" w:hAnsi="Consolas" w:cs="Times New Roman"/>
-          <w:color w:val="9CDCFE"/>
-          <w:kern w:val="0"/>
-          <w:sz w:val="21"/>
-          <w:szCs w:val="21"/>
-          <w:lang w:eastAsia="en-PK"/>
-          <w14:ligatures w14:val="none"/>
-        </w:rPr>
-        <w:t>button</w:t>
-      </w:r>
-      <w:r>
-        <w:rPr>
-          <w:rFonts w:ascii="Consolas" w:eastAsia="Times New Roman" w:hAnsi="Consolas" w:cs="Times New Roman"/>
-          <w:color w:val="CCCCCC"/>
-          <w:kern w:val="0"/>
-          <w:sz w:val="21"/>
-          <w:szCs w:val="21"/>
-          <w:lang w:eastAsia="en-PK"/>
-          <w14:ligatures w14:val="none"/>
-        </w:rPr>
-        <w:t>.</w:t>
-      </w:r>
-      <w:r>
-        <w:rPr>
-          <w:rFonts w:ascii="Consolas" w:eastAsia="Times New Roman" w:hAnsi="Consolas" w:cs="Times New Roman"/>
-          <w:color w:val="9CDCFE"/>
-          <w:kern w:val="0"/>
-          <w:sz w:val="21"/>
-          <w:szCs w:val="21"/>
-          <w:lang w:eastAsia="en-PK"/>
-          <w14:ligatures w14:val="none"/>
-        </w:rPr>
-        <w:t>disabled</w:t>
-      </w:r>
-      <w:proofErr w:type="spellEnd"/>
-      <w:proofErr w:type="gramEnd"/>
-      <w:r>
-        <w:rPr>
-          <w:rFonts w:ascii="Consolas" w:eastAsia="Times New Roman" w:hAnsi="Consolas" w:cs="Times New Roman"/>
-          <w:color w:val="CCCCCC"/>
-          <w:kern w:val="0"/>
-          <w:sz w:val="21"/>
-          <w:szCs w:val="21"/>
-          <w:lang w:eastAsia="en-PK"/>
-          <w14:ligatures w14:val="none"/>
-        </w:rPr>
-        <w:t xml:space="preserve"> </w:t>
-      </w:r>
-      <w:r>
-        <w:rPr>
-          <w:rFonts w:ascii="Consolas" w:eastAsia="Times New Roman" w:hAnsi="Consolas" w:cs="Times New Roman"/>
-          <w:color w:val="D4D4D4"/>
-          <w:kern w:val="0"/>
-          <w:sz w:val="21"/>
-          <w:szCs w:val="21"/>
-          <w:lang w:eastAsia="en-PK"/>
-          <w14:ligatures w14:val="none"/>
-        </w:rPr>
-        <w:t>=</w:t>
-      </w:r>
-      <w:r>
-        <w:rPr>
-          <w:rFonts w:ascii="Consolas" w:eastAsia="Times New Roman" w:hAnsi="Consolas" w:cs="Times New Roman"/>
-          <w:color w:val="CCCCCC"/>
-          <w:kern w:val="0"/>
-          <w:sz w:val="21"/>
-          <w:szCs w:val="21"/>
-          <w:lang w:eastAsia="en-PK"/>
-          <w14:ligatures w14:val="none"/>
-        </w:rPr>
-        <w:t xml:space="preserve"> </w:t>
-      </w:r>
-      <w:proofErr w:type="gramStart"/>
-      <w:r>
-        <w:rPr>
-          <w:rFonts w:ascii="Consolas" w:eastAsia="Times New Roman" w:hAnsi="Consolas" w:cs="Times New Roman"/>
-          <w:color w:val="569CD6"/>
-          <w:kern w:val="0"/>
-          <w:sz w:val="21"/>
-          <w:szCs w:val="21"/>
-          <w:lang w:eastAsia="en-PK"/>
-          <w14:ligatures w14:val="none"/>
-        </w:rPr>
-        <w:t>true</w:t>
-      </w:r>
-      <w:r>
-        <w:rPr>
-          <w:rFonts w:ascii="Consolas" w:eastAsia="Times New Roman" w:hAnsi="Consolas" w:cs="Times New Roman"/>
-          <w:color w:val="CCCCCC"/>
-          <w:kern w:val="0"/>
-          <w:sz w:val="21"/>
-          <w:szCs w:val="21"/>
-          <w:lang w:eastAsia="en-PK"/>
-          <w14:ligatures w14:val="none"/>
-        </w:rPr>
-        <w:t>;</w:t>
-      </w:r>
-      <w:proofErr w:type="gramEnd"/>
-    </w:p>
-    <w:p>
-      <w:pPr>
-        <w:pStyle w:val="ListParagraph"/>
-        <w:numPr>
-          <w:ilvl w:val="0"/>
-          <w:numId w:val="18"/>
-        </w:numPr>
-        <w:shd w:val="clear" w:color="auto" w:fill="1F1F1F"/>
-        <w:spacing w:after="0" w:line="300" w:lineRule="atLeast"/>
-        <w:rPr>
-          <w:rFonts w:ascii="Consolas" w:eastAsia="Times New Roman" w:hAnsi="Consolas" w:cs="Times New Roman"/>
-          <w:color w:val="CCCCCC"/>
-          <w:kern w:val="0"/>
-          <w:sz w:val="21"/>
-          <w:szCs w:val="21"/>
-          <w:lang w:eastAsia="en-PK"/>
-          <w14:ligatures w14:val="none"/>
-        </w:rPr>
-      </w:pPr>
-      <w:r>
-        <w:rPr>
-          <w:rFonts w:ascii="Consolas" w:eastAsia="Times New Roman" w:hAnsi="Consolas" w:cs="Times New Roman"/>
-          <w:color w:val="CCCCCC"/>
-          <w:kern w:val="0"/>
-          <w:sz w:val="21"/>
-          <w:szCs w:val="21"/>
-          <w:lang w:eastAsia="en-PK"/>
-          <w14:ligatures w14:val="none"/>
-        </w:rPr>
-        <w:t xml:space="preserve">  </w:t>
-      </w:r>
-      <w:proofErr w:type="spellStart"/>
-      <w:r>
-        <w:rPr>
-          <w:rFonts w:ascii="Consolas" w:eastAsia="Times New Roman" w:hAnsi="Consolas" w:cs="Times New Roman"/>
-          <w:color w:val="9CDCFE"/>
-          <w:kern w:val="0"/>
-          <w:sz w:val="21"/>
-          <w:szCs w:val="21"/>
-          <w:lang w:eastAsia="en-PK"/>
-          <w14:ligatures w14:val="none"/>
-        </w:rPr>
-        <w:t>button</w:t>
-      </w:r>
-      <w:r>
-        <w:rPr>
-          <w:rFonts w:ascii="Consolas" w:eastAsia="Times New Roman" w:hAnsi="Consolas" w:cs="Times New Roman"/>
-          <w:color w:val="CCCCCC"/>
-          <w:kern w:val="0"/>
-          <w:sz w:val="21"/>
-          <w:szCs w:val="21"/>
-          <w:lang w:eastAsia="en-PK"/>
-          <w14:ligatures w14:val="none"/>
-        </w:rPr>
-        <w:t>.</w:t>
-      </w:r>
-      <w:r>
-        <w:rPr>
-          <w:rFonts w:ascii="Consolas" w:eastAsia="Times New Roman" w:hAnsi="Consolas" w:cs="Times New Roman"/>
-          <w:color w:val="9CDCFE"/>
-          <w:kern w:val="0"/>
-          <w:sz w:val="21"/>
-          <w:szCs w:val="21"/>
-          <w:lang w:eastAsia="en-PK"/>
-          <w14:ligatures w14:val="none"/>
-        </w:rPr>
-        <w:t>classList</w:t>
-      </w:r>
-      <w:r>
-        <w:rPr>
-          <w:rFonts w:ascii="Consolas" w:eastAsia="Times New Roman" w:hAnsi="Consolas" w:cs="Times New Roman"/>
-          <w:color w:val="CCCCCC"/>
-          <w:kern w:val="0"/>
-          <w:sz w:val="21"/>
-          <w:szCs w:val="21"/>
-          <w:lang w:eastAsia="en-PK"/>
-          <w14:ligatures w14:val="none"/>
-        </w:rPr>
-        <w:t>.</w:t>
-      </w:r>
-      <w:r>
-        <w:rPr>
-          <w:rFonts w:ascii="Consolas" w:eastAsia="Times New Roman" w:hAnsi="Consolas" w:cs="Times New Roman"/>
-          <w:color w:val="DCDCAA"/>
-          <w:kern w:val="0"/>
-          <w:sz w:val="21"/>
-          <w:szCs w:val="21"/>
-          <w:lang w:eastAsia="en-PK"/>
-          <w14:ligatures w14:val="none"/>
-        </w:rPr>
-        <w:t>add</w:t>
-      </w:r>
-      <w:proofErr w:type="spellEnd"/>
-      <w:r>
-        <w:rPr>
-          <w:rFonts w:ascii="Consolas" w:eastAsia="Times New Roman" w:hAnsi="Consolas" w:cs="Times New Roman"/>
-          <w:color w:val="CCCCCC"/>
-          <w:kern w:val="0"/>
-          <w:sz w:val="21"/>
-          <w:szCs w:val="21"/>
-          <w:lang w:eastAsia="en-PK"/>
-          <w14:ligatures w14:val="none"/>
-        </w:rPr>
-        <w:t>(</w:t>
-      </w:r>
-      <w:r>
-        <w:rPr>
-          <w:rFonts w:ascii="Consolas" w:eastAsia="Times New Roman" w:hAnsi="Consolas" w:cs="Times New Roman"/>
-          <w:color w:val="CE9178"/>
-          <w:kern w:val="0"/>
-          <w:sz w:val="21"/>
-          <w:szCs w:val="21"/>
-          <w:lang w:eastAsia="en-PK"/>
-          <w14:ligatures w14:val="none"/>
-        </w:rPr>
-        <w:t>'rejected'</w:t>
-      </w:r>
-      <w:proofErr w:type="gramStart"/>
-      <w:r>
-        <w:rPr>
-          <w:rFonts w:ascii="Consolas" w:eastAsia="Times New Roman" w:hAnsi="Consolas" w:cs="Times New Roman"/>
-          <w:color w:val="CCCCCC"/>
-          <w:kern w:val="0"/>
-          <w:sz w:val="21"/>
-          <w:szCs w:val="21"/>
-          <w:lang w:eastAsia="en-PK"/>
-          <w14:ligatures w14:val="none"/>
-        </w:rPr>
-        <w:t>);</w:t>
-      </w:r>
-      <w:proofErr w:type="gramEnd"/>
-    </w:p>
-    <w:p>
-      <w:pPr>
-        <w:pStyle w:val="ListParagraph"/>
-        <w:numPr>
-          <w:ilvl w:val="0"/>
-          <w:numId w:val="18"/>
-        </w:numPr>
-        <w:shd w:val="clear" w:color="auto" w:fill="1F1F1F"/>
-        <w:spacing w:after="0" w:line="300" w:lineRule="atLeast"/>
-        <w:rPr>
-          <w:rFonts w:ascii="Consolas" w:eastAsia="Times New Roman" w:hAnsi="Consolas" w:cs="Times New Roman"/>
-          <w:color w:val="CCCCCC"/>
-          <w:kern w:val="0"/>
-          <w:sz w:val="21"/>
-          <w:szCs w:val="21"/>
-          <w:lang w:eastAsia="en-PK"/>
-          <w14:ligatures w14:val="none"/>
-        </w:rPr>
-      </w:pPr>
-      <w:r>
-        <w:rPr>
-          <w:rFonts w:ascii="Consolas" w:eastAsia="Times New Roman" w:hAnsi="Consolas" w:cs="Times New Roman"/>
-          <w:color w:val="CCCCCC"/>
-          <w:kern w:val="0"/>
-          <w:sz w:val="21"/>
-          <w:szCs w:val="21"/>
-          <w:lang w:eastAsia="en-PK"/>
-          <w14:ligatures w14:val="none"/>
-        </w:rPr>
-        <w:t xml:space="preserve">} </w:t>
-      </w:r>
-      <w:r>
-        <w:rPr>
-          <w:rFonts w:ascii="Consolas" w:eastAsia="Times New Roman" w:hAnsi="Consolas" w:cs="Times New Roman"/>
-          <w:color w:val="C586C0"/>
-          <w:kern w:val="0"/>
-          <w:sz w:val="21"/>
-          <w:szCs w:val="21"/>
-          <w:lang w:eastAsia="en-PK"/>
-          <w14:ligatures w14:val="none"/>
-        </w:rPr>
-        <w:t>else</w:t>
-      </w:r>
-      <w:r>
-        <w:rPr>
-          <w:rFonts w:ascii="Consolas" w:eastAsia="Times New Roman" w:hAnsi="Consolas" w:cs="Times New Roman"/>
-          <w:color w:val="CCCCCC"/>
-          <w:kern w:val="0"/>
-          <w:sz w:val="21"/>
-          <w:szCs w:val="21"/>
-          <w:lang w:eastAsia="en-PK"/>
-          <w14:ligatures w14:val="none"/>
-        </w:rPr>
-        <w:t xml:space="preserve"> {</w:t>
-      </w:r>
-    </w:p>
-    <w:p>
-      <w:pPr>
-        <w:pStyle w:val="ListParagraph"/>
-        <w:numPr>
-          <w:ilvl w:val="0"/>
-          <w:numId w:val="18"/>
-        </w:numPr>
-        <w:shd w:val="clear" w:color="auto" w:fill="1F1F1F"/>
-        <w:spacing w:after="0" w:line="300" w:lineRule="atLeast"/>
-        <w:rPr>
-          <w:rFonts w:ascii="Consolas" w:eastAsia="Times New Roman" w:hAnsi="Consolas" w:cs="Times New Roman"/>
-          <w:color w:val="CCCCCC"/>
-          <w:kern w:val="0"/>
-          <w:sz w:val="21"/>
-          <w:szCs w:val="21"/>
-          <w:lang w:eastAsia="en-PK"/>
-          <w14:ligatures w14:val="none"/>
-        </w:rPr>
-      </w:pPr>
-      <w:r>
-        <w:rPr>
-          <w:rFonts w:ascii="Consolas" w:eastAsia="Times New Roman" w:hAnsi="Consolas" w:cs="Times New Roman"/>
-          <w:color w:val="CCCCCC"/>
-          <w:kern w:val="0"/>
-          <w:sz w:val="21"/>
-          <w:szCs w:val="21"/>
-          <w:lang w:eastAsia="en-PK"/>
-          <w14:ligatures w14:val="none"/>
-        </w:rPr>
-        <w:t xml:space="preserve">  </w:t>
-      </w:r>
-      <w:r>
-        <w:rPr>
-          <w:rFonts w:ascii="Consolas" w:eastAsia="Times New Roman" w:hAnsi="Consolas" w:cs="Times New Roman"/>
-          <w:color w:val="6A9955"/>
-          <w:kern w:val="0"/>
-          <w:sz w:val="21"/>
-          <w:szCs w:val="21"/>
-          <w:lang w:eastAsia="en-PK"/>
-          <w14:ligatures w14:val="none"/>
-        </w:rPr>
-        <w:t>// status === 'available' or timer expired</w:t>
-      </w:r>
-    </w:p>
-    <w:p>
-      <w:pPr>
-        <w:pStyle w:val="ListParagraph"/>
-        <w:numPr>
-          <w:ilvl w:val="0"/>
-          <w:numId w:val="18"/>
-        </w:numPr>
-        <w:shd w:val="clear" w:color="auto" w:fill="1F1F1F"/>
-        <w:spacing w:after="0" w:line="300" w:lineRule="atLeast"/>
-        <w:rPr>
-          <w:rFonts w:ascii="Consolas" w:eastAsia="Times New Roman" w:hAnsi="Consolas" w:cs="Times New Roman"/>
-          <w:color w:val="CCCCCC"/>
-          <w:kern w:val="0"/>
-          <w:sz w:val="21"/>
-          <w:szCs w:val="21"/>
-          <w:lang w:eastAsia="en-PK"/>
-          <w14:ligatures w14:val="none"/>
-        </w:rPr>
-      </w:pPr>
-      <w:r>
-        <w:rPr>
-          <w:rFonts w:ascii="Consolas" w:eastAsia="Times New Roman" w:hAnsi="Consolas" w:cs="Times New Roman"/>
-          <w:color w:val="CCCCCC"/>
-          <w:kern w:val="0"/>
-          <w:sz w:val="21"/>
-          <w:szCs w:val="21"/>
-          <w:lang w:eastAsia="en-PK"/>
-          <w14:ligatures w14:val="none"/>
-        </w:rPr>
-        <w:t xml:space="preserve">  </w:t>
-      </w:r>
-      <w:proofErr w:type="spellStart"/>
-      <w:proofErr w:type="gramStart"/>
-      <w:r>
-        <w:rPr>
-          <w:rFonts w:ascii="Consolas" w:eastAsia="Times New Roman" w:hAnsi="Consolas" w:cs="Times New Roman"/>
-          <w:color w:val="9CDCFE"/>
-          <w:kern w:val="0"/>
-          <w:sz w:val="21"/>
-          <w:szCs w:val="21"/>
-          <w:lang w:eastAsia="en-PK"/>
-          <w14:ligatures w14:val="none"/>
-        </w:rPr>
-        <w:t>button</w:t>
-      </w:r>
-      <w:r>
-        <w:rPr>
-          <w:rFonts w:ascii="Consolas" w:eastAsia="Times New Roman" w:hAnsi="Consolas" w:cs="Times New Roman"/>
-          <w:color w:val="CCCCCC"/>
-          <w:kern w:val="0"/>
-          <w:sz w:val="21"/>
-          <w:szCs w:val="21"/>
-          <w:lang w:eastAsia="en-PK"/>
-          <w14:ligatures w14:val="none"/>
-        </w:rPr>
-        <w:t>.</w:t>
-      </w:r>
-      <w:r>
-        <w:rPr>
-          <w:rFonts w:ascii="Consolas" w:eastAsia="Times New Roman" w:hAnsi="Consolas" w:cs="Times New Roman"/>
-          <w:color w:val="9CDCFE"/>
-          <w:kern w:val="0"/>
-          <w:sz w:val="21"/>
-          <w:szCs w:val="21"/>
-          <w:lang w:eastAsia="en-PK"/>
-          <w14:ligatures w14:val="none"/>
-        </w:rPr>
-        <w:t>disabled</w:t>
-      </w:r>
-      <w:proofErr w:type="spellEnd"/>
-      <w:proofErr w:type="gramEnd"/>
-      <w:r>
-        <w:rPr>
-          <w:rFonts w:ascii="Consolas" w:eastAsia="Times New Roman" w:hAnsi="Consolas" w:cs="Times New Roman"/>
-          <w:color w:val="CCCCCC"/>
-          <w:kern w:val="0"/>
-          <w:sz w:val="21"/>
-          <w:szCs w:val="21"/>
-          <w:lang w:eastAsia="en-PK"/>
-          <w14:ligatures w14:val="none"/>
-        </w:rPr>
-        <w:t xml:space="preserve"> </w:t>
-      </w:r>
-      <w:r>
-        <w:rPr>
-          <w:rFonts w:ascii="Consolas" w:eastAsia="Times New Roman" w:hAnsi="Consolas" w:cs="Times New Roman"/>
-          <w:color w:val="D4D4D4"/>
-          <w:kern w:val="0"/>
-          <w:sz w:val="21"/>
-          <w:szCs w:val="21"/>
-          <w:lang w:eastAsia="en-PK"/>
-          <w14:ligatures w14:val="none"/>
-        </w:rPr>
-        <w:t>=</w:t>
-      </w:r>
-      <w:r>
-        <w:rPr>
-          <w:rFonts w:ascii="Consolas" w:eastAsia="Times New Roman" w:hAnsi="Consolas" w:cs="Times New Roman"/>
-          <w:color w:val="CCCCCC"/>
-          <w:kern w:val="0"/>
-          <w:sz w:val="21"/>
-          <w:szCs w:val="21"/>
-          <w:lang w:eastAsia="en-PK"/>
-          <w14:ligatures w14:val="none"/>
-        </w:rPr>
-        <w:t xml:space="preserve"> </w:t>
-      </w:r>
-      <w:proofErr w:type="gramStart"/>
-      <w:r>
-        <w:rPr>
-          <w:rFonts w:ascii="Consolas" w:eastAsia="Times New Roman" w:hAnsi="Consolas" w:cs="Times New Roman"/>
-          <w:color w:val="569CD6"/>
-          <w:kern w:val="0"/>
-          <w:sz w:val="21"/>
-          <w:szCs w:val="21"/>
-          <w:lang w:eastAsia="en-PK"/>
-          <w14:ligatures w14:val="none"/>
-        </w:rPr>
-        <w:t>false</w:t>
-      </w:r>
-      <w:r>
-        <w:rPr>
-          <w:rFonts w:ascii="Consolas" w:eastAsia="Times New Roman" w:hAnsi="Consolas" w:cs="Times New Roman"/>
-          <w:color w:val="CCCCCC"/>
-          <w:kern w:val="0"/>
-          <w:sz w:val="21"/>
-          <w:szCs w:val="21"/>
-          <w:lang w:eastAsia="en-PK"/>
-          <w14:ligatures w14:val="none"/>
-        </w:rPr>
-        <w:t>;</w:t>
-      </w:r>
-      <w:proofErr w:type="gramEnd"/>
-    </w:p>
-    <w:p>
-      <w:pPr>
-        <w:pStyle w:val="ListParagraph"/>
-        <w:numPr>
-          <w:ilvl w:val="0"/>
-          <w:numId w:val="18"/>
-        </w:numPr>
-        <w:shd w:val="clear" w:color="auto" w:fill="1F1F1F"/>
-        <w:spacing w:after="0" w:line="300" w:lineRule="atLeast"/>
-        <w:rPr>
-          <w:rFonts w:ascii="Consolas" w:eastAsia="Times New Roman" w:hAnsi="Consolas" w:cs="Times New Roman"/>
-          <w:color w:val="CCCCCC"/>
-          <w:kern w:val="0"/>
-          <w:sz w:val="21"/>
-          <w:szCs w:val="21"/>
-          <w:lang w:eastAsia="en-PK"/>
-          <w14:ligatures w14:val="none"/>
-        </w:rPr>
-      </w:pPr>
-      <w:r>
-        <w:rPr>
-          <w:rFonts w:ascii="Consolas" w:eastAsia="Times New Roman" w:hAnsi="Consolas" w:cs="Times New Roman"/>
-          <w:color w:val="CCCCCC"/>
-          <w:kern w:val="0"/>
-          <w:sz w:val="21"/>
-          <w:szCs w:val="21"/>
-          <w:lang w:eastAsia="en-PK"/>
-          <w14:ligatures w14:val="none"/>
-        </w:rPr>
-        <w:t>}</w:t>
+      </w:pPr>
+      <w:r>
+        <w:rPr>
+          <w:b/>
+          <w:bCs/>
+        </w:rPr>
+        <w:t>When supplier clicks "Assign":</w:t>
       </w:r>
     </w:p>
     <w:p>
@@ -4569,20 +3463,8 @@
           <w:numId w:val="18"/>
         </w:numPr>
       </w:pPr>
-    </w:p>
-    <w:p>
-      <w:pPr>
-        <w:numPr>
-          <w:ilvl w:val="0"/>
-          <w:numId w:val="18"/>
-        </w:numPr>
-      </w:pPr>
-      <w:r>
-        <w:rPr>
-          <w:b/>
-          <w:bCs/>
-        </w:rPr>
-        <w:t>When supplier clicks "Assign":</w:t>
+      <w:r>
+        <w:t>Frontend just calls assign_driver_to_order()</w:t>
       </w:r>
     </w:p>
     <w:p>
@@ -4593,33 +3475,6 @@
         </w:numPr>
       </w:pPr>
       <w:r>
-        <w:t>Frontend just calls </w:t>
-      </w:r>
-      <w:proofErr w:type="spellStart"/>
-      <w:r>
-        <w:t>assign_driver_to_</w:t>
-      </w:r>
-      <w:proofErr w:type="gramStart"/>
-      <w:r>
-        <w:t>order</w:t>
-      </w:r>
-      <w:proofErr w:type="spellEnd"/>
-      <w:r>
-        <w:t>(</w:t>
-      </w:r>
-      <w:proofErr w:type="gramEnd"/>
-      <w:r>
-        <w:t>)</w:t>
-      </w:r>
-    </w:p>
-    <w:p>
-      <w:pPr>
-        <w:numPr>
-          <w:ilvl w:val="1"/>
-          <w:numId w:val="18"/>
-        </w:numPr>
-      </w:pPr>
-      <w:r>
         <w:t>If they somehow bypass frontend checks, backend validates:</w:t>
       </w:r>
     </w:p>
@@ -4631,15 +3486,7 @@
         </w:numPr>
       </w:pPr>
       <w:r>
-        <w:t>Rejects if </w:t>
-      </w:r>
-      <w:proofErr w:type="spellStart"/>
-      <w:r>
-        <w:t>order_rejected</w:t>
-      </w:r>
-      <w:proofErr w:type="spellEnd"/>
-      <w:r>
-        <w:t xml:space="preserve"> = TRUE</w:t>
+        <w:t>Rejects if order_rejected = TRUE</w:t>
       </w:r>
     </w:p>
     <w:p>
@@ -4650,15 +3497,7 @@
         </w:numPr>
       </w:pPr>
       <w:r>
-        <w:t xml:space="preserve">Deletes </w:t>
-      </w:r>
-      <w:proofErr w:type="gramStart"/>
-      <w:r>
-        <w:t>old expired</w:t>
-      </w:r>
-      <w:proofErr w:type="gramEnd"/>
-      <w:r>
-        <w:t xml:space="preserve"> assignment</w:t>
+        <w:t>Deletes old expired assignment</w:t>
       </w:r>
     </w:p>
     <w:p>
@@ -4695,23 +3534,7 @@
         <w:t>✅</w:t>
       </w:r>
       <w:r>
-        <w:t> </w:t>
-      </w:r>
-      <w:proofErr w:type="spellStart"/>
-      <w:r>
-        <w:t>confirm_order_</w:t>
-      </w:r>
-      <w:proofErr w:type="gramStart"/>
-      <w:r>
-        <w:t>driver</w:t>
-      </w:r>
-      <w:proofErr w:type="spellEnd"/>
-      <w:r>
-        <w:t>(</w:t>
-      </w:r>
-      <w:proofErr w:type="gramEnd"/>
-      <w:r>
-        <w:t>) - checks driver's timer</w:t>
+        <w:t> confirm_order_driver() - checks driver's timer</w:t>
       </w:r>
     </w:p>
     <w:p>
@@ -4728,23 +3551,7 @@
         <w:t>✅</w:t>
       </w:r>
       <w:r>
-        <w:t> </w:t>
-      </w:r>
-      <w:proofErr w:type="spellStart"/>
-      <w:r>
-        <w:t>assign_driver_to_</w:t>
-      </w:r>
-      <w:proofErr w:type="gramStart"/>
-      <w:r>
-        <w:t>order</w:t>
-      </w:r>
-      <w:proofErr w:type="spellEnd"/>
-      <w:r>
-        <w:t>(</w:t>
-      </w:r>
-      <w:proofErr w:type="gramEnd"/>
-      <w:r>
-        <w:t>) - checks rejection status</w:t>
+        <w:t> assign_driver_to_order() - checks rejection status</w:t>
       </w:r>
     </w:p>
     <w:p>
@@ -4773,15 +3580,7 @@
         <w:t>Perfect architecture! No backend timer polling needed.</w:t>
       </w:r>
       <w:r>
-        <w:t> Frontend calculates based on </w:t>
-      </w:r>
-      <w:proofErr w:type="spellStart"/>
-      <w:r>
-        <w:t>time_limit</w:t>
-      </w:r>
-      <w:proofErr w:type="spellEnd"/>
-      <w:r>
-        <w:t> timestamp.</w:t>
+        <w:t> Frontend calculates based on time_limit timestamp.</w:t>
       </w:r>
     </w:p>
     <w:p/>
@@ -4827,15 +3626,7 @@
         <w:t>Initially:</w:t>
       </w:r>
       <w:r>
-        <w:t xml:space="preserve"> All drivers available (no </w:t>
-      </w:r>
-      <w:proofErr w:type="spellStart"/>
-      <w:r>
-        <w:t>driver_assignment</w:t>
-      </w:r>
-      <w:proofErr w:type="spellEnd"/>
-      <w:r>
-        <w:t xml:space="preserve"> rows exist)</w:t>
+        <w:t> All drivers available (no driver_assignment rows exist)</w:t>
       </w:r>
     </w:p>
     <w:p>
@@ -4861,13 +3652,8 @@
         </w:numPr>
       </w:pPr>
       <w:r>
-        <w:t xml:space="preserve">INSERT into </w:t>
-      </w:r>
-      <w:proofErr w:type="spellStart"/>
-      <w:r>
-        <w:t>driver_assignment</w:t>
-      </w:r>
-      <w:proofErr w:type="spellEnd"/>
+        <w:t>INSERT into driver_assignment</w:t>
+      </w:r>
     </w:p>
     <w:p>
       <w:pPr>
@@ -4904,23 +3690,7 @@
       </w:pPr>
       <w:r>
         <w:lastRenderedPageBreak/>
-        <w:t xml:space="preserve">UPDATE </w:t>
-      </w:r>
-      <w:proofErr w:type="spellStart"/>
-      <w:r>
-        <w:t>driver_assignment</w:t>
-      </w:r>
-      <w:proofErr w:type="spellEnd"/>
-      <w:r>
-        <w:t xml:space="preserve"> SET </w:t>
-      </w:r>
-      <w:proofErr w:type="spellStart"/>
-      <w:r>
-        <w:t>order_rejected</w:t>
-      </w:r>
-      <w:proofErr w:type="spellEnd"/>
-      <w:r>
-        <w:t xml:space="preserve"> = TRUE</w:t>
+        <w:t>UPDATE driver_assignment SET order_rejected = TRUE</w:t>
       </w:r>
     </w:p>
     <w:p>
@@ -4978,44 +3748,18 @@
           <w:b/>
           <w:bCs/>
         </w:rPr>
-        <w:t xml:space="preserve">Add TRIGGER on </w:t>
-      </w:r>
-      <w:proofErr w:type="spellStart"/>
-      <w:r>
-        <w:rPr>
-          <w:b/>
-          <w:bCs/>
-        </w:rPr>
-        <w:t>driver_assignment</w:t>
-      </w:r>
-      <w:proofErr w:type="spellEnd"/>
-      <w:r>
-        <w:rPr>
-          <w:b/>
-          <w:bCs/>
-        </w:rPr>
-        <w:t xml:space="preserve"> (like we have for orders):</w:t>
-      </w:r>
-    </w:p>
-    <w:p>
-      <w:r>
-        <w:t xml:space="preserve">CREATE TRIGGER </w:t>
-      </w:r>
-      <w:proofErr w:type="spellStart"/>
-      <w:r>
-        <w:t>trigger_notify_driver_assignment_updated</w:t>
-      </w:r>
-      <w:proofErr w:type="spellEnd"/>
-    </w:p>
-    <w:p>
-      <w:r>
-        <w:t xml:space="preserve">    AFTER INSERT OR UPDATE OR DELETE ON </w:t>
-      </w:r>
-      <w:proofErr w:type="spellStart"/>
-      <w:r>
-        <w:t>driver_assignment</w:t>
-      </w:r>
-      <w:proofErr w:type="spellEnd"/>
+        <w:t>Add TRIGGER on driver_assignment (like we have for orders):</w:t>
+      </w:r>
+    </w:p>
+    <w:p>
+      <w:r>
+        <w:t>CREATE TRIGGER trigger_notify_driver_assignment_updated</w:t>
+      </w:r>
+    </w:p>
+    <w:p>
+      <w:r>
+        <w:t xml:space="preserve">    AFTER INSERT OR UPDATE OR DELETE ON driver_assignment</w:t>
+      </w:r>
     </w:p>
     <w:p>
       <w:r>
@@ -5024,21 +3768,8 @@
     </w:p>
     <w:p>
       <w:r>
-        <w:t xml:space="preserve">    EXECUTE FUNCTION </w:t>
-      </w:r>
-      <w:proofErr w:type="spellStart"/>
-      <w:r>
-        <w:t>notify_driver_assignment_</w:t>
-      </w:r>
-      <w:proofErr w:type="gramStart"/>
-      <w:r>
-        <w:t>updated</w:t>
-      </w:r>
-      <w:proofErr w:type="spellEnd"/>
-      <w:r>
-        <w:t>();</w:t>
-      </w:r>
-      <w:proofErr w:type="gramEnd"/>
+        <w:t xml:space="preserve">    EXECUTE FUNCTION notify_driver_assignment_updated();</w:t>
+      </w:r>
     </w:p>
     <w:p/>
     <w:p>
@@ -5058,92 +3789,23 @@
     </w:p>
     <w:p>
       <w:r>
-        <w:t xml:space="preserve">// Listen to </w:t>
-      </w:r>
-      <w:proofErr w:type="spellStart"/>
-      <w:r>
-        <w:t>driver_assignment_channel</w:t>
-      </w:r>
-      <w:proofErr w:type="spellEnd"/>
-    </w:p>
-    <w:p>
-      <w:proofErr w:type="spellStart"/>
-      <w:proofErr w:type="gramStart"/>
-      <w:r>
-        <w:t>client.on</w:t>
-      </w:r>
-      <w:proofErr w:type="spellEnd"/>
-      <w:proofErr w:type="gramEnd"/>
-      <w:r>
-        <w:t>('notification', (msg) =&gt; {</w:t>
-      </w:r>
-    </w:p>
-    <w:p>
-      <w:r>
-        <w:t>  if (</w:t>
-      </w:r>
-      <w:proofErr w:type="spellStart"/>
-      <w:proofErr w:type="gramStart"/>
-      <w:r>
-        <w:t>msg.channel</w:t>
-      </w:r>
-      <w:proofErr w:type="spellEnd"/>
-      <w:proofErr w:type="gramEnd"/>
-      <w:r>
-        <w:t xml:space="preserve"> === '</w:t>
-      </w:r>
-      <w:proofErr w:type="spellStart"/>
-      <w:r>
-        <w:t>driver_assignment_channel</w:t>
-      </w:r>
-      <w:proofErr w:type="spellEnd"/>
-      <w:r>
-        <w:t>') {</w:t>
-      </w:r>
-    </w:p>
-    <w:p>
-      <w:r>
-        <w:t xml:space="preserve">    </w:t>
-      </w:r>
-      <w:proofErr w:type="spellStart"/>
-      <w:proofErr w:type="gramStart"/>
-      <w:r>
-        <w:t>io.emit</w:t>
-      </w:r>
-      <w:proofErr w:type="spellEnd"/>
-      <w:proofErr w:type="gramEnd"/>
-      <w:r>
-        <w:t>('</w:t>
-      </w:r>
-      <w:proofErr w:type="spellStart"/>
-      <w:r>
-        <w:t>driver_assignment_update</w:t>
-      </w:r>
-      <w:proofErr w:type="spellEnd"/>
-      <w:r>
-        <w:t xml:space="preserve">', </w:t>
-      </w:r>
-      <w:proofErr w:type="gramStart"/>
-      <w:r>
-        <w:t xml:space="preserve">{ </w:t>
-      </w:r>
-      <w:proofErr w:type="spellStart"/>
-      <w:r>
-        <w:t>order</w:t>
-      </w:r>
-      <w:proofErr w:type="gramEnd"/>
-      <w:r>
-        <w:t>_id</w:t>
-      </w:r>
-      <w:proofErr w:type="spellEnd"/>
-      <w:r>
-        <w:t xml:space="preserve">: </w:t>
-      </w:r>
-      <w:proofErr w:type="gramStart"/>
-      <w:r>
-        <w:t>... });</w:t>
-      </w:r>
-      <w:proofErr w:type="gramEnd"/>
+        <w:t>// Listen to driver_assignment_channel</w:t>
+      </w:r>
+    </w:p>
+    <w:p>
+      <w:r>
+        <w:t>client.on('notification', (msg) =&gt; {</w:t>
+      </w:r>
+    </w:p>
+    <w:p>
+      <w:r>
+        <w:t>  if (msg.channel === 'driver_assignment_channel') {</w:t>
+      </w:r>
+    </w:p>
+    <w:p>
+      <w:r>
+        <w:t>    io.emit('driver_assignment_update', { order_id: ... });</w:t>
+      </w:r>
     </w:p>
     <w:p>
       <w:r>
@@ -5152,13 +3814,8 @@
     </w:p>
     <w:p>
       <w:r>
-        <w:t>}</w:t>
-      </w:r>
-      <w:proofErr w:type="gramStart"/>
-      <w:r>
-        <w:t>);</w:t>
-      </w:r>
-      <w:proofErr w:type="gramEnd"/>
+        <w:t>});</w:t>
+      </w:r>
     </w:p>
     <w:p>
       <w:pPr>
@@ -5203,23 +3860,7 @@
           <w:b/>
           <w:bCs/>
         </w:rPr>
-        <w:t xml:space="preserve">Added available flag in </w:t>
-      </w:r>
-      <w:proofErr w:type="spellStart"/>
-      <w:r>
-        <w:rPr>
-          <w:b/>
-          <w:bCs/>
-        </w:rPr>
-        <w:t>supplier_Driver</w:t>
-      </w:r>
-      <w:proofErr w:type="spellEnd"/>
-      <w:r>
-        <w:rPr>
-          <w:b/>
-          <w:bCs/>
-        </w:rPr>
-        <w:t xml:space="preserve"> table which is set to false when a driver has been assigned to an order</w:t>
+        <w:t>Added available flag in supplier_Driver table which is set to false when a driver has been assigned to an order</w:t>
       </w:r>
     </w:p>
     <w:p>
@@ -5276,15 +3917,7 @@
     </w:p>
     <w:p>
       <w:r>
-        <w:t xml:space="preserve">Now only the delivery process and the ride finish </w:t>
-      </w:r>
-      <w:proofErr w:type="gramStart"/>
-      <w:r>
-        <w:t>has</w:t>
-      </w:r>
-      <w:proofErr w:type="gramEnd"/>
-      <w:r>
-        <w:t xml:space="preserve"> to be taken care of as well as order history</w:t>
+        <w:t>Now only the delivery process and the ride finish has to be taken care of as well as order history</w:t>
       </w:r>
     </w:p>
     <w:p>
@@ -5300,23 +3933,7 @@
     <w:p/>
     <w:p>
       <w:r>
-        <w:t xml:space="preserve">The real time changes on tables and other things on </w:t>
-      </w:r>
-      <w:proofErr w:type="spellStart"/>
-      <w:r>
-        <w:t>db</w:t>
-      </w:r>
-      <w:proofErr w:type="spellEnd"/>
-      <w:r>
-        <w:t xml:space="preserve"> side will be only noticed used trigger on </w:t>
-      </w:r>
-      <w:proofErr w:type="spellStart"/>
-      <w:r>
-        <w:t>db</w:t>
-      </w:r>
-      <w:proofErr w:type="spellEnd"/>
-      <w:r>
-        <w:t xml:space="preserve"> logic.</w:t>
+        <w:t>The real time changes on tables and other things on db side will be only noticed used trigger on db logic.</w:t>
       </w:r>
     </w:p>
     <w:p>
@@ -5327,80 +3944,16 @@
     <w:p/>
     <w:p>
       <w:r>
-        <w:t xml:space="preserve">Now rating is added but for cancellation we </w:t>
-      </w:r>
-      <w:proofErr w:type="gramStart"/>
-      <w:r>
-        <w:t>have to</w:t>
-      </w:r>
-      <w:proofErr w:type="gramEnd"/>
-      <w:r>
-        <w:t xml:space="preserve"> take care of rating too if driver or supplier cancels it rating falls by 0</w:t>
-      </w:r>
-      <w:r>
-        <w:t xml:space="preserve">.2 for supplier side rating drop will happen if the status was accepted or </w:t>
-      </w:r>
-      <w:proofErr w:type="spellStart"/>
-      <w:r>
-        <w:t>ride_</w:t>
-      </w:r>
-      <w:proofErr w:type="gramStart"/>
-      <w:r>
-        <w:t>started</w:t>
-      </w:r>
-      <w:proofErr w:type="spellEnd"/>
-      <w:r>
-        <w:t xml:space="preserve">  same</w:t>
-      </w:r>
-      <w:proofErr w:type="gramEnd"/>
-      <w:r>
-        <w:t xml:space="preserve"> for </w:t>
-      </w:r>
-      <w:proofErr w:type="gramStart"/>
-      <w:r>
-        <w:t>driver .</w:t>
-      </w:r>
-      <w:proofErr w:type="gramEnd"/>
-      <w:r>
-        <w:t xml:space="preserve"> if customer does it at the accepted or </w:t>
-      </w:r>
-      <w:proofErr w:type="spellStart"/>
-      <w:r>
-        <w:t>ride_started</w:t>
-      </w:r>
-      <w:proofErr w:type="spellEnd"/>
-      <w:r>
-        <w:t xml:space="preserve"> stage then no rating will be updated but reason will be logged in rating table if customer or supplier does it at any stage before accepted then no problem</w:t>
+        <w:t>Now rating is added but for cancellation we have to take care of rating too if driver or supplier cancels it rating falls by 0</w:t>
+      </w:r>
+      <w:r>
+        <w:t>.2 for supplier side rating drop will happen if the status was accepted or ride_started  same for driver . if customer does it at the accepted or ride_started stage then no rating will be updated but reason will be logged in rating table if customer or supplier does it at any stage before accepted then no problem</w:t>
       </w:r>
     </w:p>
     <w:p/>
     <w:p>
       <w:r>
-        <w:t xml:space="preserve">Ok first, if any party </w:t>
-      </w:r>
-      <w:proofErr w:type="gramStart"/>
-      <w:r>
-        <w:t>cancelled  on</w:t>
-      </w:r>
-      <w:proofErr w:type="gramEnd"/>
-      <w:r>
-        <w:t xml:space="preserve"> status that was not accepted or ride started then </w:t>
-      </w:r>
-      <w:proofErr w:type="spellStart"/>
-      <w:r>
-        <w:t>dont</w:t>
-      </w:r>
-      <w:proofErr w:type="spellEnd"/>
-      <w:r>
-        <w:t xml:space="preserve"> log it into </w:t>
-      </w:r>
-      <w:proofErr w:type="spellStart"/>
-      <w:r>
-        <w:t>oder</w:t>
-      </w:r>
-      <w:proofErr w:type="spellEnd"/>
-      <w:r>
-        <w:t xml:space="preserve"> history</w:t>
+        <w:t>Ok first, if any party cancelled  on status that was not accepted or ride started then dont log it into oder history</w:t>
       </w:r>
     </w:p>
     <w:p>
@@ -5410,40 +3963,19 @@
     </w:p>
     <w:p>
       <w:r>
-        <w:t xml:space="preserve">If rider or </w:t>
-      </w:r>
-      <w:proofErr w:type="gramStart"/>
-      <w:r>
-        <w:t>supplier</w:t>
-      </w:r>
-      <w:proofErr w:type="gramEnd"/>
-      <w:r>
-        <w:t xml:space="preserve"> does it, log the reason into ratings table, rating of supplier affected</w:t>
+        <w:t>If rider or supplier does it, log the reason into ratings table, rating of supplier affected</w:t>
       </w:r>
     </w:p>
     <w:p/>
     <w:p/>
     <w:p>
       <w:r>
-        <w:t xml:space="preserve">View past orders list has implemented in </w:t>
-      </w:r>
-      <w:proofErr w:type="spellStart"/>
-      <w:r>
-        <w:t>schema.sql</w:t>
-      </w:r>
-      <w:proofErr w:type="spellEnd"/>
-      <w:r>
-        <w:t xml:space="preserve"> as it is same for all </w:t>
-      </w:r>
-    </w:p>
-    <w:p>
-      <w:proofErr w:type="spellStart"/>
-      <w:r>
-        <w:t>Seperate</w:t>
-      </w:r>
-      <w:proofErr w:type="spellEnd"/>
-      <w:r>
-        <w:t xml:space="preserve"> implementations of view past order details is done due to fetching different data </w:t>
+        <w:t xml:space="preserve">View past orders list has implemented in schema.sql as it is same for all </w:t>
+      </w:r>
+    </w:p>
+    <w:p>
+      <w:r>
+        <w:t xml:space="preserve">Seperate implementations of view past order details is done due to fetching different data </w:t>
       </w:r>
       <w:r>
         <w:t xml:space="preserve">for each user </w:t>
@@ -5463,15 +3995,7 @@
     </w:p>
     <w:p>
       <w:r>
-        <w:t xml:space="preserve">Have made the basic version with middleware and the basic </w:t>
-      </w:r>
-      <w:proofErr w:type="spellStart"/>
-      <w:r>
-        <w:t>apis</w:t>
-      </w:r>
-      <w:proofErr w:type="spellEnd"/>
-      <w:r>
-        <w:t xml:space="preserve"> set up.</w:t>
+        <w:t>Have made the basic version with middleware and the basic apis set up.</w:t>
       </w:r>
     </w:p>
     <w:p>
@@ -5527,47 +4051,7 @@
     <w:p/>
     <w:p>
       <w:r>
-        <w:t xml:space="preserve">I implemented a strict role-lock in the database profile functions so users can set role details only </w:t>
-      </w:r>
-      <w:proofErr w:type="gramStart"/>
-      <w:r>
-        <w:t>once, and</w:t>
-      </w:r>
-      <w:proofErr w:type="gramEnd"/>
-      <w:r>
-        <w:t xml:space="preserve"> never change or update role details afterward. I updated the role check in `</w:t>
-      </w:r>
-      <w:proofErr w:type="spellStart"/>
-      <w:r>
-        <w:t>enter_details_customer</w:t>
-      </w:r>
-      <w:proofErr w:type="spellEnd"/>
-      <w:r>
-        <w:t>`, `</w:t>
-      </w:r>
-      <w:proofErr w:type="spellStart"/>
-      <w:r>
-        <w:t>enter_details_driver</w:t>
-      </w:r>
-      <w:proofErr w:type="spellEnd"/>
-      <w:r>
-        <w:t>`, and `</w:t>
-      </w:r>
-      <w:proofErr w:type="spellStart"/>
-      <w:r>
-        <w:t>enter_details_supplier</w:t>
-      </w:r>
-      <w:proofErr w:type="spellEnd"/>
-      <w:r>
-        <w:t>` to reject when the current role is not `undefined</w:t>
-      </w:r>
-      <w:proofErr w:type="gramStart"/>
-      <w:r>
-        <w:t>`, and</w:t>
-      </w:r>
-      <w:proofErr w:type="gramEnd"/>
-      <w:r>
-        <w:t xml:space="preserve"> standardized the rejection message to: "Role already assigned. Details update is not allowed." I did this </w:t>
+        <w:t xml:space="preserve">I implemented a strict role-lock in the database profile functions so users can set role details only once, and never change or update role details afterward. I updated the role check in `enter_details_customer`, `enter_details_driver`, and `enter_details_supplier` to reject when the current role is not `undefined`, and standardized the rejection message to: "Role already assigned. Details update is not allowed." I did this </w:t>
       </w:r>
       <w:r>
         <w:t>to ensure</w:t>
@@ -5632,13 +4116,8 @@
     <w:p/>
     <w:p/>
     <w:p>
-      <w:proofErr w:type="gramStart"/>
-      <w:r>
-        <w:t>Lastly ,</w:t>
-      </w:r>
-      <w:proofErr w:type="gramEnd"/>
-      <w:r>
-        <w:t xml:space="preserve"> now on driver onboarding, if he exists in the supplier driver table then allow him in.</w:t>
+      <w:r>
+        <w:t>Lastly , now on driver onboarding, if he exists in the supplier driver table then allow him in.</w:t>
       </w:r>
     </w:p>
     <w:p>
@@ -5649,15 +4128,7 @@
     <w:p/>
     <w:p>
       <w:r>
-        <w:t xml:space="preserve">Rigorous code testing with tweaks done. The authentication and onboarding logic </w:t>
-      </w:r>
-      <w:proofErr w:type="gramStart"/>
-      <w:r>
-        <w:t>is</w:t>
-      </w:r>
-      <w:proofErr w:type="gramEnd"/>
-      <w:r>
-        <w:t xml:space="preserve"> done and tested.</w:t>
+        <w:t>Rigorous code testing with tweaks done. The authentication and onboarding logic is done and tested.</w:t>
       </w:r>
     </w:p>
     <w:p>
@@ -5723,99 +4194,19 @@
     <w:p/>
     <w:p>
       <w:r>
-        <w:t xml:space="preserve">I enforced supplier bidding eligibility. Supplier can view marketplace list and </w:t>
-      </w:r>
-      <w:proofErr w:type="gramStart"/>
-      <w:r>
-        <w:t>details, but</w:t>
-      </w:r>
-      <w:proofErr w:type="gramEnd"/>
-      <w:r>
-        <w:t xml:space="preserve"> cannot bid unless they have at least one linked and currently available driver. This is enforced in backend and in </w:t>
-      </w:r>
-      <w:proofErr w:type="spellStart"/>
-      <w:r>
-        <w:t>send_bid</w:t>
-      </w:r>
-      <w:proofErr w:type="spellEnd"/>
-      <w:r>
-        <w:t xml:space="preserve"> DB function.</w:t>
+        <w:t>I enforced supplier bidding eligibility. Supplier can view marketplace list and details, but cannot bid unless they have at least one linked and currently available driver. This is enforced in backend and in send_bid DB function.</w:t>
       </w:r>
     </w:p>
     <w:p/>
     <w:p>
       <w:r>
-        <w:t xml:space="preserve">I made the marketplace list </w:t>
-      </w:r>
-      <w:proofErr w:type="gramStart"/>
-      <w:r>
-        <w:t>privacy-safe</w:t>
-      </w:r>
-      <w:proofErr w:type="gramEnd"/>
-      <w:r>
-        <w:t xml:space="preserve">. Supplier available orders now return only </w:t>
-      </w:r>
-      <w:proofErr w:type="spellStart"/>
-      <w:r>
-        <w:t>order_id</w:t>
-      </w:r>
-      <w:proofErr w:type="spellEnd"/>
-      <w:r>
-        <w:t xml:space="preserve">, </w:t>
-      </w:r>
-      <w:proofErr w:type="spellStart"/>
-      <w:r>
-        <w:t>requested_capacity</w:t>
-      </w:r>
-      <w:proofErr w:type="spellEnd"/>
-      <w:r>
-        <w:t xml:space="preserve">, and </w:t>
-      </w:r>
-      <w:proofErr w:type="spellStart"/>
-      <w:r>
-        <w:t>customer_bid_price</w:t>
-      </w:r>
-      <w:proofErr w:type="spellEnd"/>
-      <w:r>
-        <w:t xml:space="preserve">. Full details including customer name and delivery location are returned only to bid-eligible suppliers, implemented in </w:t>
-      </w:r>
-      <w:proofErr w:type="spellStart"/>
-      <w:r>
-        <w:t>view_order_details</w:t>
-      </w:r>
-      <w:proofErr w:type="spellEnd"/>
-      <w:r>
-        <w:t xml:space="preserve"> with </w:t>
-      </w:r>
-      <w:proofErr w:type="spellStart"/>
-      <w:r>
-        <w:t>supplier_id</w:t>
-      </w:r>
-      <w:proofErr w:type="spellEnd"/>
-      <w:r>
-        <w:t xml:space="preserve"> check.</w:t>
+        <w:t>I made the marketplace list privacy-safe. Supplier available orders now return only order_id, requested_capacity, and customer_bid_price. Full details including customer name and delivery location are returned only to bid-eligible suppliers, implemented in view_order_details with supplier_id check.</w:t>
       </w:r>
     </w:p>
     <w:p/>
     <w:p>
       <w:r>
-        <w:t xml:space="preserve">Also implemented supplier bid cooldown and expiry window of 90 seconds in </w:t>
-      </w:r>
-      <w:proofErr w:type="spellStart"/>
-      <w:r>
-        <w:t>send_bid</w:t>
-      </w:r>
-      <w:proofErr w:type="spellEnd"/>
-      <w:r>
-        <w:t xml:space="preserve">. Customer bid visibility and acceptance use the same 90-second window, enforced in </w:t>
-      </w:r>
-      <w:proofErr w:type="spellStart"/>
-      <w:r>
-        <w:t>customer.sql</w:t>
-      </w:r>
-      <w:proofErr w:type="spellEnd"/>
-      <w:r>
-        <w:t>.</w:t>
+        <w:t>Also implemented supplier bid cooldown and expiry window of 90 seconds in send_bid. Customer bid visibility and acceptance use the same 90-second window, enforced in customer.sql.</w:t>
       </w:r>
     </w:p>
     <w:p>
@@ -5829,15 +4220,7 @@
       </w:r>
       <w:r>
         <w:br/>
-        <w:t xml:space="preserve">So </w:t>
-      </w:r>
-      <w:proofErr w:type="gramStart"/>
-      <w:r>
-        <w:t>far</w:t>
-      </w:r>
-      <w:proofErr w:type="gramEnd"/>
-      <w:r>
-        <w:t xml:space="preserve"> they are working</w:t>
+        <w:t>So far they are working</w:t>
       </w:r>
     </w:p>
     <w:p>
@@ -5857,13 +4240,8 @@
       </w:r>
     </w:p>
     <w:p>
-      <w:proofErr w:type="spellStart"/>
-      <w:r>
-        <w:t>Implennted</w:t>
-      </w:r>
-      <w:proofErr w:type="spellEnd"/>
-      <w:r>
-        <w:t xml:space="preserve"> supplier assignment and driver accepting/rejecting order all in their own time limits</w:t>
+      <w:r>
+        <w:t>Implennted supplier assignment and driver accepting/rejecting order all in their own time limits</w:t>
       </w:r>
     </w:p>
     <w:p>
@@ -5875,28 +4253,12 @@
     <w:p>
       <w:r>
         <w:lastRenderedPageBreak/>
-        <w:t xml:space="preserve">Hardened timeout </w:t>
-      </w:r>
-      <w:proofErr w:type="spellStart"/>
-      <w:r>
-        <w:t>behavior</w:t>
-      </w:r>
-      <w:proofErr w:type="spellEnd"/>
-      <w:r>
-        <w:t xml:space="preserve"> across the full flow because I discovered inconsistent edge cases during testing. Added supplier time limit visibility in the supplier order details response so the expiry was explicit. I enforced that once the supplier timer expires, the supplier can no longer view assignable drivers, cannot assign a driver, and cannot access the expired order as an active order.</w:t>
-      </w:r>
-    </w:p>
-    <w:p>
-      <w:r>
-        <w:t xml:space="preserve">Fixed the active-orders listing </w:t>
-      </w:r>
-      <w:proofErr w:type="spellStart"/>
-      <w:r>
-        <w:t>behavior</w:t>
-      </w:r>
-      <w:proofErr w:type="spellEnd"/>
-      <w:r>
-        <w:t xml:space="preserve"> so expired supplier-timer orders no longer appear there. </w:t>
+        <w:t>Hardened timeout behavior across the full flow because I discovered inconsistent edge cases during testing. Added supplier time limit visibility in the supplier order details response so the expiry was explicit. I enforced that once the supplier timer expires, the supplier can no longer view assignable drivers, cannot assign a driver, and cannot access the expired order as an active order.</w:t>
+      </w:r>
+    </w:p>
+    <w:p>
+      <w:r>
+        <w:t xml:space="preserve">Fixed the active-orders listing behavior so expired supplier-timer orders no longer appear there. </w:t>
       </w:r>
     </w:p>
     <w:p>
@@ -5912,23 +4274,7 @@
     <w:p/>
     <w:p>
       <w:r>
-        <w:t xml:space="preserve">Added customer rating endpoints with both rating and skip functionality. When a customer rates an order, the supplier’s rating is updated with a weighted average based on all completed orders, and the order is archived in </w:t>
-      </w:r>
-      <w:proofErr w:type="spellStart"/>
-      <w:r>
-        <w:t>order_history</w:t>
-      </w:r>
-      <w:proofErr w:type="spellEnd"/>
-      <w:r>
-        <w:t xml:space="preserve"> with the rating snapshot. When a customer skips rating, only the total orders count is </w:t>
-      </w:r>
-      <w:proofErr w:type="gramStart"/>
-      <w:r>
-        <w:t>incremented</w:t>
-      </w:r>
-      <w:proofErr w:type="gramEnd"/>
-      <w:r>
-        <w:t xml:space="preserve"> and the order is archived without a rating. </w:t>
+        <w:t xml:space="preserve">Added customer rating endpoints with both rating and skip functionality. When a customer rates an order, the supplier’s rating is updated with a weighted average based on all completed orders, and the order is archived in order_history with the rating snapshot. When a customer skips rating, only the total orders count is incremented and the order is archived without a rating. </w:t>
       </w:r>
     </w:p>
     <w:p>
@@ -5960,26 +4306,13 @@
       </w:r>
     </w:p>
     <w:p>
-      <w:proofErr w:type="spellStart"/>
-      <w:r>
-        <w:t>Implemetned</w:t>
-      </w:r>
-      <w:proofErr w:type="spellEnd"/>
-      <w:r>
-        <w:t xml:space="preserve"> logout and deletion of each role</w:t>
-      </w:r>
-    </w:p>
-    <w:p>
-      <w:r>
-        <w:t xml:space="preserve">Testing is all that is left now... if I </w:t>
-      </w:r>
-      <w:proofErr w:type="spellStart"/>
-      <w:r>
-        <w:t>dont</w:t>
-      </w:r>
-      <w:proofErr w:type="spellEnd"/>
-      <w:r>
-        <w:t xml:space="preserve"> think of any more stuff to add.</w:t>
+      <w:r>
+        <w:t>Implemetned logout and deletion of each role</w:t>
+      </w:r>
+    </w:p>
+    <w:p>
+      <w:r>
+        <w:t>Testing is all that is left now... if I dont think of any more stuff to add.</w:t>
       </w:r>
       <w:r>
         <w:br/>
@@ -6004,14 +4337,7 @@
       </w:r>
       <w:r>
         <w:br/>
-      </w:r>
-      <w:proofErr w:type="spellStart"/>
-      <w:r>
-        <w:t>eg</w:t>
-      </w:r>
-      <w:proofErr w:type="spellEnd"/>
-      <w:r>
-        <w:t xml:space="preserve"> recently added supplier id to order history as to prevent no access of supplier’s info when a driver deletes his account when he has had an order on finished state and the customer hasn’t rated it.</w:t>
+        <w:t>eg recently added supplier id to order history as to prevent no access of supplier’s info when a driver deletes his account when he has had an order on finished state and the customer hasn’t rated it.</w:t>
       </w:r>
       <w:r>
         <w:br/>
@@ -6058,11 +4384,6 @@
       </w:r>
     </w:p>
     <w:p>
-      <w:pPr>
-        <w:rPr>
-          <w:lang w:val="en-PK"/>
-        </w:rPr>
-      </w:pPr>
       <w:r>
         <w:t>And boy is it hard.</w:t>
       </w:r>
@@ -6076,7 +4397,6 @@
         <w:rPr>
           <w:b/>
           <w:bCs/>
-          <w:lang w:val="en-PK"/>
         </w:rPr>
         <w:t>Summary / Quick Rule of Thumb:</w:t>
       </w:r>
@@ -6087,21 +4407,14 @@
           <w:ilvl w:val="0"/>
           <w:numId w:val="22"/>
         </w:numPr>
-        <w:rPr>
-          <w:lang w:val="en-PK"/>
-        </w:rPr>
-      </w:pPr>
-      <w:r>
-        <w:rPr>
-          <w:lang w:val="en-PK"/>
-        </w:rPr>
+      </w:pPr>
+      <w:r>
         <w:t>Is it a full page? -&gt; </w:t>
       </w:r>
       <w:r>
         <w:rPr>
           <w:b/>
           <w:bCs/>
-          <w:lang w:val="en-PK"/>
         </w:rPr>
         <w:t>screens/</w:t>
       </w:r>
@@ -6112,21 +4425,14 @@
           <w:ilvl w:val="0"/>
           <w:numId w:val="22"/>
         </w:numPr>
-        <w:rPr>
-          <w:lang w:val="en-PK"/>
-        </w:rPr>
-      </w:pPr>
-      <w:r>
-        <w:rPr>
-          <w:lang w:val="en-PK"/>
-        </w:rPr>
+      </w:pPr>
+      <w:r>
         <w:t>Is it a small reusable UI piece? -&gt; </w:t>
       </w:r>
       <w:r>
         <w:rPr>
           <w:b/>
           <w:bCs/>
-          <w:lang w:val="en-PK"/>
         </w:rPr>
         <w:t>components/</w:t>
       </w:r>
@@ -6137,33 +4443,16 @@
           <w:ilvl w:val="0"/>
           <w:numId w:val="22"/>
         </w:numPr>
-        <w:rPr>
-          <w:lang w:val="en-PK"/>
-        </w:rPr>
-      </w:pPr>
-      <w:r>
-        <w:rPr>
-          <w:lang w:val="en-PK"/>
-        </w:rPr>
+      </w:pPr>
+      <w:r>
         <w:t>Is it an internet request to your server? -&gt; </w:t>
       </w:r>
-      <w:proofErr w:type="spellStart"/>
-      <w:r>
-        <w:rPr>
-          <w:b/>
-          <w:bCs/>
-          <w:lang w:val="en-PK"/>
-        </w:rPr>
-        <w:t>api</w:t>
-      </w:r>
-      <w:proofErr w:type="spellEnd"/>
-      <w:r>
-        <w:rPr>
-          <w:b/>
-          <w:bCs/>
-          <w:lang w:val="en-PK"/>
-        </w:rPr>
-        <w:t>/</w:t>
+      <w:r>
+        <w:rPr>
+          <w:b/>
+          <w:bCs/>
+        </w:rPr>
+        <w:t>api/</w:t>
       </w:r>
     </w:p>
     <w:p>
@@ -6172,21 +4461,14 @@
           <w:ilvl w:val="0"/>
           <w:numId w:val="22"/>
         </w:numPr>
-        <w:rPr>
-          <w:lang w:val="en-PK"/>
-        </w:rPr>
-      </w:pPr>
-      <w:r>
-        <w:rPr>
-          <w:lang w:val="en-PK"/>
-        </w:rPr>
+      </w:pPr>
+      <w:r>
         <w:t>Is it data that the whole app needs to share? -&gt; </w:t>
       </w:r>
       <w:r>
         <w:rPr>
           <w:b/>
           <w:bCs/>
-          <w:lang w:val="en-PK"/>
         </w:rPr>
         <w:t>state</w:t>
       </w:r>
@@ -6196,72 +4478,67 @@
         <w:rPr>
           <w:b/>
           <w:bCs/>
-          <w:lang w:val="en-PK"/>
-        </w:rPr>
-      </w:pPr>
-    </w:p>
-    <w:p>
-      <w:pPr>
-        <w:rPr>
-          <w:b/>
-          <w:bCs/>
-          <w:lang w:val="en-PK"/>
-        </w:rPr>
-      </w:pPr>
-      <w:r>
-        <w:rPr>
-          <w:b/>
-          <w:bCs/>
-          <w:lang w:val="en-PK"/>
+        </w:rPr>
+      </w:pPr>
+    </w:p>
+    <w:p>
+      <w:pPr>
+        <w:rPr>
+          <w:b/>
+          <w:bCs/>
+        </w:rPr>
+      </w:pPr>
+      <w:r>
+        <w:rPr>
+          <w:b/>
+          <w:bCs/>
         </w:rPr>
         <w:t>Database change:</w:t>
       </w:r>
     </w:p>
     <w:p>
-      <w:pPr>
-        <w:rPr>
-          <w:lang w:val="en-PK"/>
-        </w:rPr>
-      </w:pPr>
-      <w:r>
-        <w:rPr>
-          <w:lang w:val="en-PK"/>
-        </w:rPr>
+      <w:r>
         <w:t>Supplier adds driver to roster -&gt; available = FALSE</w:t>
       </w:r>
     </w:p>
     <w:p>
-      <w:pPr>
-        <w:rPr>
-          <w:lang w:val="en-PK"/>
-        </w:rPr>
-      </w:pPr>
-      <w:r>
-        <w:rPr>
-          <w:lang w:val="en-PK"/>
-        </w:rPr>
+      <w:r>
         <w:t>Driver signs up for the first time and enters their name -&gt; available = TRUE</w:t>
       </w:r>
     </w:p>
     <w:p>
-      <w:pPr>
-        <w:rPr>
-          <w:lang w:val="en-PK"/>
-        </w:rPr>
-      </w:pPr>
-      <w:r>
-        <w:rPr>
-          <w:lang w:val="en-PK"/>
-        </w:rPr>
+      <w:r>
         <w:t>Driver logs out and logs back in later -&gt; available = TRUE</w:t>
       </w:r>
     </w:p>
-    <w:p>
-      <w:pPr>
-        <w:rPr>
-          <w:lang w:val="en-PK"/>
-        </w:rPr>
-      </w:pPr>
+    <w:p/>
+    <w:p/>
+    <w:p/>
+    <w:p>
+      <w:r>
+        <w:t>08/04/2026:</w:t>
+      </w:r>
+    </w:p>
+    <w:p>
+      <w:r>
+        <w:t>Client.js : a general fn for sending request to backend. Defines the basic structure of a query with all the relevant checks etc</w:t>
+      </w:r>
+    </w:p>
+    <w:p>
+      <w:r>
+        <w:t xml:space="preserve">authApi.js : Fn that actually has the json query </w:t>
+      </w:r>
+      <w:r>
+        <w:t>of each fn that is being called from frontend.</w:t>
+      </w:r>
+    </w:p>
+    <w:p>
+      <w:r>
+        <w:t>Uses the client.js for the response structure.</w:t>
+      </w:r>
+      <w:r>
+        <w:br/>
+      </w:r>
     </w:p>
     <w:sectPr>
       <w:pgSz w:w="11906" w:h="16838"/>
@@ -10061,6 +8338,7 @@
   <w:style w:type="character" w:default="1" w:styleId="DefaultParagraphFont">
     <w:name w:val="Default Paragraph Font"/>
     <w:uiPriority w:val="1"/>
+    <w:semiHidden/>
     <w:unhideWhenUsed/>
   </w:style>
   <w:style w:type="table" w:default="1" w:styleId="TableNormal">

</xml_diff>

<commit_message>
Completed dashboard of all roles, including open order lifecycle, bidding and accepting order
</commit_message>
<xml_diff>
--- a/documents/code logic.docx
+++ b/documents/code logic.docx
@@ -4536,8 +4536,244 @@
       <w:r>
         <w:t>Uses the client.js for the response structure.</w:t>
       </w:r>
+    </w:p>
+    <w:p/>
+    <w:p/>
+    <w:p>
+      <w:r>
+        <w:t>13/04/2026:</w:t>
+      </w:r>
+    </w:p>
+    <w:p>
+      <w:r>
+        <w:t>Broke the code down to bear bone to only focus on functionality</w:t>
+      </w:r>
+    </w:p>
+    <w:p>
+      <w:r>
+        <w:t>Customer flow is working till order creation and cancellation</w:t>
+      </w:r>
+    </w:p>
+    <w:p>
+      <w:r>
+        <w:t>Now working on supplier side.</w:t>
+      </w:r>
+    </w:p>
+    <w:p/>
+    <w:p>
+      <w:r>
+        <w:t>useState is simply used to change or update the value of a variable which triggers a re render</w:t>
+      </w:r>
+    </w:p>
+    <w:p/>
+    <w:p/>
+    <w:p>
+      <w:r>
+        <w:t xml:space="preserve">useEffect is used to do something when a component re renders or a </w:t>
+      </w:r>
+      <w:proofErr w:type="gramStart"/>
+      <w:r>
+        <w:t>specific value changes</w:t>
+      </w:r>
+      <w:proofErr w:type="gramEnd"/>
       <w:r>
         <w:br/>
+      </w:r>
+    </w:p>
+    <w:p/>
+    <w:p>
+      <w:r>
+        <w:rPr>
+          <w:noProof/>
+        </w:rPr>
+        <w:drawing>
+          <wp:inline distT="0" distB="0" distL="0" distR="0" wp14:anchorId="75EDE710" wp14:editId="652BB77E">
+            <wp:extent cx="5731510" cy="1936750"/>
+            <wp:effectExtent l="0" t="0" r="2540" b="6350"/>
+            <wp:docPr id="291850252" name="Picture 1"/>
+            <wp:cNvGraphicFramePr>
+              <a:graphicFrameLocks xmlns:a="http://schemas.openxmlformats.org/drawingml/2006/main" noChangeAspect="1"/>
+            </wp:cNvGraphicFramePr>
+            <a:graphic xmlns:a="http://schemas.openxmlformats.org/drawingml/2006/main">
+              <a:graphicData uri="http://schemas.openxmlformats.org/drawingml/2006/picture">
+                <pic:pic xmlns:pic="http://schemas.openxmlformats.org/drawingml/2006/picture">
+                  <pic:nvPicPr>
+                    <pic:cNvPr id="291850252" name=""/>
+                    <pic:cNvPicPr/>
+                  </pic:nvPicPr>
+                  <pic:blipFill>
+                    <a:blip r:embed="rId5"/>
+                    <a:stretch>
+                      <a:fillRect/>
+                    </a:stretch>
+                  </pic:blipFill>
+                  <pic:spPr>
+                    <a:xfrm>
+                      <a:off x="0" y="0"/>
+                      <a:ext cx="5731510" cy="1936750"/>
+                    </a:xfrm>
+                    <a:prstGeom prst="rect">
+                      <a:avLst/>
+                    </a:prstGeom>
+                  </pic:spPr>
+                </pic:pic>
+              </a:graphicData>
+            </a:graphic>
+          </wp:inline>
+        </w:drawing>
+      </w:r>
+    </w:p>
+    <w:p/>
+    <w:p>
+      <w:r>
+        <w:rPr>
+          <w:noProof/>
+        </w:rPr>
+        <w:lastRenderedPageBreak/>
+        <w:drawing>
+          <wp:inline distT="0" distB="0" distL="0" distR="0" wp14:anchorId="1FD54843" wp14:editId="57A374BB">
+            <wp:extent cx="5731510" cy="3115945"/>
+            <wp:effectExtent l="0" t="0" r="2540" b="8255"/>
+            <wp:docPr id="1901494868" name="Picture 1"/>
+            <wp:cNvGraphicFramePr>
+              <a:graphicFrameLocks xmlns:a="http://schemas.openxmlformats.org/drawingml/2006/main" noChangeAspect="1"/>
+            </wp:cNvGraphicFramePr>
+            <a:graphic xmlns:a="http://schemas.openxmlformats.org/drawingml/2006/main">
+              <a:graphicData uri="http://schemas.openxmlformats.org/drawingml/2006/picture">
+                <pic:pic xmlns:pic="http://schemas.openxmlformats.org/drawingml/2006/picture">
+                  <pic:nvPicPr>
+                    <pic:cNvPr id="1901494868" name=""/>
+                    <pic:cNvPicPr/>
+                  </pic:nvPicPr>
+                  <pic:blipFill>
+                    <a:blip r:embed="rId6"/>
+                    <a:stretch>
+                      <a:fillRect/>
+                    </a:stretch>
+                  </pic:blipFill>
+                  <pic:spPr>
+                    <a:xfrm>
+                      <a:off x="0" y="0"/>
+                      <a:ext cx="5731510" cy="3115945"/>
+                    </a:xfrm>
+                    <a:prstGeom prst="rect">
+                      <a:avLst/>
+                    </a:prstGeom>
+                  </pic:spPr>
+                </pic:pic>
+              </a:graphicData>
+            </a:graphic>
+          </wp:inline>
+        </w:drawing>
+      </w:r>
+    </w:p>
+    <w:p/>
+    <w:p/>
+    <w:p>
+      <w:r>
+        <w:t>A</w:t>
+      </w:r>
+      <w:r>
+        <w:t xml:space="preserve">dded customer login cleanup </w:t>
+      </w:r>
+      <w:proofErr w:type="spellStart"/>
+      <w:r>
+        <w:t>behavior</w:t>
+      </w:r>
+      <w:proofErr w:type="spellEnd"/>
+      <w:r>
+        <w:t xml:space="preserve"> so on startup login and OTP login, customer open orders are </w:t>
+      </w:r>
+      <w:proofErr w:type="gramStart"/>
+      <w:r>
+        <w:t>auto-deleted</w:t>
+      </w:r>
+      <w:proofErr w:type="gramEnd"/>
+      <w:r>
+        <w:t>.</w:t>
+      </w:r>
+      <w:r>
+        <w:t xml:space="preserve"> </w:t>
+      </w:r>
+    </w:p>
+    <w:p>
+      <w:r>
+        <w:t xml:space="preserve">Updated </w:t>
+      </w:r>
+      <w:r>
+        <w:t xml:space="preserve">customer bid update rules by adding stricter conflict mapping that prevents lowering price, requires increase by at least 50, and increments of 50. </w:t>
+      </w:r>
+    </w:p>
+    <w:p>
+      <w:r>
+        <w:t xml:space="preserve">Added </w:t>
+      </w:r>
+      <w:r>
+        <w:t xml:space="preserve">customer-side bid marketplace APIs including wrappers for open-order fetch, list bids, update bid, accept bid, and reject bid. </w:t>
+      </w:r>
+    </w:p>
+    <w:p>
+      <w:proofErr w:type="spellStart"/>
+      <w:r>
+        <w:t>I</w:t>
+      </w:r>
+      <w:r>
+        <w:t>I</w:t>
+      </w:r>
+      <w:r>
+        <w:t>mplemented</w:t>
+      </w:r>
+      <w:proofErr w:type="spellEnd"/>
+      <w:r>
+        <w:t xml:space="preserve"> customer dashboard bid flow with polling for incoming bids every second, accept and reject actions, customer bid update action, countdown handling, and open-order hydration from backend.</w:t>
+      </w:r>
+    </w:p>
+    <w:p>
+      <w:r>
+        <w:t xml:space="preserve">I improved expired bid UI cleanup so expired bids are pruned from visible list immediately at zero seconds, not just disabled. </w:t>
+      </w:r>
+    </w:p>
+    <w:p>
+      <w:r>
+        <w:t>U</w:t>
+      </w:r>
+      <w:r>
+        <w:t xml:space="preserve">pdated SQL-side bid lifecycle rules including 15-second bid validity, added </w:t>
+      </w:r>
+      <w:proofErr w:type="spellStart"/>
+      <w:r>
+        <w:t>remaining_seconds</w:t>
+      </w:r>
+      <w:proofErr w:type="spellEnd"/>
+      <w:r>
+        <w:t xml:space="preserve"> in customer bid list response, customer bid increment rules, and clearing old supplier bids after customer price update. </w:t>
+      </w:r>
+    </w:p>
+    <w:p>
+      <w:r>
+        <w:t xml:space="preserve">Also </w:t>
+      </w:r>
+      <w:r>
+        <w:t xml:space="preserve">enforced supplier cooldown at runtime in backend controller by adding direct 15-second bid cooldown logic in controller path to avoid old DB-function </w:t>
+      </w:r>
+      <w:proofErr w:type="spellStart"/>
+      <w:r>
+        <w:t>behavior</w:t>
+      </w:r>
+      <w:proofErr w:type="spellEnd"/>
+      <w:r>
+        <w:t>.</w:t>
+      </w:r>
+    </w:p>
+    <w:p/>
+    <w:p>
+      <w:proofErr w:type="gramStart"/>
+      <w:r>
+        <w:t>So</w:t>
+      </w:r>
+      <w:proofErr w:type="gramEnd"/>
+      <w:r>
+        <w:t xml:space="preserve"> for now, the code is working correctly till supplier timer state.</w:t>
       </w:r>
     </w:p>
     <w:sectPr>

</xml_diff>

<commit_message>
Added: Supplier timer logic with driver assignment and UI updates
</commit_message>
<xml_diff>
--- a/documents/code logic.docx
+++ b/documents/code logic.docx
@@ -4569,13 +4569,8 @@
     <w:p/>
     <w:p>
       <w:r>
-        <w:t xml:space="preserve">useEffect is used to do something when a component re renders or a </w:t>
-      </w:r>
-      <w:proofErr w:type="gramStart"/>
-      <w:r>
-        <w:t>specific value changes</w:t>
-      </w:r>
-      <w:proofErr w:type="gramEnd"/>
+        <w:t>useEffect is used to do something when a component re renders or a specific value changes</w:t>
+      </w:r>
       <w:r>
         <w:br/>
       </w:r>
@@ -4674,23 +4669,7 @@
         <w:t>A</w:t>
       </w:r>
       <w:r>
-        <w:t xml:space="preserve">dded customer login cleanup </w:t>
-      </w:r>
-      <w:proofErr w:type="spellStart"/>
-      <w:r>
-        <w:t>behavior</w:t>
-      </w:r>
-      <w:proofErr w:type="spellEnd"/>
-      <w:r>
-        <w:t xml:space="preserve"> so on startup login and OTP login, customer open orders are </w:t>
-      </w:r>
-      <w:proofErr w:type="gramStart"/>
-      <w:r>
-        <w:t>auto-deleted</w:t>
-      </w:r>
-      <w:proofErr w:type="gramEnd"/>
-      <w:r>
-        <w:t>.</w:t>
+        <w:t>dded customer login cleanup behavior so on startup login and OTP login, customer open orders are auto-deleted.</w:t>
       </w:r>
       <w:r>
         <w:t xml:space="preserve"> </w:t>
@@ -4713,7 +4692,6 @@
       </w:r>
     </w:p>
     <w:p>
-      <w:proofErr w:type="spellStart"/>
       <w:r>
         <w:t>I</w:t>
       </w:r>
@@ -4721,11 +4699,7 @@
         <w:t>I</w:t>
       </w:r>
       <w:r>
-        <w:t>mplemented</w:t>
-      </w:r>
-      <w:proofErr w:type="spellEnd"/>
-      <w:r>
-        <w:t xml:space="preserve"> customer dashboard bid flow with polling for incoming bids every second, accept and reject actions, customer bid update action, countdown handling, and open-order hydration from backend.</w:t>
+        <w:t>mplemented customer dashboard bid flow with polling for incoming bids every second, accept and reject actions, customer bid update action, countdown handling, and open-order hydration from backend.</w:t>
       </w:r>
     </w:p>
     <w:p>
@@ -4738,15 +4712,7 @@
         <w:t>U</w:t>
       </w:r>
       <w:r>
-        <w:t xml:space="preserve">pdated SQL-side bid lifecycle rules including 15-second bid validity, added </w:t>
-      </w:r>
-      <w:proofErr w:type="spellStart"/>
-      <w:r>
-        <w:t>remaining_seconds</w:t>
-      </w:r>
-      <w:proofErr w:type="spellEnd"/>
-      <w:r>
-        <w:t xml:space="preserve"> in customer bid list response, customer bid increment rules, and clearing old supplier bids after customer price update. </w:t>
+        <w:t xml:space="preserve">pdated SQL-side bid lifecycle rules including 15-second bid validity, added remaining_seconds in customer bid list response, customer bid increment rules, and clearing old supplier bids after customer price update. </w:t>
       </w:r>
     </w:p>
     <w:p>
@@ -4754,26 +4720,167 @@
         <w:t xml:space="preserve">Also </w:t>
       </w:r>
       <w:r>
-        <w:t xml:space="preserve">enforced supplier cooldown at runtime in backend controller by adding direct 15-second bid cooldown logic in controller path to avoid old DB-function </w:t>
-      </w:r>
-      <w:proofErr w:type="spellStart"/>
-      <w:r>
-        <w:t>behavior</w:t>
-      </w:r>
-      <w:proofErr w:type="spellEnd"/>
-      <w:r>
-        <w:t>.</w:t>
-      </w:r>
-    </w:p>
-    <w:p/>
-    <w:p>
-      <w:proofErr w:type="gramStart"/>
-      <w:r>
-        <w:t>So</w:t>
-      </w:r>
-      <w:proofErr w:type="gramEnd"/>
-      <w:r>
-        <w:t xml:space="preserve"> for now, the code is working correctly till supplier timer state.</w:t>
+        <w:t>enforced supplier cooldown at runtime in backend controller by adding direct 15-second bid cooldown logic in controller path to avoid old DB-function behavior.</w:t>
+      </w:r>
+    </w:p>
+    <w:p/>
+    <w:p>
+      <w:r>
+        <w:t>So for now, the code is working correctly till supplier timer state.</w:t>
+      </w:r>
+    </w:p>
+    <w:p/>
+    <w:p/>
+    <w:p>
+      <w:r>
+        <w:t>14/04/2026:</w:t>
+      </w:r>
+    </w:p>
+    <w:p>
+      <w:r>
+        <w:t>UI timer maybe a little off but the actual timeout will be checked on database on specific fns like accept order, send a new bid, etc</w:t>
+      </w:r>
+    </w:p>
+    <w:p>
+      <w:r>
+        <w:t>So timer phase is working well.</w:t>
+      </w:r>
+    </w:p>
+    <w:p>
+      <w:r>
+        <w:t>Polling is working well. So far.</w:t>
+      </w:r>
+    </w:p>
+    <w:p>
+      <w:r>
+        <w:t>Need to check , whether the same order is shown on customer side on logout or direct closing application</w:t>
+      </w:r>
+    </w:p>
+    <w:p>
+      <w:r>
+        <w:t>Same on supplier side in active orders status.</w:t>
+      </w:r>
+    </w:p>
+    <w:p/>
+    <w:p/>
+    <w:p/>
+    <w:p>
+      <w:r>
+        <w:t>20/04/2026:</w:t>
+      </w:r>
+    </w:p>
+    <w:p>
+      <w:r>
+        <w:t>To start application in uni:</w:t>
+      </w:r>
+    </w:p>
+    <w:p>
+      <w:pPr>
+        <w:pStyle w:val="ListParagraph"/>
+        <w:numPr>
+          <w:ilvl w:val="1"/>
+          <w:numId w:val="6"/>
+        </w:numPr>
+      </w:pPr>
+      <w:r>
+        <w:t>Use direct pooler as hotspot supports ipv6</w:t>
+      </w:r>
+    </w:p>
+    <w:p>
+      <w:pPr>
+        <w:pStyle w:val="ListParagraph"/>
+        <w:numPr>
+          <w:ilvl w:val="1"/>
+          <w:numId w:val="6"/>
+        </w:numPr>
+      </w:pPr>
+      <w:r>
+        <w:t xml:space="preserve">Update the ip address </w:t>
+      </w:r>
+      <w:r>
+        <w:t>(ipconfig)</w:t>
+      </w:r>
+    </w:p>
+    <w:p/>
+    <w:p/>
+    <w:p>
+      <w:r>
+        <w:t>21/04/2026:</w:t>
+      </w:r>
+    </w:p>
+    <w:p>
+      <w:r>
+        <w:t>Added api fns for assigning drivers to orders , get assignable drivers, and cancel order</w:t>
+      </w:r>
+    </w:p>
+    <w:p>
+      <w:r>
+        <w:t>Auto navigation for supplier dashboard on login so that if he has an active order WHICH is on supplier timer then re-direct him to that page insated of live market</w:t>
+      </w:r>
+    </w:p>
+    <w:p>
+      <w:r>
+        <w:t>Same when the customer first accepts the order.</w:t>
+      </w:r>
+    </w:p>
+    <w:p>
+      <w:r>
+        <w:t>Basic order details are shown</w:t>
+      </w:r>
+    </w:p>
+    <w:p/>
+    <w:p>
+      <w:r>
+        <w:t>On driver side, currently he has to refresh to view new assigned orders to him. He can accept or reject that order after confirmation.</w:t>
+      </w:r>
+    </w:p>
+    <w:p>
+      <w:r>
+        <w:t>He has to do it in driver_timer = 60 seconds or the remaining supplier_timer (max : 5 minutes)</w:t>
+      </w:r>
+    </w:p>
+    <w:p>
+      <w:r>
+        <w:lastRenderedPageBreak/>
+        <w:t xml:space="preserve">The lesser of the two , when finished , will trgger order cancellation </w:t>
+      </w:r>
+    </w:p>
+    <w:p>
+      <w:r>
+        <w:t>Timer is shown on frontend</w:t>
+      </w:r>
+    </w:p>
+    <w:p/>
+    <w:p>
+      <w:r>
+        <w:t>The whole timer part is consistent and implemented in SQL only, not in JS.</w:t>
+      </w:r>
+    </w:p>
+    <w:p>
+      <w:r>
+        <w:t>Throughout the whole process, cancel order is available for customer and supplier.</w:t>
+      </w:r>
+    </w:p>
+    <w:p/>
+    <w:p>
+      <w:r>
+        <w:t>D</w:t>
+      </w:r>
+      <w:r>
+        <w:t xml:space="preserve">river availability is intentionally set to false in two places: when a driver accepts an order and when they explicitly log out. App close without logout leaves them available, which is intentional and matches Uber and Bykea behavior since there is no reliable way to detect app closure. </w:t>
+      </w:r>
+    </w:p>
+    <w:p>
+      <w:r>
+        <w:t>D</w:t>
+      </w:r>
+      <w:r>
+        <w:t xml:space="preserve">river who rejects an order gets `order_rejected = TRUE` in the driver assignment table, causing the supplier to see them as rejected and greyed out, while the `assign_driver_to_order` function blocks reassignment to the same order, though they can still be assigned to other orders. </w:t>
+      </w:r>
+    </w:p>
+    <w:p>
+      <w:r>
+        <w:t>Upon order acceptance, all the role’s UI are updated with order details.</w:t>
       </w:r>
     </w:p>
     <w:sectPr>
@@ -6596,7 +6703,7 @@
   <w:abstractNum w:abstractNumId="13" w15:restartNumberingAfterBreak="0">
     <w:nsid w:val="551D0A41"/>
     <w:multiLevelType w:val="multilevel"/>
-    <w:tmpl w:val="02CA478A"/>
+    <w:tmpl w:val="55749CFA"/>
     <w:lvl w:ilvl="0">
       <w:start w:val="1"/>
       <w:numFmt w:val="bullet"/>
@@ -6613,20 +6720,16 @@
         <w:sz w:val="20"/>
       </w:rPr>
     </w:lvl>
-    <w:lvl w:ilvl="1" w:tentative="1">
-      <w:start w:val="1"/>
-      <w:numFmt w:val="bullet"/>
-      <w:lvlText w:val="o"/>
-      <w:lvlJc w:val="left"/>
-      <w:pPr>
-        <w:tabs>
-          <w:tab w:val="num" w:pos="1440"/>
-        </w:tabs>
+    <w:lvl w:ilvl="1">
+      <w:start w:val="1"/>
+      <w:numFmt w:val="decimal"/>
+      <w:lvlText w:val="%2."/>
+      <w:lvlJc w:val="left"/>
+      <w:pPr>
         <w:ind w:left="1440" w:hanging="360"/>
       </w:pPr>
       <w:rPr>
-        <w:rFonts w:ascii="Courier New" w:hAnsi="Courier New" w:hint="default"/>
-        <w:sz w:val="20"/>
+        <w:rFonts w:hint="default"/>
       </w:rPr>
     </w:lvl>
     <w:lvl w:ilvl="2" w:tentative="1">

</xml_diff>

<commit_message>
feat: Complete order lifecycle with rating, bidding, and delivery flows
</commit_message>
<xml_diff>
--- a/documents/code logic.docx
+++ b/documents/code logic.docx
@@ -4864,23 +4864,88 @@
     <w:p/>
     <w:p>
       <w:r>
-        <w:t>D</w:t>
-      </w:r>
-      <w:r>
-        <w:t xml:space="preserve">river availability is intentionally set to false in two places: when a driver accepts an order and when they explicitly log out. App close without logout leaves them available, which is intentional and matches Uber and Bykea behavior since there is no reliable way to detect app closure. </w:t>
-      </w:r>
-    </w:p>
-    <w:p>
-      <w:r>
-        <w:t>D</w:t>
-      </w:r>
-      <w:r>
-        <w:t xml:space="preserve">river who rejects an order gets `order_rejected = TRUE` in the driver assignment table, causing the supplier to see them as rejected and greyed out, while the `assign_driver_to_order` function blocks reassignment to the same order, though they can still be assigned to other orders. </w:t>
+        <w:t xml:space="preserve">Driver availability is intentionally set to false in two places: when a driver accepts an order and when they explicitly log out. App close without logout leaves them available, which is intentional and matches Uber and Bykea behavior since there is no reliable way to detect app closure. </w:t>
+      </w:r>
+    </w:p>
+    <w:p>
+      <w:r>
+        <w:t xml:space="preserve">Driver who rejects an order gets `order_rejected = TRUE` in the driver assignment table, causing the supplier to see them as rejected and greyed out, while the `assign_driver_to_order` function blocks reassignment to the same order, though they can still be assigned to other orders. </w:t>
       </w:r>
     </w:p>
     <w:p>
       <w:r>
         <w:t>Upon order acceptance, all the role’s UI are updated with order details.</w:t>
+      </w:r>
+    </w:p>
+    <w:p/>
+    <w:p/>
+    <w:p/>
+    <w:p>
+      <w:r>
+        <w:t>25/04/2026:</w:t>
+      </w:r>
+    </w:p>
+    <w:p>
+      <w:r>
+        <w:t>Added customer history and rating feature set including API calls for GET customer history, GET customer history by order ID, and POST customer order rating. Updated customer history detail response in startupController.js to include order_id and customer_rating from order_history. Added full History tab, details screen, and rating UI in CustomerDashboard.js.</w:t>
+      </w:r>
+    </w:p>
+    <w:p>
+      <w:r>
+        <w:t>Added supplier view details before bidding feature including API call for GET supplier orders available by order ID. Added market detail flow in SupplierDashboard.js with view button opening full detail page, bid submission supported there, and 403 handling shown when supplier has no available linked drivers.</w:t>
+      </w:r>
+    </w:p>
+    <w:p>
+      <w:r>
+        <w:t>Added driver confirmation and completion UX including accept and reject confirmation alerts and driver completion receipt modal in DriverDashboard.js.</w:t>
+      </w:r>
+    </w:p>
+    <w:p/>
+    <w:p>
+      <w:r>
+        <w:t xml:space="preserve">Implemented area and district handling at order creation by adding Karachi area dropdown in CustomerDashboard.js and storing delivery_location as address comma </w:t>
+      </w:r>
+      <w:r>
+        <w:lastRenderedPageBreak/>
+        <w:t>area</w:t>
+      </w:r>
+      <w:r>
+        <w:t xml:space="preserve"> and also modified</w:t>
+      </w:r>
+      <w:r>
+        <w:t xml:space="preserve"> live market layout and area-only display by adding delivery_location to supplier market list SQL</w:t>
+      </w:r>
+      <w:r>
+        <w:t xml:space="preserve"> so that each card </w:t>
+      </w:r>
+      <w:r>
+        <w:t>show</w:t>
+      </w:r>
+      <w:r>
+        <w:t>ed</w:t>
+      </w:r>
+      <w:r>
+        <w:t xml:space="preserve"> area parsed from delivery_location instead of full address.</w:t>
+      </w:r>
+    </w:p>
+    <w:p/>
+    <w:p>
+      <w:r>
+        <w:t>Added rating prompt modal logic in CustomerDashboard.js that shows rating modal automatically, allows not now option dismissing for current app session only, and submits rating from modal.</w:t>
+      </w:r>
+    </w:p>
+    <w:p/>
+    <w:p>
+      <w:r>
+        <w:t>So far testing is working as well as the UI. Obviously more testing to do but can potentially say that the app is completed</w:t>
+      </w:r>
+      <w:r>
+        <w:t>.</w:t>
+      </w:r>
+    </w:p>
+    <w:p>
+      <w:r>
+        <w:t>I revert back, the frontend’s functionality is complete.</w:t>
       </w:r>
     </w:p>
     <w:sectPr>

</xml_diff>

<commit_message>
fix: Order completion, rating popup, driver history, supplier past orders
- Fixed customer not returning to create order screen after completion

- Fixed rating popup persisting after logout (not-now flag reset on session)

- Fixed driver past order details opening at bottom; now separate detail page

- Added past orders button and detail view for supplier dashboard

- Added polling on driver dashboard to auto-refresh and detect new assignments
</commit_message>
<xml_diff>
--- a/documents/code logic.docx
+++ b/documents/code logic.docx
@@ -3,12 +3,201 @@
 <w:document xmlns:wpc="http://schemas.microsoft.com/office/word/2010/wordprocessingCanvas" xmlns:cx="http://schemas.microsoft.com/office/drawing/2014/chartex" xmlns:cx1="http://schemas.microsoft.com/office/drawing/2015/9/8/chartex" xmlns:cx2="http://schemas.microsoft.com/office/drawing/2015/10/21/chartex" xmlns:cx3="http://schemas.microsoft.com/office/drawing/2016/5/9/chartex" xmlns:cx4="http://schemas.microsoft.com/office/drawing/2016/5/10/chartex" xmlns:cx5="http://schemas.microsoft.com/office/drawing/2016/5/11/chartex" xmlns:cx6="http://schemas.microsoft.com/office/drawing/2016/5/12/chartex" xmlns:cx7="http://schemas.microsoft.com/office/drawing/2016/5/13/chartex" xmlns:cx8="http://schemas.microsoft.com/office/drawing/2016/5/14/chartex" xmlns:mc="http://schemas.openxmlformats.org/markup-compatibility/2006" xmlns:aink="http://schemas.microsoft.com/office/drawing/2016/ink" xmlns:am3d="http://schemas.microsoft.com/office/drawing/2017/model3d" xmlns:o="urn:schemas-microsoft-com:office:office" xmlns:oel="http://schemas.microsoft.com/office/2019/extlst" xmlns:r="http://schemas.openxmlformats.org/officeDocument/2006/relationships" xmlns:m="http://schemas.openxmlformats.org/officeDocument/2006/math" xmlns:v="urn:schemas-microsoft-com:vml" xmlns:wp14="http://schemas.microsoft.com/office/word/2010/wordprocessingDrawing" xmlns:wp="http://schemas.openxmlformats.org/drawingml/2006/wordprocessingDrawing" xmlns:w10="urn:schemas-microsoft-com:office:word" xmlns:w="http://schemas.openxmlformats.org/wordprocessingml/2006/main" xmlns:w14="http://schemas.microsoft.com/office/word/2010/wordml" xmlns:w15="http://schemas.microsoft.com/office/word/2012/wordml" xmlns:w16cex="http://schemas.microsoft.com/office/word/2018/wordml/cex" xmlns:w16cid="http://schemas.microsoft.com/office/word/2016/wordml/cid" xmlns:w16="http://schemas.microsoft.com/office/word/2018/wordml" xmlns:w16du="http://schemas.microsoft.com/office/word/2023/wordml/word16du" xmlns:w16sdtdh="http://schemas.microsoft.com/office/word/2020/wordml/sdtdatahash" xmlns:w16sdtfl="http://schemas.microsoft.com/office/word/2024/wordml/sdtformatlock" xmlns:w16se="http://schemas.microsoft.com/office/word/2015/wordml/symex" xmlns:wpg="http://schemas.microsoft.com/office/word/2010/wordprocessingGroup" xmlns:wpi="http://schemas.microsoft.com/office/word/2010/wordprocessingInk" xmlns:wne="http://schemas.microsoft.com/office/word/2006/wordml" xmlns:wps="http://schemas.microsoft.com/office/word/2010/wordprocessingShape" mc:Ignorable="w14 w15 w16se w16cid w16 w16cex w16sdtdh w16sdtfl w16du wp14">
   <w:body>
     <w:p>
-      <w:r>
-        <w:t>oh so the easy way is to check local token if that exists then redirect to orders page if deosnt exist for this app then red diecet to phone numeb page whihc is same for reislateld suers and new users same opt verifaiton. then this numebr is chekced in database if exists then redirecet to orders (ie returing user after reinstall) . not exists then firs time user redirect to name entering</w:t>
+      <w:proofErr w:type="gramStart"/>
+      <w:r>
+        <w:t>oh</w:t>
+      </w:r>
+      <w:proofErr w:type="gramEnd"/>
+      <w:r>
+        <w:t xml:space="preserve"> so the easy way is to check local token if that exists then redirect to orders page if </w:t>
+      </w:r>
+      <w:proofErr w:type="spellStart"/>
+      <w:r>
+        <w:t>deosnt</w:t>
+      </w:r>
+      <w:proofErr w:type="spellEnd"/>
+      <w:r>
+        <w:t xml:space="preserve"> exist for this app then red </w:t>
+      </w:r>
+      <w:proofErr w:type="spellStart"/>
+      <w:r>
+        <w:t>diecet</w:t>
+      </w:r>
+      <w:proofErr w:type="spellEnd"/>
+      <w:r>
+        <w:t xml:space="preserve"> to phone </w:t>
+      </w:r>
+      <w:proofErr w:type="spellStart"/>
+      <w:r>
+        <w:t>numeb</w:t>
+      </w:r>
+      <w:proofErr w:type="spellEnd"/>
+      <w:r>
+        <w:t xml:space="preserve"> page </w:t>
+      </w:r>
+      <w:proofErr w:type="spellStart"/>
+      <w:r>
+        <w:t>whihc</w:t>
+      </w:r>
+      <w:proofErr w:type="spellEnd"/>
+      <w:r>
+        <w:t xml:space="preserve"> is same for </w:t>
+      </w:r>
+      <w:proofErr w:type="spellStart"/>
+      <w:r>
+        <w:t>reislateld</w:t>
+      </w:r>
+      <w:proofErr w:type="spellEnd"/>
+      <w:r>
+        <w:t xml:space="preserve"> suers and new users same opt </w:t>
+      </w:r>
+      <w:proofErr w:type="spellStart"/>
+      <w:r>
+        <w:t>verifaiton</w:t>
+      </w:r>
+      <w:proofErr w:type="spellEnd"/>
+      <w:r>
+        <w:t xml:space="preserve">. then this </w:t>
+      </w:r>
+      <w:proofErr w:type="spellStart"/>
+      <w:r>
+        <w:t>numebr</w:t>
+      </w:r>
+      <w:proofErr w:type="spellEnd"/>
+      <w:r>
+        <w:t xml:space="preserve"> is </w:t>
+      </w:r>
+      <w:proofErr w:type="spellStart"/>
+      <w:r>
+        <w:t>chekced</w:t>
+      </w:r>
+      <w:proofErr w:type="spellEnd"/>
+      <w:r>
+        <w:t xml:space="preserve"> in database if exists then </w:t>
+      </w:r>
+      <w:proofErr w:type="spellStart"/>
+      <w:r>
+        <w:t>redirecet</w:t>
+      </w:r>
+      <w:proofErr w:type="spellEnd"/>
+      <w:r>
+        <w:t xml:space="preserve"> to orders (</w:t>
+      </w:r>
+      <w:proofErr w:type="spellStart"/>
+      <w:r>
+        <w:t>ie</w:t>
+      </w:r>
+      <w:proofErr w:type="spellEnd"/>
+      <w:r>
+        <w:t xml:space="preserve"> </w:t>
+      </w:r>
+      <w:proofErr w:type="spellStart"/>
+      <w:r>
+        <w:t>returing</w:t>
+      </w:r>
+      <w:proofErr w:type="spellEnd"/>
+      <w:r>
+        <w:t xml:space="preserve"> user after </w:t>
+      </w:r>
+      <w:proofErr w:type="gramStart"/>
+      <w:r>
+        <w:t>reinstall) .</w:t>
+      </w:r>
+      <w:proofErr w:type="gramEnd"/>
+      <w:r>
+        <w:t xml:space="preserve"> not exists then firs time user redirect to name entering</w:t>
       </w:r>
       <w:r>
         <w:br/>
-        <w:t>but now two things where does local token be stored ? in db or what? seocndly does the local toekn also consits of user id ? because how will i know whihc user it is if i odnt ahve the user id</w:t>
+        <w:t xml:space="preserve">but now two things where does local token be </w:t>
+      </w:r>
+      <w:proofErr w:type="gramStart"/>
+      <w:r>
+        <w:t>stored ?</w:t>
+      </w:r>
+      <w:proofErr w:type="gramEnd"/>
+      <w:r>
+        <w:t xml:space="preserve"> in </w:t>
+      </w:r>
+      <w:proofErr w:type="spellStart"/>
+      <w:r>
+        <w:t>db</w:t>
+      </w:r>
+      <w:proofErr w:type="spellEnd"/>
+      <w:r>
+        <w:t xml:space="preserve"> or what? </w:t>
+      </w:r>
+      <w:proofErr w:type="spellStart"/>
+      <w:r>
+        <w:t>seocndly</w:t>
+      </w:r>
+      <w:proofErr w:type="spellEnd"/>
+      <w:r>
+        <w:t xml:space="preserve"> does the local </w:t>
+      </w:r>
+      <w:proofErr w:type="spellStart"/>
+      <w:r>
+        <w:t>toekn</w:t>
+      </w:r>
+      <w:proofErr w:type="spellEnd"/>
+      <w:r>
+        <w:t xml:space="preserve"> also </w:t>
+      </w:r>
+      <w:proofErr w:type="spellStart"/>
+      <w:r>
+        <w:t>consits</w:t>
+      </w:r>
+      <w:proofErr w:type="spellEnd"/>
+      <w:r>
+        <w:t xml:space="preserve"> of user </w:t>
+      </w:r>
+      <w:proofErr w:type="gramStart"/>
+      <w:r>
+        <w:t>id ?</w:t>
+      </w:r>
+      <w:proofErr w:type="gramEnd"/>
+      <w:r>
+        <w:t xml:space="preserve"> because how will </w:t>
+      </w:r>
+      <w:proofErr w:type="spellStart"/>
+      <w:r>
+        <w:t>i</w:t>
+      </w:r>
+      <w:proofErr w:type="spellEnd"/>
+      <w:r>
+        <w:t xml:space="preserve"> know </w:t>
+      </w:r>
+      <w:proofErr w:type="spellStart"/>
+      <w:r>
+        <w:t>whihc</w:t>
+      </w:r>
+      <w:proofErr w:type="spellEnd"/>
+      <w:r>
+        <w:t xml:space="preserve"> user it is if </w:t>
+      </w:r>
+      <w:proofErr w:type="spellStart"/>
+      <w:r>
+        <w:t>i</w:t>
+      </w:r>
+      <w:proofErr w:type="spellEnd"/>
+      <w:r>
+        <w:t xml:space="preserve"> </w:t>
+      </w:r>
+      <w:proofErr w:type="spellStart"/>
+      <w:r>
+        <w:t>odnt</w:t>
+      </w:r>
+      <w:proofErr w:type="spellEnd"/>
+      <w:r>
+        <w:t xml:space="preserve"> </w:t>
+      </w:r>
+      <w:proofErr w:type="spellStart"/>
+      <w:r>
+        <w:t>ahve</w:t>
+      </w:r>
+      <w:proofErr w:type="spellEnd"/>
+      <w:r>
+        <w:t xml:space="preserve"> the user id</w:t>
       </w:r>
     </w:p>
     <w:p/>
@@ -16,17 +205,67 @@
     <w:p/>
     <w:p>
       <w:r>
-        <w:t>Just check local token existence in the db . if  it exists then redirect to orders</w:t>
-      </w:r>
-    </w:p>
-    <w:p>
-      <w:r>
-        <w:t>If it doesn’t then make them enter phone numeb and verify otp</w:t>
-      </w:r>
-    </w:p>
-    <w:p>
-      <w:r>
-        <w:t>If phone number exists then reidriect to orders page</w:t>
+        <w:t xml:space="preserve">Just check local token existence in the </w:t>
+      </w:r>
+      <w:proofErr w:type="spellStart"/>
+      <w:proofErr w:type="gramStart"/>
+      <w:r>
+        <w:t>db</w:t>
+      </w:r>
+      <w:proofErr w:type="spellEnd"/>
+      <w:r>
+        <w:t xml:space="preserve"> .</w:t>
+      </w:r>
+      <w:proofErr w:type="gramEnd"/>
+      <w:r>
+        <w:t xml:space="preserve"> </w:t>
+      </w:r>
+      <w:proofErr w:type="gramStart"/>
+      <w:r>
+        <w:t>if  it</w:t>
+      </w:r>
+      <w:proofErr w:type="gramEnd"/>
+      <w:r>
+        <w:t xml:space="preserve"> exists then redirect to orders</w:t>
+      </w:r>
+    </w:p>
+    <w:p>
+      <w:r>
+        <w:t xml:space="preserve">If it doesn’t then make them enter phone </w:t>
+      </w:r>
+      <w:proofErr w:type="spellStart"/>
+      <w:r>
+        <w:t>numeb</w:t>
+      </w:r>
+      <w:proofErr w:type="spellEnd"/>
+      <w:r>
+        <w:t xml:space="preserve"> and verify </w:t>
+      </w:r>
+      <w:proofErr w:type="spellStart"/>
+      <w:r>
+        <w:t>otp</w:t>
+      </w:r>
+      <w:proofErr w:type="spellEnd"/>
+    </w:p>
+    <w:p>
+      <w:r>
+        <w:t xml:space="preserve">If phone number </w:t>
+      </w:r>
+      <w:proofErr w:type="gramStart"/>
+      <w:r>
+        <w:t>exists</w:t>
+      </w:r>
+      <w:proofErr w:type="gramEnd"/>
+      <w:r>
+        <w:t xml:space="preserve"> then </w:t>
+      </w:r>
+      <w:proofErr w:type="spellStart"/>
+      <w:r>
+        <w:t>reidriect</w:t>
+      </w:r>
+      <w:proofErr w:type="spellEnd"/>
+      <w:r>
+        <w:t xml:space="preserve"> to orders page</w:t>
       </w:r>
     </w:p>
     <w:p>
@@ -45,7 +284,15 @@
     </w:p>
     <w:p>
       <w:r>
-        <w:t xml:space="preserve">OTP will be generated and sent by backend to the email/sms and </w:t>
+        <w:t>OTP will be generated and sent by backend to the email/</w:t>
+      </w:r>
+      <w:proofErr w:type="spellStart"/>
+      <w:r>
+        <w:t>sms</w:t>
+      </w:r>
+      <w:proofErr w:type="spellEnd"/>
+      <w:r>
+        <w:t xml:space="preserve"> and </w:t>
       </w:r>
     </w:p>
     <w:p/>
@@ -72,45 +319,172 @@
     <w:p/>
     <w:p>
       <w:r>
-        <w:t>Phone number_exists fn:</w:t>
-      </w:r>
-    </w:p>
-    <w:p>
-      <w:r>
-        <w:t>Checks  if the entered number already exists in the users table if it does, then set the verified Boolean to false in the user_id table : the user already exists but has to undergo verification of phone number again</w:t>
+        <w:t xml:space="preserve">Phone </w:t>
+      </w:r>
+      <w:proofErr w:type="spellStart"/>
+      <w:r>
+        <w:t>number_exists</w:t>
+      </w:r>
+      <w:proofErr w:type="spellEnd"/>
+      <w:r>
+        <w:t xml:space="preserve"> fn:</w:t>
+      </w:r>
+    </w:p>
+    <w:p>
+      <w:proofErr w:type="gramStart"/>
+      <w:r>
+        <w:t>Checks  if</w:t>
+      </w:r>
+      <w:proofErr w:type="gramEnd"/>
+      <w:r>
+        <w:t xml:space="preserve"> the entered number already exists in the users table if it does, then set the verified Boolean to false in the </w:t>
+      </w:r>
+      <w:proofErr w:type="spellStart"/>
+      <w:r>
+        <w:t>user_id</w:t>
+      </w:r>
+      <w:proofErr w:type="spellEnd"/>
+      <w:r>
+        <w:t xml:space="preserve"> </w:t>
+      </w:r>
+      <w:proofErr w:type="gramStart"/>
+      <w:r>
+        <w:t>table :</w:t>
+      </w:r>
+      <w:proofErr w:type="gramEnd"/>
+      <w:r>
+        <w:t xml:space="preserve"> the user already exists but </w:t>
+      </w:r>
+      <w:proofErr w:type="gramStart"/>
+      <w:r>
+        <w:t>has to</w:t>
+      </w:r>
+      <w:proofErr w:type="gramEnd"/>
+      <w:r>
+        <w:t xml:space="preserve"> undergo verification of phone number again</w:t>
       </w:r>
     </w:p>
     <w:p>
       <w:r>
         <w:lastRenderedPageBreak/>
-        <w:t>Checks if the entered phone number exists in the pending users table, if it does then do nothing , if it doesn’t then insert the number (This will be done for existing users too that are getting back to the application as they are currently pending (unverified) users too</w:t>
+        <w:t xml:space="preserve">Checks if the entered phone number exists in the pending users table, if it does then do </w:t>
+      </w:r>
+      <w:proofErr w:type="gramStart"/>
+      <w:r>
+        <w:t>nothing ,</w:t>
+      </w:r>
+      <w:proofErr w:type="gramEnd"/>
+      <w:r>
+        <w:t xml:space="preserve"> if it doesn’t then insert the number (This will be done for existing users too that are getting back to the application as they are currently pending (unverified) users too</w:t>
       </w:r>
     </w:p>
     <w:p/>
     <w:p>
       <w:r>
-        <w:t>Store otp:</w:t>
-      </w:r>
-    </w:p>
-    <w:p>
-      <w:r>
-        <w:t xml:space="preserve">Stores otp in the pending users table </w:t>
-      </w:r>
-    </w:p>
-    <w:p>
-      <w:r>
-        <w:t>If the otp already exists then upates the otp (can be because the user exited during the process came again, or that he requested a new otp)</w:t>
+        <w:t xml:space="preserve">Store </w:t>
+      </w:r>
+      <w:proofErr w:type="spellStart"/>
+      <w:r>
+        <w:t>otp</w:t>
+      </w:r>
+      <w:proofErr w:type="spellEnd"/>
+      <w:r>
+        <w:t>:</w:t>
+      </w:r>
+    </w:p>
+    <w:p>
+      <w:r>
+        <w:t xml:space="preserve">Stores </w:t>
+      </w:r>
+      <w:proofErr w:type="spellStart"/>
+      <w:r>
+        <w:t>otp</w:t>
+      </w:r>
+      <w:proofErr w:type="spellEnd"/>
+      <w:r>
+        <w:t xml:space="preserve"> in the pending </w:t>
+      </w:r>
+      <w:proofErr w:type="gramStart"/>
+      <w:r>
+        <w:t>users</w:t>
+      </w:r>
+      <w:proofErr w:type="gramEnd"/>
+      <w:r>
+        <w:t xml:space="preserve"> table </w:t>
+      </w:r>
+    </w:p>
+    <w:p>
+      <w:r>
+        <w:t xml:space="preserve">If the </w:t>
+      </w:r>
+      <w:proofErr w:type="spellStart"/>
+      <w:r>
+        <w:t>otp</w:t>
+      </w:r>
+      <w:proofErr w:type="spellEnd"/>
+      <w:r>
+        <w:t xml:space="preserve"> already exists then </w:t>
+      </w:r>
+      <w:proofErr w:type="spellStart"/>
+      <w:r>
+        <w:t>upates</w:t>
+      </w:r>
+      <w:proofErr w:type="spellEnd"/>
+      <w:r>
+        <w:t xml:space="preserve"> the </w:t>
+      </w:r>
+      <w:proofErr w:type="spellStart"/>
+      <w:r>
+        <w:t>otp</w:t>
+      </w:r>
+      <w:proofErr w:type="spellEnd"/>
+      <w:r>
+        <w:t xml:space="preserve"> (can be because the user exited during the process came again, or that he requested a new </w:t>
+      </w:r>
+      <w:proofErr w:type="spellStart"/>
+      <w:r>
+        <w:t>otp</w:t>
+      </w:r>
+      <w:proofErr w:type="spellEnd"/>
+      <w:r>
+        <w:t>)</w:t>
       </w:r>
     </w:p>
     <w:p/>
     <w:p>
-      <w:r>
-        <w:t>Verify_otp_and_activate_users fn:</w:t>
-      </w:r>
-    </w:p>
-    <w:p>
-      <w:r>
-        <w:t xml:space="preserve">Checks the entered  otp against the stored otp </w:t>
+      <w:proofErr w:type="spellStart"/>
+      <w:r>
+        <w:t>Verify_otp_and_activate_users</w:t>
+      </w:r>
+      <w:proofErr w:type="spellEnd"/>
+      <w:r>
+        <w:t xml:space="preserve"> fn:</w:t>
+      </w:r>
+    </w:p>
+    <w:p>
+      <w:r>
+        <w:t xml:space="preserve">Checks the </w:t>
+      </w:r>
+      <w:proofErr w:type="gramStart"/>
+      <w:r>
+        <w:t xml:space="preserve">entered  </w:t>
+      </w:r>
+      <w:proofErr w:type="spellStart"/>
+      <w:r>
+        <w:t>otp</w:t>
+      </w:r>
+      <w:proofErr w:type="spellEnd"/>
+      <w:proofErr w:type="gramEnd"/>
+      <w:r>
+        <w:t xml:space="preserve"> against the stored </w:t>
+      </w:r>
+      <w:proofErr w:type="spellStart"/>
+      <w:r>
+        <w:t>otp</w:t>
+      </w:r>
+      <w:proofErr w:type="spellEnd"/>
+      <w:r>
+        <w:t xml:space="preserve"> </w:t>
       </w:r>
     </w:p>
     <w:p>
@@ -120,7 +494,15 @@
     </w:p>
     <w:p>
       <w:r>
-        <w:t>If new user, inserts the info from pending users table to new users table</w:t>
+        <w:t xml:space="preserve">If new user, inserts the info from pending users table to new </w:t>
+      </w:r>
+      <w:proofErr w:type="gramStart"/>
+      <w:r>
+        <w:t>users</w:t>
+      </w:r>
+      <w:proofErr w:type="gramEnd"/>
+      <w:r>
+        <w:t xml:space="preserve"> table</w:t>
       </w:r>
     </w:p>
     <w:p>
@@ -143,7 +525,15 @@
     </w:p>
     <w:p>
       <w:r>
-        <w:t>If both session and role exists: Go to orders page</w:t>
+        <w:t xml:space="preserve">If both session and role </w:t>
+      </w:r>
+      <w:proofErr w:type="gramStart"/>
+      <w:r>
+        <w:t>exists</w:t>
+      </w:r>
+      <w:proofErr w:type="gramEnd"/>
+      <w:r>
+        <w:t>: Go to orders page</w:t>
       </w:r>
     </w:p>
     <w:p>
@@ -164,7 +554,15 @@
     <w:p/>
     <w:p>
       <w:r>
-        <w:t>The common steps for all the users uptil OTP done.</w:t>
+        <w:t xml:space="preserve">The common steps for all the users </w:t>
+      </w:r>
+      <w:proofErr w:type="spellStart"/>
+      <w:r>
+        <w:t>uptil</w:t>
+      </w:r>
+      <w:proofErr w:type="spellEnd"/>
+      <w:r>
+        <w:t xml:space="preserve"> OTP done.</w:t>
       </w:r>
     </w:p>
     <w:p>
@@ -180,7 +578,15 @@
     <w:p>
       <w:r>
         <w:lastRenderedPageBreak/>
-        <w:t>Supplier: Two pages and therefore two procedures, one for entering fields and the other for entering the cnic images</w:t>
+        <w:t xml:space="preserve">Supplier: Two pages and therefore two procedures, one for entering fields and the other for entering the </w:t>
+      </w:r>
+      <w:proofErr w:type="spellStart"/>
+      <w:r>
+        <w:t>cnic</w:t>
+      </w:r>
+      <w:proofErr w:type="spellEnd"/>
+      <w:r>
+        <w:t xml:space="preserve"> images</w:t>
       </w:r>
     </w:p>
     <w:p/>
@@ -191,7 +597,23 @@
     </w:p>
     <w:p>
       <w:r>
-        <w:t>Upon entering the orders page, first his existence in the supplier_Drivers table will be checked, if he doesn’t exist there therefore he hasn’t defined one single driver, implying he is a new registration.</w:t>
+        <w:t xml:space="preserve">Upon entering the orders page, first his existence in the </w:t>
+      </w:r>
+      <w:proofErr w:type="spellStart"/>
+      <w:r>
+        <w:t>supplier_Drivers</w:t>
+      </w:r>
+      <w:proofErr w:type="spellEnd"/>
+      <w:r>
+        <w:t xml:space="preserve"> table will be checked, if he doesn’t exist there </w:t>
+      </w:r>
+      <w:proofErr w:type="gramStart"/>
+      <w:r>
+        <w:t>therefore</w:t>
+      </w:r>
+      <w:proofErr w:type="gramEnd"/>
+      <w:r>
+        <w:t xml:space="preserve"> he hasn’t defined one single driver, implying he is a new registration.</w:t>
       </w:r>
     </w:p>
     <w:p>
@@ -209,7 +631,39 @@
         <w:t xml:space="preserve">This will be checked by checking the </w:t>
       </w:r>
       <w:r>
-        <w:t>supplier drivers table again against the suppliers user id, and checking the driver_user_id there. If atleast one of them is not null he can view the orders page. Until then, the orders page remains inaccessible.</w:t>
+        <w:t xml:space="preserve">supplier drivers table again against the </w:t>
+      </w:r>
+      <w:proofErr w:type="gramStart"/>
+      <w:r>
+        <w:t>suppliers</w:t>
+      </w:r>
+      <w:proofErr w:type="gramEnd"/>
+      <w:r>
+        <w:t xml:space="preserve"> user </w:t>
+      </w:r>
+      <w:proofErr w:type="gramStart"/>
+      <w:r>
+        <w:t>id, and</w:t>
+      </w:r>
+      <w:proofErr w:type="gramEnd"/>
+      <w:r>
+        <w:t xml:space="preserve"> checking the </w:t>
+      </w:r>
+      <w:proofErr w:type="spellStart"/>
+      <w:r>
+        <w:t>driver_user_id</w:t>
+      </w:r>
+      <w:proofErr w:type="spellEnd"/>
+      <w:r>
+        <w:t xml:space="preserve"> there. If </w:t>
+      </w:r>
+      <w:proofErr w:type="spellStart"/>
+      <w:r>
+        <w:t>atleast</w:t>
+      </w:r>
+      <w:proofErr w:type="spellEnd"/>
+      <w:r>
+        <w:t xml:space="preserve"> one of them is not null he can view the orders page. Until then, the orders page remains inaccessible.</w:t>
       </w:r>
     </w:p>
     <w:p/>
@@ -225,7 +679,15 @@
     </w:p>
     <w:p>
       <w:r>
-        <w:t xml:space="preserve">When he comes back to the application, after verification, his session will be generated, upon entering his details it will be checked that if his role is already set to driver that implies he is an existing user therefore only set his id back into the supplier drivers table. </w:t>
+        <w:t xml:space="preserve">When he comes back to the application, after verification, his session will be generated, upon entering his details it will be checked that if his role is already set to driver that implies he is an existing user therefore only set his id back into the supplier </w:t>
+      </w:r>
+      <w:proofErr w:type="gramStart"/>
+      <w:r>
+        <w:t>drivers</w:t>
+      </w:r>
+      <w:proofErr w:type="gramEnd"/>
+      <w:r>
+        <w:t xml:space="preserve"> table. </w:t>
       </w:r>
     </w:p>
     <w:p/>
@@ -234,12 +696,44 @@
         <w:t xml:space="preserve">So </w:t>
       </w:r>
       <w:r>
-        <w:t>updated the enter deitals driver fn to remove re-linking of driver_id to the supplier_drivers table</w:t>
-      </w:r>
-    </w:p>
-    <w:p>
-      <w:r>
-        <w:t>Made a new trigger of re-link_driver_after_session generation</w:t>
+        <w:t xml:space="preserve">updated the enter </w:t>
+      </w:r>
+      <w:proofErr w:type="spellStart"/>
+      <w:r>
+        <w:t>deitals</w:t>
+      </w:r>
+      <w:proofErr w:type="spellEnd"/>
+      <w:r>
+        <w:t xml:space="preserve"> driver fn to remove re-linking of </w:t>
+      </w:r>
+      <w:proofErr w:type="spellStart"/>
+      <w:r>
+        <w:t>driver_id</w:t>
+      </w:r>
+      <w:proofErr w:type="spellEnd"/>
+      <w:r>
+        <w:t xml:space="preserve"> to the </w:t>
+      </w:r>
+      <w:proofErr w:type="spellStart"/>
+      <w:r>
+        <w:t>supplier_drivers</w:t>
+      </w:r>
+      <w:proofErr w:type="spellEnd"/>
+      <w:r>
+        <w:t xml:space="preserve"> table</w:t>
+      </w:r>
+    </w:p>
+    <w:p>
+      <w:r>
+        <w:t>Made a new trigger of re-</w:t>
+      </w:r>
+      <w:proofErr w:type="spellStart"/>
+      <w:r>
+        <w:t>link_driver_after_session</w:t>
+      </w:r>
+      <w:proofErr w:type="spellEnd"/>
+      <w:r>
+        <w:t xml:space="preserve"> generation</w:t>
       </w:r>
     </w:p>
     <w:p>
@@ -249,7 +743,15 @@
     </w:p>
     <w:p>
       <w:r>
-        <w:t>if it has then that means his details already exists jsut need to link his id to the suppliers table again</w:t>
+        <w:t xml:space="preserve">if it has then that means his details already exists </w:t>
+      </w:r>
+      <w:proofErr w:type="spellStart"/>
+      <w:r>
+        <w:t>jsut</w:t>
+      </w:r>
+      <w:proofErr w:type="spellEnd"/>
+      <w:r>
+        <w:t xml:space="preserve"> need to link his id to the suppliers table again</w:t>
       </w:r>
     </w:p>
     <w:p/>
@@ -272,8 +774,13 @@
       </w:r>
     </w:p>
     <w:p>
-      <w:r>
-        <w:t>Check_supplier_has_drivers fn:</w:t>
+      <w:proofErr w:type="spellStart"/>
+      <w:r>
+        <w:t>Check_supplier_has_drivers</w:t>
+      </w:r>
+      <w:proofErr w:type="spellEnd"/>
+      <w:r>
+        <w:t xml:space="preserve"> fn:</w:t>
       </w:r>
       <w:r>
         <w:tab/>
@@ -287,13 +794,29 @@
     </w:p>
     <w:p>
       <w:r>
-        <w:t>This will be checked by checked the supplier_drivers table</w:t>
+        <w:t xml:space="preserve">This will be checked by checked the </w:t>
+      </w:r>
+      <w:proofErr w:type="spellStart"/>
+      <w:r>
+        <w:t>supplier_drivers</w:t>
+      </w:r>
+      <w:proofErr w:type="spellEnd"/>
+      <w:r>
+        <w:t xml:space="preserve"> table</w:t>
       </w:r>
     </w:p>
     <w:p/>
     <w:p>
       <w:r>
-        <w:t>Check supplier_has_active_drivers:</w:t>
+        <w:t xml:space="preserve">Check </w:t>
+      </w:r>
+      <w:proofErr w:type="spellStart"/>
+      <w:r>
+        <w:t>supplier_has_active_drivers</w:t>
+      </w:r>
+      <w:proofErr w:type="spellEnd"/>
+      <w:r>
+        <w:t>:</w:t>
       </w:r>
       <w:r>
         <w:tab/>
@@ -302,12 +825,65 @@
     </w:p>
     <w:p>
       <w:r>
-        <w:t>This will be checked by checking the supplier_id and the driver_id against that supplier in the supplier drivers table</w:t>
-      </w:r>
-    </w:p>
-    <w:p>
-      <w:r>
-        <w:t>If, for that supplier_id, even if one of the driver_id is not null, then that means atleast one of his drivers is active</w:t>
+        <w:t xml:space="preserve">This will be checked by checking the </w:t>
+      </w:r>
+      <w:proofErr w:type="spellStart"/>
+      <w:r>
+        <w:t>supplier_id</w:t>
+      </w:r>
+      <w:proofErr w:type="spellEnd"/>
+      <w:r>
+        <w:t xml:space="preserve"> and the </w:t>
+      </w:r>
+      <w:proofErr w:type="spellStart"/>
+      <w:r>
+        <w:t>driver_id</w:t>
+      </w:r>
+      <w:proofErr w:type="spellEnd"/>
+      <w:r>
+        <w:t xml:space="preserve"> against that supplier in the supplier </w:t>
+      </w:r>
+      <w:proofErr w:type="gramStart"/>
+      <w:r>
+        <w:t>drivers</w:t>
+      </w:r>
+      <w:proofErr w:type="gramEnd"/>
+      <w:r>
+        <w:t xml:space="preserve"> table</w:t>
+      </w:r>
+    </w:p>
+    <w:p>
+      <w:r>
+        <w:t xml:space="preserve">If, for that </w:t>
+      </w:r>
+      <w:proofErr w:type="spellStart"/>
+      <w:r>
+        <w:t>supplier_id</w:t>
+      </w:r>
+      <w:proofErr w:type="spellEnd"/>
+      <w:r>
+        <w:t xml:space="preserve">, even if one of the </w:t>
+      </w:r>
+      <w:proofErr w:type="spellStart"/>
+      <w:proofErr w:type="gramStart"/>
+      <w:r>
+        <w:t>driver</w:t>
+      </w:r>
+      <w:proofErr w:type="gramEnd"/>
+      <w:r>
+        <w:t>_id</w:t>
+      </w:r>
+      <w:proofErr w:type="spellEnd"/>
+      <w:r>
+        <w:t xml:space="preserve"> is not null, then that means </w:t>
+      </w:r>
+      <w:proofErr w:type="spellStart"/>
+      <w:r>
+        <w:t>atleast</w:t>
+      </w:r>
+      <w:proofErr w:type="spellEnd"/>
+      <w:r>
+        <w:t xml:space="preserve"> one of his drivers is active</w:t>
       </w:r>
     </w:p>
     <w:p>
@@ -371,7 +947,20 @@
         </w:numPr>
       </w:pPr>
       <w:r>
-        <w:t>'orders_channel' = The radio station name (you can name it anything)</w:t>
+        <w:t>'</w:t>
+      </w:r>
+      <w:proofErr w:type="spellStart"/>
+      <w:proofErr w:type="gramStart"/>
+      <w:r>
+        <w:t>orders</w:t>
+      </w:r>
+      <w:proofErr w:type="gramEnd"/>
+      <w:r>
+        <w:t>_channel</w:t>
+      </w:r>
+      <w:proofErr w:type="spellEnd"/>
+      <w:r>
+        <w:t>' = The radio station name (you can name it anything)</w:t>
       </w:r>
     </w:p>
     <w:p>
@@ -607,7 +1196,39 @@
           <w:b/>
           <w:bCs/>
         </w:rPr>
-        <w:t>Step 5: Node.js calls view_available_orders()</w:t>
+        <w:t xml:space="preserve">Step 5: Node.js calls </w:t>
+      </w:r>
+      <w:proofErr w:type="spellStart"/>
+      <w:r>
+        <w:rPr>
+          <w:b/>
+          <w:bCs/>
+        </w:rPr>
+        <w:t>view_available_</w:t>
+      </w:r>
+      <w:proofErr w:type="gramStart"/>
+      <w:r>
+        <w:rPr>
+          <w:b/>
+          <w:bCs/>
+        </w:rPr>
+        <w:t>orders</w:t>
+      </w:r>
+      <w:proofErr w:type="spellEnd"/>
+      <w:r>
+        <w:rPr>
+          <w:b/>
+          <w:bCs/>
+        </w:rPr>
+        <w:t>(</w:t>
+      </w:r>
+      <w:proofErr w:type="gramEnd"/>
+      <w:r>
+        <w:rPr>
+          <w:b/>
+          <w:bCs/>
+        </w:rPr>
+        <w:t>)</w:t>
       </w:r>
     </w:p>
     <w:p>
@@ -719,12 +1340,37 @@
           <w:numId w:val="8"/>
         </w:numPr>
       </w:pPr>
-      <w:r>
-        <w:rPr>
-          <w:b/>
-          <w:bCs/>
-        </w:rPr>
-        <w:t>view_available_orders() is NOT called by the trigger</w:t>
+      <w:proofErr w:type="spellStart"/>
+      <w:r>
+        <w:rPr>
+          <w:b/>
+          <w:bCs/>
+        </w:rPr>
+        <w:t>view_available_</w:t>
+      </w:r>
+      <w:proofErr w:type="gramStart"/>
+      <w:r>
+        <w:rPr>
+          <w:b/>
+          <w:bCs/>
+        </w:rPr>
+        <w:t>orders</w:t>
+      </w:r>
+      <w:proofErr w:type="spellEnd"/>
+      <w:r>
+        <w:rPr>
+          <w:b/>
+          <w:bCs/>
+        </w:rPr>
+        <w:t>(</w:t>
+      </w:r>
+      <w:proofErr w:type="gramEnd"/>
+      <w:r>
+        <w:rPr>
+          <w:b/>
+          <w:bCs/>
+        </w:rPr>
+        <w:t>) is NOT called by the trigger</w:t>
       </w:r>
     </w:p>
     <w:p>
@@ -848,13 +1494,38 @@
       </w:r>
     </w:p>
     <w:p>
-      <w:r>
-        <w:t>client.on('notification', (msg) =&gt; {</w:t>
-      </w:r>
-    </w:p>
-    <w:p>
-      <w:r>
-        <w:t>    if (msg.channel === 'orders_channel') {</w:t>
+      <w:proofErr w:type="spellStart"/>
+      <w:proofErr w:type="gramStart"/>
+      <w:r>
+        <w:t>client.on</w:t>
+      </w:r>
+      <w:proofErr w:type="spellEnd"/>
+      <w:proofErr w:type="gramEnd"/>
+      <w:r>
+        <w:t>('notification', (msg) =&gt; {</w:t>
+      </w:r>
+    </w:p>
+    <w:p>
+      <w:r>
+        <w:t>    if (</w:t>
+      </w:r>
+      <w:proofErr w:type="spellStart"/>
+      <w:proofErr w:type="gramStart"/>
+      <w:r>
+        <w:t>msg.channel</w:t>
+      </w:r>
+      <w:proofErr w:type="spellEnd"/>
+      <w:proofErr w:type="gramEnd"/>
+      <w:r>
+        <w:t xml:space="preserve"> === '</w:t>
+      </w:r>
+      <w:proofErr w:type="spellStart"/>
+      <w:r>
+        <w:t>orders_channel</w:t>
+      </w:r>
+      <w:proofErr w:type="spellEnd"/>
+      <w:r>
+        <w:t>') {</w:t>
       </w:r>
     </w:p>
     <w:p>
@@ -864,7 +1535,33 @@
     </w:p>
     <w:p>
       <w:r>
-        <w:t>        const orders = await db.query('SELECT view_available_orders()');</w:t>
+        <w:t xml:space="preserve">        const orders = await </w:t>
+      </w:r>
+      <w:proofErr w:type="spellStart"/>
+      <w:proofErr w:type="gramStart"/>
+      <w:r>
+        <w:t>db.query</w:t>
+      </w:r>
+      <w:proofErr w:type="spellEnd"/>
+      <w:proofErr w:type="gramEnd"/>
+      <w:r>
+        <w:t xml:space="preserve">('SELECT </w:t>
+      </w:r>
+      <w:proofErr w:type="spellStart"/>
+      <w:r>
+        <w:t>view_available_</w:t>
+      </w:r>
+      <w:proofErr w:type="gramStart"/>
+      <w:r>
+        <w:t>orders</w:t>
+      </w:r>
+      <w:proofErr w:type="spellEnd"/>
+      <w:r>
+        <w:t>(</w:t>
+      </w:r>
+      <w:proofErr w:type="gramEnd"/>
+      <w:r>
+        <w:t>)');</w:t>
       </w:r>
     </w:p>
     <w:p>
@@ -879,7 +1576,25 @@
     </w:p>
     <w:p>
       <w:r>
-        <w:t>        io.emit('orders_updated', orders);</w:t>
+        <w:t xml:space="preserve">        </w:t>
+      </w:r>
+      <w:proofErr w:type="spellStart"/>
+      <w:proofErr w:type="gramStart"/>
+      <w:r>
+        <w:t>io.emit</w:t>
+      </w:r>
+      <w:proofErr w:type="spellEnd"/>
+      <w:proofErr w:type="gramEnd"/>
+      <w:r>
+        <w:t>('</w:t>
+      </w:r>
+      <w:proofErr w:type="spellStart"/>
+      <w:r>
+        <w:t>orders_updated</w:t>
+      </w:r>
+      <w:proofErr w:type="spellEnd"/>
+      <w:r>
+        <w:t>', orders);</w:t>
       </w:r>
     </w:p>
     <w:p>
@@ -895,7 +1610,23 @@
     <w:p/>
     <w:p>
       <w:r>
-        <w:t>Why not call directly the fn in trigger? Because trigger cant do anything with the data. It cant return the data back to backend</w:t>
+        <w:t xml:space="preserve">Why not call directly the fn in trigger? Because trigger </w:t>
+      </w:r>
+      <w:proofErr w:type="gramStart"/>
+      <w:r>
+        <w:t>cant</w:t>
+      </w:r>
+      <w:proofErr w:type="gramEnd"/>
+      <w:r>
+        <w:t xml:space="preserve"> do anything with the data. It </w:t>
+      </w:r>
+      <w:proofErr w:type="gramStart"/>
+      <w:r>
+        <w:t>cant</w:t>
+      </w:r>
+      <w:proofErr w:type="gramEnd"/>
+      <w:r>
+        <w:t xml:space="preserve"> return the data back to backend</w:t>
       </w:r>
     </w:p>
     <w:p>
@@ -904,7 +1635,36 @@
         <w:br/>
       </w:r>
       <w:r>
-        <w:t>ok so some updates there will be no transpation cost in my recommended fare calculation. we will only allow 7 quantites  to be choesn.</w:t>
+        <w:t xml:space="preserve">ok so some updates there will be no </w:t>
+      </w:r>
+      <w:proofErr w:type="spellStart"/>
+      <w:r>
+        <w:t>transpation</w:t>
+      </w:r>
+      <w:proofErr w:type="spellEnd"/>
+      <w:r>
+        <w:t xml:space="preserve"> cost in my recommended fare calculation. we will only allow 7 </w:t>
+      </w:r>
+      <w:proofErr w:type="spellStart"/>
+      <w:proofErr w:type="gramStart"/>
+      <w:r>
+        <w:t>quantites</w:t>
+      </w:r>
+      <w:proofErr w:type="spellEnd"/>
+      <w:r>
+        <w:t xml:space="preserve">  to</w:t>
+      </w:r>
+      <w:proofErr w:type="gramEnd"/>
+      <w:r>
+        <w:t xml:space="preserve"> be </w:t>
+      </w:r>
+      <w:proofErr w:type="spellStart"/>
+      <w:r>
+        <w:t>choesn</w:t>
+      </w:r>
+      <w:proofErr w:type="spellEnd"/>
+      <w:r>
+        <w:t>.</w:t>
       </w:r>
     </w:p>
     <w:p>
@@ -975,8 +1735,21 @@
         <w:t>Geocoding API</w:t>
       </w:r>
       <w:r>
-        <w:t> → Convert address to lat/lng</w:t>
-      </w:r>
+        <w:t xml:space="preserve"> → Convert address to </w:t>
+      </w:r>
+      <w:proofErr w:type="spellStart"/>
+      <w:r>
+        <w:t>lat</w:t>
+      </w:r>
+      <w:proofErr w:type="spellEnd"/>
+      <w:r>
+        <w:t>/</w:t>
+      </w:r>
+      <w:proofErr w:type="spellStart"/>
+      <w:r>
+        <w:t>lng</w:t>
+      </w:r>
+      <w:proofErr w:type="spellEnd"/>
     </w:p>
     <w:p>
       <w:pPr>
@@ -1141,8 +1914,13 @@
         <w:t>Geocoding:</w:t>
       </w:r>
       <w:r>
-        <w:t> Nominatim</w:t>
-      </w:r>
+        <w:t> </w:t>
+      </w:r>
+      <w:proofErr w:type="spellStart"/>
+      <w:r>
+        <w:t>Nominatim</w:t>
+      </w:r>
+      <w:proofErr w:type="spellEnd"/>
     </w:p>
     <w:p>
       <w:pPr>
@@ -1159,7 +1937,15 @@
         <w:t>Real-time:</w:t>
       </w:r>
       <w:r>
-        <w:t> WebSockets (you already planned this)</w:t>
+        <w:t> </w:t>
+      </w:r>
+      <w:proofErr w:type="spellStart"/>
+      <w:r>
+        <w:t>WebSockets</w:t>
+      </w:r>
+      <w:proofErr w:type="spellEnd"/>
+      <w:r>
+        <w:t xml:space="preserve"> (you already planned this)</w:t>
       </w:r>
     </w:p>
     <w:p>
@@ -1209,7 +1995,39 @@
     <w:p>
       <w:r>
         <w:lastRenderedPageBreak/>
-        <w:t>well i also wanted the frontend to dispaly the driver coming to a location so in real time his lication can be seen by the cusotmer when he is coming after acceptance of an order. can that also be free</w:t>
+        <w:t xml:space="preserve">well </w:t>
+      </w:r>
+      <w:proofErr w:type="spellStart"/>
+      <w:r>
+        <w:t>i</w:t>
+      </w:r>
+      <w:proofErr w:type="spellEnd"/>
+      <w:r>
+        <w:t xml:space="preserve"> also wanted the frontend to </w:t>
+      </w:r>
+      <w:proofErr w:type="spellStart"/>
+      <w:r>
+        <w:t>dispaly</w:t>
+      </w:r>
+      <w:proofErr w:type="spellEnd"/>
+      <w:r>
+        <w:t xml:space="preserve"> the driver coming to a location so in real time his </w:t>
+      </w:r>
+      <w:proofErr w:type="spellStart"/>
+      <w:r>
+        <w:t>lication</w:t>
+      </w:r>
+      <w:proofErr w:type="spellEnd"/>
+      <w:r>
+        <w:t xml:space="preserve"> can be seen by the </w:t>
+      </w:r>
+      <w:proofErr w:type="spellStart"/>
+      <w:r>
+        <w:t>cusotmer</w:t>
+      </w:r>
+      <w:proofErr w:type="spellEnd"/>
+      <w:r>
+        <w:t xml:space="preserve"> when he is coming after acceptance of an order. can that also be free</w:t>
       </w:r>
     </w:p>
     <w:p>
@@ -1340,7 +2158,23 @@
           <w:b/>
           <w:bCs/>
         </w:rPr>
-        <w:t>2. Backend (Node.js + WebSockets)</w:t>
+        <w:t xml:space="preserve">2. Backend (Node.js + </w:t>
+      </w:r>
+      <w:proofErr w:type="spellStart"/>
+      <w:r>
+        <w:rPr>
+          <w:b/>
+          <w:bCs/>
+        </w:rPr>
+        <w:t>WebSockets</w:t>
+      </w:r>
+      <w:proofErr w:type="spellEnd"/>
+      <w:r>
+        <w:rPr>
+          <w:b/>
+          <w:bCs/>
+        </w:rPr>
+        <w:t>)</w:t>
       </w:r>
     </w:p>
     <w:p>
@@ -1384,7 +2218,15 @@
         <w:t>Cost:</w:t>
       </w:r>
       <w:r>
-        <w:t> $0 - WebSockets (socket.io) is free</w:t>
+        <w:t xml:space="preserve"> $0 - </w:t>
+      </w:r>
+      <w:proofErr w:type="spellStart"/>
+      <w:r>
+        <w:t>WebSockets</w:t>
+      </w:r>
+      <w:proofErr w:type="spellEnd"/>
+      <w:r>
+        <w:t xml:space="preserve"> (socket.io) is free</w:t>
       </w:r>
     </w:p>
     <w:p>
@@ -1731,8 +2573,13 @@
             <w:hideMark/>
           </w:tcPr>
           <w:p>
+            <w:proofErr w:type="spellStart"/>
             <w:r>
-              <w:t>WebSockets (socket.io)</w:t>
+              <w:t>WebSockets</w:t>
+            </w:r>
+            <w:proofErr w:type="spellEnd"/>
+            <w:r>
+              <w:t xml:space="preserve"> (socket.io)</w:t>
             </w:r>
           </w:p>
         </w:tc>
@@ -2031,7 +2878,15 @@
         <w:t>Every 5-10 seconds</w:t>
       </w:r>
       <w:r>
-        <w:t> - Good balance (not too much data)</w:t>
+        <w:t xml:space="preserve"> - </w:t>
+      </w:r>
+      <w:proofErr w:type="gramStart"/>
+      <w:r>
+        <w:t>Good</w:t>
+      </w:r>
+      <w:proofErr w:type="gramEnd"/>
+      <w:r>
+        <w:t xml:space="preserve"> balance (not too much data)</w:t>
       </w:r>
     </w:p>
     <w:p>
@@ -2079,7 +2934,15 @@
     <w:p>
       <w:r>
         <w:lastRenderedPageBreak/>
-        <w:t>Added a constraitn on table of orders that there cannot be more than one order for a customer with status = ‘open’</w:t>
+        <w:t xml:space="preserve">Added a </w:t>
+      </w:r>
+      <w:proofErr w:type="spellStart"/>
+      <w:r>
+        <w:t>constraitn</w:t>
+      </w:r>
+      <w:proofErr w:type="spellEnd"/>
+      <w:r>
+        <w:t xml:space="preserve"> on table of orders that there cannot be more than one order for a customer with status = ‘open’</w:t>
       </w:r>
     </w:p>
     <w:p>
@@ -2096,12 +2959,28 @@
     </w:p>
     <w:p>
       <w:r>
-        <w:t>Supplier sends a bid using a submit bid fn were first it will be checked if that order status is still open and if the supplier_id for that order is null or not</w:t>
-      </w:r>
-    </w:p>
-    <w:p>
-      <w:r>
-        <w:t xml:space="preserve">If yes then submit bid </w:t>
+        <w:t xml:space="preserve">Supplier sends a bid using a submit bid fn were first it will be checked if that order status is still open and if the </w:t>
+      </w:r>
+      <w:proofErr w:type="spellStart"/>
+      <w:r>
+        <w:t>supplier_id</w:t>
+      </w:r>
+      <w:proofErr w:type="spellEnd"/>
+      <w:r>
+        <w:t xml:space="preserve"> for that order is null or not</w:t>
+      </w:r>
+    </w:p>
+    <w:p>
+      <w:r>
+        <w:t xml:space="preserve">If </w:t>
+      </w:r>
+      <w:proofErr w:type="gramStart"/>
+      <w:r>
+        <w:t>yes</w:t>
+      </w:r>
+      <w:proofErr w:type="gramEnd"/>
+      <w:r>
+        <w:t xml:space="preserve"> then submit bid </w:t>
       </w:r>
     </w:p>
     <w:p/>
@@ -2117,7 +2996,31 @@
     </w:p>
     <w:p>
       <w:r>
-        <w:t xml:space="preserve">If it is then update the supplier id, accepted price, order_accepted_by_supplier at  and </w:t>
+        <w:t xml:space="preserve">If it is then </w:t>
+      </w:r>
+      <w:proofErr w:type="gramStart"/>
+      <w:r>
+        <w:t>update</w:t>
+      </w:r>
+      <w:proofErr w:type="gramEnd"/>
+      <w:r>
+        <w:t xml:space="preserve"> the supplier id, accepted price, </w:t>
+      </w:r>
+      <w:proofErr w:type="spellStart"/>
+      <w:r>
+        <w:t>order_accepted_by_supplier</w:t>
+      </w:r>
+      <w:proofErr w:type="spellEnd"/>
+      <w:r>
+        <w:t xml:space="preserve"> </w:t>
+      </w:r>
+      <w:proofErr w:type="gramStart"/>
+      <w:r>
+        <w:t>at  and</w:t>
+      </w:r>
+      <w:proofErr w:type="gramEnd"/>
+      <w:r>
+        <w:t xml:space="preserve"> </w:t>
       </w:r>
     </w:p>
     <w:p>
@@ -2128,13 +3031,29 @@
     <w:p/>
     <w:p>
       <w:r>
-        <w:t>As soon as this status update happens a trigger will be called for this order where all the bids for that order  will be deleted instantly</w:t>
+        <w:t xml:space="preserve">As soon as this status update happens a trigger will be called for this order where all the bids for that </w:t>
+      </w:r>
+      <w:proofErr w:type="gramStart"/>
+      <w:r>
+        <w:t>order  will</w:t>
+      </w:r>
+      <w:proofErr w:type="gramEnd"/>
+      <w:r>
+        <w:t xml:space="preserve"> be deleted instantly</w:t>
       </w:r>
     </w:p>
     <w:p/>
     <w:p>
       <w:r>
-        <w:t>For accepting bid, the customer id will be sent using the session id from backend (this has to be done for others too, for other human/computer interactions</w:t>
+        <w:t xml:space="preserve">For accepting bid, the customer id will be sent using the session id from backend (this </w:t>
+      </w:r>
+      <w:proofErr w:type="gramStart"/>
+      <w:r>
+        <w:t>has to</w:t>
+      </w:r>
+      <w:proofErr w:type="gramEnd"/>
+      <w:r>
+        <w:t xml:space="preserve"> be done for others too, for other human/computer interactions</w:t>
       </w:r>
     </w:p>
     <w:p/>
@@ -2150,13 +3069,42 @@
       </w:r>
     </w:p>
     <w:p>
-      <w:r>
-        <w:t>Have to remove  the order as soon as timer goes up.</w:t>
-      </w:r>
-    </w:p>
-    <w:p>
-      <w:r>
-        <w:t>From the orders  table and from drivers table</w:t>
+      <w:proofErr w:type="gramStart"/>
+      <w:r>
+        <w:t>Have to</w:t>
+      </w:r>
+      <w:proofErr w:type="gramEnd"/>
+      <w:r>
+        <w:t xml:space="preserve"> </w:t>
+      </w:r>
+      <w:proofErr w:type="gramStart"/>
+      <w:r>
+        <w:t>remove  the</w:t>
+      </w:r>
+      <w:proofErr w:type="gramEnd"/>
+      <w:r>
+        <w:t xml:space="preserve"> order as soon as timer goes up.</w:t>
+      </w:r>
+    </w:p>
+    <w:p>
+      <w:r>
+        <w:t xml:space="preserve">From the </w:t>
+      </w:r>
+      <w:proofErr w:type="gramStart"/>
+      <w:r>
+        <w:t>orders  table</w:t>
+      </w:r>
+      <w:proofErr w:type="gramEnd"/>
+      <w:r>
+        <w:t xml:space="preserve"> and from </w:t>
+      </w:r>
+      <w:proofErr w:type="gramStart"/>
+      <w:r>
+        <w:t>drivers</w:t>
+      </w:r>
+      <w:proofErr w:type="gramEnd"/>
+      <w:r>
+        <w:t xml:space="preserve"> table</w:t>
       </w:r>
     </w:p>
     <w:p/>
@@ -2166,7 +3114,15 @@
         <w:t>Now remove order fn will be called that will remove the order from the orders side</w:t>
       </w:r>
       <w:r>
-        <w:t xml:space="preserve"> and from the driver_assignment table</w:t>
+        <w:t xml:space="preserve"> and from the </w:t>
+      </w:r>
+      <w:proofErr w:type="spellStart"/>
+      <w:r>
+        <w:t>driver_assignment</w:t>
+      </w:r>
+      <w:proofErr w:type="spellEnd"/>
+      <w:r>
+        <w:t xml:space="preserve"> table</w:t>
       </w:r>
     </w:p>
     <w:p>
@@ -2194,7 +3150,15 @@
     <w:p/>
     <w:p>
       <w:r>
-        <w:t>REMINDER: session id has to be checked in backend logic as it was not catered here</w:t>
+        <w:t xml:space="preserve">REMINDER: session id </w:t>
+      </w:r>
+      <w:proofErr w:type="gramStart"/>
+      <w:r>
+        <w:t>has to</w:t>
+      </w:r>
+      <w:proofErr w:type="gramEnd"/>
+      <w:r>
+        <w:t xml:space="preserve"> be checked in backend logic as it was not catered here</w:t>
       </w:r>
     </w:p>
     <w:p/>
@@ -2208,17 +3172,49 @@
     </w:p>
     <w:p>
       <w:r>
-        <w:t>Did this by adding anotrer field to thebtal called order rejected in driver assignment table</w:t>
-      </w:r>
-    </w:p>
-    <w:p>
-      <w:r>
-        <w:t>If assignment already existed but rejected field is false then delete that row and reassign and vice versa</w:t>
-      </w:r>
-    </w:p>
-    <w:p>
-      <w:r>
-        <w:t xml:space="preserve">For making button unavailable after assigining, frontend will handle it in real time </w:t>
+        <w:t xml:space="preserve">Did this by adding </w:t>
+      </w:r>
+      <w:proofErr w:type="spellStart"/>
+      <w:r>
+        <w:t>anotrer</w:t>
+      </w:r>
+      <w:proofErr w:type="spellEnd"/>
+      <w:r>
+        <w:t xml:space="preserve"> field to </w:t>
+      </w:r>
+      <w:proofErr w:type="spellStart"/>
+      <w:r>
+        <w:t>thebtal</w:t>
+      </w:r>
+      <w:proofErr w:type="spellEnd"/>
+      <w:r>
+        <w:t xml:space="preserve"> called order rejected in driver assignment table</w:t>
+      </w:r>
+    </w:p>
+    <w:p>
+      <w:r>
+        <w:t xml:space="preserve">If assignment already existed but rejected field is </w:t>
+      </w:r>
+      <w:proofErr w:type="gramStart"/>
+      <w:r>
+        <w:t>false</w:t>
+      </w:r>
+      <w:proofErr w:type="gramEnd"/>
+      <w:r>
+        <w:t xml:space="preserve"> then delete that row and reassign and vice versa</w:t>
+      </w:r>
+    </w:p>
+    <w:p>
+      <w:r>
+        <w:t xml:space="preserve">For making button unavailable after </w:t>
+      </w:r>
+      <w:proofErr w:type="spellStart"/>
+      <w:r>
+        <w:t>assigining</w:t>
+      </w:r>
+      <w:proofErr w:type="spellEnd"/>
+      <w:r>
+        <w:t xml:space="preserve">, frontend will handle it in real time </w:t>
       </w:r>
     </w:p>
     <w:p/>
@@ -2259,7 +3255,36 @@
         <w:t>Fetch driver list</w:t>
       </w:r>
       <w:r>
-        <w:t> with get_available_drivers_for_supplier(supplier_id, order_id)</w:t>
+        <w:t> with </w:t>
+      </w:r>
+      <w:proofErr w:type="spellStart"/>
+      <w:r>
+        <w:t>get_available_drivers_for_</w:t>
+      </w:r>
+      <w:proofErr w:type="gramStart"/>
+      <w:r>
+        <w:t>supplier</w:t>
+      </w:r>
+      <w:proofErr w:type="spellEnd"/>
+      <w:r>
+        <w:t>(</w:t>
+      </w:r>
+      <w:proofErr w:type="spellStart"/>
+      <w:proofErr w:type="gramEnd"/>
+      <w:r>
+        <w:t>supplier_id</w:t>
+      </w:r>
+      <w:proofErr w:type="spellEnd"/>
+      <w:r>
+        <w:t xml:space="preserve">, </w:t>
+      </w:r>
+      <w:proofErr w:type="spellStart"/>
+      <w:r>
+        <w:t>order_id</w:t>
+      </w:r>
+      <w:proofErr w:type="spellEnd"/>
+      <w:r>
+        <w:t>)</w:t>
       </w:r>
     </w:p>
     <w:p>
@@ -2270,8 +3295,13 @@
         </w:numPr>
       </w:pPr>
       <w:r>
-        <w:t>Returns each driver with status and time_limit</w:t>
-      </w:r>
+        <w:t>Returns each driver with status and </w:t>
+      </w:r>
+      <w:proofErr w:type="spellStart"/>
+      <w:r>
+        <w:t>time_limit</w:t>
+      </w:r>
+      <w:proofErr w:type="spellEnd"/>
     </w:p>
     <w:p>
       <w:pPr>
@@ -2331,6 +3361,8 @@
         </w:rPr>
         <w:t xml:space="preserve"> (</w:t>
       </w:r>
+      <w:proofErr w:type="spellStart"/>
+      <w:proofErr w:type="gramStart"/>
       <w:r>
         <w:rPr>
           <w:rFonts w:ascii="Consolas" w:eastAsia="Times New Roman" w:hAnsi="Consolas" w:cs="Times New Roman"/>
@@ -2367,6 +3399,8 @@
         </w:rPr>
         <w:t>status</w:t>
       </w:r>
+      <w:proofErr w:type="spellEnd"/>
+      <w:proofErr w:type="gramEnd"/>
       <w:r>
         <w:rPr>
           <w:rFonts w:ascii="Consolas" w:eastAsia="Times New Roman" w:hAnsi="Consolas" w:cs="Times New Roman"/>
@@ -2475,6 +3509,7 @@
         </w:rPr>
         <w:t xml:space="preserve"> </w:t>
       </w:r>
+      <w:proofErr w:type="gramStart"/>
       <w:r>
         <w:rPr>
           <w:rFonts w:ascii="Consolas" w:eastAsia="Times New Roman" w:hAnsi="Consolas" w:cs="Times New Roman"/>
@@ -2497,7 +3532,20 @@
           <w:lang w:eastAsia="en-PK"/>
           <w14:ligatures w14:val="none"/>
         </w:rPr>
-        <w:t xml:space="preserve">() &lt; new </w:t>
+        <w:t>(</w:t>
+      </w:r>
+      <w:proofErr w:type="gramEnd"/>
+      <w:r>
+        <w:rPr>
+          <w:rFonts w:ascii="Consolas" w:eastAsia="Times New Roman" w:hAnsi="Consolas" w:cs="Times New Roman"/>
+          <w:color w:val="CCCCCC"/>
+          <w:kern w:val="0"/>
+          <w:sz w:val="21"/>
+          <w:szCs w:val="21"/>
+          <w:lang w:eastAsia="en-PK"/>
+          <w14:ligatures w14:val="none"/>
+        </w:rPr>
+        <w:t xml:space="preserve">) &lt; new </w:t>
       </w:r>
       <w:r>
         <w:rPr>
@@ -2521,7 +3569,47 @@
           <w:lang w:eastAsia="en-PK"/>
           <w14:ligatures w14:val="none"/>
         </w:rPr>
-        <w:t>(driver.time_limit)) {</w:t>
+        <w:t>(</w:t>
+      </w:r>
+      <w:proofErr w:type="spellStart"/>
+      <w:proofErr w:type="gramStart"/>
+      <w:r>
+        <w:rPr>
+          <w:rFonts w:ascii="Consolas" w:eastAsia="Times New Roman" w:hAnsi="Consolas" w:cs="Times New Roman"/>
+          <w:color w:val="CCCCCC"/>
+          <w:kern w:val="0"/>
+          <w:sz w:val="21"/>
+          <w:szCs w:val="21"/>
+          <w:lang w:eastAsia="en-PK"/>
+          <w14:ligatures w14:val="none"/>
+        </w:rPr>
+        <w:t>driver.time</w:t>
+      </w:r>
+      <w:proofErr w:type="gramEnd"/>
+      <w:r>
+        <w:rPr>
+          <w:rFonts w:ascii="Consolas" w:eastAsia="Times New Roman" w:hAnsi="Consolas" w:cs="Times New Roman"/>
+          <w:color w:val="CCCCCC"/>
+          <w:kern w:val="0"/>
+          <w:sz w:val="21"/>
+          <w:szCs w:val="21"/>
+          <w:lang w:eastAsia="en-PK"/>
+          <w14:ligatures w14:val="none"/>
+        </w:rPr>
+        <w:t>_limit</w:t>
+      </w:r>
+      <w:proofErr w:type="spellEnd"/>
+      <w:r>
+        <w:rPr>
+          <w:rFonts w:ascii="Consolas" w:eastAsia="Times New Roman" w:hAnsi="Consolas" w:cs="Times New Roman"/>
+          <w:color w:val="CCCCCC"/>
+          <w:kern w:val="0"/>
+          <w:sz w:val="21"/>
+          <w:szCs w:val="21"/>
+          <w:lang w:eastAsia="en-PK"/>
+          <w14:ligatures w14:val="none"/>
+        </w:rPr>
+        <w:t>)) {</w:t>
       </w:r>
     </w:p>
     <w:p>
@@ -2600,6 +3688,8 @@
         <w:lastRenderedPageBreak/>
         <w:t xml:space="preserve">  </w:t>
       </w:r>
+      <w:proofErr w:type="spellStart"/>
+      <w:proofErr w:type="gramStart"/>
       <w:r>
         <w:rPr>
           <w:rFonts w:ascii="Consolas" w:eastAsia="Times New Roman" w:hAnsi="Consolas" w:cs="Times New Roman"/>
@@ -2636,6 +3726,8 @@
         </w:rPr>
         <w:t>disabled</w:t>
       </w:r>
+      <w:proofErr w:type="spellEnd"/>
+      <w:proofErr w:type="gramEnd"/>
       <w:r>
         <w:rPr>
           <w:rFonts w:ascii="Consolas" w:eastAsia="Times New Roman" w:hAnsi="Consolas" w:cs="Times New Roman"/>
@@ -2776,6 +3868,8 @@
         </w:rPr>
         <w:t xml:space="preserve"> (</w:t>
       </w:r>
+      <w:proofErr w:type="spellStart"/>
+      <w:proofErr w:type="gramStart"/>
       <w:r>
         <w:rPr>
           <w:rFonts w:ascii="Consolas" w:eastAsia="Times New Roman" w:hAnsi="Consolas" w:cs="Times New Roman"/>
@@ -2812,6 +3906,8 @@
         </w:rPr>
         <w:t>status</w:t>
       </w:r>
+      <w:proofErr w:type="spellEnd"/>
+      <w:proofErr w:type="gramEnd"/>
       <w:r>
         <w:rPr>
           <w:rFonts w:ascii="Consolas" w:eastAsia="Times New Roman" w:hAnsi="Consolas" w:cs="Times New Roman"/>
@@ -2948,6 +4044,8 @@
         </w:rPr>
         <w:t xml:space="preserve">  </w:t>
       </w:r>
+      <w:proofErr w:type="spellStart"/>
+      <w:proofErr w:type="gramStart"/>
       <w:r>
         <w:rPr>
           <w:rFonts w:ascii="Consolas" w:eastAsia="Times New Roman" w:hAnsi="Consolas" w:cs="Times New Roman"/>
@@ -2984,6 +4082,8 @@
         </w:rPr>
         <w:t>disabled</w:t>
       </w:r>
+      <w:proofErr w:type="spellEnd"/>
+      <w:proofErr w:type="gramEnd"/>
       <w:r>
         <w:rPr>
           <w:rFonts w:ascii="Consolas" w:eastAsia="Times New Roman" w:hAnsi="Consolas" w:cs="Times New Roman"/>
@@ -3076,6 +4176,7 @@
         </w:rPr>
         <w:t xml:space="preserve">  </w:t>
       </w:r>
+      <w:proofErr w:type="spellStart"/>
       <w:r>
         <w:rPr>
           <w:rFonts w:ascii="Consolas" w:eastAsia="Times New Roman" w:hAnsi="Consolas" w:cs="Times New Roman"/>
@@ -3136,6 +4237,7 @@
         </w:rPr>
         <w:t>add</w:t>
       </w:r>
+      <w:proofErr w:type="spellEnd"/>
       <w:r>
         <w:rPr>
           <w:rFonts w:ascii="Consolas" w:eastAsia="Times New Roman" w:hAnsi="Consolas" w:cs="Times New Roman"/>
@@ -3304,6 +4406,8 @@
         </w:rPr>
         <w:t xml:space="preserve">  </w:t>
       </w:r>
+      <w:proofErr w:type="spellStart"/>
+      <w:proofErr w:type="gramStart"/>
       <w:r>
         <w:rPr>
           <w:rFonts w:ascii="Consolas" w:eastAsia="Times New Roman" w:hAnsi="Consolas" w:cs="Times New Roman"/>
@@ -3340,6 +4444,8 @@
         </w:rPr>
         <w:t>disabled</w:t>
       </w:r>
+      <w:proofErr w:type="spellEnd"/>
+      <w:proofErr w:type="gramEnd"/>
       <w:r>
         <w:rPr>
           <w:rFonts w:ascii="Consolas" w:eastAsia="Times New Roman" w:hAnsi="Consolas" w:cs="Times New Roman"/>
@@ -3464,7 +4570,23 @@
         </w:numPr>
       </w:pPr>
       <w:r>
-        <w:t>Frontend just calls assign_driver_to_order()</w:t>
+        <w:t>Frontend just calls </w:t>
+      </w:r>
+      <w:proofErr w:type="spellStart"/>
+      <w:r>
+        <w:t>assign_driver_to_</w:t>
+      </w:r>
+      <w:proofErr w:type="gramStart"/>
+      <w:r>
+        <w:t>order</w:t>
+      </w:r>
+      <w:proofErr w:type="spellEnd"/>
+      <w:r>
+        <w:t>(</w:t>
+      </w:r>
+      <w:proofErr w:type="gramEnd"/>
+      <w:r>
+        <w:t>)</w:t>
       </w:r>
     </w:p>
     <w:p>
@@ -3486,7 +4608,15 @@
         </w:numPr>
       </w:pPr>
       <w:r>
-        <w:t>Rejects if order_rejected = TRUE</w:t>
+        <w:t>Rejects if </w:t>
+      </w:r>
+      <w:proofErr w:type="spellStart"/>
+      <w:r>
+        <w:t>order_rejected</w:t>
+      </w:r>
+      <w:proofErr w:type="spellEnd"/>
+      <w:r>
+        <w:t xml:space="preserve"> = TRUE</w:t>
       </w:r>
     </w:p>
     <w:p>
@@ -3497,7 +4627,15 @@
         </w:numPr>
       </w:pPr>
       <w:r>
-        <w:t>Deletes old expired assignment</w:t>
+        <w:t xml:space="preserve">Deletes </w:t>
+      </w:r>
+      <w:proofErr w:type="gramStart"/>
+      <w:r>
+        <w:t>old expired</w:t>
+      </w:r>
+      <w:proofErr w:type="gramEnd"/>
+      <w:r>
+        <w:t xml:space="preserve"> assignment</w:t>
       </w:r>
     </w:p>
     <w:p>
@@ -3534,7 +4672,23 @@
         <w:t>✅</w:t>
       </w:r>
       <w:r>
-        <w:t> confirm_order_driver() - checks driver's timer</w:t>
+        <w:t> </w:t>
+      </w:r>
+      <w:proofErr w:type="spellStart"/>
+      <w:r>
+        <w:t>confirm_order_</w:t>
+      </w:r>
+      <w:proofErr w:type="gramStart"/>
+      <w:r>
+        <w:t>driver</w:t>
+      </w:r>
+      <w:proofErr w:type="spellEnd"/>
+      <w:r>
+        <w:t>(</w:t>
+      </w:r>
+      <w:proofErr w:type="gramEnd"/>
+      <w:r>
+        <w:t>) - checks driver's timer</w:t>
       </w:r>
     </w:p>
     <w:p>
@@ -3551,7 +4705,23 @@
         <w:t>✅</w:t>
       </w:r>
       <w:r>
-        <w:t> assign_driver_to_order() - checks rejection status</w:t>
+        <w:t> </w:t>
+      </w:r>
+      <w:proofErr w:type="spellStart"/>
+      <w:r>
+        <w:t>assign_driver_to_</w:t>
+      </w:r>
+      <w:proofErr w:type="gramStart"/>
+      <w:r>
+        <w:t>order</w:t>
+      </w:r>
+      <w:proofErr w:type="spellEnd"/>
+      <w:r>
+        <w:t>(</w:t>
+      </w:r>
+      <w:proofErr w:type="gramEnd"/>
+      <w:r>
+        <w:t>) - checks rejection status</w:t>
       </w:r>
     </w:p>
     <w:p>
@@ -3580,7 +4750,15 @@
         <w:t>Perfect architecture! No backend timer polling needed.</w:t>
       </w:r>
       <w:r>
-        <w:t> Frontend calculates based on time_limit timestamp.</w:t>
+        <w:t> Frontend calculates based on </w:t>
+      </w:r>
+      <w:proofErr w:type="spellStart"/>
+      <w:r>
+        <w:t>time_limit</w:t>
+      </w:r>
+      <w:proofErr w:type="spellEnd"/>
+      <w:r>
+        <w:t> timestamp.</w:t>
       </w:r>
     </w:p>
     <w:p/>
@@ -3626,7 +4804,15 @@
         <w:t>Initially:</w:t>
       </w:r>
       <w:r>
-        <w:t> All drivers available (no driver_assignment rows exist)</w:t>
+        <w:t xml:space="preserve"> All drivers available (no </w:t>
+      </w:r>
+      <w:proofErr w:type="spellStart"/>
+      <w:r>
+        <w:t>driver_assignment</w:t>
+      </w:r>
+      <w:proofErr w:type="spellEnd"/>
+      <w:r>
+        <w:t xml:space="preserve"> rows exist)</w:t>
       </w:r>
     </w:p>
     <w:p>
@@ -3652,8 +4838,13 @@
         </w:numPr>
       </w:pPr>
       <w:r>
-        <w:t>INSERT into driver_assignment</w:t>
-      </w:r>
+        <w:t xml:space="preserve">INSERT into </w:t>
+      </w:r>
+      <w:proofErr w:type="spellStart"/>
+      <w:r>
+        <w:t>driver_assignment</w:t>
+      </w:r>
+      <w:proofErr w:type="spellEnd"/>
     </w:p>
     <w:p>
       <w:pPr>
@@ -3690,7 +4881,23 @@
       </w:pPr>
       <w:r>
         <w:lastRenderedPageBreak/>
-        <w:t>UPDATE driver_assignment SET order_rejected = TRUE</w:t>
+        <w:t xml:space="preserve">UPDATE </w:t>
+      </w:r>
+      <w:proofErr w:type="spellStart"/>
+      <w:r>
+        <w:t>driver_assignment</w:t>
+      </w:r>
+      <w:proofErr w:type="spellEnd"/>
+      <w:r>
+        <w:t xml:space="preserve"> SET </w:t>
+      </w:r>
+      <w:proofErr w:type="spellStart"/>
+      <w:r>
+        <w:t>order_rejected</w:t>
+      </w:r>
+      <w:proofErr w:type="spellEnd"/>
+      <w:r>
+        <w:t xml:space="preserve"> = TRUE</w:t>
       </w:r>
     </w:p>
     <w:p>
@@ -3748,18 +4955,44 @@
           <w:b/>
           <w:bCs/>
         </w:rPr>
-        <w:t>Add TRIGGER on driver_assignment (like we have for orders):</w:t>
-      </w:r>
-    </w:p>
-    <w:p>
-      <w:r>
-        <w:t>CREATE TRIGGER trigger_notify_driver_assignment_updated</w:t>
-      </w:r>
-    </w:p>
-    <w:p>
-      <w:r>
-        <w:t xml:space="preserve">    AFTER INSERT OR UPDATE OR DELETE ON driver_assignment</w:t>
-      </w:r>
+        <w:t xml:space="preserve">Add TRIGGER on </w:t>
+      </w:r>
+      <w:proofErr w:type="spellStart"/>
+      <w:r>
+        <w:rPr>
+          <w:b/>
+          <w:bCs/>
+        </w:rPr>
+        <w:t>driver_assignment</w:t>
+      </w:r>
+      <w:proofErr w:type="spellEnd"/>
+      <w:r>
+        <w:rPr>
+          <w:b/>
+          <w:bCs/>
+        </w:rPr>
+        <w:t xml:space="preserve"> (like we have for orders):</w:t>
+      </w:r>
+    </w:p>
+    <w:p>
+      <w:r>
+        <w:t xml:space="preserve">CREATE TRIGGER </w:t>
+      </w:r>
+      <w:proofErr w:type="spellStart"/>
+      <w:r>
+        <w:t>trigger_notify_driver_assignment_updated</w:t>
+      </w:r>
+      <w:proofErr w:type="spellEnd"/>
+    </w:p>
+    <w:p>
+      <w:r>
+        <w:t xml:space="preserve">    AFTER INSERT OR UPDATE OR DELETE ON </w:t>
+      </w:r>
+      <w:proofErr w:type="spellStart"/>
+      <w:r>
+        <w:t>driver_assignment</w:t>
+      </w:r>
+      <w:proofErr w:type="spellEnd"/>
     </w:p>
     <w:p>
       <w:r>
@@ -3768,7 +5001,23 @@
     </w:p>
     <w:p>
       <w:r>
-        <w:t xml:space="preserve">    EXECUTE FUNCTION notify_driver_assignment_updated();</w:t>
+        <w:t xml:space="preserve">    EXECUTE FUNCTION </w:t>
+      </w:r>
+      <w:proofErr w:type="spellStart"/>
+      <w:r>
+        <w:t>notify_driver_assignment_</w:t>
+      </w:r>
+      <w:proofErr w:type="gramStart"/>
+      <w:r>
+        <w:t>updated</w:t>
+      </w:r>
+      <w:proofErr w:type="spellEnd"/>
+      <w:r>
+        <w:t>(</w:t>
+      </w:r>
+      <w:proofErr w:type="gramEnd"/>
+      <w:r>
+        <w:t>);</w:t>
       </w:r>
     </w:p>
     <w:p/>
@@ -3789,22 +5038,94 @@
     </w:p>
     <w:p>
       <w:r>
-        <w:t>// Listen to driver_assignment_channel</w:t>
-      </w:r>
-    </w:p>
-    <w:p>
-      <w:r>
-        <w:t>client.on('notification', (msg) =&gt; {</w:t>
-      </w:r>
-    </w:p>
-    <w:p>
-      <w:r>
-        <w:t>  if (msg.channel === 'driver_assignment_channel') {</w:t>
-      </w:r>
-    </w:p>
-    <w:p>
-      <w:r>
-        <w:t>    io.emit('driver_assignment_update', { order_id: ... });</w:t>
+        <w:t xml:space="preserve">// Listen to </w:t>
+      </w:r>
+      <w:proofErr w:type="spellStart"/>
+      <w:r>
+        <w:t>driver_assignment_channel</w:t>
+      </w:r>
+      <w:proofErr w:type="spellEnd"/>
+    </w:p>
+    <w:p>
+      <w:proofErr w:type="spellStart"/>
+      <w:proofErr w:type="gramStart"/>
+      <w:r>
+        <w:t>client.on</w:t>
+      </w:r>
+      <w:proofErr w:type="spellEnd"/>
+      <w:proofErr w:type="gramEnd"/>
+      <w:r>
+        <w:t>('notification', (msg) =&gt; {</w:t>
+      </w:r>
+    </w:p>
+    <w:p>
+      <w:r>
+        <w:t>  if (</w:t>
+      </w:r>
+      <w:proofErr w:type="spellStart"/>
+      <w:proofErr w:type="gramStart"/>
+      <w:r>
+        <w:t>msg.channel</w:t>
+      </w:r>
+      <w:proofErr w:type="spellEnd"/>
+      <w:proofErr w:type="gramEnd"/>
+      <w:r>
+        <w:t xml:space="preserve"> === '</w:t>
+      </w:r>
+      <w:proofErr w:type="spellStart"/>
+      <w:r>
+        <w:t>driver_assignment_channel</w:t>
+      </w:r>
+      <w:proofErr w:type="spellEnd"/>
+      <w:r>
+        <w:t>') {</w:t>
+      </w:r>
+    </w:p>
+    <w:p>
+      <w:r>
+        <w:t xml:space="preserve">    </w:t>
+      </w:r>
+      <w:proofErr w:type="spellStart"/>
+      <w:proofErr w:type="gramStart"/>
+      <w:r>
+        <w:t>io.emit</w:t>
+      </w:r>
+      <w:proofErr w:type="spellEnd"/>
+      <w:proofErr w:type="gramEnd"/>
+      <w:r>
+        <w:t>('</w:t>
+      </w:r>
+      <w:proofErr w:type="spellStart"/>
+      <w:r>
+        <w:t>driver_assignment_update</w:t>
+      </w:r>
+      <w:proofErr w:type="spellEnd"/>
+      <w:r>
+        <w:t xml:space="preserve">', </w:t>
+      </w:r>
+      <w:proofErr w:type="gramStart"/>
+      <w:r>
+        <w:t xml:space="preserve">{ </w:t>
+      </w:r>
+      <w:proofErr w:type="spellStart"/>
+      <w:r>
+        <w:t>order</w:t>
+      </w:r>
+      <w:proofErr w:type="gramEnd"/>
+      <w:r>
+        <w:t>_id</w:t>
+      </w:r>
+      <w:proofErr w:type="spellEnd"/>
+      <w:r>
+        <w:t xml:space="preserve">: </w:t>
+      </w:r>
+      <w:proofErr w:type="gramStart"/>
+      <w:r>
+        <w:t>... }</w:t>
+      </w:r>
+      <w:proofErr w:type="gramEnd"/>
+      <w:r>
+        <w:t>);</w:t>
       </w:r>
     </w:p>
     <w:p>
@@ -3860,7 +5181,23 @@
           <w:b/>
           <w:bCs/>
         </w:rPr>
-        <w:t>Added available flag in supplier_Driver table which is set to false when a driver has been assigned to an order</w:t>
+        <w:t xml:space="preserve">Added available flag in </w:t>
+      </w:r>
+      <w:proofErr w:type="spellStart"/>
+      <w:r>
+        <w:rPr>
+          <w:b/>
+          <w:bCs/>
+        </w:rPr>
+        <w:t>supplier_Driver</w:t>
+      </w:r>
+      <w:proofErr w:type="spellEnd"/>
+      <w:r>
+        <w:rPr>
+          <w:b/>
+          <w:bCs/>
+        </w:rPr>
+        <w:t xml:space="preserve"> table which is set to false when a driver has been assigned to an order</w:t>
       </w:r>
     </w:p>
     <w:p>
@@ -3917,7 +5254,15 @@
     </w:p>
     <w:p>
       <w:r>
-        <w:t>Now only the delivery process and the ride finish has to be taken care of as well as order history</w:t>
+        <w:t xml:space="preserve">Now only the delivery process and the ride finish </w:t>
+      </w:r>
+      <w:proofErr w:type="gramStart"/>
+      <w:r>
+        <w:t>has</w:t>
+      </w:r>
+      <w:proofErr w:type="gramEnd"/>
+      <w:r>
+        <w:t xml:space="preserve"> to be taken care of as well as order history</w:t>
       </w:r>
     </w:p>
     <w:p>
@@ -3933,7 +5278,23 @@
     <w:p/>
     <w:p>
       <w:r>
-        <w:t>The real time changes on tables and other things on db side will be only noticed used trigger on db logic.</w:t>
+        <w:t xml:space="preserve">The real time changes on tables and other things on </w:t>
+      </w:r>
+      <w:proofErr w:type="spellStart"/>
+      <w:r>
+        <w:t>db</w:t>
+      </w:r>
+      <w:proofErr w:type="spellEnd"/>
+      <w:r>
+        <w:t xml:space="preserve"> side will be only noticed used trigger on </w:t>
+      </w:r>
+      <w:proofErr w:type="spellStart"/>
+      <w:r>
+        <w:t>db</w:t>
+      </w:r>
+      <w:proofErr w:type="spellEnd"/>
+      <w:r>
+        <w:t xml:space="preserve"> logic.</w:t>
       </w:r>
     </w:p>
     <w:p>
@@ -3944,16 +5305,80 @@
     <w:p/>
     <w:p>
       <w:r>
-        <w:t>Now rating is added but for cancellation we have to take care of rating too if driver or supplier cancels it rating falls by 0</w:t>
-      </w:r>
-      <w:r>
-        <w:t>.2 for supplier side rating drop will happen if the status was accepted or ride_started  same for driver . if customer does it at the accepted or ride_started stage then no rating will be updated but reason will be logged in rating table if customer or supplier does it at any stage before accepted then no problem</w:t>
+        <w:t xml:space="preserve">Now rating is added but for cancellation we </w:t>
+      </w:r>
+      <w:proofErr w:type="gramStart"/>
+      <w:r>
+        <w:t>have to</w:t>
+      </w:r>
+      <w:proofErr w:type="gramEnd"/>
+      <w:r>
+        <w:t xml:space="preserve"> take care of rating too if driver or supplier cancels it rating falls by 0</w:t>
+      </w:r>
+      <w:r>
+        <w:t xml:space="preserve">.2 for supplier side rating drop will happen if the status was accepted or </w:t>
+      </w:r>
+      <w:proofErr w:type="spellStart"/>
+      <w:r>
+        <w:t>ride_</w:t>
+      </w:r>
+      <w:proofErr w:type="gramStart"/>
+      <w:r>
+        <w:t>started</w:t>
+      </w:r>
+      <w:proofErr w:type="spellEnd"/>
+      <w:r>
+        <w:t xml:space="preserve">  same</w:t>
+      </w:r>
+      <w:proofErr w:type="gramEnd"/>
+      <w:r>
+        <w:t xml:space="preserve"> for </w:t>
+      </w:r>
+      <w:proofErr w:type="gramStart"/>
+      <w:r>
+        <w:t>driver .</w:t>
+      </w:r>
+      <w:proofErr w:type="gramEnd"/>
+      <w:r>
+        <w:t xml:space="preserve"> if customer does it at the accepted or </w:t>
+      </w:r>
+      <w:proofErr w:type="spellStart"/>
+      <w:r>
+        <w:t>ride_started</w:t>
+      </w:r>
+      <w:proofErr w:type="spellEnd"/>
+      <w:r>
+        <w:t xml:space="preserve"> stage then no rating will be updated but reason will be logged in rating table if customer or supplier does it at any stage before accepted then no problem</w:t>
       </w:r>
     </w:p>
     <w:p/>
     <w:p>
       <w:r>
-        <w:t>Ok first, if any party cancelled  on status that was not accepted or ride started then dont log it into oder history</w:t>
+        <w:t xml:space="preserve">Ok first, if any party </w:t>
+      </w:r>
+      <w:proofErr w:type="gramStart"/>
+      <w:r>
+        <w:t>cancelled  on</w:t>
+      </w:r>
+      <w:proofErr w:type="gramEnd"/>
+      <w:r>
+        <w:t xml:space="preserve"> status that was not accepted or ride started then </w:t>
+      </w:r>
+      <w:proofErr w:type="spellStart"/>
+      <w:r>
+        <w:t>dont</w:t>
+      </w:r>
+      <w:proofErr w:type="spellEnd"/>
+      <w:r>
+        <w:t xml:space="preserve"> log it into </w:t>
+      </w:r>
+      <w:proofErr w:type="spellStart"/>
+      <w:r>
+        <w:t>oder</w:t>
+      </w:r>
+      <w:proofErr w:type="spellEnd"/>
+      <w:r>
+        <w:t xml:space="preserve"> history</w:t>
       </w:r>
     </w:p>
     <w:p>
@@ -3963,19 +5388,40 @@
     </w:p>
     <w:p>
       <w:r>
-        <w:t>If rider or supplier does it, log the reason into ratings table, rating of supplier affected</w:t>
+        <w:t xml:space="preserve">If rider or </w:t>
+      </w:r>
+      <w:proofErr w:type="gramStart"/>
+      <w:r>
+        <w:t>supplier</w:t>
+      </w:r>
+      <w:proofErr w:type="gramEnd"/>
+      <w:r>
+        <w:t xml:space="preserve"> does it, log the reason into ratings table, rating of supplier affected</w:t>
       </w:r>
     </w:p>
     <w:p/>
     <w:p/>
     <w:p>
       <w:r>
-        <w:t xml:space="preserve">View past orders list has implemented in schema.sql as it is same for all </w:t>
-      </w:r>
-    </w:p>
-    <w:p>
-      <w:r>
-        <w:t xml:space="preserve">Seperate implementations of view past order details is done due to fetching different data </w:t>
+        <w:t xml:space="preserve">View past orders list has implemented in </w:t>
+      </w:r>
+      <w:proofErr w:type="spellStart"/>
+      <w:r>
+        <w:t>schema.sql</w:t>
+      </w:r>
+      <w:proofErr w:type="spellEnd"/>
+      <w:r>
+        <w:t xml:space="preserve"> as it is same for all </w:t>
+      </w:r>
+    </w:p>
+    <w:p>
+      <w:proofErr w:type="spellStart"/>
+      <w:r>
+        <w:t>Seperate</w:t>
+      </w:r>
+      <w:proofErr w:type="spellEnd"/>
+      <w:r>
+        <w:t xml:space="preserve"> implementations of view past order details is done due to fetching different data </w:t>
       </w:r>
       <w:r>
         <w:t xml:space="preserve">for each user </w:t>
@@ -3995,7 +5441,15 @@
     </w:p>
     <w:p>
       <w:r>
-        <w:t>Have made the basic version with middleware and the basic apis set up.</w:t>
+        <w:t xml:space="preserve">Have made the basic version with middleware and the basic </w:t>
+      </w:r>
+      <w:proofErr w:type="spellStart"/>
+      <w:r>
+        <w:t>apis</w:t>
+      </w:r>
+      <w:proofErr w:type="spellEnd"/>
+      <w:r>
+        <w:t xml:space="preserve"> set up.</w:t>
       </w:r>
     </w:p>
     <w:p>
@@ -4051,7 +5505,47 @@
     <w:p/>
     <w:p>
       <w:r>
-        <w:t xml:space="preserve">I implemented a strict role-lock in the database profile functions so users can set role details only once, and never change or update role details afterward. I updated the role check in `enter_details_customer`, `enter_details_driver`, and `enter_details_supplier` to reject when the current role is not `undefined`, and standardized the rejection message to: "Role already assigned. Details update is not allowed." I did this </w:t>
+        <w:t xml:space="preserve">I implemented a strict role-lock in the database profile functions so users can set role details only </w:t>
+      </w:r>
+      <w:proofErr w:type="gramStart"/>
+      <w:r>
+        <w:t>once, and</w:t>
+      </w:r>
+      <w:proofErr w:type="gramEnd"/>
+      <w:r>
+        <w:t xml:space="preserve"> never change or update role details afterward. I updated the role check in `</w:t>
+      </w:r>
+      <w:proofErr w:type="spellStart"/>
+      <w:r>
+        <w:t>enter_details_customer</w:t>
+      </w:r>
+      <w:proofErr w:type="spellEnd"/>
+      <w:r>
+        <w:t>`, `</w:t>
+      </w:r>
+      <w:proofErr w:type="spellStart"/>
+      <w:r>
+        <w:t>enter_details_driver</w:t>
+      </w:r>
+      <w:proofErr w:type="spellEnd"/>
+      <w:r>
+        <w:t>`, and `</w:t>
+      </w:r>
+      <w:proofErr w:type="spellStart"/>
+      <w:r>
+        <w:t>enter_details_supplier</w:t>
+      </w:r>
+      <w:proofErr w:type="spellEnd"/>
+      <w:r>
+        <w:t>` to reject when the current role is not `undefined</w:t>
+      </w:r>
+      <w:proofErr w:type="gramStart"/>
+      <w:r>
+        <w:t>`, and</w:t>
+      </w:r>
+      <w:proofErr w:type="gramEnd"/>
+      <w:r>
+        <w:t xml:space="preserve"> standardized the rejection message to: "Role already assigned. Details update is not allowed." I did this </w:t>
       </w:r>
       <w:r>
         <w:t>to ensure</w:t>
@@ -4116,8 +5610,13 @@
     <w:p/>
     <w:p/>
     <w:p>
-      <w:r>
-        <w:t>Lastly , now on driver onboarding, if he exists in the supplier driver table then allow him in.</w:t>
+      <w:proofErr w:type="gramStart"/>
+      <w:r>
+        <w:t>Lastly ,</w:t>
+      </w:r>
+      <w:proofErr w:type="gramEnd"/>
+      <w:r>
+        <w:t xml:space="preserve"> now on driver onboarding, if he exists in the supplier driver table then allow him in.</w:t>
       </w:r>
     </w:p>
     <w:p>
@@ -4128,7 +5627,15 @@
     <w:p/>
     <w:p>
       <w:r>
-        <w:t>Rigorous code testing with tweaks done. The authentication and onboarding logic is done and tested.</w:t>
+        <w:t xml:space="preserve">Rigorous code testing with tweaks done. The authentication and onboarding logic </w:t>
+      </w:r>
+      <w:proofErr w:type="gramStart"/>
+      <w:r>
+        <w:t>is</w:t>
+      </w:r>
+      <w:proofErr w:type="gramEnd"/>
+      <w:r>
+        <w:t xml:space="preserve"> done and tested.</w:t>
       </w:r>
     </w:p>
     <w:p>
@@ -4194,19 +5701,99 @@
     <w:p/>
     <w:p>
       <w:r>
-        <w:t>I enforced supplier bidding eligibility. Supplier can view marketplace list and details, but cannot bid unless they have at least one linked and currently available driver. This is enforced in backend and in send_bid DB function.</w:t>
+        <w:t xml:space="preserve">I enforced supplier bidding eligibility. Supplier can view marketplace list and </w:t>
+      </w:r>
+      <w:proofErr w:type="gramStart"/>
+      <w:r>
+        <w:t>details, but</w:t>
+      </w:r>
+      <w:proofErr w:type="gramEnd"/>
+      <w:r>
+        <w:t xml:space="preserve"> cannot bid unless they have at least one linked and currently available driver. This is enforced in backend and in </w:t>
+      </w:r>
+      <w:proofErr w:type="spellStart"/>
+      <w:r>
+        <w:t>send_bid</w:t>
+      </w:r>
+      <w:proofErr w:type="spellEnd"/>
+      <w:r>
+        <w:t xml:space="preserve"> DB function.</w:t>
       </w:r>
     </w:p>
     <w:p/>
     <w:p>
       <w:r>
-        <w:t>I made the marketplace list privacy-safe. Supplier available orders now return only order_id, requested_capacity, and customer_bid_price. Full details including customer name and delivery location are returned only to bid-eligible suppliers, implemented in view_order_details with supplier_id check.</w:t>
+        <w:t xml:space="preserve">I made the marketplace list </w:t>
+      </w:r>
+      <w:proofErr w:type="gramStart"/>
+      <w:r>
+        <w:t>privacy-safe</w:t>
+      </w:r>
+      <w:proofErr w:type="gramEnd"/>
+      <w:r>
+        <w:t xml:space="preserve">. Supplier available orders now return only </w:t>
+      </w:r>
+      <w:proofErr w:type="spellStart"/>
+      <w:r>
+        <w:t>order_id</w:t>
+      </w:r>
+      <w:proofErr w:type="spellEnd"/>
+      <w:r>
+        <w:t xml:space="preserve">, </w:t>
+      </w:r>
+      <w:proofErr w:type="spellStart"/>
+      <w:r>
+        <w:t>requested_capacity</w:t>
+      </w:r>
+      <w:proofErr w:type="spellEnd"/>
+      <w:r>
+        <w:t xml:space="preserve">, and </w:t>
+      </w:r>
+      <w:proofErr w:type="spellStart"/>
+      <w:r>
+        <w:t>customer_bid_price</w:t>
+      </w:r>
+      <w:proofErr w:type="spellEnd"/>
+      <w:r>
+        <w:t xml:space="preserve">. Full details including customer name and delivery location are returned only to bid-eligible suppliers, implemented in </w:t>
+      </w:r>
+      <w:proofErr w:type="spellStart"/>
+      <w:r>
+        <w:t>view_order_details</w:t>
+      </w:r>
+      <w:proofErr w:type="spellEnd"/>
+      <w:r>
+        <w:t xml:space="preserve"> with </w:t>
+      </w:r>
+      <w:proofErr w:type="spellStart"/>
+      <w:r>
+        <w:t>supplier_id</w:t>
+      </w:r>
+      <w:proofErr w:type="spellEnd"/>
+      <w:r>
+        <w:t xml:space="preserve"> check.</w:t>
       </w:r>
     </w:p>
     <w:p/>
     <w:p>
       <w:r>
-        <w:t>Also implemented supplier bid cooldown and expiry window of 90 seconds in send_bid. Customer bid visibility and acceptance use the same 90-second window, enforced in customer.sql.</w:t>
+        <w:t xml:space="preserve">Also implemented supplier bid cooldown and expiry window of 90 seconds in </w:t>
+      </w:r>
+      <w:proofErr w:type="spellStart"/>
+      <w:r>
+        <w:t>send_bid</w:t>
+      </w:r>
+      <w:proofErr w:type="spellEnd"/>
+      <w:r>
+        <w:t xml:space="preserve">. Customer bid visibility and acceptance use the same 90-second window, enforced in </w:t>
+      </w:r>
+      <w:proofErr w:type="spellStart"/>
+      <w:r>
+        <w:t>customer.sql</w:t>
+      </w:r>
+      <w:proofErr w:type="spellEnd"/>
+      <w:r>
+        <w:t>.</w:t>
       </w:r>
     </w:p>
     <w:p>
@@ -4220,7 +5807,15 @@
       </w:r>
       <w:r>
         <w:br/>
-        <w:t>So far they are working</w:t>
+        <w:t xml:space="preserve">So </w:t>
+      </w:r>
+      <w:proofErr w:type="gramStart"/>
+      <w:r>
+        <w:t>far</w:t>
+      </w:r>
+      <w:proofErr w:type="gramEnd"/>
+      <w:r>
+        <w:t xml:space="preserve"> they are working</w:t>
       </w:r>
     </w:p>
     <w:p>
@@ -4240,8 +5835,13 @@
       </w:r>
     </w:p>
     <w:p>
-      <w:r>
-        <w:t>Implennted supplier assignment and driver accepting/rejecting order all in their own time limits</w:t>
+      <w:proofErr w:type="spellStart"/>
+      <w:r>
+        <w:t>Implennted</w:t>
+      </w:r>
+      <w:proofErr w:type="spellEnd"/>
+      <w:r>
+        <w:t xml:space="preserve"> supplier assignment and driver accepting/rejecting order all in their own time limits</w:t>
       </w:r>
     </w:p>
     <w:p>
@@ -4253,12 +5853,28 @@
     <w:p>
       <w:r>
         <w:lastRenderedPageBreak/>
-        <w:t>Hardened timeout behavior across the full flow because I discovered inconsistent edge cases during testing. Added supplier time limit visibility in the supplier order details response so the expiry was explicit. I enforced that once the supplier timer expires, the supplier can no longer view assignable drivers, cannot assign a driver, and cannot access the expired order as an active order.</w:t>
-      </w:r>
-    </w:p>
-    <w:p>
-      <w:r>
-        <w:t xml:space="preserve">Fixed the active-orders listing behavior so expired supplier-timer orders no longer appear there. </w:t>
+        <w:t xml:space="preserve">Hardened timeout </w:t>
+      </w:r>
+      <w:proofErr w:type="spellStart"/>
+      <w:r>
+        <w:t>behavior</w:t>
+      </w:r>
+      <w:proofErr w:type="spellEnd"/>
+      <w:r>
+        <w:t xml:space="preserve"> across the full flow because I discovered inconsistent edge cases during testing. Added supplier time limit visibility in the supplier order details response so the expiry was explicit. I enforced that once the supplier timer expires, the supplier can no longer view assignable drivers, cannot assign a driver, and cannot access the expired order as an active order.</w:t>
+      </w:r>
+    </w:p>
+    <w:p>
+      <w:r>
+        <w:t xml:space="preserve">Fixed the active-orders listing </w:t>
+      </w:r>
+      <w:proofErr w:type="spellStart"/>
+      <w:r>
+        <w:t>behavior</w:t>
+      </w:r>
+      <w:proofErr w:type="spellEnd"/>
+      <w:r>
+        <w:t xml:space="preserve"> so expired supplier-timer orders no longer appear there. </w:t>
       </w:r>
     </w:p>
     <w:p>
@@ -4274,7 +5890,23 @@
     <w:p/>
     <w:p>
       <w:r>
-        <w:t xml:space="preserve">Added customer rating endpoints with both rating and skip functionality. When a customer rates an order, the supplier’s rating is updated with a weighted average based on all completed orders, and the order is archived in order_history with the rating snapshot. When a customer skips rating, only the total orders count is incremented and the order is archived without a rating. </w:t>
+        <w:t xml:space="preserve">Added customer rating endpoints with both rating and skip functionality. When a customer rates an order, the supplier’s rating is updated with a weighted average based on all completed orders, and the order is archived in </w:t>
+      </w:r>
+      <w:proofErr w:type="spellStart"/>
+      <w:r>
+        <w:t>order_history</w:t>
+      </w:r>
+      <w:proofErr w:type="spellEnd"/>
+      <w:r>
+        <w:t xml:space="preserve"> with the rating snapshot. When a customer skips rating, only the total orders count is </w:t>
+      </w:r>
+      <w:proofErr w:type="gramStart"/>
+      <w:r>
+        <w:t>incremented</w:t>
+      </w:r>
+      <w:proofErr w:type="gramEnd"/>
+      <w:r>
+        <w:t xml:space="preserve"> and the order is archived without a rating. </w:t>
       </w:r>
     </w:p>
     <w:p>
@@ -4306,13 +5938,26 @@
       </w:r>
     </w:p>
     <w:p>
-      <w:r>
-        <w:t>Implemetned logout and deletion of each role</w:t>
-      </w:r>
-    </w:p>
-    <w:p>
-      <w:r>
-        <w:t>Testing is all that is left now... if I dont think of any more stuff to add.</w:t>
+      <w:proofErr w:type="spellStart"/>
+      <w:r>
+        <w:t>Implemetned</w:t>
+      </w:r>
+      <w:proofErr w:type="spellEnd"/>
+      <w:r>
+        <w:t xml:space="preserve"> logout and deletion of each role</w:t>
+      </w:r>
+    </w:p>
+    <w:p>
+      <w:r>
+        <w:t xml:space="preserve">Testing is all that is left now... if I </w:t>
+      </w:r>
+      <w:proofErr w:type="spellStart"/>
+      <w:r>
+        <w:t>dont</w:t>
+      </w:r>
+      <w:proofErr w:type="spellEnd"/>
+      <w:r>
+        <w:t xml:space="preserve"> think of any more stuff to add.</w:t>
       </w:r>
       <w:r>
         <w:br/>
@@ -4337,7 +5982,14 @@
       </w:r>
       <w:r>
         <w:br/>
-        <w:t>eg recently added supplier id to order history as to prevent no access of supplier’s info when a driver deletes his account when he has had an order on finished state and the customer hasn’t rated it.</w:t>
+      </w:r>
+      <w:proofErr w:type="spellStart"/>
+      <w:r>
+        <w:t>eg</w:t>
+      </w:r>
+      <w:proofErr w:type="spellEnd"/>
+      <w:r>
+        <w:t xml:space="preserve"> recently added supplier id to order history as to prevent no access of supplier’s info when a driver deletes his account when he has had an order on finished state and the customer hasn’t rated it.</w:t>
       </w:r>
       <w:r>
         <w:br/>
@@ -4447,12 +6099,21 @@
       <w:r>
         <w:t>Is it an internet request to your server? -&gt; </w:t>
       </w:r>
-      <w:r>
-        <w:rPr>
-          <w:b/>
-          <w:bCs/>
-        </w:rPr>
-        <w:t>api/</w:t>
+      <w:proofErr w:type="spellStart"/>
+      <w:r>
+        <w:rPr>
+          <w:b/>
+          <w:bCs/>
+        </w:rPr>
+        <w:t>api</w:t>
+      </w:r>
+      <w:proofErr w:type="spellEnd"/>
+      <w:r>
+        <w:rPr>
+          <w:b/>
+          <w:bCs/>
+        </w:rPr>
+        <w:t>/</w:t>
       </w:r>
     </w:p>
     <w:p>
@@ -4520,13 +6181,39 @@
       </w:r>
     </w:p>
     <w:p>
-      <w:r>
-        <w:t>Client.js : a general fn for sending request to backend. Defines the basic structure of a query with all the relevant checks etc</w:t>
-      </w:r>
-    </w:p>
-    <w:p>
-      <w:r>
-        <w:t xml:space="preserve">authApi.js : Fn that actually has the json query </w:t>
+      <w:proofErr w:type="gramStart"/>
+      <w:r>
+        <w:t>Client.js :</w:t>
+      </w:r>
+      <w:proofErr w:type="gramEnd"/>
+      <w:r>
+        <w:t xml:space="preserve"> a general fn for sending request to backend. Defines the basic structure of a query with all the relevant checks etc</w:t>
+      </w:r>
+    </w:p>
+    <w:p>
+      <w:proofErr w:type="gramStart"/>
+      <w:r>
+        <w:t>authApi.js :</w:t>
+      </w:r>
+      <w:proofErr w:type="gramEnd"/>
+      <w:r>
+        <w:t xml:space="preserve"> Fn that </w:t>
+      </w:r>
+      <w:proofErr w:type="gramStart"/>
+      <w:r>
+        <w:t>actually has</w:t>
+      </w:r>
+      <w:proofErr w:type="gramEnd"/>
+      <w:r>
+        <w:t xml:space="preserve"> the </w:t>
+      </w:r>
+      <w:proofErr w:type="spellStart"/>
+      <w:r>
+        <w:t>json</w:t>
+      </w:r>
+      <w:proofErr w:type="spellEnd"/>
+      <w:r>
+        <w:t xml:space="preserve"> query </w:t>
       </w:r>
       <w:r>
         <w:t>of each fn that is being called from frontend.</w:t>
@@ -4561,16 +6248,31 @@
     </w:p>
     <w:p/>
     <w:p>
-      <w:r>
-        <w:t>useState is simply used to change or update the value of a variable which triggers a re render</w:t>
+      <w:proofErr w:type="spellStart"/>
+      <w:r>
+        <w:t>useState</w:t>
+      </w:r>
+      <w:proofErr w:type="spellEnd"/>
+      <w:r>
+        <w:t xml:space="preserve"> is simply used to change or update the value of a variable which triggers a re render</w:t>
       </w:r>
     </w:p>
     <w:p/>
     <w:p/>
     <w:p>
-      <w:r>
-        <w:t>useEffect is used to do something when a component re renders or a specific value changes</w:t>
-      </w:r>
+      <w:proofErr w:type="spellStart"/>
+      <w:r>
+        <w:t>useEffect</w:t>
+      </w:r>
+      <w:proofErr w:type="spellEnd"/>
+      <w:r>
+        <w:t xml:space="preserve"> is used to do something when a component re renders or a </w:t>
+      </w:r>
+      <w:proofErr w:type="gramStart"/>
+      <w:r>
+        <w:t>specific value changes</w:t>
+      </w:r>
+      <w:proofErr w:type="gramEnd"/>
       <w:r>
         <w:br/>
       </w:r>
@@ -4669,7 +6371,23 @@
         <w:t>A</w:t>
       </w:r>
       <w:r>
-        <w:t>dded customer login cleanup behavior so on startup login and OTP login, customer open orders are auto-deleted.</w:t>
+        <w:t xml:space="preserve">dded customer login cleanup </w:t>
+      </w:r>
+      <w:proofErr w:type="spellStart"/>
+      <w:r>
+        <w:t>behavior</w:t>
+      </w:r>
+      <w:proofErr w:type="spellEnd"/>
+      <w:r>
+        <w:t xml:space="preserve"> so on startup login and OTP login, customer open orders are </w:t>
+      </w:r>
+      <w:proofErr w:type="gramStart"/>
+      <w:r>
+        <w:t>auto-deleted</w:t>
+      </w:r>
+      <w:proofErr w:type="gramEnd"/>
+      <w:r>
+        <w:t>.</w:t>
       </w:r>
       <w:r>
         <w:t xml:space="preserve"> </w:t>
@@ -4692,6 +6410,7 @@
       </w:r>
     </w:p>
     <w:p>
+      <w:proofErr w:type="spellStart"/>
       <w:r>
         <w:t>I</w:t>
       </w:r>
@@ -4699,7 +6418,11 @@
         <w:t>I</w:t>
       </w:r>
       <w:r>
-        <w:t>mplemented customer dashboard bid flow with polling for incoming bids every second, accept and reject actions, customer bid update action, countdown handling, and open-order hydration from backend.</w:t>
+        <w:t>mplemented</w:t>
+      </w:r>
+      <w:proofErr w:type="spellEnd"/>
+      <w:r>
+        <w:t xml:space="preserve"> customer dashboard bid flow with polling for incoming bids every second, accept and reject actions, customer bid update action, countdown handling, and open-order hydration from backend.</w:t>
       </w:r>
     </w:p>
     <w:p>
@@ -4712,7 +6435,15 @@
         <w:t>U</w:t>
       </w:r>
       <w:r>
-        <w:t xml:space="preserve">pdated SQL-side bid lifecycle rules including 15-second bid validity, added remaining_seconds in customer bid list response, customer bid increment rules, and clearing old supplier bids after customer price update. </w:t>
+        <w:t xml:space="preserve">pdated SQL-side bid lifecycle rules including 15-second bid validity, added </w:t>
+      </w:r>
+      <w:proofErr w:type="spellStart"/>
+      <w:r>
+        <w:t>remaining_seconds</w:t>
+      </w:r>
+      <w:proofErr w:type="spellEnd"/>
+      <w:r>
+        <w:t xml:space="preserve"> in customer bid list response, customer bid increment rules, and clearing old supplier bids after customer price update. </w:t>
       </w:r>
     </w:p>
     <w:p>
@@ -4720,13 +6451,26 @@
         <w:t xml:space="preserve">Also </w:t>
       </w:r>
       <w:r>
-        <w:t>enforced supplier cooldown at runtime in backend controller by adding direct 15-second bid cooldown logic in controller path to avoid old DB-function behavior.</w:t>
+        <w:t xml:space="preserve">enforced supplier cooldown at runtime in backend controller by adding direct 15-second bid cooldown logic in controller path to avoid old DB-function </w:t>
+      </w:r>
+      <w:proofErr w:type="spellStart"/>
+      <w:r>
+        <w:t>behavior</w:t>
+      </w:r>
+      <w:proofErr w:type="spellEnd"/>
+      <w:r>
+        <w:t>.</w:t>
       </w:r>
     </w:p>
     <w:p/>
     <w:p>
-      <w:r>
-        <w:t>So for now, the code is working correctly till supplier timer state.</w:t>
+      <w:proofErr w:type="gramStart"/>
+      <w:r>
+        <w:t>So</w:t>
+      </w:r>
+      <w:proofErr w:type="gramEnd"/>
+      <w:r>
+        <w:t xml:space="preserve"> for now, the code is working correctly till supplier timer state.</w:t>
       </w:r>
     </w:p>
     <w:p/>
@@ -4742,8 +6486,13 @@
       </w:r>
     </w:p>
     <w:p>
-      <w:r>
-        <w:t>So timer phase is working well.</w:t>
+      <w:proofErr w:type="gramStart"/>
+      <w:r>
+        <w:t>So</w:t>
+      </w:r>
+      <w:proofErr w:type="gramEnd"/>
+      <w:r>
+        <w:t xml:space="preserve"> timer phase is working well.</w:t>
       </w:r>
     </w:p>
     <w:p>
@@ -4753,7 +6502,15 @@
     </w:p>
     <w:p>
       <w:r>
-        <w:t>Need to check , whether the same order is shown on customer side on logout or direct closing application</w:t>
+        <w:t xml:space="preserve">Need to </w:t>
+      </w:r>
+      <w:proofErr w:type="gramStart"/>
+      <w:r>
+        <w:t>check ,</w:t>
+      </w:r>
+      <w:proofErr w:type="gramEnd"/>
+      <w:r>
+        <w:t xml:space="preserve"> whether the same order is shown on customer side on logout or direct closing application</w:t>
       </w:r>
     </w:p>
     <w:p>
@@ -4771,7 +6528,15 @@
     </w:p>
     <w:p>
       <w:r>
-        <w:t>To start application in uni:</w:t>
+        <w:t xml:space="preserve">To start application in </w:t>
+      </w:r>
+      <w:proofErr w:type="spellStart"/>
+      <w:r>
+        <w:t>uni</w:t>
+      </w:r>
+      <w:proofErr w:type="spellEnd"/>
+      <w:r>
+        <w:t>:</w:t>
       </w:r>
     </w:p>
     <w:p>
@@ -4795,7 +6560,15 @@
         </w:numPr>
       </w:pPr>
       <w:r>
-        <w:t xml:space="preserve">Update the ip address </w:t>
+        <w:t xml:space="preserve">Update the </w:t>
+      </w:r>
+      <w:proofErr w:type="spellStart"/>
+      <w:r>
+        <w:t>ip</w:t>
+      </w:r>
+      <w:proofErr w:type="spellEnd"/>
+      <w:r>
+        <w:t xml:space="preserve"> address </w:t>
       </w:r>
       <w:r>
         <w:t>(ipconfig)</w:t>
@@ -4810,12 +6583,36 @@
     </w:p>
     <w:p>
       <w:r>
-        <w:t>Added api fns for assigning drivers to orders , get assignable drivers, and cancel order</w:t>
-      </w:r>
-    </w:p>
-    <w:p>
-      <w:r>
-        <w:t>Auto navigation for supplier dashboard on login so that if he has an active order WHICH is on supplier timer then re-direct him to that page insated of live market</w:t>
+        <w:t xml:space="preserve">Added </w:t>
+      </w:r>
+      <w:proofErr w:type="spellStart"/>
+      <w:r>
+        <w:t>api</w:t>
+      </w:r>
+      <w:proofErr w:type="spellEnd"/>
+      <w:r>
+        <w:t xml:space="preserve"> fns for assigning drivers to </w:t>
+      </w:r>
+      <w:proofErr w:type="gramStart"/>
+      <w:r>
+        <w:t>orders ,</w:t>
+      </w:r>
+      <w:proofErr w:type="gramEnd"/>
+      <w:r>
+        <w:t xml:space="preserve"> get assignable drivers, and cancel order</w:t>
+      </w:r>
+    </w:p>
+    <w:p>
+      <w:r>
+        <w:t xml:space="preserve">Auto navigation for supplier dashboard on login so that if he has an active order WHICH is on supplier timer then re-direct him to that page </w:t>
+      </w:r>
+      <w:proofErr w:type="spellStart"/>
+      <w:r>
+        <w:t>insated</w:t>
+      </w:r>
+      <w:proofErr w:type="spellEnd"/>
+      <w:r>
+        <w:t xml:space="preserve"> of live market</w:t>
       </w:r>
     </w:p>
     <w:p>
@@ -4831,18 +6628,82 @@
     <w:p/>
     <w:p>
       <w:r>
-        <w:t>On driver side, currently he has to refresh to view new assigned orders to him. He can accept or reject that order after confirmation.</w:t>
-      </w:r>
-    </w:p>
-    <w:p>
-      <w:r>
-        <w:t>He has to do it in driver_timer = 60 seconds or the remaining supplier_timer (max : 5 minutes)</w:t>
+        <w:t xml:space="preserve">On driver side, currently he </w:t>
+      </w:r>
+      <w:proofErr w:type="gramStart"/>
+      <w:r>
+        <w:t>has to</w:t>
+      </w:r>
+      <w:proofErr w:type="gramEnd"/>
+      <w:r>
+        <w:t xml:space="preserve"> refresh to view new assigned orders to him. He can accept or reject that order after confirmation.</w:t>
+      </w:r>
+    </w:p>
+    <w:p>
+      <w:r>
+        <w:t xml:space="preserve">He </w:t>
+      </w:r>
+      <w:proofErr w:type="gramStart"/>
+      <w:r>
+        <w:t>has to</w:t>
+      </w:r>
+      <w:proofErr w:type="gramEnd"/>
+      <w:r>
+        <w:t xml:space="preserve"> do it in </w:t>
+      </w:r>
+      <w:proofErr w:type="spellStart"/>
+      <w:r>
+        <w:t>driver_timer</w:t>
+      </w:r>
+      <w:proofErr w:type="spellEnd"/>
+      <w:r>
+        <w:t xml:space="preserve"> = 60 seconds or the remaining </w:t>
+      </w:r>
+      <w:proofErr w:type="spellStart"/>
+      <w:r>
+        <w:t>supplier_timer</w:t>
+      </w:r>
+      <w:proofErr w:type="spellEnd"/>
+      <w:r>
+        <w:t xml:space="preserve"> (</w:t>
+      </w:r>
+      <w:proofErr w:type="gramStart"/>
+      <w:r>
+        <w:t>max :</w:t>
+      </w:r>
+      <w:proofErr w:type="gramEnd"/>
+      <w:r>
+        <w:t xml:space="preserve"> 5 minutes)</w:t>
       </w:r>
     </w:p>
     <w:p>
       <w:r>
         <w:lastRenderedPageBreak/>
-        <w:t xml:space="preserve">The lesser of the two , when finished , will trgger order cancellation </w:t>
+        <w:t xml:space="preserve">The lesser of the </w:t>
+      </w:r>
+      <w:proofErr w:type="gramStart"/>
+      <w:r>
+        <w:t>two ,</w:t>
+      </w:r>
+      <w:proofErr w:type="gramEnd"/>
+      <w:r>
+        <w:t xml:space="preserve"> when </w:t>
+      </w:r>
+      <w:proofErr w:type="gramStart"/>
+      <w:r>
+        <w:t>finished ,</w:t>
+      </w:r>
+      <w:proofErr w:type="gramEnd"/>
+      <w:r>
+        <w:t xml:space="preserve"> will </w:t>
+      </w:r>
+      <w:proofErr w:type="spellStart"/>
+      <w:r>
+        <w:t>trgger</w:t>
+      </w:r>
+      <w:proofErr w:type="spellEnd"/>
+      <w:r>
+        <w:t xml:space="preserve"> order cancellation </w:t>
       </w:r>
     </w:p>
     <w:p>
@@ -4864,12 +6725,44 @@
     <w:p/>
     <w:p>
       <w:r>
-        <w:t xml:space="preserve">Driver availability is intentionally set to false in two places: when a driver accepts an order and when they explicitly log out. App close without logout leaves them available, which is intentional and matches Uber and Bykea behavior since there is no reliable way to detect app closure. </w:t>
-      </w:r>
-    </w:p>
-    <w:p>
-      <w:r>
-        <w:t xml:space="preserve">Driver who rejects an order gets `order_rejected = TRUE` in the driver assignment table, causing the supplier to see them as rejected and greyed out, while the `assign_driver_to_order` function blocks reassignment to the same order, though they can still be assigned to other orders. </w:t>
+        <w:t xml:space="preserve">Driver availability is intentionally set to false in two places: when a driver accepts an order and when they explicitly log out. App close without logout leaves them available, which is intentional and matches Uber and </w:t>
+      </w:r>
+      <w:proofErr w:type="spellStart"/>
+      <w:r>
+        <w:t>Bykea</w:t>
+      </w:r>
+      <w:proofErr w:type="spellEnd"/>
+      <w:r>
+        <w:t xml:space="preserve"> </w:t>
+      </w:r>
+      <w:proofErr w:type="spellStart"/>
+      <w:r>
+        <w:t>behavior</w:t>
+      </w:r>
+      <w:proofErr w:type="spellEnd"/>
+      <w:r>
+        <w:t xml:space="preserve"> since there is no reliable way to detect app closure. </w:t>
+      </w:r>
+    </w:p>
+    <w:p>
+      <w:r>
+        <w:t>Driver who rejects an order gets `</w:t>
+      </w:r>
+      <w:proofErr w:type="spellStart"/>
+      <w:r>
+        <w:t>order_rejected</w:t>
+      </w:r>
+      <w:proofErr w:type="spellEnd"/>
+      <w:r>
+        <w:t xml:space="preserve"> = TRUE` in the driver assignment table, causing the supplier to see them as rejected and greyed out, while the `</w:t>
+      </w:r>
+      <w:proofErr w:type="spellStart"/>
+      <w:r>
+        <w:t>assign_driver_to_order</w:t>
+      </w:r>
+      <w:proofErr w:type="spellEnd"/>
+      <w:r>
+        <w:t xml:space="preserve">` function blocks reassignment to the same order, though they can still be assigned to other orders. </w:t>
       </w:r>
     </w:p>
     <w:p>
@@ -4887,7 +6780,31 @@
     </w:p>
     <w:p>
       <w:r>
-        <w:t>Added customer history and rating feature set including API calls for GET customer history, GET customer history by order ID, and POST customer order rating. Updated customer history detail response in startupController.js to include order_id and customer_rating from order_history. Added full History tab, details screen, and rating UI in CustomerDashboard.js.</w:t>
+        <w:t xml:space="preserve">Added customer history and rating feature set including API calls for GET customer history, GET customer history by order ID, and POST customer order rating. Updated customer history detail response in startupController.js to include </w:t>
+      </w:r>
+      <w:proofErr w:type="spellStart"/>
+      <w:r>
+        <w:t>order_id</w:t>
+      </w:r>
+      <w:proofErr w:type="spellEnd"/>
+      <w:r>
+        <w:t xml:space="preserve"> and </w:t>
+      </w:r>
+      <w:proofErr w:type="spellStart"/>
+      <w:r>
+        <w:t>customer_rating</w:t>
+      </w:r>
+      <w:proofErr w:type="spellEnd"/>
+      <w:r>
+        <w:t xml:space="preserve"> from </w:t>
+      </w:r>
+      <w:proofErr w:type="spellStart"/>
+      <w:r>
+        <w:t>order_history</w:t>
+      </w:r>
+      <w:proofErr w:type="spellEnd"/>
+      <w:r>
+        <w:t>. Added full History tab, details screen, and rating UI in CustomerDashboard.js.</w:t>
       </w:r>
     </w:p>
     <w:p>
@@ -4903,29 +6820,43 @@
     <w:p/>
     <w:p>
       <w:r>
-        <w:t xml:space="preserve">Implemented area and district handling at order creation by adding Karachi area dropdown in CustomerDashboard.js and storing delivery_location as address comma </w:t>
+        <w:t xml:space="preserve">Implemented area and district handling at order creation by adding Karachi area dropdown in CustomerDashboard.js and storing </w:t>
+      </w:r>
+      <w:proofErr w:type="spellStart"/>
+      <w:r>
+        <w:t>delivery_location</w:t>
+      </w:r>
+      <w:proofErr w:type="spellEnd"/>
+      <w:r>
+        <w:t xml:space="preserve"> as address comma </w:t>
       </w:r>
       <w:r>
         <w:lastRenderedPageBreak/>
-        <w:t>area</w:t>
-      </w:r>
-      <w:r>
-        <w:t xml:space="preserve"> and also modified</w:t>
-      </w:r>
-      <w:r>
-        <w:t xml:space="preserve"> live market layout and area-only display by adding delivery_location to supplier market list SQL</w:t>
-      </w:r>
-      <w:r>
-        <w:t xml:space="preserve"> so that each card </w:t>
-      </w:r>
-      <w:r>
-        <w:t>show</w:t>
-      </w:r>
-      <w:r>
-        <w:t>ed</w:t>
-      </w:r>
-      <w:r>
-        <w:t xml:space="preserve"> area parsed from delivery_location instead of full address.</w:t>
+        <w:t xml:space="preserve">area </w:t>
+      </w:r>
+      <w:proofErr w:type="gramStart"/>
+      <w:r>
+        <w:t>and also</w:t>
+      </w:r>
+      <w:proofErr w:type="gramEnd"/>
+      <w:r>
+        <w:t xml:space="preserve"> modified live market layout and area-only display by adding </w:t>
+      </w:r>
+      <w:proofErr w:type="spellStart"/>
+      <w:r>
+        <w:t>delivery_location</w:t>
+      </w:r>
+      <w:proofErr w:type="spellEnd"/>
+      <w:r>
+        <w:t xml:space="preserve"> to supplier market list SQL so that each card showed area parsed from </w:t>
+      </w:r>
+      <w:proofErr w:type="spellStart"/>
+      <w:r>
+        <w:t>delivery_location</w:t>
+      </w:r>
+      <w:proofErr w:type="spellEnd"/>
+      <w:r>
+        <w:t xml:space="preserve"> instead of full address.</w:t>
       </w:r>
     </w:p>
     <w:p/>
@@ -4945,7 +6876,56 @@
     </w:p>
     <w:p>
       <w:r>
-        <w:t>I revert back, the frontend’s functionality is complete.</w:t>
+        <w:t xml:space="preserve">I revert </w:t>
+      </w:r>
+      <w:proofErr w:type="gramStart"/>
+      <w:r>
+        <w:t>back,</w:t>
+      </w:r>
+      <w:proofErr w:type="gramEnd"/>
+      <w:r>
+        <w:t xml:space="preserve"> the frontend’s functionality is complete.</w:t>
+      </w:r>
+    </w:p>
+    <w:p/>
+    <w:p/>
+    <w:p/>
+    <w:p>
+      <w:r>
+        <w:t>13/05/2026:</w:t>
+      </w:r>
+    </w:p>
+    <w:p>
+      <w:r>
+        <w:t>Doing minor checks.</w:t>
+      </w:r>
+    </w:p>
+    <w:p>
+      <w:r>
+        <w:t>After completing an order, customer was not reverting to the create order screen. Fixed</w:t>
+      </w:r>
+      <w:r>
+        <w:t>.</w:t>
+      </w:r>
+    </w:p>
+    <w:p>
+      <w:r>
+        <w:t>On completion of order, after pressing not now on submit rating pop up and logging out, the customer was getting the same pop up when logging back in.  Fixed.</w:t>
+      </w:r>
+    </w:p>
+    <w:p>
+      <w:r>
+        <w:t>Driver was getting order details on the bottom of the screen after pressing view details for a past order. Fixed it. Now shows it on a new page.</w:t>
+      </w:r>
+    </w:p>
+    <w:p>
+      <w:r>
+        <w:t>Supplier had no button for viewing past orders. Added that and the details tab.</w:t>
+      </w:r>
+    </w:p>
+    <w:p>
+      <w:r>
+        <w:t>Added polling on driver dashboard to automatically refresh and find new assignments</w:t>
       </w:r>
     </w:p>
     <w:sectPr>

</xml_diff>

<commit_message>
Added: Sessions to frontend
</commit_message>
<xml_diff>
--- a/documents/code logic.docx
+++ b/documents/code logic.docx
@@ -6926,6 +6926,11 @@
     <w:p>
       <w:r>
         <w:t>Added polling on driver dashboard to automatically refresh and find new assignments</w:t>
+      </w:r>
+    </w:p>
+    <w:p>
+      <w:r>
+        <w:t>Added sessions to login</w:t>
       </w:r>
     </w:p>
     <w:sectPr>

</xml_diff>

<commit_message>
fix: Real-time timer updates, socket sync for supplier/driver, and animated splash screen
</commit_message>
<xml_diff>
--- a/documents/code logic.docx
+++ b/documents/code logic.docx
@@ -6931,6 +6931,207 @@
     <w:p>
       <w:r>
         <w:t>Added sessions to login</w:t>
+      </w:r>
+    </w:p>
+    <w:p/>
+    <w:p/>
+    <w:p>
+      <w:pPr>
+        <w:rPr>
+          <w:lang w:val="en-PK"/>
+        </w:rPr>
+      </w:pPr>
+      <w:r>
+        <w:t>01/06/2026</w:t>
+      </w:r>
+      <w:r>
+        <w:t xml:space="preserve"> (</w:t>
+      </w:r>
+      <w:r>
+        <w:t>and some other days in between</w:t>
+      </w:r>
+      <w:r>
+        <w:t>):</w:t>
+      </w:r>
+      <w:r>
+        <w:br/>
+      </w:r>
+      <w:r>
+        <w:br/>
+      </w:r>
+    </w:p>
+    <w:p>
+      <w:pPr>
+        <w:rPr>
+          <w:lang w:val="en-PK"/>
+        </w:rPr>
+      </w:pPr>
+      <w:r>
+        <w:rPr>
+          <w:lang w:val="en-PK"/>
+        </w:rPr>
+        <w:t>F</w:t>
+      </w:r>
+      <w:r>
+        <w:rPr>
+          <w:lang w:val="en-PK"/>
+        </w:rPr>
+        <w:t>ixed bid countdown timer on customer dashboard.</w:t>
+      </w:r>
+    </w:p>
+    <w:p>
+      <w:pPr>
+        <w:rPr>
+          <w:lang w:val="en-PK"/>
+        </w:rPr>
+      </w:pPr>
+      <w:r>
+        <w:rPr>
+          <w:lang w:val="en-PK"/>
+        </w:rPr>
+        <w:lastRenderedPageBreak/>
+        <w:t xml:space="preserve">Fixed supplier confirmation timer on customer dashboard. Timer was frozen at server-provided value. Added order fetch timestamp ref and extended tick interval to run during </w:t>
+      </w:r>
+      <w:proofErr w:type="spellStart"/>
+      <w:r>
+        <w:rPr>
+          <w:lang w:val="en-PK"/>
+        </w:rPr>
+        <w:t>supplier_timer</w:t>
+      </w:r>
+      <w:proofErr w:type="spellEnd"/>
+      <w:r>
+        <w:rPr>
+          <w:lang w:val="en-PK"/>
+        </w:rPr>
+        <w:t xml:space="preserve"> status, enabling live countdown display.</w:t>
+      </w:r>
+    </w:p>
+    <w:p>
+      <w:pPr>
+        <w:rPr>
+          <w:lang w:val="en-PK"/>
+        </w:rPr>
+      </w:pPr>
+      <w:r>
+        <w:rPr>
+          <w:lang w:val="en-PK"/>
+        </w:rPr>
+        <w:t xml:space="preserve">Fixed supplier order detail screen not updating in real time when driver changes status. Socket </w:t>
+      </w:r>
+      <w:proofErr w:type="spellStart"/>
+      <w:r>
+        <w:rPr>
+          <w:lang w:val="en-PK"/>
+        </w:rPr>
+        <w:t>order_updated</w:t>
+      </w:r>
+      <w:proofErr w:type="spellEnd"/>
+      <w:r>
+        <w:rPr>
+          <w:lang w:val="en-PK"/>
+        </w:rPr>
+        <w:t xml:space="preserve"> handler extended to call </w:t>
+      </w:r>
+      <w:proofErr w:type="spellStart"/>
+      <w:r>
+        <w:rPr>
+          <w:lang w:val="en-PK"/>
+        </w:rPr>
+        <w:t>fetchOrderDetail</w:t>
+      </w:r>
+      <w:proofErr w:type="spellEnd"/>
+      <w:r>
+        <w:rPr>
+          <w:lang w:val="en-PK"/>
+        </w:rPr>
+        <w:t xml:space="preserve"> when the currently viewed order is the one being updated.</w:t>
+      </w:r>
+    </w:p>
+    <w:p>
+      <w:pPr>
+        <w:rPr>
+          <w:lang w:val="en-PK"/>
+        </w:rPr>
+      </w:pPr>
+      <w:r>
+        <w:rPr>
+          <w:lang w:val="en-PK"/>
+        </w:rPr>
+        <w:t xml:space="preserve">Added automatic polling on driver dashboard during </w:t>
+      </w:r>
+      <w:proofErr w:type="spellStart"/>
+      <w:r>
+        <w:rPr>
+          <w:lang w:val="en-PK"/>
+        </w:rPr>
+        <w:t>supplier_timer</w:t>
+      </w:r>
+      <w:proofErr w:type="spellEnd"/>
+      <w:r>
+        <w:rPr>
+          <w:lang w:val="en-PK"/>
+        </w:rPr>
+        <w:t xml:space="preserve"> </w:t>
+      </w:r>
+      <w:proofErr w:type="spellStart"/>
+      <w:r>
+        <w:rPr>
+          <w:lang w:val="en-PK"/>
+        </w:rPr>
+        <w:t>pending_assignment</w:t>
+      </w:r>
+      <w:proofErr w:type="spellEnd"/>
+      <w:r>
+        <w:rPr>
+          <w:lang w:val="en-PK"/>
+        </w:rPr>
+        <w:t xml:space="preserve"> phase to detect cancellations and clear stale countdown without manual refresh. Added manual refresh button to driver task screen as fallback.</w:t>
+      </w:r>
+    </w:p>
+    <w:p>
+      <w:pPr>
+        <w:rPr>
+          <w:lang w:val="en-PK"/>
+        </w:rPr>
+      </w:pPr>
+      <w:r>
+        <w:rPr>
+          <w:lang w:val="en-PK"/>
+        </w:rPr>
+        <w:t xml:space="preserve">Fixed supplier timer notification modal to support multiple simultaneous </w:t>
+      </w:r>
+      <w:proofErr w:type="spellStart"/>
+      <w:r>
+        <w:rPr>
+          <w:lang w:val="en-PK"/>
+        </w:rPr>
+        <w:t>supplier_timer</w:t>
+      </w:r>
+      <w:proofErr w:type="spellEnd"/>
+      <w:r>
+        <w:rPr>
+          <w:lang w:val="en-PK"/>
+        </w:rPr>
+        <w:t xml:space="preserve"> orders</w:t>
+      </w:r>
+    </w:p>
+    <w:p>
+      <w:pPr>
+        <w:rPr>
+          <w:lang w:val="en-PK"/>
+        </w:rPr>
+      </w:pPr>
+      <w:r>
+        <w:rPr>
+          <w:lang w:val="en-PK"/>
+        </w:rPr>
+        <w:t>Added animated splash screen with logo zoom</w:t>
+      </w:r>
+    </w:p>
+    <w:p>
+      <w:r>
+        <w:t>IA now cleanup and deployment left only</w:t>
       </w:r>
     </w:p>
     <w:sectPr>
@@ -10727,7 +10928,6 @@
   <w:style w:type="character" w:default="1" w:styleId="DefaultParagraphFont">
     <w:name w:val="Default Paragraph Font"/>
     <w:uiPriority w:val="1"/>
-    <w:semiHidden/>
     <w:unhideWhenUsed/>
   </w:style>
   <w:style w:type="table" w:default="1" w:styleId="TableNormal">

</xml_diff>